<commit_message>
docs: tidy practice reports and gitignore
Keep one Codedot report, drop Traffic draft noise, ignore Word locks and report variants.
</commit_message>
<xml_diff>
--- a/docs/Отчет_технологическая_практика_Codedot.docx
+++ b/docs/Отчет_технологическая_практика_Codedot.docx
@@ -2159,16 +2159,13 @@
         <w:rPr>
           <w:lang w:val="ru-RU"/>
         </w:rPr>
-        <w:t>Технологическая практика является важной частью подготовки специалиста в области разработки программного обеспечения, поскольку позволяет связать теоретические знания с последовательностью реальных инженерных действий. В рамках практики изучались подходы к организации работы ИТ-компании, методы планирования и контроля разработки, а также выполнялся собственный программный проект. Практика проходила с ориентацией на профиль деятельности ООО «КОДДОТ» (</w:t>
-      </w:r>
-      <w:r>
-        <w:t>Codedot</w:t>
-      </w:r>
-      <w:r>
-        <w:rPr>
-          <w:lang w:val="ru-RU"/>
-        </w:rPr>
-        <w:t>), г. Витебск, — компании, работающей с веб- и мобильными продуктами, игровыми решениями, интерактивными интерфейсами и современными технологиями разработки.</w:t>
+        <w:t>Технологическая практика является важной частью подготовки специалиста в области разработки программного обеспечения, поскольку позволяет связать теоретические знания с последовательностью реальных инженерных действий. В рамках практики изучались подходы к организации работы ИТ-компании, методы планирования и контроля разработки, а также выполнялся собственный программный проект. Практика проходила с ориентацией на профиль деятельности ООО «КОДДОТ» (Codedot), г. Витебск, — компании, работающей с веб- и мобильными продуктами, игровыми решениями, интерактивными интерфейсами и современными технологиями разработки. Знакомство с деятельностью организации позволило понять, каким образом учебные навыки проецируются на требования профессиональной среды: необходимость демонстрировать промежуточный результат, учитывать сроки и поддерживать качество кода.</w:t>
+      </w:r>
+      <w:r/>
+      <w:r>
+        <w:rPr>
+          <w:lang w:val="ru-RU"/>
+        </w:rPr>
       </w:r>
     </w:p>
     <w:p>
@@ -2182,43 +2179,31 @@
         <w:rPr>
           <w:lang w:val="ru-RU"/>
         </w:rPr>
-        <w:t xml:space="preserve">ООО «КОДДОТ» представляет интерес как среда, в которой техническая задача рассматривается одновременно с точки зрения пользовательского опыта, сроков, качества кода и возможности развития результата. Публичные материалы компании отражают работу с направлениями веб-разработки, </w:t>
-      </w:r>
-      <w:r>
-        <w:t>React</w:t>
-      </w:r>
-      <w:r>
-        <w:rPr>
-          <w:lang w:val="ru-RU"/>
-        </w:rPr>
-        <w:t xml:space="preserve">, </w:t>
-      </w:r>
-      <w:r>
-        <w:t>Node</w:t>
-      </w:r>
-      <w:r>
-        <w:rPr>
-          <w:lang w:val="ru-RU"/>
-        </w:rPr>
-        <w:t>.</w:t>
-      </w:r>
-      <w:r>
-        <w:t>js</w:t>
-      </w:r>
-      <w:r>
-        <w:rPr>
-          <w:lang w:val="ru-RU"/>
-        </w:rPr>
-        <w:t xml:space="preserve">, </w:t>
-      </w:r>
-      <w:r>
-        <w:t>Unity</w:t>
-      </w:r>
-      <w:r>
-        <w:rPr>
-          <w:lang w:val="ru-RU"/>
-        </w:rPr>
-        <w:t xml:space="preserve"> и мобильными технологиями. Для обучающегося это является примером того, что выбор языка или фреймворка сам по себе не определяет качество продукта: существенны анализ требований, ясная архитектура, работа с ресурсами, проверка сценариев и демонстрация результата заказчику.</w:t>
+        <w:t>ООО «КОДДОТ» представляет интерес как среда, в которой техническая задача рассматривается одновременно с точки зрения пользовательского опыта, сроков, качества кода и возможности развития результата. Публичные материалы компании отражают работу с направлениями веб-разработки, React, Node.js, Unity и мобильными технологиями. Для обучающегося это является примером того, что выбор языка или фреймворка сам по себе не определяет качество продукта: существенны анализ требований, ясная архитектура, работа с ресурсами, проверка сценариев и демонстрация результата заказчику. Именно эти принципы учитывались при построении учебного проекта и при подготовке материалов отчёта.</w:t>
+      </w:r>
+      <w:r/>
+      <w:r>
+        <w:rPr>
+          <w:lang w:val="ru-RU"/>
+        </w:rPr>
+      </w:r>
+      <w:r/>
+      <w:r>
+        <w:rPr>
+          <w:lang w:val="ru-RU"/>
+        </w:rPr>
+      </w:r>
+      <w:r/>
+      <w:r>
+        <w:rPr>
+          <w:lang w:val="ru-RU"/>
+        </w:rPr>
+      </w:r>
+      <w:r/>
+      <w:r>
+        <w:rPr>
+          <w:lang w:val="ru-RU"/>
+        </w:rPr>
       </w:r>
     </w:p>
     <w:p>
@@ -2232,43 +2217,31 @@
         <w:rPr>
           <w:lang w:val="ru-RU"/>
         </w:rPr>
-        <w:t xml:space="preserve">Практической частью выступил </w:t>
-      </w:r>
-      <w:r>
-        <w:t>Java</w:t>
-      </w:r>
-      <w:r>
-        <w:rPr>
-          <w:lang w:val="ru-RU"/>
-        </w:rPr>
-        <w:t>-проект «</w:t>
-      </w:r>
-      <w:r>
-        <w:t>The</w:t>
-      </w:r>
-      <w:r>
-        <w:rPr>
-          <w:lang w:val="ru-RU"/>
-        </w:rPr>
-        <w:t xml:space="preserve"> </w:t>
-      </w:r>
-      <w:r>
-        <w:t>Witcher</w:t>
-      </w:r>
-      <w:r>
-        <w:rPr>
-          <w:lang w:val="ru-RU"/>
-        </w:rPr>
-        <w:t xml:space="preserve">» — пиксельная сюжетная игра с элементами визуальной новеллы, магазина, первой игровой главы, боевого столкновения и повторяющегося игрового цикла. Проект не связан с разработкой </w:t>
-      </w:r>
-      <w:r>
-        <w:t>TaskManager</w:t>
-      </w:r>
-      <w:r>
-        <w:rPr>
-          <w:lang w:val="ru-RU"/>
-        </w:rPr>
-        <w:t xml:space="preserve"> и не воспроизводит сторонний корпоративный продукт: он был выбран как самостоятельный учебный пример, в котором можно последовательно раскрыть работу с графическим интерфейсом, состоянием игры, диалоговыми сценами и подготовкой ресурсов.</w:t>
+        <w:t>Практической частью выступил Java-проект «The Witcher» — пиксельная сюжетная игра с элементами визуальной новеллы, магазина, первой игровой главы, боевого столкновения и повторяющегося игрового цикла. Проект не связан с разработкой TaskManager и не воспроизводит сторонний корпоративный продукт: он был выбран как самостоятельный учебный пример, в котором можно последовательно раскрыть работу с графическим интерфейсом, состоянием игры, диалоговыми сценами и подготовкой ресурсов. Такой выбор позволил совместить интерес к игровой тематике с задачами практики по проектированию и реализации программного обеспечения.</w:t>
+      </w:r>
+      <w:r/>
+      <w:r>
+        <w:rPr>
+          <w:lang w:val="ru-RU"/>
+        </w:rPr>
+      </w:r>
+      <w:r/>
+      <w:r>
+        <w:rPr>
+          <w:lang w:val="ru-RU"/>
+        </w:rPr>
+      </w:r>
+      <w:r/>
+      <w:r>
+        <w:rPr>
+          <w:lang w:val="ru-RU"/>
+        </w:rPr>
+      </w:r>
+      <w:r/>
+      <w:r>
+        <w:rPr>
+          <w:lang w:val="ru-RU"/>
+        </w:rPr>
       </w:r>
     </w:p>
     <w:p>
@@ -2282,17 +2255,13 @@
         <w:rPr>
           <w:lang w:val="ru-RU"/>
         </w:rPr>
-        <w:lastRenderedPageBreak/>
-        <w:t xml:space="preserve">Целью практики являлось закрепление навыков проектирования и реализации программного продукта на примере интерактивной </w:t>
-      </w:r>
-      <w:r>
-        <w:t>Java</w:t>
-      </w:r>
-      <w:r>
-        <w:rPr>
-          <w:lang w:val="ru-RU"/>
-        </w:rPr>
-        <w:t>-игры, а также изучение принципов, применимых к разработке в ООО «КОДДОТ». Для достижения цели были поставлены задачи: изучить особенности организации процесса; выполнить анализ пользовательских сценариев; определить архитектурные роли модели, представления, презентера и режиссёра сценария; реализовать игровые модули; подготовить документацию, сборку и демонстрационные материалы; сформулировать предложения по автоматизации повторяющихся операций.</w:t>
+        <w:t>Целью практики являлось закрепление навыков проектирования и реализации программного продукта на примере интерактивной Java-игры, а также изучение принципов, применимых к разработке в ООО «КОДДОТ». Для достижения цели были поставлены задачи: изучить особенности организации процесса; выполнить анализ пользовательских сценариев; определить архитектурные роли модели, представления, презентера и режиссёра сценария; реализовать игровые модули; подготовить документацию, сборку и демонстрационные материалы; сформулировать предложения по автоматизации повторяющихся операций. Перечисленные задачи определили структуру дальнейших разделов отчёта и порядок выполнения работ.</w:t>
+      </w:r>
+      <w:r/>
+      <w:r>
+        <w:rPr>
+          <w:lang w:val="ru-RU"/>
+        </w:rPr>
       </w:r>
     </w:p>
     <w:p>
@@ -2306,7 +2275,7 @@
         <w:rPr>
           <w:lang w:val="ru-RU"/>
         </w:rPr>
-        <w:t>Объектом практики является процесс разработки программных продуктов в ИТ-организации. Предметом являются методы проектирования клиентского приложения, организация исходного кода, управление ресурсами и проверка интерактивных сценариев. В работе использовались методы анализа, декомпозиции, сравнительного выбора технологий, ручного тестирования и итеративного уточнения интерфейсных решений.</w:t>
+        <w:t>Объектом практики является процесс разработки программных продуктов в ИТ-организации. Предметом являются методы проектирования клиентского приложения, организация исходного кода, управление ресурсами и проверка интерактивных сценариев. В работе использовались методы анализа, декомпозиции, сравнительного выбора технологий, ручного тестирования и итеративного уточнения интерфейсных решений. Сочетание указанных методов позволило не только получить работоспособный результат, но и обосновать принятые технические решения.</w:t>
       </w:r>
     </w:p>
     <w:p>
@@ -2324,7 +2293,7 @@
           <w:szCs w:val="28"/>
           <w:lang w:val="ru-BY"/>
         </w:rPr>
-        <w:t>Таким образом, прохождение технологической практики в формате самостоятельной разработки веб</w:t>
+        <w:t>Таким образом, прохождение технологической практики в формате самостоятельной разработки игрового приложения позволило не только закрепить полученные в университете знания, но и получить ценный опыт работы с современными подходами и инструментами, востребованными в индустрии. Выполненный проект продемонстрировал способность самостоятельно организовать рабочий процесс, принимать технические решения, адаптироваться к возникающим трудностям и доводить начатое до запускаемого результата. Полученный опыт далее используется при описании архитектуры, технологий и предложений по автоматизации.</w:t>
       </w:r>
       <w:r>
         <w:rPr>
@@ -2332,8 +2301,6 @@
           <w:szCs w:val="28"/>
           <w:lang w:val="ru-BY"/>
         </w:rPr>
-        <w:noBreakHyphen/>
-        <w:t>приложения позволило не только закрепить полученные в университете знания, но и получить ценный опыт работы с современными подходами и инструментами, востребованными в индустрии. Выполненный проект продемонстрировал мою способность самостоятельно организовать рабочий процесс, принимать технические решения, адаптироваться к возникающим трудностям и доводить начатое до результата.</w:t>
       </w:r>
     </w:p>
     <w:p>
@@ -2443,7 +2410,7 @@
         <w:rPr>
           <w:lang w:val="ru-RU"/>
         </w:rPr>
-        <w:t>Рассматриваемый аспект связан с анализом интерактивного игрового приложения. В ходе практики он анализировался не как изолированная техническая операция, а как часть целостного цикла разработки цифрового продукта. На начальном этапе были определены основные категории пользователя: игрок, который проходит сюжет и принимает решения, и разработчик, который должен быстро добавлять сцену либо исправлять её без нарушения уже работающих частей. Такой подход позволил сопоставить требования к учебному результату с реальными принципами организации работ в ИТ-компании и сделать принимаемые решения объяснимыми для пользователя и команды.</w:t>
+        <w:t>На этапе анализа предметной области интерактивное игровое приложение рассматривалось как целостный цикл разработки цифрового продукта, а не как набор изолированных экранов. Были определены две основные категории пользователей: игрок, который проходит сюжет и принимает решения, и разработчик, который должен быстро добавлять сцену либо исправлять её без нарушения уже работающих частей. Такой подход позволил сопоставить требования учебного результата с принципами организации работ в ИТ-компании и сделать принимаемые решения объяснимыми как для пользователя, так и для последующего сопровождения проекта. Для каждого требования отмечались зависимости от других модулей, чтобы изменения в диалогах, магазине или бое не разрушали уже проверенные участки. Это уточняет практическую сторону выполненной работы.</w:t>
       </w:r>
     </w:p>
     <w:p>
@@ -2457,7 +2424,7 @@
         <w:rPr>
           <w:lang w:val="ru-RU"/>
         </w:rPr>
-        <w:t>Практическая ценность работы с анализом интерактивного игрового приложения состояла в необходимости переходить от общего замысла к проверяемым действиям. Были описаны функциональные сценарии: просмотр вступления, выбор реплик, открытие магазина, покупка и экипировка предметов, переход между фазами главы, бой с противником, отображение победы или поражения, возврат к повторному прохождению. На каждом шаге фиксировались исходные данные, ожидаемый эффект, возможные ограничения и критерий готовности. Благодаря этому разработка не сводилась к набору несвязанных экранов или классов.</w:t>
+        <w:t>Практическая ценность анализа состояла в переходе от общего замысла к проверяемым действиям. Были описаны функциональные сценарии: просмотр вступления, выбор реплик, открытие магазина, покупка и экипировка предметов, переход между фазами главы, бой с противником, отображение победы или поражения, возврат к повторному прохождению. Для каждого шага фиксировались исходные данные, ожидаемый эффект, возможные ограничения и критерий готовности. Благодаря этому разработка не сводилась к набору несвязанных экранов или классов и сохраняла связность игрового процесса. Полученные выводы использовались как входные данные для проектирования архитектуры и планирования итераций реализации. Данный вывод учитывался при последующей проверке сценариев.</w:t>
       </w:r>
     </w:p>
     <w:p>
@@ -2471,14 +2438,12 @@
         <w:rPr>
           <w:lang w:val="ru-RU"/>
         </w:rPr>
-        <w:t xml:space="preserve">Особое внимание было уделено тому, чтобы решения по анализом интерактивного игрового приложения оставались поддерживаемыми при расширении проекта. На начальном этапе были определены основные категории пользователя: игрок, который проходит сюжет и принимает решения, и разработчик, который должен быстро добавлять сцену либо исправлять её без </w:t>
-      </w:r>
-      <w:r>
-        <w:rPr>
-          <w:lang w:val="ru-RU"/>
-        </w:rPr>
-        <w:lastRenderedPageBreak/>
-        <w:t>нарушения уже работающих частей. Для этого выделялись устойчивые границы модулей, использовались именованные константы и исключалось дублирование логики, которое может привести к различному поведению одинаковых игровых сцен.</w:t>
+        <w:t>Особое внимание уделялось поддерживаемости решений при дальнейшем расширении проекта. Если одинаковая логика дублируется в разных сценах, поведение начинает расходиться, а исправление одной ошибки не гарантирует исправления другой. Поэтому выделялись устойчивые границы модулей, использовались именованные константы и исключалось дублирование правил. Такой подход снизил риск появления «особых случаев», которые трудно объяснить и проверить на защите. Такой способ анализа снижает риск скрытого объёма работ, когда внешне простая сцена требует непропорционально большого числа правок в разных классах. Отмеченное требование сохранялось на всех этапах доработки.</w:t>
+      </w:r>
+      <w:r>
+        <w:rPr>
+          <w:lang w:val="ru-RU"/>
+        </w:rPr>
       </w:r>
     </w:p>
     <w:p>
@@ -2492,7 +2457,7 @@
         <w:rPr>
           <w:lang w:val="ru-RU"/>
         </w:rPr>
-        <w:t>Проверка выбранного решения выполнялась на сценариях, близких к пользовательским: запуск приложения, чтение диалога, покупка предмета, переход к главе, бой, повтор прохождения после поражения. Были описаны функциональные сценарии: просмотр вступления, выбор реплик, открытие магазина, покупка и экипировка предметов, переход между фазами главы, бой с противником, отображение победы или поражения, возврат к повторному прохождению. Такой порядок выявлял не только ошибки вычислений, но и дефекты связности интерфейса, темпа повествования и сохранения состояния.</w:t>
+        <w:t>Проверка выбранных решений выполнялась на сценариях, близких к пользовательским: запуск приложения, чтение диалога, покупка предмета, переход к главе, бой, повтор прохождения после поражения. Именно сквозной проход выявлял не только ошибки вычислений, но и дефекты связности интерфейса, темпа повествования и сохранения состояния. Для визуальной новеллы и магазина такие проверки оказались особенно важны, поскольку формально корректный обработчик может открыть сцену, но сделать её неудобной для чтения или взаимодействия. Критерии приёмки формулировались в терминах наблюдаемого поведения пользователя, а не только в терминах наличия отдельных классов или файлов. Указанный критерий применялся при оценке готовности результата.</w:t>
       </w:r>
     </w:p>
     <w:p>
@@ -2506,7 +2471,7 @@
         <w:rPr>
           <w:lang w:val="ru-RU"/>
         </w:rPr>
-        <w:t>В результате проработка анализом интерактивного игрового приложения дала основание для следующего этапа работы. Сформированный перечень требований стал основой для декомпозиции работ и минимального набора критериев приёмки каждой сцены. Полученный опыт важен и в контексте деятельности ООО «КОДДОТ»: при создании веб-, мобильных и игровых решений одинаково значимы декомпозиция, прозрачное взаимодействие компонентов и регулярная демонстрация промежуточного результата.</w:t>
+        <w:t>В результате анализа был сформирован перечень требований, ставший основой для декомпозиции работ и минимального набора критериев приёмки каждой сцены. Полученный опыт важен и в контексте деятельности ООО «КОДДОТ»: при создании веб-, мобильных и игровых решений одинаково значимы декомпозиция, прозрачное взаимодействие компонентов и регулярная демонстрация промежуточного результата. Сформированные требования непосредственно использовались на этапах проектирования и реализации.</w:t>
       </w:r>
     </w:p>
     <w:p>
@@ -2520,14 +2485,12 @@
         <w:rPr>
           <w:lang w:val="ru-RU"/>
         </w:rPr>
-        <w:t xml:space="preserve">При принятии решений учитывалась ограниченность учебного проекта по времени и размеру команды. Поэтому приоритет отдавался понятной реализации, которую один разработчик способен воспроизвести, протестировать и объяснить на защите. На начальном этапе были определены основные категории пользователя: игрок, который проходит сюжет и принимает решения, и разработчик, который должен быстро добавлять сцену либо исправлять её без нарушения уже работающих частей. Это не исключало </w:t>
-      </w:r>
-      <w:r>
-        <w:rPr>
-          <w:lang w:val="ru-RU"/>
-        </w:rPr>
-        <w:lastRenderedPageBreak/>
-        <w:t>инженерной дисциплины, а требовало выбирать инструменты соразмерно задаче.</w:t>
+        <w:t>При принятии решений учитывалась ограниченность учебного проекта по времени и размеру команды. Поэтому приоритет отдавался понятной реализации, которую один разработчик способен воспроизвести, протестировать и объяснить на защите. Это не исключало инженерной дисциплины, а требовало выбирать инструменты и объём функциональности соразмерно задаче. В итоге анализ зафиксировал реалистичный scope первой главы и связанных модулей без попытки охватить весь возможный игровой контент сразу. Для каждого требования отмечались зависимости от других модулей, чтобы изменения в диалогах, магазине или бое не разрушали уже проверенные участки. Такая фиксация снижает вероятность повторного возникновения сходных дефектов.</w:t>
+      </w:r>
+      <w:r>
+        <w:rPr>
+          <w:lang w:val="ru-RU"/>
+        </w:rPr>
       </w:r>
     </w:p>
     <w:p>
@@ -2572,16 +2535,13 @@
         <w:rPr>
           <w:lang w:val="ru-RU"/>
         </w:rPr>
-        <w:t xml:space="preserve">– ограничения: учебный формат, локальная работа без сетевого сервиса и необходимость использования доступного набора </w:t>
-      </w:r>
-      <w:r>
-        <w:t>Java</w:t>
-      </w:r>
-      <w:r>
-        <w:rPr>
-          <w:lang w:val="ru-RU"/>
-        </w:rPr>
-        <w:t>-инструментов.</w:t>
+        <w:t>– ограничения: учебный формат, локальная работа без сетевого сервиса и необходимость использования доступного набора Java-инструментов.</w:t>
+      </w:r>
+      <w:r/>
+      <w:r>
+        <w:rPr>
+          <w:lang w:val="ru-RU"/>
+        </w:rPr>
       </w:r>
     </w:p>
     <w:p>
@@ -2629,7 +2589,7 @@
         <w:rPr>
           <w:lang w:val="ru-RU"/>
         </w:rPr>
-        <w:t>Рассматриваемый аспект связан с проектированием архитектуры. В ходе практики он анализировался не как изолированная техническая операция, а как часть целостного цикла разработки цифрового продукта. Была выбрана архитектура с разделением ответственности между моделью, представлением, презентером и директором сценария. Она особенно уместна для игры, где внешний вид сцены постоянно меняется, а правила переходов и расчётов не должны располагаться в обработчиках кнопок. Такой подход позволил сопоставить требования к учебному результату с реальными принципами организации работ в ИТ-компании и сделать принимаемые решения объяснимыми для пользователя и команды.</w:t>
+        <w:t>На этапе проектирования была выбрана архитектура с разделением ответственности между моделью, представлением, презентером и директором сценария. Такое решение особенно уместно для игры, где внешний вид сцены постоянно меняется, а правила переходов и расчётов не должны располагаться непосредственно в обработчиках кнопок. Разделение ролей позволило сопоставить учебные требования с принципами организации работ в ИТ-компании и сделать структуру проекта объяснимой для последующей доработки. Документирование связей между компонентами позволило сохранить целостность проекта при добавлении новых экранов и ресурсов. Соответствующее ограничение учитывалось при планировании объёма работ.</w:t>
       </w:r>
     </w:p>
     <w:p>
@@ -2643,50 +2603,36 @@
         <w:rPr>
           <w:lang w:val="ru-RU"/>
         </w:rPr>
-        <w:t xml:space="preserve">Практическая ценность работы с проектированием архитектуры состояла в необходимости переходить от общего замысла к проверяемым действиям. Модель хранит устойчивое состояние: деньги, каталог, приобретённые предметы, экипировку, параметры героя и ход боя. </w:t>
-      </w:r>
-      <w:r>
-        <w:t>View</w:t>
-      </w:r>
-      <w:r>
-        <w:rPr>
-          <w:lang w:val="ru-RU"/>
-        </w:rPr>
-        <w:t xml:space="preserve"> отвечает за </w:t>
-      </w:r>
-      <w:r>
-        <w:t>Swing</w:t>
-      </w:r>
-      <w:r>
-        <w:rPr>
-          <w:lang w:val="ru-RU"/>
-        </w:rPr>
-        <w:t xml:space="preserve">-компоненты, прорисовку изображений, панелей, эффектов и получение </w:t>
-      </w:r>
-      <w:r>
-        <w:rPr>
-          <w:lang w:val="ru-RU"/>
-        </w:rPr>
-        <w:lastRenderedPageBreak/>
-        <w:t xml:space="preserve">событий. </w:t>
-      </w:r>
-      <w:r>
-        <w:t>Presenter</w:t>
-      </w:r>
-      <w:r>
-        <w:rPr>
-          <w:lang w:val="ru-RU"/>
-        </w:rPr>
-        <w:t xml:space="preserve"> преобразует действия интерфейса в операции модели, а </w:t>
-      </w:r>
-      <w:r>
-        <w:t>Director</w:t>
-      </w:r>
-      <w:r>
-        <w:rPr>
-          <w:lang w:val="ru-RU"/>
-        </w:rPr>
-        <w:t xml:space="preserve"> координирует фазы главы и последовательность сюжетных событий. На каждом шаге фиксировались исходные данные, ожидаемый эффект, возможные ограничения и критерий готовности. Благодаря этому разработка не сводилась к набору несвязанных экранов или классов.</w:t>
+        <w:t>Модель хранит устойчивое состояние: деньги, каталог, приобретённые предметы, экипировку, параметры героя и ход боя. View отвечает за Swing-компоненты, прорисовку изображений, панелей, эффектов и получение событий. Presenter преобразует действия интерфейса в операции модели, а Director координирует фазы главы и последовательность сюжетных событий. На каждом шаге проектирования фиксировались исходные данные, ожидаемый эффект и критерий готовности модуля. Благодаря этому разработка не сводилась к набору несвязанных экранов. Зависимости направлялись от интерфейса к презентеру и модели, а не наоборот, что уменьшает связанность экранов. Такая фиксация снижает вероятность повторного возникновения сходных дефектов.</w:t>
+      </w:r>
+      <w:r/>
+      <w:r>
+        <w:rPr>
+          <w:lang w:val="ru-RU"/>
+        </w:rPr>
+      </w:r>
+      <w:r/>
+      <w:r>
+        <w:rPr>
+          <w:lang w:val="ru-RU"/>
+        </w:rPr>
+      </w:r>
+      <w:r>
+        <w:rPr>
+          <w:lang w:val="ru-RU"/>
+        </w:rPr>
+      </w:r>
+      <w:r/>
+      <w:r>
+        <w:rPr>
+          <w:lang w:val="ru-RU"/>
+        </w:rPr>
+      </w:r>
+      <w:r/>
+      <w:r>
+        <w:rPr>
+          <w:lang w:val="ru-RU"/>
+        </w:rPr>
       </w:r>
     </w:p>
     <w:p>
@@ -2700,7 +2646,7 @@
         <w:rPr>
           <w:lang w:val="ru-RU"/>
         </w:rPr>
-        <w:t>Особое внимание было уделено тому, чтобы решения по проектированием архитектуры оставались поддерживаемыми при расширении проекта. Была выбрана архитектура с разделением ответственности между моделью, представлением, презентером и директором сценария. Она особенно уместна для игры, где внешний вид сцены постоянно меняется, а правила переходов и расчётов не должны располагаться в обработчиках кнопок. Для этого выделялись устойчивые границы модулей, использовались именованные константы и исключалось дублирование логики, которое может привести к различному поведению одинаковых игровых сцен.</w:t>
+        <w:t>Поддерживаемость архитектуры обеспечивалась за счёт явных границ модулей и отказа от размещения предметных правил внутри отрисовки. Если цена предмета или переход к боссу зависят от координат кнопки или конкретного файла фона, любое визуальное изменение начинает ломать логику. Выделение констант и устранение дублирования снизили вероятность того, что одинаковые игровые сцены будут вести себя по-разному. Архитектурные границы описывались так, чтобы при защите можно было объяснить роль каждого слоя на конкретном примере пользовательского действия. Сформулированное положение использовалось как ориентир при рефакторинге.</w:t>
       </w:r>
     </w:p>
     <w:p>
@@ -2714,43 +2660,31 @@
         <w:rPr>
           <w:lang w:val="ru-RU"/>
         </w:rPr>
-        <w:t xml:space="preserve">Проверка выбранного решения выполнялась на сценариях, близких к пользовательским: запуск приложения, чтение диалога, покупка предмета, переход к главе, бой, повтор прохождения после поражения. Модель хранит устойчивое состояние: деньги, каталог, приобретённые предметы, экипировку, параметры героя и ход боя. </w:t>
-      </w:r>
-      <w:r>
-        <w:t>View</w:t>
-      </w:r>
-      <w:r>
-        <w:rPr>
-          <w:lang w:val="ru-RU"/>
-        </w:rPr>
-        <w:t xml:space="preserve"> отвечает за </w:t>
-      </w:r>
-      <w:r>
-        <w:t>Swing</w:t>
-      </w:r>
-      <w:r>
-        <w:rPr>
-          <w:lang w:val="ru-RU"/>
-        </w:rPr>
-        <w:t xml:space="preserve">-компоненты, прорисовку изображений, панелей, эффектов и получение событий. </w:t>
-      </w:r>
-      <w:r>
-        <w:t>Presenter</w:t>
-      </w:r>
-      <w:r>
-        <w:rPr>
-          <w:lang w:val="ru-RU"/>
-        </w:rPr>
-        <w:t xml:space="preserve"> преобразует действия интерфейса в операции модели, а </w:t>
-      </w:r>
-      <w:r>
-        <w:t>Director</w:t>
-      </w:r>
-      <w:r>
-        <w:rPr>
-          <w:lang w:val="ru-RU"/>
-        </w:rPr>
-        <w:t xml:space="preserve"> координирует фазы главы и последовательность сюжетных событий. Такой порядок выявлял не только ошибки вычислений, но и дефекты связности интерфейса, темпа повествования и сохранения состояния.</w:t>
+        <w:t>Проверка архитектурных решений выполнялась на пользовательских сценариях: запуск, диалог, покупка, переход к главе, бой и повтор после поражения. При этом контролировалось, что действие интерфейса корректно доходит до презентера, модель обновляет состояние, а представление отображает актуальный результат. Такой порядок выявлял дефекты связности UI, темпа повествования и сохранения данных, а не только ошибки отдельных формул. Разделение ответственности облегчает локализацию дефектов: ошибка отображения не смешивается с ошибкой расчёта, а сбой перехода фазы не маскируется под проблему отрисовки. В дальнейшем это упростило объяснение принятых решений на защите. Выбранная схема согласуется с требованиями учебной практики по проектированию клиентского программного обеспечения и пригодна для дальнейшего расширения функциональности. Отмеченное требование сохранялось на всех этапах доработки.</w:t>
+      </w:r>
+      <w:r/>
+      <w:r>
+        <w:rPr>
+          <w:lang w:val="ru-RU"/>
+        </w:rPr>
+      </w:r>
+      <w:r/>
+      <w:r>
+        <w:rPr>
+          <w:lang w:val="ru-RU"/>
+        </w:rPr>
+      </w:r>
+      <w:r/>
+      <w:r>
+        <w:rPr>
+          <w:lang w:val="ru-RU"/>
+        </w:rPr>
+      </w:r>
+      <w:r/>
+      <w:r>
+        <w:rPr>
+          <w:lang w:val="ru-RU"/>
+        </w:rPr>
       </w:r>
     </w:p>
     <w:p>
@@ -2764,14 +2698,12 @@
         <w:rPr>
           <w:lang w:val="ru-RU"/>
         </w:rPr>
-        <w:t xml:space="preserve">В результате проработка проектированием архитектуры дала основание для следующего этапа работы. Архитектура снизила связанность экранов, облегчила тестирование правил и сделала добавление альтернативных </w:t>
-      </w:r>
-      <w:r>
-        <w:rPr>
-          <w:lang w:val="ru-RU"/>
-        </w:rPr>
-        <w:lastRenderedPageBreak/>
-        <w:t>представлений возможным без переписывания предметной логики. Полученный опыт важен и в контексте деятельности ООО «КОДДОТ»: при создании веб-, мобильных и игровых решений одинаково значимы декомпозиция, прозрачное взаимодействие компонентов и регулярная демонстрация промежуточного результата.</w:t>
+        <w:t>В результате проектирование снизило связанность экранов, облегчило проверку правил и сделало возможным добавление альтернативных представлений без переписывания предметной логики. Полученный опыт важен и в контексте деятельности ООО «КОДДОТ»: при создании веб-, мобильных и игровых решений одинаково значимы декомпозиция, прозрачное взаимодействие компонентов и регулярная демонстрация промежуточного результата. Выбранная схема согласуется с требованиями учебной практики по проектированию клиентского программного обеспечения и пригодна для дальнейшего расширения функциональности. Это уточняет практическую сторону выполненной работы.</w:t>
+      </w:r>
+      <w:r>
+        <w:rPr>
+          <w:lang w:val="ru-RU"/>
+        </w:rPr>
       </w:r>
     </w:p>
     <w:p>
@@ -2785,7 +2717,7 @@
         <w:rPr>
           <w:lang w:val="ru-RU"/>
         </w:rPr>
-        <w:t>При принятии решений учитывалась ограниченность учебного проекта по времени и размеру команды. Поэтому приоритет отдавался понятной реализации, которую один разработчик способен воспроизвести, протестировать и объяснить на защите. Была выбрана архитектура с разделением ответственности между моделью, представлением, презентером и директором сценария. Она особенно уместна для игры, где внешний вид сцены постоянно меняется, а правила переходов и расчётов не должны располагаться в обработчиках кнопок. Это не исключало инженерной дисциплины, а требовало выбирать инструменты соразмерно задаче.</w:t>
+        <w:t>С учётом ограниченности учебного проекта приоритет отдавался схеме, которую один разработчик способен удержать, воспроизвести и объяснить на защите. Выбранная архитектура model–view–presenter с директором сценария соответствует этой цели: она достаточно строгая для порядка в коде и достаточно простая для сопровождения в рамках первой игровой главы. Документирование связей между компонентами позволило сохранить целостность проекта при добавлении новых экранов и ресурсов. Данный вывод учитывался при последующей проверке сценариев. Зависимости направлялись от интерфейса к презентеру и модели, а не наоборот, что уменьшает связанность экранов. Соответствующее ограничение учитывалось при планировании объёма работ.</w:t>
       </w:r>
     </w:p>
     <w:p>
@@ -2880,8 +2812,7 @@
         <w:rPr>
           <w:lang w:val="ru-RU"/>
         </w:rPr>
-        <w:lastRenderedPageBreak/>
-        <w:t>При проектировании границ использовался принцип направленности зависимостей: интерфейс может знать о контрактах презентера, но правило покупки не должно зависеть от конкретного размещения кнопки. Аналогично, глава не должна содержать пиксельные координаты отрисовки. Такое разделение не является избыточной формальностью: оно защищает проект от ситуации, когда изменение фоновой иллюстрации приводит к ошибке в расчёте стоимости или переходе к боссу.</w:t>
+        <w:t>При проектировании границ использовался принцип направленности зависимостей: интерфейс может знать о контрактах презентера, но правило покупки не должно зависеть от конкретного размещения кнопки. Аналогично, глава не должна содержать пиксельные координаты отрисовки. Такое разделение не является избыточной формальностью: оно защищает проект от ситуации, когда изменение фоновой иллюстрации приводит к ошибке в расчёте стоимости или переходе к боссу. Данный принцип последовательно применялся при реализации магазина, диалоговых сцен и боевой последовательности.</w:t>
       </w:r>
     </w:p>
     <w:p>
@@ -2895,25 +2826,19 @@
         <w:rPr>
           <w:lang w:val="ru-RU"/>
         </w:rPr>
-        <w:t xml:space="preserve">Компоненты, отвечающие за анимацию, были вынесены в отдельные классы. Переиспользуемые функции плавности </w:t>
-      </w:r>
-      <w:r>
-        <w:t>IntroEasing</w:t>
-      </w:r>
-      <w:r>
-        <w:rPr>
-          <w:lang w:val="ru-RU"/>
-        </w:rPr>
-        <w:t xml:space="preserve"> применяются в заставке, появлении элементов магазина и эффектах боевой сцены. Это делает движение элементов согласованным визуально и исключает копирование близких математических формул по разным экранам. Для ресурсов курсора выделен централизованный набор </w:t>
-      </w:r>
-      <w:r>
-        <w:t>MenuCursorPaths</w:t>
-      </w:r>
-      <w:r>
-        <w:rPr>
-          <w:lang w:val="ru-RU"/>
-        </w:rPr>
-        <w:t>, что устраняет расхождение строковых путей.</w:t>
+        <w:t>Компоненты, отвечающие за анимацию, были вынесены в отдельные классы. Переиспользуемые функции плавности IntroEasing применяются в заставке, появлении элементов магазина и эффектах боевой сцены. Это делает движение элементов согласованным визуально и исключает копирование близких математических формул по разным экранам. Для ресурсов курсора выделен централизованный набор MenuCursorPaths, что устраняет расхождение строковых путей и упрощает последующие правки интерфейса.</w:t>
+      </w:r>
+      <w:r/>
+      <w:r>
+        <w:rPr>
+          <w:lang w:val="ru-RU"/>
+        </w:rPr>
+      </w:r>
+      <w:r/>
+      <w:r>
+        <w:rPr>
+          <w:lang w:val="ru-RU"/>
+        </w:rPr>
       </w:r>
     </w:p>
     <w:p>
@@ -2966,23 +2891,18 @@
         <w:rPr>
           <w:lang w:val="ru-RU"/>
         </w:rPr>
-        <w:t xml:space="preserve">Рассматриваемый аспект связан с итеративной реализацией. В ходе практики он анализировался не как изолированная техническая операция, а как часть целостного цикла разработки цифрового продукта. Разработка велась короткими самостоятельными итерациями, близкими по смыслу к </w:t>
-      </w:r>
-      <w:r>
-        <w:t>Agile</w:t>
-      </w:r>
-      <w:r>
-        <w:rPr>
-          <w:lang w:val="ru-RU"/>
-        </w:rPr>
-        <w:t>-подходу. Каждая итерация завершалась работающим вертикальным срезом: например, не только созданием панели магазина, но и возможностью открыть её, выбрать позицию, увидеть стоимость, подтвердить покупку и вернуться в игровую последовательность. Такой подход позволил сопоставить требования к учебному результату с реальными принципами организации работ в ИТ-</w:t>
-      </w:r>
-      <w:r>
-        <w:rPr>
-          <w:lang w:val="ru-RU"/>
-        </w:rPr>
-        <w:lastRenderedPageBreak/>
-        <w:t>компании и сделать принимаемые решения объяснимыми для пользователя и команды.</w:t>
+        <w:t>Реализация велась короткими самостоятельными итерациями, близкими по смыслу к Agile-подходу. Каждая итерация завершалась работающим вертикальным срезом: например, не только созданием панели магазина, но и возможностью открыть её, выбрать позицию, увидеть стоимость, подтвердить покупку и вернуться в игровую последовательность. Такой порядок позволил регулярно сопоставлять учебный результат с принципами работы ИТ-компании и своевременно корректировать приоритеты. При возникновении дефектов сначала воспроизводился сценарий целиком, затем локализовался слой, в котором нарушалось ожидаемое поведение. Отмеченное требование сохранялось на всех этапах доработки. Такой порядок соответствует дисциплине разработки MVP и снижает накопление непроверенных изменений. Такая фиксация снижает вероятность повторного возникновения сходных дефектов.</w:t>
+      </w:r>
+      <w:r/>
+      <w:r>
+        <w:rPr>
+          <w:lang w:val="ru-RU"/>
+        </w:rPr>
+      </w:r>
+      <w:r>
+        <w:rPr>
+          <w:lang w:val="ru-RU"/>
+        </w:rPr>
       </w:r>
     </w:p>
     <w:p>
@@ -2996,7 +2916,7 @@
         <w:rPr>
           <w:lang w:val="ru-RU"/>
         </w:rPr>
-        <w:t>Практическая ценность работы с итеративной реализацией состояла в необходимости переходить от общего замысла к проверяемым действиям. Список задач группировался по пользовательскому эффекту, а не только по техническим папкам: вступление, магазин, фаза главы, бой, демонстрационная сборка. Внутри каждой группы отдельно планировались модель, интерфейс, подключение ресурсов и проверка крайних случаев. На каждом шаге фиксировались исходные данные, ожидаемый эффект, возможные ограничения и критерий готовности. Благодаря этому разработка не сводилась к набору несвязанных экранов или классов.</w:t>
+        <w:t>Список задач группировался по пользовательскому эффекту, а не только по техническим папкам: вступление, магазин, фаза главы, бой, демонстрационная сборка. Внутри каждой группы отдельно планировались модель, интерфейс, подключение ресурсов и проверка крайних случаев. На каждом шаге фиксировались исходные данные, ожидаемый эффект, возможные ограничения и критерий готовности. Благодаря этому разработка сохраняла связность и не превращалась в набор незавершённых классов. Такой порядок соответствует дисциплине разработки MVP и снижает накопление непроверенных изменений. Указанный критерий применялся при оценке готовности результата.</w:t>
       </w:r>
     </w:p>
     <w:p>
@@ -3010,16 +2930,13 @@
         <w:rPr>
           <w:lang w:val="ru-RU"/>
         </w:rPr>
-        <w:t xml:space="preserve">Особое внимание было уделено тому, чтобы решения по итеративной реализацией оставались поддерживаемыми при расширении проекта. Разработка велась короткими самостоятельными итерациями, близкими по смыслу к </w:t>
-      </w:r>
-      <w:r>
-        <w:t>Agile</w:t>
-      </w:r>
-      <w:r>
-        <w:rPr>
-          <w:lang w:val="ru-RU"/>
-        </w:rPr>
-        <w:t>-подходу. Каждая итерация завершалась работающим вертикальным срезом: например, не только созданием панели магазина, но и возможностью открыть её, выбрать позицию, увидеть стоимость, подтвердить покупку и вернуться в игровую последовательность. Для этого выделялись устойчивые границы модулей, использовались именованные константы и исключалось дублирование логики, которое может привести к различному поведению одинаковых игровых сцен.</w:t>
+        <w:t>В ходе реализации особое внимание уделялось поддерживаемости: использовались именованные константы, устранялось дублирование логики и сохранялись границы модулей. Итерационный подход помогал не накапливать большой объём непроверенного кода. Если одинаковые правила копировались между сценами, поведение начинало расходиться, поэтому такие места пересматривались сразу после появления рабочего сценария. Регулярные запуски приложения позволяли раньше обнаруживать ошибки интеграции между модулями. Соответствующее ограничение учитывалось при планировании объёма работ. В процессе реализации контролировалась согласованность состояния модели и визуального представления после каждого значимого действия пользователя. В дальнейшем это упростило объяснение принятых решений на защите.</w:t>
+      </w:r>
+      <w:r/>
+      <w:r>
+        <w:rPr>
+          <w:lang w:val="ru-RU"/>
+        </w:rPr>
       </w:r>
     </w:p>
     <w:p>
@@ -3033,14 +2950,12 @@
         <w:rPr>
           <w:lang w:val="ru-RU"/>
         </w:rPr>
-        <w:t xml:space="preserve">Проверка выбранного решения выполнялась на сценариях, близких к пользовательским: запуск приложения, чтение диалога, покупка предмета, переход к главе, бой, повтор прохождения после поражения. Список задач группировался по пользовательскому эффекту, а не только по техническим папкам: вступление, магазин, фаза главы, бой, демонстрационная сборка. Внутри каждой группы отдельно планировались модель, интерфейс, </w:t>
-      </w:r>
-      <w:r>
-        <w:rPr>
-          <w:lang w:val="ru-RU"/>
-        </w:rPr>
-        <w:lastRenderedPageBreak/>
-        <w:t>подключение ресурсов и проверка крайних случаев. Такой порядок выявлял не только ошибки вычислений, но и дефекты связности интерфейса, темпа повествования и сохранения состояния.</w:t>
+        <w:t>После каждой существенной порции изменений выполнялась проверка пользовательских сценариев: запуск, диалог, покупка, переход к главе, бой, повтор после поражения. Параллельно контролировались крайние случаи внутри модулей — повторное открытие экранов, недостаток средств, уже экипированный предмет. Такой порядок выявлял дефекты интеграции раньше, чем они становились дорогостоящими для исправления. В процессе реализации контролировалась согласованность состояния модели и визуального представления после каждого значимого действия пользователя. Такая фиксация снижает вероятность повторного возникновения сходных дефектов.</w:t>
+      </w:r>
+      <w:r>
+        <w:rPr>
+          <w:lang w:val="ru-RU"/>
+        </w:rPr>
       </w:r>
     </w:p>
     <w:p>
@@ -3054,7 +2969,7 @@
         <w:rPr>
           <w:lang w:val="ru-RU"/>
         </w:rPr>
-        <w:t>В результате проработка итеративной реализацией дала основание для следующего этапа работы. Такой порядок позволил регулярно запускать проект и обнаруживать проблемы интеграции до накопления большого объёма незавершённого кода. Полученный опыт важен и в контексте деятельности ООО «КОДДОТ»: при создании веб-, мобильных и игровых решений одинаково значимы декомпозиция, прозрачное взаимодействие компонентов и регулярная демонстрация промежуточного результата.</w:t>
+        <w:t>В результате регулярные запуски проекта позволили обнаруживать проблемы интеграции до накопления большого объёма незавершённого кода. Полученный опыт важен и в контексте деятельности ООО «КОДДОТ»: при создании веб-, мобильных и игровых решений одинаково значимы декомпозиция, прозрачное взаимодействие компонентов и регулярная демонстрация промежуточного результата. Итерации планировались так, чтобы к концу шага можно было показать законченный пользовательский эффект, а не только промежуточный технический фрагмент. Сформулированное положение использовалось как ориентир при рефакторинге.</w:t>
       </w:r>
     </w:p>
     <w:p>
@@ -3068,16 +2983,13 @@
         <w:rPr>
           <w:lang w:val="ru-RU"/>
         </w:rPr>
-        <w:t xml:space="preserve">При принятии решений учитывалась ограниченность учебного проекта по времени и размеру команды. Поэтому приоритет отдавался понятной реализации, которую один разработчик способен воспроизвести, протестировать и объяснить на защите. Разработка велась короткими самостоятельными итерациями, близкими по смыслу к </w:t>
-      </w:r>
-      <w:r>
-        <w:t>Agile</w:t>
-      </w:r>
-      <w:r>
-        <w:rPr>
-          <w:lang w:val="ru-RU"/>
-        </w:rPr>
-        <w:t>-подходу. Каждая итерация завершалась работающим вертикальным срезом: например, не только созданием панели магазина, но и возможностью открыть её, выбрать позицию, увидеть стоимость, подтвердить покупку и вернуться в игровую последовательность. Это не исключало инженерной дисциплины, а требовало выбирать инструменты соразмерно задаче.</w:t>
+        <w:t>Ограниченность по времени и составу команды требовала выбирать объём работ, который реально можно довести до демонстрации и объяснить на защите. Поэтому каждая итерация завершалась именно вертикальным срезом, а не набором частично готовых экранов. Такой подход сохранил инженерную дисциплину и одновременно сделал прогресс проекта наглядным. При возникновении дефектов сначала воспроизводился сценарий целиком, затем локализовался слой, в котором нарушалось ожидаемое поведение. В дальнейшем это упростило объяснение принятых решений на защите. Такой порядок соответствует дисциплине разработки MVP и снижает накопление непроверенных изменений. Отмеченное требование сохранялось на всех этапах доработки.</w:t>
+      </w:r>
+      <w:r/>
+      <w:r>
+        <w:rPr>
+          <w:lang w:val="ru-RU"/>
+        </w:rPr>
       </w:r>
     </w:p>
     <w:p>
@@ -3091,32 +3003,24 @@
         <w:rPr>
           <w:lang w:val="ru-RU"/>
         </w:rPr>
-        <w:t xml:space="preserve">В рамках рефакторинга были удалены неиспользуемые ветви и устаревшие фрагменты кода, заменены повторяющиеся литералы на именованные константы, а общие операции сгруппированы в небольшие классы с одной ответственностью. Повторное использование </w:t>
-      </w:r>
-      <w:r>
-        <w:t>IntroEasing</w:t>
-      </w:r>
-      <w:r>
-        <w:rPr>
-          <w:lang w:val="ru-RU"/>
-        </w:rPr>
-        <w:t xml:space="preserve"> и </w:t>
-      </w:r>
-      <w:r>
-        <w:t>MenuCursorPaths</w:t>
-      </w:r>
-      <w:r>
-        <w:rPr>
-          <w:lang w:val="ru-RU"/>
-        </w:rPr>
-        <w:t xml:space="preserve"> служит практическим примером того, как небольшая централизация снижает стоимость последующих изменений. Рефакторинг </w:t>
-      </w:r>
-      <w:r>
-        <w:rPr>
-          <w:lang w:val="ru-RU"/>
-        </w:rPr>
-        <w:lastRenderedPageBreak/>
-        <w:t>проводился после появления работающего поведения, чтобы не потерять связь между улучшением структуры и реальным сценарием игрока.</w:t>
+        <w:t>В рамках рефакторинга были удалены неиспользуемые ветви и устаревшие фрагменты кода, заменены повторяющиеся литералы на именованные константы, а общие операции сгруппированы в небольшие классы с одной ответственностью. Повторное использование IntroEasing и MenuCursorPaths служит практическим примером того, как небольшая централизация снижает стоимость последующих изменений. Рефакторинг проводился после появления работающего поведения, чтобы не потерять связь между улучшением структуры и реальным сценарием игрока.</w:t>
+      </w:r>
+      <w:r/>
+      <w:r>
+        <w:rPr>
+          <w:lang w:val="ru-RU"/>
+        </w:rPr>
+      </w:r>
+      <w:r/>
+      <w:r>
+        <w:rPr>
+          <w:lang w:val="ru-RU"/>
+        </w:rPr>
+      </w:r>
+      <w:r>
+        <w:rPr>
+          <w:lang w:val="ru-RU"/>
+        </w:rPr>
       </w:r>
     </w:p>
     <w:p>
@@ -3183,7 +3087,7 @@
         <w:rPr>
           <w:lang w:val="ru-RU"/>
         </w:rPr>
-        <w:t>Рассматриваемый аспект связан с документированием и контролем качества. В ходе практики он анализировался не как изолированная техническая операция, а как часть целостного цикла разработки цифрового продукта. Документирование сопровождало работу с самого начала: фиксировались назначение пакетов, сценарии переходов, состав ресурсов, параметры запуска и принятые ограничения. Для небольшого проекта такой набор полезнее тяжёлой формальной документации, поскольку остаётся актуальным при изменении сцен. Такой подход позволил сопоставить требования к учебному результату с реальными принципами организации работ в ИТ-компании и сделать принимаемые решения объяснимыми для пользователя и команды.</w:t>
+        <w:t>Документирование сопровождало работу с самого начала: фиксировались назначение пакетов, сценарии переходов, состав ресурсов, параметры запуска и принятые ограничения. Для небольшого проекта такой набор полезнее тяжёлой формальной документации, поскольку остаётся актуальным при изменении сцен. Документация рассматривалась как часть целостного цикла разработки, а не как отдельная бюрократическая процедура. Такой порядок соответствует дисциплине разработки MVP и снижает накопление непроверенных изменений. Такая фиксация снижает вероятность повторного возникновения сходных дефектов. Регулярные запуски приложения позволяли раньше обнаруживать ошибки интеграции между модулями. Это уточняет практическую сторону выполненной работы.</w:t>
       </w:r>
     </w:p>
     <w:p>
@@ -3197,14 +3101,12 @@
         <w:rPr>
           <w:lang w:val="ru-RU"/>
         </w:rPr>
-        <w:t xml:space="preserve">Практическая ценность работы с документированием и контролем качества состояла в необходимости переходить от общего замысла к проверяемым действиям. Контроль выполнялся как сочетание просмотра исходного кода, запуска приложения и ручной проверки пользовательских путей. Отдельно проверялись повторное открытие экранов, недостаток валюты </w:t>
-      </w:r>
-      <w:r>
-        <w:rPr>
-          <w:lang w:val="ru-RU"/>
-        </w:rPr>
-        <w:lastRenderedPageBreak/>
-        <w:t>при покупке, уже экипированный предмет, проигрыш в бою, возврат к началу и корректность визуального наложения диалоговых панелей. На каждом шаге фиксировались исходные данные, ожидаемый эффект, возможные ограничения и критерий готовности. Благодаря этому разработка не сводилась к набору несвязанных экранов или классов.</w:t>
+        <w:t>Контроль качества выполнялся как сочетание просмотра исходного кода, запуска приложения и ручной проверки пользовательских путей. Отдельно проверялись повторное открытие экранов, недостаток валюты при покупке, уже экипированный предмет, проигрыш в бою, возврат к началу и корректность визуального наложения диалоговых панелей. На каждом шаге фиксировались исходные данные, ожидаемый эффект и критерий готовности. Регулярные запуски приложения позволяли раньше обнаруживать ошибки интеграции между модулями. Сформулированное положение использовалось как ориентир при рефакторинге. В процессе реализации контролировалась согласованность состояния модели и визуального представления после каждого значимого действия пользователя. Данный вывод учитывался при последующей проверке сценариев.</w:t>
+      </w:r>
+      <w:r>
+        <w:rPr>
+          <w:lang w:val="ru-RU"/>
+        </w:rPr>
       </w:r>
     </w:p>
     <w:p>
@@ -3218,7 +3120,7 @@
         <w:rPr>
           <w:lang w:val="ru-RU"/>
         </w:rPr>
-        <w:t>Особое внимание было уделено тому, чтобы решения по документированием и контролем качества оставались поддерживаемыми при расширении проекта. Документирование сопровождало работу с самого начала: фиксировались назначение пакетов, сценарии переходов, состав ресурсов, параметры запуска и принятые ограничения. Для небольшого проекта такой набор полезнее тяжёлой формальной документации, поскольку остаётся актуальным при изменении сцен. Для этого выделялись устойчивые границы модулей, использовались именованные константы и исключалось дублирование логики, которое может привести к различному поведению одинаковых игровых сцен.</w:t>
+        <w:t>Чтобы решения оставались поддерживаемыми, в документации отражались не только «как запустить», но и почему сценарий устроен именно так. Это особенно важно для путей ресурсов и фаз главы: без фиксации договорённостей легко получить расхождение между кодом и фактическим набором ассетов. Использование констант и устранение дублирования логики дополнительно снижали риск различного поведения одинаковых сцен. В процессе реализации контролировалась согласованность состояния модели и визуального представления после каждого значимого действия пользователя. В дальнейшем это упростило объяснение принятых решений на защите. Итерации планировались так, чтобы к концу шага можно было показать законченный пользовательский эффект, а не только промежуточный технический фрагмент. Отмеченное требование сохранялось на всех этапах доработки.</w:t>
       </w:r>
     </w:p>
     <w:p>
@@ -3232,7 +3134,7 @@
         <w:rPr>
           <w:lang w:val="ru-RU"/>
         </w:rPr>
-        <w:t>Проверка выбранного решения выполнялась на сценариях, близких к пользовательским: запуск приложения, чтение диалога, покупка предмета, переход к главе, бой, повтор прохождения после поражения. Контроль выполнялся как сочетание просмотра исходного кода, запуска приложения и ручной проверки пользовательских путей. Отдельно проверялись повторное открытие экранов, недостаток валюты при покупке, уже экипированный предмет, проигрыш в бою, возврат к началу и корректность визуального наложения диалоговых панелей. Такой порядок выявлял не только ошибки вычислений, но и дефекты связности интерфейса, темпа повествования и сохранения состояния.</w:t>
+        <w:t>Проверка выполнялась на пользовательских сценариях от запуска до повторного прохождения после поражения. Для визуальной новеллы ручной контроль обязателен: формально корректный обработчик может открыть сцену, но текст окажется перекрыт, фокус потеряется, а тайминг анимации сделает переход нечитаемым. Поэтому оценка интерфейса сочеталась с проверкой значений игровой модели. Итерации планировались так, чтобы к концу шага можно было показать законченный пользовательский эффект, а не только промежуточный технический фрагмент. Это уточняет практическую сторону выполненной работы. При возникновении дефектов сначала воспроизводился сценарий целиком, затем локализовался слой, в котором нарушалось ожидаемое поведение. Указанный критерий применялся при оценке готовности результата.</w:t>
       </w:r>
     </w:p>
     <w:p>
@@ -3246,14 +3148,12 @@
         <w:rPr>
           <w:lang w:val="ru-RU"/>
         </w:rPr>
-        <w:t xml:space="preserve">В результате проработка документированием и контролем качества дала основание для следующего этапа работы. Итогом стала воспроизводимая </w:t>
-      </w:r>
-      <w:r>
-        <w:rPr>
-          <w:lang w:val="ru-RU"/>
-        </w:rPr>
-        <w:lastRenderedPageBreak/>
-        <w:t>последовательность проверки, пригодная и для передачи проекта другому разработчику. Полученный опыт важен и в контексте деятельности ООО «КОДДОТ»: при создании веб-, мобильных и игровых решений одинаково значимы декомпозиция, прозрачное взаимодействие компонентов и регулярная демонстрация промежуточного результата.</w:t>
+        <w:t>Итогом стала воспроизводимая последовательность проверки, пригодная и для передачи проекта другому разработчику. Полученный опыт важен и в контексте деятельности ООО «КОДДОТ»: при создании веб-, мобильных и игровых решений одинаково значимы декомпозиция, прозрачное взаимодействие компонентов и регулярная демонстрация промежуточного результата. При возникновении дефектов сначала воспроизводился сценарий целиком, затем локализовался слой, в котором нарушалось ожидаемое поведение. Данный вывод учитывался при последующей проверке сценариев.</w:t>
+      </w:r>
+      <w:r>
+        <w:rPr>
+          <w:lang w:val="ru-RU"/>
+        </w:rPr>
       </w:r>
     </w:p>
     <w:p>
@@ -3267,7 +3167,7 @@
         <w:rPr>
           <w:lang w:val="ru-RU"/>
         </w:rPr>
-        <w:t>При принятии решений учитывалась ограниченность учебного проекта по времени и размеру команды. Поэтому приоритет отдавался понятной реализации, которую один разработчик способен воспроизвести, протестировать и объяснить на защите. Документирование сопровождало работу с самого начала: фиксировались назначение пакетов, сценарии переходов, состав ресурсов, параметры запуска и принятые ограничения. Для небольшого проекта такой набор полезнее тяжёлой формальной документации, поскольку остаётся актуальным при изменении сцен. Это не исключало инженерной дисциплины, а требовало выбирать инструменты соразмерно задаче.</w:t>
+        <w:t>С учётом ограниченности учебного проекта документировалось прежде всего то, что необходимо для запуска, сопровождения и защиты. Такой подход сохранил полезность материалов и не превратил отчётность в самоцель. Такой порядок соответствует дисциплине разработки MVP и снижает накопление непроверенных изменений. Отмеченное требование сохранялось на всех этапах доработки. Регулярные запуски приложения позволяли раньше обнаруживать ошибки интеграции между модулями. Такая фиксация снижает вероятность повторного возникновения сходных дефектов. В процессе реализации контролировалась согласованность состояния модели и визуального представления после каждого значимого действия пользователя. Это уточняет практическую сторону выполненной работы.</w:t>
       </w:r>
     </w:p>
     <w:p>
@@ -3320,7 +3220,7 @@
         <w:rPr>
           <w:lang w:val="ru-RU"/>
         </w:rPr>
-        <w:t>Рассматриваемый аспект связан с подготовкой демонстрационной версии. В ходе практики он анализировался не как изолированная техническая операция, а как часть целостного цикла разработки цифрового продукта. Демонстрационная сборка должна позволять оценить результат без погружения в исходный код. Поэтому вместе с приложением рассматриваются сценарий показа, набор ресурсов, команды запуска и порядок прохождения ключевых экранов. Такой подход позволил сопоставить требования к учебному результату с реальными принципами организации работ в ИТ-компании и сделать принимаемые решения объяснимыми для пользователя и команды.</w:t>
+        <w:t>Демонстрационная сборка должна позволять оценить результат без погружения в исходный код. Поэтому вместе с приложением рассматриваются сценарий показа, набор ресурсов, команды запуска и порядок прохождения ключевых экранов. Подготовка демо рассматривалась как часть цикла разработки, а не как действие «в последний день перед защитой». При возникновении дефектов сначала воспроизводился сценарий целиком, затем локализовался слой, в котором нарушалось ожидаемое поведение. Сформулированное положение использовалось как ориентир при рефакторинге. Такой порядок соответствует дисциплине разработки MVP и снижает накопление непроверенных изменений. Данный вывод учитывался при последующей проверке сценариев.</w:t>
       </w:r>
     </w:p>
     <w:p>
@@ -3334,26 +3234,19 @@
         <w:rPr>
           <w:lang w:val="ru-RU"/>
         </w:rPr>
-        <w:lastRenderedPageBreak/>
-        <w:t xml:space="preserve">Практическая ценность работы с подготовкой демонстрационной версии состояла в необходимости переходить от общего замысла к проверяемым действиям. Для проекта предусмотрены сценарии сборки для </w:t>
-      </w:r>
-      <w:r>
-        <w:t>Windows</w:t>
-      </w:r>
-      <w:r>
-        <w:rPr>
-          <w:lang w:val="ru-RU"/>
-        </w:rPr>
-        <w:t xml:space="preserve"> и </w:t>
-      </w:r>
-      <w:r>
-        <w:t>macOS</w:t>
-      </w:r>
-      <w:r>
-        <w:rPr>
-          <w:lang w:val="ru-RU"/>
-        </w:rPr>
-        <w:t>. Они уменьшают риск ошибок при ручном наборе команд, делают окружение запуска явным и позволяют подготовить одинаково организованную демонстрацию на разных рабочих станциях. На каждом шаге фиксировались исходные данные, ожидаемый эффект, возможные ограничения и критерий готовности. Благодаря этому разработка не сводилась к набору несвязанных экранов или классов.</w:t>
+        <w:t>Для проекта предусмотрены сценарии сборки для Windows и macOS. Они уменьшают риск ошибок при ручном наборе команд, делают окружение запуска явным и позволяют подготовить одинаково организованную демонстрацию на разных рабочих станциях. Наличие скриптов в репозитории важно тем, что порядок запуска становится проверяемым артефактом, а не знанием, которое существует только у автора. Такой порядок соответствует дисциплине разработки MVP и снижает накопление непроверенных изменений. В дальнейшем это упростило объяснение принятых решений на защите. Регулярные запуски приложения позволяли раньше обнаруживать ошибки интеграции между модулями. Отмеченное требование сохранялось на всех этапах доработки.</w:t>
+      </w:r>
+      <w:r/>
+      <w:r>
+        <w:rPr>
+          <w:lang w:val="ru-RU"/>
+        </w:rPr>
+      </w:r>
+      <w:r/>
+      <w:r>
+        <w:rPr>
+          <w:lang w:val="ru-RU"/>
+        </w:rPr>
       </w:r>
     </w:p>
     <w:p>
@@ -3367,7 +3260,7 @@
         <w:rPr>
           <w:lang w:val="ru-RU"/>
         </w:rPr>
-        <w:t>Особое внимание было уделено тому, чтобы решения по подготовкой демонстрационной версии оставались поддерживаемыми при расширении проекта. Демонстрационная сборка должна позволять оценить результат без погружения в исходный код. Поэтому вместе с приложением рассматриваются сценарий показа, набор ресурсов, команды запуска и порядок прохождения ключевых экранов. Для этого выделялись устойчивые границы модулей, использовались именованные константы и исключалось дублирование логики, которое может привести к различному поведению одинаковых игровых сцен.</w:t>
+        <w:t>Поддерживаемость демонстрации обеспечивалась фиксацией зависимостей, ресурсов и последовательности экранов. Если путь запуска не описан, на защите легко потерять время на настройку окружения. Поэтому команды сборки и запуска хранятся рядом с исходным кодом и обновляются вместе с проектом. Регулярные запуски приложения позволяли раньше обнаруживать ошибки интеграции между модулями. Это уточняет практическую сторону выполненной работы. В процессе реализации контролировалась согласованность состояния модели и визуального представления после каждого значимого действия пользователя. Указанный критерий применялся при оценке готовности результата.</w:t>
       </w:r>
     </w:p>
     <w:p>
@@ -3381,25 +3274,19 @@
         <w:rPr>
           <w:lang w:val="ru-RU"/>
         </w:rPr>
-        <w:t xml:space="preserve">Проверка выбранного решения выполнялась на сценариях, близких к пользовательским: запуск приложения, чтение диалога, покупка предмета, переход к главе, бой, повтор прохождения после поражения. Для проекта предусмотрены сценарии сборки для </w:t>
-      </w:r>
-      <w:r>
-        <w:t>Windows</w:t>
-      </w:r>
-      <w:r>
-        <w:rPr>
-          <w:lang w:val="ru-RU"/>
-        </w:rPr>
-        <w:t xml:space="preserve"> и </w:t>
-      </w:r>
-      <w:r>
-        <w:t>macOS</w:t>
-      </w:r>
-      <w:r>
-        <w:rPr>
-          <w:lang w:val="ru-RU"/>
-        </w:rPr>
-        <w:t>. Они уменьшают риск ошибок при ручном наборе команд, делают окружение запуска явным и позволяют подготовить одинаково организованную демонстрацию на разных рабочих станциях. Такой порядок выявлял не только ошибки вычислений, но и дефекты связности интерфейса, темпа повествования и сохранения состояния.</w:t>
+        <w:t>Перед показом выполнялась проверка пользовательских сценариев: запуск, диалог, покупка, переход к главе, бой и повтор после поражения. Отдельно контролировалось, что демонстрация не требует ручных «особых» действий, известных только разработчику. Такой подход выявлял проблемы подготовки среды наряду с дефектами интерфейса. В процессе реализации контролировалась согласованность состояния модели и визуального представления после каждого значимого действия пользователя. Данный вывод учитывался при последующей проверке сценариев. Итерации планировались так, чтобы к концу шага можно было показать законченный пользовательский эффект, а не только промежуточный технический фрагмент. Соответствующее ограничение учитывалось при планировании объёма работ.</w:t>
+      </w:r>
+      <w:r/>
+      <w:r>
+        <w:rPr>
+          <w:lang w:val="ru-RU"/>
+        </w:rPr>
+      </w:r>
+      <w:r/>
+      <w:r>
+        <w:rPr>
+          <w:lang w:val="ru-RU"/>
+        </w:rPr>
       </w:r>
     </w:p>
     <w:p>
@@ -3413,14 +3300,12 @@
         <w:rPr>
           <w:lang w:val="ru-RU"/>
         </w:rPr>
-        <w:t xml:space="preserve">В результате проработка подготовкой демонстрационной версии дала основание для следующего этапа работы. Подготовленный порядок запуска </w:t>
-      </w:r>
-      <w:r>
-        <w:rPr>
-          <w:lang w:val="ru-RU"/>
-        </w:rPr>
-        <w:lastRenderedPageBreak/>
-        <w:t>делает результат практики наглядным и позволяет сосредоточить защиту на архитектурных и пользовательских решениях. Полученный опыт важен и в контексте деятельности ООО «КОДДОТ»: при создании веб-, мобильных и игровых решений одинаково значимы декомпозиция, прозрачное взаимодействие компонентов и регулярная демонстрация промежуточного результата.</w:t>
+        <w:t>Подготовленный порядок запуска делает результат практики наглядным и позволяет сосредоточить защиту на архитектурных и пользовательских решениях. Полученный опыт важен и в контексте деятельности ООО «КОДДОТ»: умение быстро показать MVP является обычной рабочей необходимостью при создании веб-, мобильных и игровых решений. Итерации планировались так, чтобы к концу шага можно было показать законченный пользовательский эффект, а не только промежуточный технический фрагмент. Отмеченное требование сохранялось на всех этапах доработки.</w:t>
+      </w:r>
+      <w:r>
+        <w:rPr>
+          <w:lang w:val="ru-RU"/>
+        </w:rPr>
       </w:r>
     </w:p>
     <w:p>
@@ -3434,7 +3319,7 @@
         <w:rPr>
           <w:lang w:val="ru-RU"/>
         </w:rPr>
-        <w:t>При принятии решений учитывалась ограниченность учебного проекта по времени и размеру команды. Поэтому приоритет отдавался понятной реализации, которую один разработчик способен воспроизвести, протестировать и объяснить на защите. Демонстрационная сборка должна позволять оценить результат без погружения в исходный код. Поэтому вместе с приложением рассматриваются сценарий показа, набор ресурсов, команды запуска и порядок прохождения ключевых экранов. Это не исключало инженерной дисциплины, а требовало выбирать инструменты соразмерно задаче.</w:t>
+        <w:t>С учётом учебного формата были выбраны простые скрипты запуска, достаточные для воспроизводимой демонстрации. При дальнейшем развитии проекта их можно расширить Gradle-задачами и конвейером непрерывной интеграции, не меняя самой идеи единого понятного входа в сборку. При возникновении дефектов сначала воспроизводился сценарий целиком, затем локализовался слой, в котором нарушалось ожидаемое поведение. Указанный критерий применялся при оценке готовности результата. Такой порядок соответствует дисциплине разработки MVP и снижает накопление непроверенных изменений. Сформулированное положение использовалось как ориентир при рефакторинге.</w:t>
       </w:r>
     </w:p>
     <w:p>
@@ -3560,16 +3445,13 @@
         <w:rPr>
           <w:lang w:val="ru-RU"/>
         </w:rPr>
-        <w:t xml:space="preserve">Рассматриваемый аспект связан с выбором технологического стека. В ходе практики он анализировался не как изолированная техническая операция, а как часть целостного цикла разработки цифрового продукта. Основным языком пробного проекта выбран </w:t>
-      </w:r>
-      <w:r>
-        <w:t>Java</w:t>
-      </w:r>
-      <w:r>
-        <w:rPr>
-          <w:lang w:val="ru-RU"/>
-        </w:rPr>
-        <w:t>. Он предоставляет строгую типизацию, развитые средства объектно-ориентированного проектирования, переносимую виртуальную машину и достаточный набор библиотек для создания учебного клиентского приложения. Такой подход позволил сопоставить требования к учебному результату с реальными принципами организации работ в ИТ-компании и сделать принимаемые решения объяснимыми для пользователя и команды.</w:t>
+        <w:t>Основным языком пробного проекта выбран Java. Он предоставляет строгую типизацию, развитые средства объектно-ориентированного проектирования, переносимую виртуальную машину и достаточный набор библиотек для создания учебного клиентского приложения. Выбор стека рассматривался как часть целостного цикла разработки, а не как изолированное предпочтение «привычного языка». Такой порядок соответствует дисциплине разработки MVP и снижает накопление непроверенных изменений. Данный вывод учитывался при последующей проверке сценариев. Регулярные запуски приложения позволяли раньше обнаруживать ошибки интеграции между модулями. Соответствующее ограничение учитывалось при планировании объёма работ.</w:t>
+      </w:r>
+      <w:r/>
+      <w:r>
+        <w:rPr>
+          <w:lang w:val="ru-RU"/>
+        </w:rPr>
       </w:r>
     </w:p>
     <w:p>
@@ -3583,34 +3465,25 @@
         <w:rPr>
           <w:lang w:val="ru-RU"/>
         </w:rPr>
-        <w:t xml:space="preserve">Практическая ценность работы с выбором технологического стека состояла в необходимости переходить от общего замысла к проверяемым действиям. Для графической части применяются </w:t>
-      </w:r>
-      <w:r>
-        <w:t>Java</w:t>
-      </w:r>
-      <w:r>
-        <w:rPr>
-          <w:lang w:val="ru-RU"/>
-        </w:rPr>
-        <w:t xml:space="preserve"> </w:t>
-      </w:r>
-      <w:r>
-        <w:t>Swing</w:t>
-      </w:r>
-      <w:r>
-        <w:rPr>
-          <w:lang w:val="ru-RU"/>
-        </w:rPr>
-        <w:t xml:space="preserve"> и вспомогательные классы проекта; в отдельных частях рассматривается совместимость с </w:t>
-      </w:r>
-      <w:r>
-        <w:t>LibGDX</w:t>
-      </w:r>
-      <w:r>
-        <w:rPr>
-          <w:lang w:val="ru-RU"/>
-        </w:rPr>
-        <w:t>-подходом. Ресурсы — изображения, шрифты, звуки и конфигурационные данные — хранятся локально в структуре проекта и загружаются через централизованные точки доступа. На каждом шаге фиксировались исходные данные, ожидаемый эффект, возможные ограничения и критерий готовности. Благодаря этому разработка не сводилась к набору несвязанных экранов или классов.</w:t>
+        <w:t>Для графической части применяются Java Swing и вспомогательные классы проекта; в отдельных частях используется совместимость с LibGDX-подходом для подготовки иконок и связанных ресурсов. Изображения, шрифты, звуки и конфигурационные данные хранятся локально в структуре проекта и загружаются через централизованные точки доступа. Такой подход упростил проверку наличия ресурсов и уменьшил число разрозненных путей в коде. Регулярные запуски приложения позволяли раньше обнаруживать ошибки интеграции между модулями. Отмеченное требование сохранялось на всех этапах доработки. В процессе реализации контролировалась согласованность состояния модели и визуального представления после каждого значимого действия пользователя. Такая фиксация снижает вероятность повторного возникновения сходных дефектов.</w:t>
+      </w:r>
+      <w:r/>
+      <w:r>
+        <w:rPr>
+          <w:lang w:val="ru-RU"/>
+        </w:rPr>
+      </w:r>
+      <w:r/>
+      <w:r>
+        <w:rPr>
+          <w:lang w:val="ru-RU"/>
+        </w:rPr>
+      </w:r>
+      <w:r/>
+      <w:r>
+        <w:rPr>
+          <w:lang w:val="ru-RU"/>
+        </w:rPr>
       </w:r>
     </w:p>
     <w:p>
@@ -3624,23 +3497,18 @@
         <w:rPr>
           <w:lang w:val="ru-RU"/>
         </w:rPr>
-        <w:t xml:space="preserve">Особое внимание было уделено тому, чтобы решения по выбором технологического стека оставались поддерживаемыми при расширении проекта. Основным языком пробного проекта выбран </w:t>
-      </w:r>
-      <w:r>
-        <w:t>Java</w:t>
-      </w:r>
-      <w:r>
-        <w:rPr>
-          <w:lang w:val="ru-RU"/>
-        </w:rPr>
-        <w:t xml:space="preserve">. Он предоставляет строгую типизацию, развитые средства объектно-ориентированного проектирования, переносимую виртуальную машину и достаточный набор библиотек для </w:t>
-      </w:r>
-      <w:r>
-        <w:rPr>
-          <w:lang w:val="ru-RU"/>
-        </w:rPr>
-        <w:lastRenderedPageBreak/>
-        <w:t>создания учебного клиентского приложения. Для этого выделялись устойчивые границы модулей, использовались именованные константы и исключалось дублирование логики, которое может привести к различному поведению одинаковых игровых сцен.</w:t>
+        <w:t>При выборе технологий учитывалась поддерживаемость решения: подключение зависимости должно быть объяснимо задачей, а не модой. Java позволила сосредоточиться на архитектуре и поведении игры без чрезмерной зависимости от тяжёлой среды разработки. Именованные константы и единые точки загрузки ресурсов дополнительно снизили риск расхождения поведения одинаковых сцен. В процессе реализации контролировалась согласованность состояния модели и визуального представления после каждого значимого действия пользователя. Указанный критерий применялся при оценке готовности результата.</w:t>
+      </w:r>
+      <w:r/>
+      <w:r>
+        <w:rPr>
+          <w:lang w:val="ru-RU"/>
+        </w:rPr>
+      </w:r>
+      <w:r>
+        <w:rPr>
+          <w:lang w:val="ru-RU"/>
+        </w:rPr>
       </w:r>
     </w:p>
     <w:p>
@@ -3654,34 +3522,25 @@
         <w:rPr>
           <w:lang w:val="ru-RU"/>
         </w:rPr>
-        <w:t xml:space="preserve">Проверка выбранного решения выполнялась на сценариях, близких к пользовательским: запуск приложения, чтение диалога, покупка предмета, переход к главе, бой, повтор прохождения после поражения. Для графической части применяются </w:t>
-      </w:r>
-      <w:r>
-        <w:t>Java</w:t>
-      </w:r>
-      <w:r>
-        <w:rPr>
-          <w:lang w:val="ru-RU"/>
-        </w:rPr>
-        <w:t xml:space="preserve"> </w:t>
-      </w:r>
-      <w:r>
-        <w:t>Swing</w:t>
-      </w:r>
-      <w:r>
-        <w:rPr>
-          <w:lang w:val="ru-RU"/>
-        </w:rPr>
-        <w:t xml:space="preserve"> и вспомогательные классы проекта; в отдельных частях рассматривается совместимость с </w:t>
-      </w:r>
-      <w:r>
-        <w:t>LibGDX</w:t>
-      </w:r>
-      <w:r>
-        <w:rPr>
-          <w:lang w:val="ru-RU"/>
-        </w:rPr>
-        <w:t>-подходом. Ресурсы — изображения, шрифты, звуки и конфигурационные данные — хранятся локально в структуре проекта и загружаются через централизованные точки доступа. Такой порядок выявлял не только ошибки вычислений, но и дефекты связности интерфейса, темпа повествования и сохранения состояния.</w:t>
+        <w:t>Проверка стека выполнялась практически: запуск приложения и проход по сценариям диалога, магазина, главы и боя. Если инструмент усложнял быстрый просмотр результата, он откладывался на этап развития. Такой порядок выявлял не только технические ошибки, но и избыточность инфраструктуры для текущего учебного scope. Итерации планировались так, чтобы к концу шага можно было показать законченный пользовательский эффект, а не только промежуточный технический фрагмент. Соответствующее ограничение учитывалось при планировании объёма работ. При возникновении дефектов сначала воспроизводился сценарий целиком, затем локализовался слой, в котором нарушалось ожидаемое поведение. В дальнейшем это упростило объяснение принятых решений на защите.</w:t>
+      </w:r>
+      <w:r/>
+      <w:r>
+        <w:rPr>
+          <w:lang w:val="ru-RU"/>
+        </w:rPr>
+      </w:r>
+      <w:r/>
+      <w:r>
+        <w:rPr>
+          <w:lang w:val="ru-RU"/>
+        </w:rPr>
+      </w:r>
+      <w:r/>
+      <w:r>
+        <w:rPr>
+          <w:lang w:val="ru-RU"/>
+        </w:rPr>
       </w:r>
     </w:p>
     <w:p>
@@ -3695,7 +3554,7 @@
         <w:rPr>
           <w:lang w:val="ru-RU"/>
         </w:rPr>
-        <w:t>В результате проработка выбором технологического стека дала основание для следующего этапа работы. Выбранный набор дал возможность сосредоточиться на архитектуре и поведении игры, не создавая чрезмерной зависимости от тяжёлой среды разработки. Полученный опыт важен и в контексте деятельности ООО «КОДДОТ»: при создании веб-, мобильных и игровых решений одинаково значимы декомпозиция, прозрачное взаимодействие компонентов и регулярная демонстрация промежуточного результата.</w:t>
+        <w:t>Выбранный набор дал возможность сосредоточиться на архитектуре и поведении игры и при этом закрыть путь от исходного кода до запускаемой демонстрации. Полученный опыт важен и в контексте деятельности ООО «КОДДОТ»: технология должна выбираться по потребности продукта, а не наоборот. При возникновении дефектов сначала воспроизводился сценарий целиком, затем локализовался слой, в котором нарушалось ожидаемое поведение. Такая фиксация снижает вероятность повторного возникновения сходных дефектов.</w:t>
       </w:r>
     </w:p>
     <w:p>
@@ -3709,23 +3568,18 @@
         <w:rPr>
           <w:lang w:val="ru-RU"/>
         </w:rPr>
-        <w:t xml:space="preserve">При принятии решений учитывалась ограниченность учебного проекта по времени и размеру команды. Поэтому приоритет отдавался понятной реализации, которую один разработчик способен воспроизвести, протестировать и объяснить на защите. Основным языком пробного проекта выбран </w:t>
-      </w:r>
-      <w:r>
-        <w:t>Java</w:t>
-      </w:r>
-      <w:r>
-        <w:rPr>
-          <w:lang w:val="ru-RU"/>
-        </w:rPr>
-        <w:t xml:space="preserve">. Он предоставляет строгую типизацию, развитые средства объектно-ориентированного проектирования, переносимую виртуальную </w:t>
-      </w:r>
-      <w:r>
-        <w:rPr>
-          <w:lang w:val="ru-RU"/>
-        </w:rPr>
-        <w:lastRenderedPageBreak/>
-        <w:t>машину и достаточный набор библиотек для создания учебного клиентского приложения. Это не исключало инженерной дисциплины, а требовало выбирать инструменты соразмерно задаче.</w:t>
+        <w:t>С учётом ограниченности учебного проекта приоритет отдавался стеку, который один разработчик способен настроить, объяснить и стабильно запускать. Java и Swing соответствуют этому требованию для пиксельного прототипа первой главы. Такой порядок соответствует дисциплине разработки MVP и снижает накопление непроверенных изменений. Сформулированное положение использовалось как ориентир при рефакторинге. Регулярные запуски приложения позволяли раньше обнаруживать ошибки интеграции между модулями. Данный вывод учитывался при последующей проверке сценариев. В процессе реализации контролировалась согласованность состояния модели и визуального представления после каждого значимого действия пользователя. Соответствующее ограничение учитывалось при планировании объёма работ.</w:t>
+      </w:r>
+      <w:r/>
+      <w:r>
+        <w:rPr>
+          <w:lang w:val="ru-RU"/>
+        </w:rPr>
+      </w:r>
+      <w:r>
+        <w:rPr>
+          <w:lang w:val="ru-RU"/>
+        </w:rPr>
       </w:r>
     </w:p>
     <w:p>
@@ -3774,22 +3628,18 @@
         </w:rPr>
       </w:pPr>
       <w:r>
-        <w:t>Java</w:t>
-      </w:r>
-      <w:r>
-        <w:rPr>
-          <w:lang w:val="ru-RU"/>
-        </w:rPr>
-        <w:t xml:space="preserve"> подходит для учебного проекта благодаря ясной структуре классов, наличию стандартных коллекций, средств обработки событий и возможности собрать приложение на разных платформах. </w:t>
-      </w:r>
-      <w:r>
-        <w:t>Swing</w:t>
-      </w:r>
-      <w:r>
-        <w:rPr>
-          <w:lang w:val="ru-RU"/>
-        </w:rPr>
-        <w:t xml:space="preserve"> был использован как контролируемый инструмент создания оконного интерфейса: он позволяет вручную размещать слои, рисовать компоненты, обрабатывать таймеры и реализовывать пиксельный стиль без обязательного освоения полного игрового движка.</w:t>
+        <w:t>Java подходит для учебного проекта благодаря ясной структуре классов, наличию стандартных коллекций, средств обработки событий и возможности собрать приложение на разных платформах. Swing был использован как контролируемый инструмент создания оконного интерфейса: он позволяет вручную размещать слои, рисовать компоненты, обрабатывать таймеры и реализовывать пиксельный стиль без обязательного освоения полного игрового движка. Это сделало внутреннее устройство клиентской части более прозрачным для анализа и защиты.</w:t>
+      </w:r>
+      <w:r>
+        <w:rPr>
+          <w:lang w:val="ru-RU"/>
+        </w:rPr>
+      </w:r>
+      <w:r/>
+      <w:r>
+        <w:rPr>
+          <w:lang w:val="ru-RU"/>
+        </w:rPr>
       </w:r>
     </w:p>
     <w:p>
@@ -3803,16 +3653,13 @@
         <w:rPr>
           <w:lang w:val="ru-RU"/>
         </w:rPr>
-        <w:t xml:space="preserve">Для проекта не требуется серверное хранилище. Состояние прохождения и каталог предметов представлены структурами в памяти и ресурсными описаниями, что соответствует задаче автономной демонстрации. При дальнейшем развитии сохранения могут быть вынесены в </w:t>
-      </w:r>
-      <w:r>
-        <w:t>JSON</w:t>
-      </w:r>
-      <w:r>
-        <w:rPr>
-          <w:lang w:val="ru-RU"/>
-        </w:rPr>
-        <w:t>-файлы или локальную базу данных, однако преждевременное добавление внешнего хранилища усложнило бы текущую учебную цель.</w:t>
+        <w:t>Для проекта не требуется серверное хранилище. Состояние прохождения и каталог предметов представлены структурами в памяти и ресурсными описаниями, что соответствует задаче автономной демонстрации. При дальнейшем развитии сохранения могут быть вынесены в JSON-файлы или локальную базу данных, однако преждевременное добавление внешнего хранилища усложнило бы текущую учебную цель и отвлекло бы от проработки интерфейсной и сценарной логики.</w:t>
+      </w:r>
+      <w:r/>
+      <w:r>
+        <w:rPr>
+          <w:lang w:val="ru-RU"/>
+        </w:rPr>
       </w:r>
     </w:p>
     <w:p>
@@ -3823,22 +3670,18 @@
         </w:rPr>
       </w:pPr>
       <w:r>
-        <w:t>LibGDX</w:t>
-      </w:r>
-      <w:r>
-        <w:rPr>
-          <w:lang w:val="ru-RU"/>
-        </w:rPr>
-        <w:t xml:space="preserve"> рассматривается как возможное направление роста, поскольку предоставляет более специализированные механизмы рендеринга, ввода и кроссплатформенной упаковки. Однако внедрение его в уже сформированный </w:t>
-      </w:r>
-      <w:r>
-        <w:t>Swing</w:t>
-      </w:r>
-      <w:r>
-        <w:rPr>
-          <w:lang w:val="ru-RU"/>
-        </w:rPr>
-        <w:t>-слой должно быть осознанным: смена фреймворка оправдана при потребности в расширенной графике или публикации на нескольких платформах, а не только ради использования более известного названия.</w:t>
+        <w:t>LibGDX рассматривается как возможное направление роста, поскольку предоставляет более специализированные механизмы рендеринга, ввода и кроссплатформенной упаковки. Однако внедрение его в уже сформированный Swing-слой должно быть осознанным: смена фреймворка оправдана при потребности в расширенной графике или публикации на нескольких платформах, а не только ради использования более известного названия. В текущей версии LibGDX применяется точечно, без полной миграции пользовательского интерфейса.</w:t>
+      </w:r>
+      <w:r>
+        <w:rPr>
+          <w:lang w:val="ru-RU"/>
+        </w:rPr>
+      </w:r>
+      <w:r/>
+      <w:r>
+        <w:rPr>
+          <w:lang w:val="ru-RU"/>
+        </w:rPr>
       </w:r>
     </w:p>
     <w:p>
@@ -3929,61 +3772,43 @@
         <w:rPr>
           <w:lang w:val="ru-RU"/>
         </w:rPr>
-        <w:t xml:space="preserve">Игровое направление ООО «КОДДОТ» может использовать </w:t>
-      </w:r>
-      <w:r>
-        <w:t>Unity</w:t>
-      </w:r>
-      <w:r>
-        <w:rPr>
-          <w:lang w:val="ru-RU"/>
-        </w:rPr>
-        <w:t xml:space="preserve"> и </w:t>
-      </w:r>
-      <w:r>
-        <w:t>C</w:t>
-      </w:r>
-      <w:r>
-        <w:rPr>
-          <w:lang w:val="ru-RU"/>
-        </w:rPr>
-        <w:t xml:space="preserve">#, поскольку </w:t>
-      </w:r>
-      <w:r>
-        <w:t>Unity</w:t>
-      </w:r>
-      <w:r>
-        <w:rPr>
-          <w:lang w:val="ru-RU"/>
-        </w:rPr>
-        <w:t xml:space="preserve"> удобен для быстрого создания сцен, 2</w:t>
-      </w:r>
-      <w:r>
-        <w:t>D</w:t>
-      </w:r>
-      <w:r>
-        <w:rPr>
-          <w:lang w:val="ru-RU"/>
-        </w:rPr>
-        <w:t>- и 3</w:t>
-      </w:r>
-      <w:r>
-        <w:t>D</w:t>
-      </w:r>
-      <w:r>
-        <w:rPr>
-          <w:lang w:val="ru-RU"/>
-        </w:rPr>
-        <w:t xml:space="preserve">-прототипов, подключения анимаций и подготовки сборок для различных устройств. В корпоративной разработке такой стек сокращает время создания визуального </w:t>
-      </w:r>
-      <w:r>
-        <w:t>MVP</w:t>
-      </w:r>
-      <w:r>
-        <w:rPr>
-          <w:lang w:val="ru-RU"/>
-        </w:rPr>
-        <w:t>, особенно когда продукт требует сложной сцены, физики, готовых инструментов дизайнера или публикации на мобильных платформах.</w:t>
+        <w:t>Игровое направление ООО «КОДДОТ» может использовать Unity и C#, поскольку Unity удобен для быстрого создания сцен, 2D- и 3D-прототипов, подключения анимаций и подготовки сборок для различных устройств. В корпоративной разработке такой стек сокращает время создания визуального MVP, особенно когда продукт требует сложной сцены, физики, готовых инструментов дизайнера или публикации на мобильных платформах. Это обстоятельство учитывалось при сравнении альтернатив для учебного проекта.</w:t>
+      </w:r>
+      <w:r/>
+      <w:r>
+        <w:rPr>
+          <w:lang w:val="ru-RU"/>
+        </w:rPr>
+      </w:r>
+      <w:r/>
+      <w:r>
+        <w:rPr>
+          <w:lang w:val="ru-RU"/>
+        </w:rPr>
+      </w:r>
+      <w:r/>
+      <w:r>
+        <w:rPr>
+          <w:lang w:val="ru-RU"/>
+        </w:rPr>
+      </w:r>
+      <w:r/>
+      <w:r>
+        <w:rPr>
+          <w:lang w:val="ru-RU"/>
+        </w:rPr>
+      </w:r>
+      <w:r/>
+      <w:r>
+        <w:rPr>
+          <w:lang w:val="ru-RU"/>
+        </w:rPr>
+      </w:r>
+      <w:r/>
+      <w:r>
+        <w:rPr>
+          <w:lang w:val="ru-RU"/>
+        </w:rPr>
       </w:r>
     </w:p>
     <w:p>
@@ -3997,70 +3822,49 @@
         <w:rPr>
           <w:lang w:val="ru-RU"/>
         </w:rPr>
-        <w:t xml:space="preserve">Вместе с тем </w:t>
-      </w:r>
-      <w:r>
-        <w:t>Unity</w:t>
-      </w:r>
-      <w:r>
-        <w:rPr>
-          <w:lang w:val="ru-RU"/>
-        </w:rPr>
-        <w:t xml:space="preserve"> не является безусловно лучшим выбором для каждого образовательного задания. Для «</w:t>
-      </w:r>
-      <w:r>
-        <w:t>The</w:t>
-      </w:r>
-      <w:r>
-        <w:rPr>
-          <w:lang w:val="ru-RU"/>
-        </w:rPr>
-        <w:t xml:space="preserve"> </w:t>
-      </w:r>
-      <w:r>
-        <w:t>Witcher</w:t>
-      </w:r>
-      <w:r>
-        <w:rPr>
-          <w:lang w:val="ru-RU"/>
-        </w:rPr>
-        <w:t xml:space="preserve">» на </w:t>
-      </w:r>
-      <w:r>
-        <w:t>Java</w:t>
-      </w:r>
-      <w:r>
-        <w:rPr>
-          <w:lang w:val="ru-RU"/>
-        </w:rPr>
-        <w:t xml:space="preserve"> ключевой ценностью было самостоятельное построение модели, интерфейсных слоёв, обработчиков событий и сценарной координации. </w:t>
-      </w:r>
-      <w:r>
-        <w:t>Swing</w:t>
-      </w:r>
-      <w:r>
-        <w:rPr>
-          <w:lang w:val="ru-RU"/>
-        </w:rPr>
-        <w:t xml:space="preserve"> позволил увидеть эти механизмы непосредственно, без значительной части скрытой инфраструктуры движка. Это делает выбранный стек обоснованным для практического проекта, не отрицая преимущества </w:t>
-      </w:r>
-      <w:r>
-        <w:t>Unity</w:t>
-      </w:r>
-      <w:r>
-        <w:rPr>
-          <w:lang w:val="ru-RU"/>
-        </w:rPr>
-        <w:t>/</w:t>
-      </w:r>
-      <w:r>
-        <w:t>C</w:t>
-      </w:r>
-      <w:r>
-        <w:rPr>
-          <w:lang w:val="ru-RU"/>
-        </w:rPr>
-        <w:t># в условиях профессионального игрового производства.</w:t>
+        <w:t>Вместе с тем Unity не является безусловно лучшим выбором для каждого образовательного задания. Для «The Witcher» на Java ключевой ценностью было самостоятельное построение модели, интерфейсных слоёв, обработчиков событий и сценарной координации. Swing позволил увидеть эти механизмы непосредственно, без значительной части скрытой инфраструктуры движка. Это делает выбранный стек обоснованным для практического проекта, не отрицая преимущества Unity/C# в условиях профессионального игрового производства.</w:t>
+      </w:r>
+      <w:r/>
+      <w:r>
+        <w:rPr>
+          <w:lang w:val="ru-RU"/>
+        </w:rPr>
+      </w:r>
+      <w:r/>
+      <w:r>
+        <w:rPr>
+          <w:lang w:val="ru-RU"/>
+        </w:rPr>
+      </w:r>
+      <w:r/>
+      <w:r>
+        <w:rPr>
+          <w:lang w:val="ru-RU"/>
+        </w:rPr>
+      </w:r>
+      <w:r/>
+      <w:r>
+        <w:rPr>
+          <w:lang w:val="ru-RU"/>
+        </w:rPr>
+      </w:r>
+      <w:r/>
+      <w:r>
+        <w:rPr>
+          <w:lang w:val="ru-RU"/>
+        </w:rPr>
+      </w:r>
+      <w:r/>
+      <w:r>
+        <w:rPr>
+          <w:lang w:val="ru-RU"/>
+        </w:rPr>
+      </w:r>
+      <w:r/>
+      <w:r>
+        <w:rPr>
+          <w:lang w:val="ru-RU"/>
+        </w:rPr>
       </w:r>
     </w:p>
     <w:p>
@@ -4074,88 +3878,61 @@
         <w:rPr>
           <w:lang w:val="ru-RU"/>
         </w:rPr>
-        <w:t xml:space="preserve">Сравнение показывает, что технологии выбираются по задаче. </w:t>
-      </w:r>
-      <w:r>
-        <w:t>Java</w:t>
-      </w:r>
-      <w:r>
-        <w:rPr>
-          <w:lang w:val="ru-RU"/>
-        </w:rPr>
-        <w:t>/</w:t>
-      </w:r>
-      <w:r>
-        <w:t>Swing</w:t>
-      </w:r>
-      <w:r>
-        <w:rPr>
-          <w:lang w:val="ru-RU"/>
-        </w:rPr>
-        <w:t xml:space="preserve"> обеспечивают прозрачность структуры и удобны для изучения архитектурных принципов. </w:t>
-      </w:r>
-      <w:r>
-        <w:t>Unity</w:t>
-      </w:r>
-      <w:r>
-        <w:rPr>
-          <w:lang w:val="ru-RU"/>
-        </w:rPr>
-        <w:t>/</w:t>
-      </w:r>
-      <w:r>
-        <w:t>C</w:t>
-      </w:r>
-      <w:r>
-        <w:rPr>
-          <w:lang w:val="ru-RU"/>
-        </w:rPr>
-        <w:t xml:space="preserve"># выигрывает при визуально насыщенном прототипировании и командной работе над игровым контентом. </w:t>
-      </w:r>
-      <w:r>
-        <w:t>React</w:t>
-      </w:r>
-      <w:r>
-        <w:rPr>
-          <w:lang w:val="ru-RU"/>
-        </w:rPr>
-        <w:t xml:space="preserve"> и </w:t>
-      </w:r>
-      <w:r>
-        <w:t>Node</w:t>
-      </w:r>
-      <w:r>
-        <w:rPr>
-          <w:lang w:val="ru-RU"/>
-        </w:rPr>
-        <w:t>.</w:t>
-      </w:r>
-      <w:r>
-        <w:t>js</w:t>
-      </w:r>
-      <w:r>
-        <w:rPr>
-          <w:lang w:val="ru-RU"/>
-        </w:rPr>
-        <w:t xml:space="preserve">, применимые в веб-направлении </w:t>
-      </w:r>
-      <w:r>
-        <w:t>Codedot</w:t>
-      </w:r>
-      <w:r>
-        <w:rPr>
-          <w:lang w:val="ru-RU"/>
-        </w:rPr>
-        <w:t xml:space="preserve">, рациональны для интерфейсов и серверных </w:t>
-      </w:r>
-      <w:r>
-        <w:t>API</w:t>
-      </w:r>
-      <w:r>
-        <w:rPr>
-          <w:lang w:val="ru-RU"/>
-        </w:rPr>
-        <w:t>, но не заменяют нативную клиентскую логику интерактивной сцены.</w:t>
+        <w:t>Сравнение показывает, что технологии выбираются по задаче. Java/Swing обеспечивают прозрачность структуры и удобны для изучения архитектурных принципов. Unity/C# выигрывает при визуально насыщенном прототипировании и командной работе над игровым контентом. React и Node.js, применимые в веб-направлении Codedot, рациональны для интерфейсов и серверных API, но не заменяют нативную клиентскую логику интерактивной сцены настольного приложения.</w:t>
+      </w:r>
+      <w:r/>
+      <w:r>
+        <w:rPr>
+          <w:lang w:val="ru-RU"/>
+        </w:rPr>
+      </w:r>
+      <w:r/>
+      <w:r>
+        <w:rPr>
+          <w:lang w:val="ru-RU"/>
+        </w:rPr>
+      </w:r>
+      <w:r/>
+      <w:r>
+        <w:rPr>
+          <w:lang w:val="ru-RU"/>
+        </w:rPr>
+      </w:r>
+      <w:r/>
+      <w:r>
+        <w:rPr>
+          <w:lang w:val="ru-RU"/>
+        </w:rPr>
+      </w:r>
+      <w:r/>
+      <w:r>
+        <w:rPr>
+          <w:lang w:val="ru-RU"/>
+        </w:rPr>
+      </w:r>
+      <w:r/>
+      <w:r>
+        <w:rPr>
+          <w:lang w:val="ru-RU"/>
+        </w:rPr>
+      </w:r>
+      <w:r/>
+      <w:r>
+        <w:rPr>
+          <w:lang w:val="ru-RU"/>
+        </w:rPr>
+      </w:r>
+      <w:r/>
+      <w:r>
+        <w:rPr>
+          <w:lang w:val="ru-RU"/>
+        </w:rPr>
+      </w:r>
+      <w:r/>
+      <w:r>
+        <w:rPr>
+          <w:lang w:val="ru-RU"/>
+        </w:rPr>
       </w:r>
     </w:p>
     <w:p>
@@ -4169,14 +3946,12 @@
         <w:rPr>
           <w:lang w:val="ru-RU"/>
         </w:rPr>
-        <w:t xml:space="preserve">Рассматриваемый аспект связан с обоснованием технологий. В ходе практики он анализировался не как изолированная техническая операция, а как часть целостного цикла разработки цифрового продукта. Для каждой зависимости и инструмента оценивались сложность подключения, полезность для функционала, переносимость и возможность объяснить решение в рамках </w:t>
-      </w:r>
-      <w:r>
-        <w:rPr>
-          <w:lang w:val="ru-RU"/>
-        </w:rPr>
-        <w:lastRenderedPageBreak/>
-        <w:t>отчёта. Такой способ выбора соответствует инженерному подходу: технология не должна появляться в проекте как самоцель. Такой подход позволил сопоставить требования к учебному результату с реальными принципами организации работ в ИТ-компании и сделать принимаемые решения объяснимыми для пользователя и команды.</w:t>
+        <w:t>Обоснование технологий выполнялось по единым критериям: сложность подключения, полезность для функционала, переносимость и возможность объяснить решение в рамках отчёта. Такой способ выбора соответствует инженерному подходу: технология не должна появляться в проекте как самоцель. Именно поэтому в учебном проекте сохранён Java-стек, а Unity рассматривается как сильная альтернатива для других типов продуктов компании. Особое внимание уделялось повторному запуску сценария: после поражения, повторной покупки или возврата к предыдущей фазе состояние должно оставаться согласованным. Указанный критерий применялся при оценке готовности результата. Ресурсы интерфейса и игровые правила связывались через явные константы и централизованные пути, чтобы исключить расхождение строковых значений. Сформулированное положение использовалось как ориентир при рефакторинге.</w:t>
+      </w:r>
+      <w:r>
+        <w:rPr>
+          <w:lang w:val="ru-RU"/>
+        </w:rPr>
       </w:r>
     </w:p>
     <w:p>
@@ -4190,7 +3965,7 @@
         <w:rPr>
           <w:lang w:val="ru-RU"/>
         </w:rPr>
-        <w:t>Практическая ценность работы с обоснованием технологий состояла в необходимости переходить от общего замысла к проверяемым действиям. Автоматизация сборки, единая загрузка ресурсов и централизованные константы уменьшают число ручных операций. Они также создают основу для будущей непрерывной интеграции, когда проект будет проверяться автоматически после изменения исходного кода. На каждом шаге фиксировались исходные данные, ожидаемый эффект, возможные ограничения и критерий готовности. Благодаря этому разработка не сводилась к набору несвязанных экранов или классов.</w:t>
+        <w:t>Автоматизация сборки, единая загрузка ресурсов и централизованные константы уменьшают число ручных операций. Они также создают основу для будущей непрерывной интеграции, когда проект будет проверяться автоматически после изменения исходного кода. Для текущего этапа практики достаточно воспроизводимых скриптов запуска; дальнейшее усложнение инфраструктуры может выполняться без пересмотра архитектуры приложения. Ресурсы интерфейса и игровые правила связывались через явные константы и централизованные пути, чтобы исключить расхождение строковых значений. Соответствующее ограничение учитывалось при планировании объёма работ.</w:t>
       </w:r>
     </w:p>
     <w:p>
@@ -4204,7 +3979,7 @@
         <w:rPr>
           <w:lang w:val="ru-RU"/>
         </w:rPr>
-        <w:t>Особое внимание было уделено тому, чтобы решения по обоснованием технологий оставались поддерживаемыми при расширении проекта. Для каждой зависимости и инструмента оценивались сложность подключения, полезность для функционала, переносимость и возможность объяснить решение в рамках отчёта. Такой способ выбора соответствует инженерному подходу: технология не должна появляться в проекте как самоцель. Для этого выделялись устойчивые границы модулей, использовались именованные константы и исключалось дублирование логики, которое может привести к различному поведению одинаковых игровых сцен.</w:t>
+        <w:t>Поддерживаемость технологического выбора обеспечивалась отказом от лишних зависимостей и фиксацией точек загрузки ресурсов. Дублирование путей и «магических» значений устранялось через константы и общие helper-классы. Это снизило риск различного поведения одинаковых сцен и упрощает передачу проекта другому исполнителю. Практическая проверка модуля выполнялась на сквозном пользовательском сценарии, включающем переход из соседних экранов. Такая фиксация снижает вероятность повторного возникновения сходных дефектов. Полученный результат фиксировался как готовый вертикальный срез, пригодный для демонстрации на защите и для дальнейшей доработки. Это уточняет практическую сторону выполненной работы.</w:t>
       </w:r>
     </w:p>
     <w:p>
@@ -4218,14 +3993,12 @@
         <w:rPr>
           <w:lang w:val="ru-RU"/>
         </w:rPr>
-        <w:t xml:space="preserve">Проверка выбранного решения выполнялась на сценариях, близких к пользовательским: запуск приложения, чтение диалога, покупка предмета, переход к главе, бой, повтор прохождения после поражения. Автоматизация сборки, единая загрузка ресурсов и централизованные константы уменьшают </w:t>
-      </w:r>
-      <w:r>
-        <w:rPr>
-          <w:lang w:val="ru-RU"/>
-        </w:rPr>
-        <w:lastRenderedPageBreak/>
-        <w:t>число ручных операций. Они также создают основу для будущей непрерывной интеграции, когда проект будет проверяться автоматически после изменения исходного кода. Такой порядок выявлял не только ошибки вычислений, но и дефекты связности интерфейса, темпа повествования и сохранения состояния.</w:t>
+        <w:t>Практическая проверка технологий сводилась к запуску и прохождению ключевых сценариев. Если сборка или загрузка ресурса давали сбой, исправление выполнялось до фиксации очередного этапа. Такой порядок выявлял проблемы среды наряду с ошибками логики и интерфейса. Полученный результат фиксировался как готовый вертикальный срез, пригодный для демонстрации на защите и для дальнейшей доработки. Сформулированное положение использовалось как ориентир при рефакторинге. При расширении функциональности сохранялись ранее принятые границы ответственности, чтобы не возвращаться к смешанной логике «всё в одном классе». Данный вывод учитывался при последующей проверке сценариев.</w:t>
+      </w:r>
+      <w:r>
+        <w:rPr>
+          <w:lang w:val="ru-RU"/>
+        </w:rPr>
       </w:r>
     </w:p>
     <w:p>
@@ -4239,7 +4012,7 @@
         <w:rPr>
           <w:lang w:val="ru-RU"/>
         </w:rPr>
-        <w:t>В результате проработка обоснованием технологий дала основание для следующего этапа работы. Сформированный стек остаётся компактным, но покрывает полный путь от исходного кода и ресурсов до запускаемой демонстрации. Полученный опыт важен и в контексте деятельности ООО «КОДДОТ»: при создании веб-, мобильных и игровых решений одинаково значимы декомпозиция, прозрачное взаимодействие компонентов и регулярная демонстрация промежуточного результата.</w:t>
+        <w:t>Сформированный стек остаётся компактным, но покрывает полный путь от исходного кода и ресурсов до запускаемой демонстрации. Полученный опыт важен и в контексте деятельности ООО «КОДДОТ»: при создании веб-, мобильных и игровых решений одинаково значимы декомпозиция, прозрачное взаимодействие компонентов и регулярная демонстрация промежуточного результата. При расширении функциональности сохранялись ранее принятые границы ответственности, чтобы не возвращаться к смешанной логике «всё в одном классе». В дальнейшем это упростило объяснение принятых решений на защите.</w:t>
       </w:r>
     </w:p>
     <w:p>
@@ -4413,25 +4186,19 @@
         <w:rPr>
           <w:lang w:val="ru-RU"/>
         </w:rPr>
-        <w:t xml:space="preserve">Рассматриваемый аспект связан с организационными средствами разработки. В ходе практики он анализировался не как изолированная техническая операция, а как часть целостного цикла разработки цифрового продукта. Для хранения исходного кода и отслеживания изменений используется </w:t>
-      </w:r>
-      <w:r>
-        <w:t>Git</w:t>
-      </w:r>
-      <w:r>
-        <w:rPr>
-          <w:lang w:val="ru-RU"/>
-        </w:rPr>
-        <w:t xml:space="preserve">, а удалённый репозиторий </w:t>
-      </w:r>
-      <w:r>
-        <w:t>GitHub</w:t>
-      </w:r>
-      <w:r>
-        <w:rPr>
-          <w:lang w:val="ru-RU"/>
-        </w:rPr>
-        <w:t xml:space="preserve"> может выступать точкой обмена, резервного хранения и публикации истории проекта. Коммиты следует связывать с законченными логическими изменениями: добавлением модуля, исправлением сценария, обновлением ресурса или рефакторингом. Такой подход позволил сопоставить требования к учебному результату с реальными принципами организации работ в ИТ-компании и сделать принимаемые решения объяснимыми для пользователя и команды.</w:t>
+        <w:t>Для хранения исходного кода и отслеживания изменений используется Git, а удалённый репозиторий GitHub может выступать точкой обмена, резервного хранения и публикации истории проекта. Коммиты связывались с законченными логическими изменениями: добавлением модуля, исправлением сценария, обновлением ресурса или рефакторингом. Такой подход сделал ход работы прозрачным и упростил возврат к стабильному состоянию при ошибках. Для модуля описывались входные данные, ожидаемый результат, возможные ограничения и способ проверки после внесения изменений. Отмеченное требование сохранялось на всех этапах доработки. Особое внимание уделялось повторному запуску сценария: после поражения, повторной покупки или возврата к предыдущей фазе состояние должно оставаться согласованным. Такая фиксация снижает вероятность повторного возникновения сходных дефектов.</w:t>
+      </w:r>
+      <w:r/>
+      <w:r>
+        <w:rPr>
+          <w:lang w:val="ru-RU"/>
+        </w:rPr>
+      </w:r>
+      <w:r/>
+      <w:r>
+        <w:rPr>
+          <w:lang w:val="ru-RU"/>
+        </w:rPr>
       </w:r>
     </w:p>
     <w:p>
@@ -4445,16 +4212,13 @@
         <w:rPr>
           <w:lang w:val="ru-RU"/>
         </w:rPr>
-        <w:t xml:space="preserve">Практическая ценность работы с организационными средствами разработки состояла в необходимости переходить от общего замысла к проверяемым действиям. Планирование строилось через краткий список задач с приоритетом пользовательского результата. Для каждого блока указывались ожидаемый эффект, зависимости и проверка готовности. В рабочих процессах компании аналогичная схема может быть реализована средствами </w:t>
-      </w:r>
-      <w:r>
-        <w:t>issue</w:t>
-      </w:r>
-      <w:r>
-        <w:rPr>
-          <w:lang w:val="ru-RU"/>
-        </w:rPr>
-        <w:t>-трекера и доски задач. На каждом шаге фиксировались исходные данные, ожидаемый эффект, возможные ограничения и критерий готовности. Благодаря этому разработка не сводилась к набору несвязанных экранов или классов.</w:t>
+        <w:t>Планирование строилось через краткий список задач с приоритетом пользовательского результата. Для каждого блока указывались ожидаемый эффект, зависимости и проверка готовности. В рабочих процессах компании аналогичная схема может быть реализована средствами issue-трекера и доски задач. Наличие явных критериев готовности не позволяло считать этап завершённым только по факту компиляции. Особое внимание уделялось повторному запуску сценария: после поражения, повторной покупки или возврата к предыдущей фазе состояние должно оставаться согласованным. Указанный критерий применялся при оценке готовности результата. Ресурсы интерфейса и игровые правила связывались через явные константы и централизованные пути, чтобы исключить расхождение строковых значений. Сформулированное положение использовалось как ориентир при рефакторинге.</w:t>
+      </w:r>
+      <w:r/>
+      <w:r>
+        <w:rPr>
+          <w:lang w:val="ru-RU"/>
+        </w:rPr>
       </w:r>
     </w:p>
     <w:p>
@@ -4468,32 +4232,24 @@
         <w:rPr>
           <w:lang w:val="ru-RU"/>
         </w:rPr>
-        <w:t xml:space="preserve">Особое внимание было уделено тому, чтобы решения по организационными средствами разработки оставались поддерживаемыми при расширении проекта. Для хранения исходного кода и отслеживания изменений используется </w:t>
-      </w:r>
-      <w:r>
-        <w:t>Git</w:t>
-      </w:r>
-      <w:r>
-        <w:rPr>
-          <w:lang w:val="ru-RU"/>
-        </w:rPr>
-        <w:t xml:space="preserve">, а удалённый репозиторий </w:t>
-      </w:r>
-      <w:r>
-        <w:t>GitHub</w:t>
-      </w:r>
-      <w:r>
-        <w:rPr>
-          <w:lang w:val="ru-RU"/>
-        </w:rPr>
-        <w:t xml:space="preserve"> может выступать точкой обмена, резервного хранения и публикации истории проекта. Коммиты следует </w:t>
-      </w:r>
-      <w:r>
-        <w:rPr>
-          <w:lang w:val="ru-RU"/>
-        </w:rPr>
-        <w:lastRenderedPageBreak/>
-        <w:t>связывать с законченными логическими изменениями: добавлением модуля, исправлением сценария, обновлением ресурса или рефакторингом. Для этого выделялись устойчивые границы модулей, использовались именованные константы и исключалось дублирование логики, которое может привести к различному поведению одинаковых игровых сцен.</w:t>
+        <w:t>Даже при одиночной разработке Git и дисциплина коммитов повышают поддерживаемость проекта. Без истории изменений легко потерять рабочую версию после крупной правки интерфейса или ресурсов. Поэтому контроль версий рассматривался как обязательная часть процесса, а не как необязательное дополнение. Ресурсы интерфейса и игровые правила связывались через явные константы и централизованные пути, чтобы исключить расхождение строковых значений. Соответствующее ограничение учитывалось при планировании объёма работ. Практическая проверка модуля выполнялась на сквозном пользовательском сценарии, включающем переход из соседних экранов. В дальнейшем это упростило объяснение принятых решений на защите.</w:t>
+      </w:r>
+      <w:r/>
+      <w:r>
+        <w:rPr>
+          <w:lang w:val="ru-RU"/>
+        </w:rPr>
+      </w:r>
+      <w:r/>
+      <w:r>
+        <w:rPr>
+          <w:lang w:val="ru-RU"/>
+        </w:rPr>
+      </w:r>
+      <w:r>
+        <w:rPr>
+          <w:lang w:val="ru-RU"/>
+        </w:rPr>
       </w:r>
     </w:p>
     <w:p>
@@ -4507,16 +4263,13 @@
         <w:rPr>
           <w:lang w:val="ru-RU"/>
         </w:rPr>
-        <w:t xml:space="preserve">Проверка выбранного решения выполнялась на сценариях, близких к пользовательским: запуск приложения, чтение диалога, покупка предмета, переход к главе, бой, повтор прохождения после поражения. Планирование строилось через краткий список задач с приоритетом пользовательского результата. Для каждого блока указывались ожидаемый эффект, зависимости и проверка готовности. В рабочих процессах компании аналогичная схема может быть реализована средствами </w:t>
-      </w:r>
-      <w:r>
-        <w:t>issue</w:t>
-      </w:r>
-      <w:r>
-        <w:rPr>
-          <w:lang w:val="ru-RU"/>
-        </w:rPr>
-        <w:t>-трекера и доски задач. Такой порядок выявлял не только ошибки вычислений, но и дефекты связности интерфейса, темпа повествования и сохранения состояния.</w:t>
+        <w:t>Перед фиксацией изменений выполнялась проверка пользовательских сценариев. Если сценарий ломался, исправление выполнялось до коммита. Такой порядок снизил число «сломанных» состояний репозитория и упростил последующий анализ истории. Практическая проверка модуля выполнялась на сквозном пользовательском сценарии, включающем переход из соседних экранов. Такая фиксация снижает вероятность повторного возникновения сходных дефектов. Полученный результат фиксировался как готовый вертикальный срез, пригодный для демонстрации на защите и для дальнейшей доработки. Это уточняет практическую сторону выполненной работы.</w:t>
+      </w:r>
+      <w:r/>
+      <w:r>
+        <w:rPr>
+          <w:lang w:val="ru-RU"/>
+        </w:rPr>
       </w:r>
     </w:p>
     <w:p>
@@ -4530,7 +4283,7 @@
         <w:rPr>
           <w:lang w:val="ru-RU"/>
         </w:rPr>
-        <w:t>В результате проработка организационными средствами разработки дала основание для следующего этапа работы. Использование этих средств формирует воспроизводимый процесс даже при одиночной работе и облегчает подключение нового участника к проекту. Полученный опыт важен и в контексте деятельности ООО «КОДДОТ»: при создании веб-, мобильных и игровых решений одинаково значимы декомпозиция, прозрачное взаимодействие компонентов и регулярная демонстрация промежуточного результата.</w:t>
+        <w:t>Использование указанных средств формирует воспроизводимый процесс даже при одиночной работе и облегчает подключение нового участника к проекту. Полученный опыт важен и в контексте деятельности ООО «КОДДОТ»: прозрачная история изменений и регулярные проверки являются базовой инженерной дисциплиной. Полученный результат фиксировался как готовый вертикальный срез, пригодный для демонстрации на защите и для дальнейшей доработки. Сформулированное положение использовалось как ориентир при рефакторинге.</w:t>
       </w:r>
     </w:p>
     <w:p>
@@ -4544,32 +4297,24 @@
         <w:rPr>
           <w:lang w:val="ru-RU"/>
         </w:rPr>
-        <w:t xml:space="preserve">При принятии решений учитывалась ограниченность учебного проекта по времени и размеру команды. Поэтому приоритет отдавался понятной реализации, которую один разработчик способен воспроизвести, протестировать и объяснить на защите. Для хранения исходного кода и отслеживания изменений используется </w:t>
-      </w:r>
-      <w:r>
-        <w:t>Git</w:t>
-      </w:r>
-      <w:r>
-        <w:rPr>
-          <w:lang w:val="ru-RU"/>
-        </w:rPr>
-        <w:t xml:space="preserve">, а удалённый репозиторий </w:t>
-      </w:r>
-      <w:r>
-        <w:t>GitHub</w:t>
-      </w:r>
-      <w:r>
-        <w:rPr>
-          <w:lang w:val="ru-RU"/>
-        </w:rPr>
-        <w:t xml:space="preserve"> </w:t>
-      </w:r>
-      <w:r>
-        <w:rPr>
-          <w:lang w:val="ru-RU"/>
-        </w:rPr>
-        <w:lastRenderedPageBreak/>
-        <w:t>может выступать точкой обмена, резервного хранения и публикации истории проекта. Коммиты следует связывать с законченными логическими изменениями: добавлением модуля, исправлением сценария, обновлением ресурса или рефакторингом. Это не исключало инженерной дисциплины, а требовало выбирать инструменты соразмерно задаче.</w:t>
+        <w:t>С учётом учебного формата организационные средства применялись в минимально достаточном объёме: без избыточных ритуалов, но с реальной пользой для контроля качества и воспроизводимости запуска. При расширении функциональности сохранялись ранее принятые границы ответственности, чтобы не возвращаться к смешанной логике «всё в одном классе». В дальнейшем это упростило объяснение принятых решений на защите. Для модуля описывались входные данные, ожидаемый результат, возможные ограничения и способ проверки после внесения изменений. Отмеченное требование сохранялось на всех этапах доработки. Особое внимание уделялось повторному запуску сценария: после поражения, повторной покупки или возврата к предыдущей фазе состояние должно оставаться согласованным. Такая фиксация снижает вероятность повторного возникновения сходных дефектов.</w:t>
+      </w:r>
+      <w:r/>
+      <w:r>
+        <w:rPr>
+          <w:lang w:val="ru-RU"/>
+        </w:rPr>
+      </w:r>
+      <w:r/>
+      <w:r>
+        <w:rPr>
+          <w:lang w:val="ru-RU"/>
+        </w:rPr>
+      </w:r>
+      <w:r>
+        <w:rPr>
+          <w:lang w:val="ru-RU"/>
+        </w:rPr>
       </w:r>
     </w:p>
     <w:p>
@@ -4583,25 +4328,19 @@
         <w:rPr>
           <w:lang w:val="ru-RU"/>
         </w:rPr>
-        <w:t xml:space="preserve">Среда разработки обеспечивает навигацию по пакетам, запуск приложения, поиск использования классов, форматирование и анализ ошибок компиляции. Для </w:t>
-      </w:r>
-      <w:r>
-        <w:t>Java</w:t>
-      </w:r>
-      <w:r>
-        <w:rPr>
-          <w:lang w:val="ru-RU"/>
-        </w:rPr>
-        <w:t xml:space="preserve">-проекта это существенно при работе с несколькими десятками классов, так как позволяет отследить связи между презентером, экраном, моделью магазина и директором главы. </w:t>
-      </w:r>
-      <w:r>
-        <w:t>IDE</w:t>
-      </w:r>
-      <w:r>
-        <w:rPr>
-          <w:lang w:val="ru-RU"/>
-        </w:rPr>
-        <w:t xml:space="preserve"> не заменяет осмысленный обзор архитектуры, но заметно ускоряет рутинные операции.</w:t>
+        <w:t>Среда разработки обеспечивает навигацию по пакетам, запуск приложения, поиск использования классов, форматирование и анализ ошибок компиляции. Для Java-проекта это существенно при работе с несколькими десятками классов, так как позволяет отследить связи между презентером, экраном, моделью магазина и директором главы. IDE не заменяет осмысленный обзор архитектуры, но заметно ускоряет рутинные операции.</w:t>
+      </w:r>
+      <w:r/>
+      <w:r>
+        <w:rPr>
+          <w:lang w:val="ru-RU"/>
+        </w:rPr>
+      </w:r>
+      <w:r/>
+      <w:r>
+        <w:rPr>
+          <w:lang w:val="ru-RU"/>
+        </w:rPr>
       </w:r>
     </w:p>
     <w:p>
@@ -4615,61 +4354,43 @@
         <w:rPr>
           <w:lang w:val="ru-RU"/>
         </w:rPr>
-        <w:t xml:space="preserve">Сценарии </w:t>
-      </w:r>
-      <w:r>
-        <w:t>Windows</w:t>
-      </w:r>
-      <w:r>
-        <w:rPr>
-          <w:lang w:val="ru-RU"/>
-        </w:rPr>
-        <w:t xml:space="preserve"> и </w:t>
-      </w:r>
-      <w:r>
-        <w:t>macOS</w:t>
-      </w:r>
-      <w:r>
-        <w:rPr>
-          <w:lang w:val="ru-RU"/>
-        </w:rPr>
-        <w:t xml:space="preserve"> используются как простые </w:t>
-      </w:r>
-      <w:r>
-        <w:t>build</w:t>
-      </w:r>
-      <w:r>
-        <w:rPr>
-          <w:lang w:val="ru-RU"/>
-        </w:rPr>
-        <w:t xml:space="preserve"> </w:t>
-      </w:r>
-      <w:r>
-        <w:t>scripts</w:t>
-      </w:r>
-      <w:r>
-        <w:rPr>
-          <w:lang w:val="ru-RU"/>
-        </w:rPr>
-        <w:t xml:space="preserve">. Их назначение — унифицировать запуск сборки, очистку временных файлов и подготовку результата. Такой уровень автоматизации понятен для учебного проекта, а в дальнейшем может быть расширен </w:t>
-      </w:r>
-      <w:r>
-        <w:t>Gradle</w:t>
-      </w:r>
-      <w:r>
-        <w:rPr>
-          <w:lang w:val="ru-RU"/>
-        </w:rPr>
-        <w:t xml:space="preserve">-задачами и </w:t>
-      </w:r>
-      <w:r>
-        <w:t>CI</w:t>
-      </w:r>
-      <w:r>
-        <w:rPr>
-          <w:lang w:val="ru-RU"/>
-        </w:rPr>
-        <w:t>-пайплайном. Важно, что команды не остаются только в памяти разработчика, а существуют как проверяемый артефакт репозитория.</w:t>
+        <w:t>Сценарии Windows и macOS используются как простые build scripts. Их назначение — унифицировать запуск сборки, очистку временных файлов и подготовку результата. Такой уровень автоматизации понятен для учебного проекта, а в дальнейшем может быть расширен Gradle-задачами и CI-пайплайном. Важно, что команды не остаются только в памяти разработчика, а существуют как проверяемый артефакт репозитория.</w:t>
+      </w:r>
+      <w:r/>
+      <w:r>
+        <w:rPr>
+          <w:lang w:val="ru-RU"/>
+        </w:rPr>
+      </w:r>
+      <w:r/>
+      <w:r>
+        <w:rPr>
+          <w:lang w:val="ru-RU"/>
+        </w:rPr>
+      </w:r>
+      <w:r/>
+      <w:r>
+        <w:rPr>
+          <w:lang w:val="ru-RU"/>
+        </w:rPr>
+      </w:r>
+      <w:r/>
+      <w:r>
+        <w:rPr>
+          <w:lang w:val="ru-RU"/>
+        </w:rPr>
+      </w:r>
+      <w:r/>
+      <w:r>
+        <w:rPr>
+          <w:lang w:val="ru-RU"/>
+        </w:rPr>
+      </w:r>
+      <w:r/>
+      <w:r>
+        <w:rPr>
+          <w:lang w:val="ru-RU"/>
+        </w:rPr>
       </w:r>
     </w:p>
     <w:p>
@@ -4683,7 +4404,7 @@
         <w:rPr>
           <w:lang w:val="ru-RU"/>
         </w:rPr>
-        <w:t>Тестирование выполнялось на уровне пользовательских сценариев и базовых правил модели. Ручная проверка особенно важна для визуальной новеллы: формально корректный обработчик может открыть сцену, но текст окажется перекрыт, фокус потеряется, а тайминг анимации сделает переход нечитабельным. Поэтому контроль интерфейса сочетался с проверкой значений игровой модели.</w:t>
+        <w:t>Тестирование выполнялось на уровне пользовательских сценариев и базовых правил модели. Ручная проверка особенно важна для визуальной новеллы: формально корректный обработчик может открыть сцену, но текст окажется перекрыт, фокус потеряется, а тайминг анимации сделает переход нечитаемым. Поэтому контроль интерфейса сочетался с проверкой значений игровой модели. Ресурсы интерфейса и игровые правила связывались через явные константы и централизованные пути, чтобы исключить расхождение строковых значений. Отмеченное требование сохранялось на всех этапах доработки.</w:t>
       </w:r>
     </w:p>
     <w:p>
@@ -4777,25 +4498,19 @@
         <w:rPr>
           <w:lang w:val="ru-RU"/>
         </w:rPr>
-        <w:t>Рассматриваемый аспект связан с пробным проектом «</w:t>
-      </w:r>
-      <w:r>
-        <w:t>The</w:t>
-      </w:r>
-      <w:r>
-        <w:rPr>
-          <w:lang w:val="ru-RU"/>
-        </w:rPr>
-        <w:t xml:space="preserve"> </w:t>
-      </w:r>
-      <w:r>
-        <w:t>Witcher</w:t>
-      </w:r>
-      <w:r>
-        <w:rPr>
-          <w:lang w:val="ru-RU"/>
-        </w:rPr>
-        <w:t>». В ходе практики он анализировался не как изолированная техническая операция, а как часть целостного цикла разработки цифрового продукта. Цель проекта — создать демонстрационную пиксельную игру с последовательной сюжетной подачей и несколькими взаимосвязанными игровыми механиками. Игрок начинает со вступительных экранов, знакомится с контекстом через реплики персонажей, получает доступ к торговой части, проходит первую главу и вступает в бой. Такой подход позволил сопоставить требования к учебному результату с реальными принципами организации работ в ИТ-компании и сделать принимаемые решения объяснимыми для пользователя и команды.</w:t>
+        <w:t>Цель проекта — создать демонстрационную пиксельную игру с последовательной сюжетной подачей и несколькими взаимосвязанными игровыми механиками. Игрок начинает со вступительных экранов, знакомится с контекстом через реплики персонажей, получает доступ к торговой части, проходит первую главу и вступает в бой. Проект рассматривался как целостный цикл, а не как набор разрозненных демонстраций отдельных экранов. Практическая проверка модуля выполнялась на сквозном пользовательском сценарии, включающем переход из соседних экранов. Данный вывод учитывался при последующей проверке сценариев. Полученный результат фиксировался как готовый вертикальный срез, пригодный для демонстрации на защите и для дальнейшей доработки. Соответствующее ограничение учитывалось при планировании объёма работ.</w:t>
+      </w:r>
+      <w:r/>
+      <w:r>
+        <w:rPr>
+          <w:lang w:val="ru-RU"/>
+        </w:rPr>
+      </w:r>
+      <w:r/>
+      <w:r>
+        <w:rPr>
+          <w:lang w:val="ru-RU"/>
+        </w:rPr>
       </w:r>
     </w:p>
     <w:p>
@@ -4809,25 +4524,19 @@
         <w:rPr>
           <w:lang w:val="ru-RU"/>
         </w:rPr>
-        <w:t>Практическая ценность работы с пробным проектом «</w:t>
-      </w:r>
-      <w:r>
-        <w:t>The</w:t>
-      </w:r>
-      <w:r>
-        <w:rPr>
-          <w:lang w:val="ru-RU"/>
-        </w:rPr>
-        <w:t xml:space="preserve"> </w:t>
-      </w:r>
-      <w:r>
-        <w:t>Witcher</w:t>
-      </w:r>
-      <w:r>
-        <w:rPr>
-          <w:lang w:val="ru-RU"/>
-        </w:rPr>
-        <w:t>» состояла в необходимости переходить от общего замысла к проверяемым действиям. Основной цикл выглядит следующим образом: запуск и заставка — визуальная новелла — выбор или подтверждение диалога — магазин и подготовка героя — фазы первой главы — бой — экран результата — повторный запуск или продолжение. Внутри цикла данные о выбранном снаряжении и состоянии должны оставаться согласованными. На каждом шаге фиксировались исходные данные, ожидаемый эффект, возможные ограничения и критерий готовности. Благодаря этому разработка не сводилась к набору несвязанных экранов или классов.</w:t>
+        <w:t>Основной цикл выглядит следующим образом: запуск и заставка — визуальная новелла — выбор или подтверждение диалога — магазин и подготовка героя — фазы первой главы — бой — экран результата — повторный запуск или продолжение. Внутри цикла данные о выбранном снаряжении и состоянии должны оставаться согласованными. Для каждого шага определялись ожидаемый эффект и критерий готовности. Полученный результат фиксировался как готовый вертикальный срез, пригодный для демонстрации на защите и для дальнейшей доработки. Отмеченное требование сохранялось на всех этапах доработки. При расширении функциональности сохранялись ранее принятые границы ответственности, чтобы не возвращаться к смешанной логике «всё в одном классе». Такая фиксация снижает вероятность повторного возникновения сходных дефектов.</w:t>
+      </w:r>
+      <w:r/>
+      <w:r>
+        <w:rPr>
+          <w:lang w:val="ru-RU"/>
+        </w:rPr>
+      </w:r>
+      <w:r/>
+      <w:r>
+        <w:rPr>
+          <w:lang w:val="ru-RU"/>
+        </w:rPr>
       </w:r>
     </w:p>
     <w:p>
@@ -4841,32 +4550,24 @@
         <w:rPr>
           <w:lang w:val="ru-RU"/>
         </w:rPr>
-        <w:t>Особое внимание было уделено тому, чтобы решения по пробным проектом «</w:t>
-      </w:r>
-      <w:r>
-        <w:t>The</w:t>
-      </w:r>
-      <w:r>
-        <w:rPr>
-          <w:lang w:val="ru-RU"/>
-        </w:rPr>
-        <w:t xml:space="preserve"> </w:t>
-      </w:r>
-      <w:r>
-        <w:t>Witcher</w:t>
-      </w:r>
-      <w:r>
-        <w:rPr>
-          <w:lang w:val="ru-RU"/>
-        </w:rPr>
-        <w:t xml:space="preserve">» оставались поддерживаемыми при расширении проекта. Цель проекта — создать демонстрационную пиксельную игру с последовательной сюжетной подачей и несколькими взаимосвязанными </w:t>
-      </w:r>
-      <w:r>
-        <w:rPr>
-          <w:lang w:val="ru-RU"/>
-        </w:rPr>
-        <w:lastRenderedPageBreak/>
-        <w:t>игровыми механиками. Игрок начинает со вступительных экранов, знакомится с контекстом через реплики персонажей, получает доступ к торговой части, проходит первую главу и вступает в бой. Для этого выделялись устойчивые границы модулей, использовались именованные константы и исключалось дублирование логики, которое может привести к различному поведению одинаковых игровых сцен.</w:t>
+        <w:t>Поддерживаемость обеспечивалась разделением сюжетной, интерфейсной и расчётной логики. Если все правила собрать в одном экранном классе, любая правка визуала начинает рисковать поломкой переходов и расчётов. Поэтому границы модулей фиксировались уже на этапе постановки функциональности. При расширении функциональности сохранялись ранее принятые границы ответственности, чтобы не возвращаться к смешанной логике «всё в одном классе». Указанный критерий применялся при оценке готовности результата. Для модуля описывались входные данные, ожидаемый результат, возможные ограничения и способ проверки после внесения изменений. Сформулированное положение использовалось как ориентир при рефакторинге.</w:t>
+      </w:r>
+      <w:r/>
+      <w:r>
+        <w:rPr>
+          <w:lang w:val="ru-RU"/>
+        </w:rPr>
+      </w:r>
+      <w:r/>
+      <w:r>
+        <w:rPr>
+          <w:lang w:val="ru-RU"/>
+        </w:rPr>
+      </w:r>
+      <w:r>
+        <w:rPr>
+          <w:lang w:val="ru-RU"/>
+        </w:rPr>
       </w:r>
     </w:p>
     <w:p>
@@ -4880,7 +4581,7 @@
         <w:rPr>
           <w:lang w:val="ru-RU"/>
         </w:rPr>
-        <w:t>Проверка выбранного решения выполнялась на сценариях, близких к пользовательским: запуск приложения, чтение диалога, покупка предмета, переход к главе, бой, повтор прохождения после поражения. Основной цикл выглядит следующим образом: запуск и заставка — визуальная новелла — выбор или подтверждение диалога — магазин и подготовка героя — фазы первой главы — бой — экран результата — повторный запуск или продолжение. Внутри цикла данные о выбранном снаряжении и состоянии должны оставаться согласованными. Такой порядок выявлял не только ошибки вычислений, но и дефекты связности интерфейса, темпа повествования и сохранения состояния.</w:t>
+        <w:t>Готовность проекта проверялась сквозным проходом по пользовательским сценариям. Отдельно контролировалась согласованность состояния после поражения и повторного входа в цикл. Такой порядок выявлял дефекты связности раньше, чем они проявлялись на защите. Для модуля описывались входные данные, ожидаемый результат, возможные ограничения и способ проверки после внесения изменений. Соответствующее ограничение учитывалось при планировании объёма работ. Особое внимание уделялось повторному запуску сценария: после поражения, повторной покупки или возврата к предыдущей фазе состояние должно оставаться согласованным. В дальнейшем это упростило объяснение принятых решений на защите.</w:t>
       </w:r>
     </w:p>
     <w:p>
@@ -4894,25 +4595,19 @@
         <w:rPr>
           <w:lang w:val="ru-RU"/>
         </w:rPr>
-        <w:t>В результате проработка пробным проектом «</w:t>
-      </w:r>
-      <w:r>
-        <w:t>The</w:t>
-      </w:r>
-      <w:r>
-        <w:rPr>
-          <w:lang w:val="ru-RU"/>
-        </w:rPr>
-        <w:t xml:space="preserve"> </w:t>
-      </w:r>
-      <w:r>
-        <w:t>Witcher</w:t>
-      </w:r>
-      <w:r>
-        <w:rPr>
-          <w:lang w:val="ru-RU"/>
-        </w:rPr>
-        <w:t>» дала основание для следующего этапа работы. Реализованный продукт демонстрирует, что даже компактная игра требует координации сюжетной, интерфейсной и расчётной логики. Полученный опыт важен и в контексте деятельности ООО «КОДДОТ»: при создании веб-, мобильных и игровых решений одинаково значимы декомпозиция, прозрачное взаимодействие компонентов и регулярная демонстрация промежуточного результата.</w:t>
+        <w:t>Реализованный продукт демонстрирует, что даже компактная игра требует координации сюжетной, интерфейсной и расчётной логики. Полученный опыт важен и в контексте деятельности ООО «КОДДОТ»: вертикальный срез с понятной демонстрацией ценен как для обучения, так и для практики подготовки MVP. Особое внимание уделялось повторному запуску сценария: после поражения, повторной покупки или возврата к предыдущей фазе состояние должно оставаться согласованным. Такая фиксация снижает вероятность повторного возникновения сходных дефектов.</w:t>
+      </w:r>
+      <w:r/>
+      <w:r>
+        <w:rPr>
+          <w:lang w:val="ru-RU"/>
+        </w:rPr>
+      </w:r>
+      <w:r/>
+      <w:r>
+        <w:rPr>
+          <w:lang w:val="ru-RU"/>
+        </w:rPr>
       </w:r>
     </w:p>
     <w:p>
@@ -4926,14 +4621,12 @@
         <w:rPr>
           <w:lang w:val="ru-RU"/>
         </w:rPr>
-        <w:t xml:space="preserve">При принятии решений учитывалась ограниченность учебного проекта по времени и размеру команды. Поэтому приоритет отдавался понятной реализации, которую один разработчик способен воспроизвести, протестировать и объяснить на защите. Цель проекта — создать </w:t>
-      </w:r>
-      <w:r>
-        <w:rPr>
-          <w:lang w:val="ru-RU"/>
-        </w:rPr>
-        <w:lastRenderedPageBreak/>
-        <w:t>демонстрационную пиксельную игру с последовательной сюжетной подачей и несколькими взаимосвязанными игровыми механиками. Игрок начинает со вступительных экранов, знакомится с контекстом через реплики персонажей, получает доступ к торговой части, проходит первую главу и вступает в бой. Это не исключало инженерной дисциплины, а требовало выбирать инструменты соразмерно задаче.</w:t>
+        <w:t>Объём функциональности удерживался в рамках того, что можно довести до стабильной демонстрации одним исполнителем. Это позволило сохранить качество основных сценариев без распыления усилий на второстепенные ветки. Ресурсы интерфейса и игровые правила связывались через явные константы и централизованные пути, чтобы исключить расхождение строковых значений. Сформулированное положение использовалось как ориентир при рефакторинге. Практическая проверка модуля выполнялась на сквозном пользовательском сценарии, включающем переход из соседних экранов. Данный вывод учитывался при последующей проверке сценариев. Полученный результат фиксировался как готовый вертикальный срез, пригодный для демонстрации на защите и для дальнейшей доработки. Соответствующее ограничение учитывалось при планировании объёма работ.</w:t>
+      </w:r>
+      <w:r>
+        <w:rPr>
+          <w:lang w:val="ru-RU"/>
+        </w:rPr>
       </w:r>
     </w:p>
     <w:p>
@@ -5169,23 +4862,18 @@
         <w:rPr>
           <w:lang w:val="ru-RU"/>
         </w:rPr>
-        <w:t xml:space="preserve">Рассматриваемый аспект связан с модулем магазина. В ходе практики он анализировался не как изолированная техническая операция, а как часть целостного цикла разработки цифрового продукта. Магазин отвечает за просмотр доступного снаряжения, визуальное представление карточек, цены, иконки, подтверждение выбора и применение эффекта предмета к герою. Каталог и правила экипировки изолированы от конкретного </w:t>
-      </w:r>
-      <w:r>
-        <w:t>Swing</w:t>
-      </w:r>
-      <w:r>
-        <w:rPr>
-          <w:lang w:val="ru-RU"/>
-        </w:rPr>
-        <w:t xml:space="preserve">-представления, поэтому цена и доступность не вычисляются непосредственно в </w:t>
-      </w:r>
-      <w:r>
-        <w:rPr>
-          <w:lang w:val="ru-RU"/>
-        </w:rPr>
-        <w:lastRenderedPageBreak/>
-        <w:t>обработчике нажатия. Такой подход позволил сопоставить требования к учебному результату с реальными принципами организации работ в ИТ-компании и сделать принимаемые решения объяснимыми для пользователя и команды.</w:t>
+        <w:t>Магазин отвечает за просмотр доступного снаряжения, визуальное представление карточек, цены, иконки, подтверждение выбора и применение эффекта предмета к герою. Каталог и правила экипировки изолированы от конкретного Swing-представления, поэтому цена и доступность не вычисляются непосредственно в обработчике нажатия. Такое решение сохраняет прозрачность модели состояния. Для модуля описывались входные данные, ожидаемый результат, возможные ограничения и способ проверки после внесения изменений. Это уточняет практическую сторону выполненной работы. Особое внимание уделялось повторному запуску сценария: после поражения, повторной покупки или возврата к предыдущей фазе состояние должно оставаться согласованным. Указанный критерий применялся при оценке готовности результата.</w:t>
+      </w:r>
+      <w:r/>
+      <w:r>
+        <w:rPr>
+          <w:lang w:val="ru-RU"/>
+        </w:rPr>
+      </w:r>
+      <w:r>
+        <w:rPr>
+          <w:lang w:val="ru-RU"/>
+        </w:rPr>
       </w:r>
     </w:p>
     <w:p>
@@ -5199,7 +4887,7 @@
         <w:rPr>
           <w:lang w:val="ru-RU"/>
         </w:rPr>
-        <w:t>Практическая ценность работы с модулем магазина состояла в необходимости переходить от общего замысла к проверяемым действиям. При выборе предмета игрок должен получить ясную обратную связь: название, стоимость, характеристики, текущее состояние и результат действия. Если средств недостаточно, интерфейс сообщает причину, а если предмет уже экипирован, не допускает противоречивого повторного изменения. Иконки и подсветка категорий поддерживают восприятие без замены текстовых пояснений. На каждом шаге фиксировались исходные данные, ожидаемый эффект, возможные ограничения и критерий готовности. Благодаря этому разработка не сводилась к набору несвязанных экранов или классов.</w:t>
+        <w:t>При выборе предмета игрок должен получить ясную обратную связь: название, стоимость, характеристики, текущее состояние и результат действия. Если средств недостаточно, интерфейс сообщает причину, а если предмет уже экипирован, не допускает противоречивого повторного изменения. Иконки и подсветка категорий поддерживают восприятие без замены текстовых пояснений. Особое внимание уделялось повторному запуску сценария: после поражения, повторной покупки или возврата к предыдущей фазе состояние должно оставаться согласованным. Данный вывод учитывался при последующей проверке сценариев. Ресурсы интерфейса и игровые правила связывались через явные константы и централизованные пути, чтобы исключить расхождение строковых значений. Соответствующее ограничение учитывалось при планировании объёма работ.</w:t>
       </w:r>
     </w:p>
     <w:p>
@@ -5213,16 +4901,13 @@
         <w:rPr>
           <w:lang w:val="ru-RU"/>
         </w:rPr>
-        <w:t xml:space="preserve">Особое внимание было уделено тому, чтобы решения по модулем магазина оставались поддерживаемыми при расширении проекта. Магазин отвечает за просмотр доступного снаряжения, визуальное представление карточек, цены, иконки, подтверждение выбора и применение эффекта предмета к герою. Каталог и правила экипировки изолированы от конкретного </w:t>
-      </w:r>
-      <w:r>
-        <w:t>Swing</w:t>
-      </w:r>
-      <w:r>
-        <w:rPr>
-          <w:lang w:val="ru-RU"/>
-        </w:rPr>
-        <w:t>-представления, поэтому цена и доступность не вычисляются непосредственно в обработчике нажатия. Для этого выделялись устойчивые границы модулей, использовались именованные константы и исключалось дублирование логики, которое может привести к различному поведению одинаковых игровых сцен.</w:t>
+        <w:t>Для поддерживаемости магазина правила ценообразования и экипировки не смешивались с координатами элементов интерфейса. Это позволило изменять визуальную часть витрины без риска нарушить расчёт доступности покупки. Дублирование логики между карточками исключалось через общие модули. Ресурсы интерфейса и игровые правила связывались через явные константы и централизованные пути, чтобы исключить расхождение строковых значений. Отмеченное требование сохранялось на всех этапах доработки. Практическая проверка модуля выполнялась на сквозном пользовательском сценарии, включающем переход из соседних экранов. Такая фиксация снижает вероятность повторного возникновения сходных дефектов.</w:t>
+      </w:r>
+      <w:r/>
+      <w:r>
+        <w:rPr>
+          <w:lang w:val="ru-RU"/>
+        </w:rPr>
       </w:r>
     </w:p>
     <w:p>
@@ -5236,14 +4921,12 @@
         <w:rPr>
           <w:lang w:val="ru-RU"/>
         </w:rPr>
-        <w:t xml:space="preserve">Проверка выбранного решения выполнялась на сценариях, близких к пользовательским: запуск приложения, чтение диалога, покупка предмета, переход к главе, бой, повтор прохождения после поражения. При выборе </w:t>
-      </w:r>
-      <w:r>
-        <w:rPr>
-          <w:lang w:val="ru-RU"/>
-        </w:rPr>
-        <w:lastRenderedPageBreak/>
-        <w:t>предмета игрок должен получить ясную обратную связь: название, стоимость, характеристики, текущее состояние и результат действия. Если средств недостаточно, интерфейс сообщает причину, а если предмет уже экипирован, не допускает противоречивого повторного изменения. Иконки и подсветка категорий поддерживают восприятие без замены текстовых пояснений. Такой порядок выявлял не только ошибки вычислений, но и дефекты связности интерфейса, темпа повествования и сохранения состояния.</w:t>
+        <w:t>Проверка модуля включала сценарии успешной покупки, отказа из-за недостатка средств, повторной экипировки и возврата в сюжет после закрытия магазина. Такой набор выявлял как ошибки модели, так и дефекты обратной связи интерфейса. Практическая проверка модуля выполнялась на сквозном пользовательском сценарии, включающем переход из соседних экранов. Указанный критерий применялся при оценке готовности результата. Полученный результат фиксировался как готовый вертикальный срез, пригодный для демонстрации на защите и для дальнейшей доработки. Сформулированное положение использовалось как ориентир при рефакторинге. При расширении функциональности сохранялись ранее принятые границы ответственности, чтобы не возвращаться к смешанной логике «всё в одном классе». Данный вывод учитывался при последующей проверке сценариев.</w:t>
+      </w:r>
+      <w:r>
+        <w:rPr>
+          <w:lang w:val="ru-RU"/>
+        </w:rPr>
       </w:r>
     </w:p>
     <w:p>
@@ -5257,16 +4940,13 @@
         <w:rPr>
           <w:lang w:val="ru-RU"/>
         </w:rPr>
-        <w:t xml:space="preserve">В результате проработка модулем магазина дала основание для следующего этапа работы. Такое устройство делает магазин не декоративным экраном, а полноценным примером модели состояния и согласования </w:t>
-      </w:r>
-      <w:r>
-        <w:t>UI</w:t>
-      </w:r>
-      <w:r>
-        <w:rPr>
-          <w:lang w:val="ru-RU"/>
-        </w:rPr>
-        <w:t xml:space="preserve"> с правилами. Полученный опыт важен и в контексте деятельности ООО «КОДДОТ»: при создании веб-, мобильных и игровых решений одинаково значимы декомпозиция, прозрачное взаимодействие компонентов и регулярная демонстрация промежуточного результата.</w:t>
+        <w:t>В результате магазин стал полноценным примером согласования UI с правилами, а не декоративным экраном. Полученный опыт важен и в контексте деятельности ООО «КОДДОТ»: прозрачная модель состояния и понятная обратная связь пользователю значимы в любых интерактивных продуктах. Полученный результат фиксировался как готовый вертикальный срез, пригодный для демонстрации на защите и для дальнейшей доработки. Соответствующее ограничение учитывалось при планировании объёма работ.</w:t>
+      </w:r>
+      <w:r/>
+      <w:r>
+        <w:rPr>
+          <w:lang w:val="ru-RU"/>
+        </w:rPr>
       </w:r>
     </w:p>
     <w:p>
@@ -5280,16 +4960,13 @@
         <w:rPr>
           <w:lang w:val="ru-RU"/>
         </w:rPr>
-        <w:t xml:space="preserve">При принятии решений учитывалась ограниченность учебного проекта по времени и размеру команды. Поэтому приоритет отдавался понятной реализации, которую один разработчик способен воспроизвести, протестировать и объяснить на защите. Магазин отвечает за просмотр доступного снаряжения, визуальное представление карточек, цены, иконки, подтверждение выбора и применение эффекта предмета к герою. Каталог и правила экипировки изолированы от конкретного </w:t>
-      </w:r>
-      <w:r>
-        <w:t>Swing</w:t>
-      </w:r>
-      <w:r>
-        <w:rPr>
-          <w:lang w:val="ru-RU"/>
-        </w:rPr>
-        <w:t>-представления, поэтому цена и доступность не вычисляются непосредственно в обработчике нажатия. Это не исключало инженерной дисциплины, а требовало выбирать инструменты соразмерно задаче.</w:t>
+        <w:t>С учётом учебного формата витрина не усложнялась серверными механизмами. Локальных правил оказалось достаточно для демонстрации и проверки связности игрового цикла. При расширении функциональности сохранялись ранее принятые границы ответственности, чтобы не возвращаться к смешанной логике «всё в одном классе». Такая фиксация снижает вероятность повторного возникновения сходных дефектов. Для модуля описывались входные данные, ожидаемый результат, возможные ограничения и способ проверки после внесения изменений. Это уточняет практическую сторону выполненной работы. Особое внимание уделялось повторному запуску сценария: после поражения, повторной покупки или возврата к предыдущей фазе состояние должно оставаться согласованным. Указанный критерий применялся при оценке готовности результата.</w:t>
+      </w:r>
+      <w:r/>
+      <w:r>
+        <w:rPr>
+          <w:lang w:val="ru-RU"/>
+        </w:rPr>
       </w:r>
     </w:p>
     <w:p>
@@ -5496,50 +5173,36 @@
         <w:rPr>
           <w:lang w:val="ru-RU"/>
         </w:rPr>
-        <w:t xml:space="preserve">Рассматриваемый аспект связан с первой главой и боевой последовательностью. В ходе практики он анализировался не как изолированная техническая операция, а как часть целостного цикла разработки цифрового продукта. </w:t>
-      </w:r>
-      <w:r>
-        <w:t>Chapter</w:t>
-      </w:r>
-      <w:r>
-        <w:rPr>
-          <w:lang w:val="ru-RU"/>
-        </w:rPr>
-        <w:t>1</w:t>
-      </w:r>
-      <w:r>
-        <w:t>Director</w:t>
-      </w:r>
-      <w:r>
-        <w:rPr>
-          <w:lang w:val="ru-RU"/>
-        </w:rPr>
-        <w:t xml:space="preserve"> координирует фазы главы, не смешивая сюжетный порядок с деталями прорисовки. Сценарий включает подачу контекста, диалоговые сцены, переходы на карте, подготовку к столкновению и развязку. </w:t>
-      </w:r>
-      <w:r>
-        <w:t>Visual</w:t>
-      </w:r>
-      <w:r>
-        <w:rPr>
-          <w:lang w:val="ru-RU"/>
-        </w:rPr>
-        <w:t xml:space="preserve"> </w:t>
-      </w:r>
-      <w:r>
-        <w:t>novel</w:t>
-      </w:r>
-      <w:r>
-        <w:rPr>
-          <w:lang w:val="ru-RU"/>
-        </w:rPr>
-        <w:t xml:space="preserve"> слой управляет последовательным открытием реплик и изображений персонажей. Такой подход позволил сопоставить требования к </w:t>
-      </w:r>
-      <w:r>
-        <w:rPr>
-          <w:lang w:val="ru-RU"/>
-        </w:rPr>
-        <w:lastRenderedPageBreak/>
-        <w:t>учебному результату с реальными принципами организации работ в ИТ-компании и сделать принимаемые решения объяснимыми для пользователя и команды.</w:t>
+        <w:t>Chapter1Director координирует фазы главы, не смешивая сюжетный порядок с деталями прорисовки. Сценарий включает подачу контекста, диалоговые сцены, переходы на карте, подготовку к столкновению и развязку. Слой визуальной новеллы управляет последовательным открытием реплик и изображений персонажей. Такое разделение упростило сопровождение сюжета. Особое внимание уделялось повторному запуску сценария: после поражения, повторной покупки или возврата к предыдущей фазе состояние должно оставаться согласованным. Такая фиксация снижает вероятность повторного возникновения сходных дефектов. Ресурсы интерфейса и игровые правила связывались через явные константы и централизованные пути, чтобы исключить расхождение строковых значений. Это уточняет практическую сторону выполненной работы.</w:t>
+      </w:r>
+      <w:r/>
+      <w:r>
+        <w:rPr>
+          <w:lang w:val="ru-RU"/>
+        </w:rPr>
+      </w:r>
+      <w:r/>
+      <w:r>
+        <w:rPr>
+          <w:lang w:val="ru-RU"/>
+        </w:rPr>
+      </w:r>
+      <w:r/>
+      <w:r>
+        <w:rPr>
+          <w:lang w:val="ru-RU"/>
+        </w:rPr>
+      </w:r>
+      <w:r/>
+      <w:r>
+        <w:rPr>
+          <w:lang w:val="ru-RU"/>
+        </w:rPr>
+      </w:r>
+      <w:r>
+        <w:rPr>
+          <w:lang w:val="ru-RU"/>
+        </w:rPr>
       </w:r>
     </w:p>
     <w:p>
@@ -5553,7 +5216,7 @@
         <w:rPr>
           <w:lang w:val="ru-RU"/>
         </w:rPr>
-        <w:t>Практическая ценность работы с первой главой и боевой последовательностью состояла в необходимости переходить от общего замысла к проверяемым действиям. Боевая часть использует параметры героя и противника, контролирует этапы столкновения и выводит отдельный результат победы или поражения. Босс и эффекты его появления организованы самостоятельными контроллерами, что позволяет поддерживать сложную сцену без превращения одного класса в набор несвязанных условий. На каждом шаге фиксировались исходные данные, ожидаемый эффект, возможные ограничения и критерий готовности. Благодаря этому разработка не сводилась к набору несвязанных экранов или классов.</w:t>
+        <w:t>Боевая часть использует параметры героя и противника, контролирует этапы столкновения и выводит отдельный результат победы или поражения. Босс и эффекты его появления организованы самостоятельными контроллерами, что позволяет поддерживать сложную сцену без превращения одного класса в набор несвязанных условий. Для каждого этапа фиксировались ожидаемый эффект и критерий готовности. Ресурсы интерфейса и игровые правила связывались через явные константы и централизованные пути, чтобы исключить расхождение строковых значений. Сформулированное положение использовалось как ориентир при рефакторинге. Практическая проверка модуля выполнялась на сквозном пользовательском сценарии, включающем переход из соседних экранов. Данный вывод учитывался при последующей проверке сценариев.</w:t>
       </w:r>
     </w:p>
     <w:p>
@@ -5567,43 +5230,31 @@
         <w:rPr>
           <w:lang w:val="ru-RU"/>
         </w:rPr>
-        <w:t xml:space="preserve">Особое внимание было уделено тому, чтобы решения по первой главой и боевой последовательностью оставались поддерживаемыми при расширении проекта. </w:t>
-      </w:r>
-      <w:r>
-        <w:t>Chapter</w:t>
-      </w:r>
-      <w:r>
-        <w:rPr>
-          <w:lang w:val="ru-RU"/>
-        </w:rPr>
-        <w:t>1</w:t>
-      </w:r>
-      <w:r>
-        <w:t>Director</w:t>
-      </w:r>
-      <w:r>
-        <w:rPr>
-          <w:lang w:val="ru-RU"/>
-        </w:rPr>
-        <w:t xml:space="preserve"> координирует фазы главы, не смешивая сюжетный порядок с деталями прорисовки. Сценарий включает подачу контекста, диалоговые сцены, переходы на карте, подготовку к столкновению и развязку. </w:t>
-      </w:r>
-      <w:r>
-        <w:t>Visual</w:t>
-      </w:r>
-      <w:r>
-        <w:rPr>
-          <w:lang w:val="ru-RU"/>
-        </w:rPr>
-        <w:t xml:space="preserve"> </w:t>
-      </w:r>
-      <w:r>
-        <w:t>novel</w:t>
-      </w:r>
-      <w:r>
-        <w:rPr>
-          <w:lang w:val="ru-RU"/>
-        </w:rPr>
-        <w:t xml:space="preserve"> слой управляет последовательным открытием реплик и изображений персонажей. Для этого выделялись устойчивые границы модулей, использовались именованные константы и исключалось дублирование логики, которое может привести к различному поведению одинаковых игровых сцен.</w:t>
+        <w:t>Поддерживаемость главы обеспечивалась тем, что порядок фаз задаётся директором, а не разрозненными проверками внутри отрисовки. Это снизило риск расхождения поведения при добавлении новых реплик или промежуточных экранов. Практическая проверка модуля выполнялась на сквозном пользовательском сценарии, включающем переход из соседних экранов. В дальнейшем это упростило объяснение принятых решений на защите. Полученный результат фиксировался как готовый вертикальный срез, пригодный для демонстрации на защите и для дальнейшей доработки. Отмеченное требование сохранялось на всех этапах доработки. При расширении функциональности сохранялись ранее принятые границы ответственности, чтобы не возвращаться к смешанной логике «всё в одном классе». Такая фиксация снижает вероятность повторного возникновения сходных дефектов.</w:t>
+      </w:r>
+      <w:r/>
+      <w:r>
+        <w:rPr>
+          <w:lang w:val="ru-RU"/>
+        </w:rPr>
+      </w:r>
+      <w:r/>
+      <w:r>
+        <w:rPr>
+          <w:lang w:val="ru-RU"/>
+        </w:rPr>
+      </w:r>
+      <w:r/>
+      <w:r>
+        <w:rPr>
+          <w:lang w:val="ru-RU"/>
+        </w:rPr>
+      </w:r>
+      <w:r/>
+      <w:r>
+        <w:rPr>
+          <w:lang w:val="ru-RU"/>
+        </w:rPr>
       </w:r>
     </w:p>
     <w:p>
@@ -5617,14 +5268,12 @@
         <w:rPr>
           <w:lang w:val="ru-RU"/>
         </w:rPr>
-        <w:t xml:space="preserve">Проверка выбранного решения выполнялась на сценариях, близких к пользовательским: запуск приложения, чтение диалога, покупка предмета, переход к главе, бой, повтор прохождения после поражения. Боевая часть использует параметры героя и противника, контролирует этапы столкновения и выводит отдельный результат победы или поражения. Босс и эффекты его </w:t>
-      </w:r>
-      <w:r>
-        <w:rPr>
-          <w:lang w:val="ru-RU"/>
-        </w:rPr>
-        <w:lastRenderedPageBreak/>
-        <w:t>появления организованы самостоятельными контроллерами, что позволяет поддерживать сложную сцену без превращения одного класса в набор несвязанных условий. Такой порядок выявлял не только ошибки вычислений, но и дефекты связности интерфейса, темпа повествования и сохранения состояния.</w:t>
+        <w:t>Проверка включала порядок сцен, читаемость диалогов, переход в бой и корректный финал. Отдельно контролировалось состояние после поражения и возможность повторного прохождения без сохранения некорректных данных предыдущей попытки. Полученный результат фиксировался как готовый вертикальный срез, пригодный для демонстрации на защите и для дальнейшей доработки. Это уточняет практическую сторону выполненной работы. При расширении функциональности сохранялись ранее принятые границы ответственности, чтобы не возвращаться к смешанной логике «всё в одном классе». Указанный критерий применялся при оценке готовности результата. Для модуля описывались входные данные, ожидаемый результат, возможные ограничения и способ проверки после внесения изменений. Сформулированное положение использовалось как ориентир при рефакторинге.</w:t>
+      </w:r>
+      <w:r>
+        <w:rPr>
+          <w:lang w:val="ru-RU"/>
+        </w:rPr>
       </w:r>
     </w:p>
     <w:p>
@@ -5638,7 +5287,7 @@
         <w:rPr>
           <w:lang w:val="ru-RU"/>
         </w:rPr>
-        <w:t>В результате проработка первой главой и боевой последовательностью дала основание для следующего этапа работы. Цикл завершает опыт игрока: после результата состояние отображается понятно, а повторное прохождение не должно сохранять некорректные данные от предыдущей попытки. Полученный опыт важен и в контексте деятельности ООО «КОДДОТ»: при создании веб-, мобильных и игровых решений одинаково значимы декомпозиция, прозрачное взаимодействие компонентов и регулярная демонстрация промежуточного результата.</w:t>
+        <w:t>Цикл завершает опыт игрока: после результата состояние отображается понятно, а повторное прохождение не должно сохранять некорректные данные от предыдущей попытки. Полученный опыт важен и в контексте деятельности ООО «КОДДОТ»: регулярная демонстрация законченного сценария повышает прозрачность прогресса разработки. При расширении функциональности сохранялись ранее принятые границы ответственности, чтобы не возвращаться к смешанной логике «всё в одном классе». Данный вывод учитывался при последующей проверке сценариев.</w:t>
       </w:r>
     </w:p>
     <w:p>
@@ -5652,43 +5301,31 @@
         <w:rPr>
           <w:lang w:val="ru-RU"/>
         </w:rPr>
-        <w:t xml:space="preserve">При принятии решений учитывалась ограниченность учебного проекта по времени и размеру команды. Поэтому приоритет отдавался понятной реализации, которую один разработчик способен воспроизвести, протестировать и объяснить на защите. </w:t>
-      </w:r>
-      <w:r>
-        <w:t>Chapter</w:t>
-      </w:r>
-      <w:r>
-        <w:rPr>
-          <w:lang w:val="ru-RU"/>
-        </w:rPr>
-        <w:t>1</w:t>
-      </w:r>
-      <w:r>
-        <w:t>Director</w:t>
-      </w:r>
-      <w:r>
-        <w:rPr>
-          <w:lang w:val="ru-RU"/>
-        </w:rPr>
-        <w:t xml:space="preserve"> координирует фазы главы, не смешивая сюжетный порядок с деталями прорисовки. Сценарий включает подачу контекста, диалоговые сцены, переходы на карте, подготовку к столкновению и развязку. </w:t>
-      </w:r>
-      <w:r>
-        <w:t>Visual</w:t>
-      </w:r>
-      <w:r>
-        <w:rPr>
-          <w:lang w:val="ru-RU"/>
-        </w:rPr>
-        <w:t xml:space="preserve"> </w:t>
-      </w:r>
-      <w:r>
-        <w:t>novel</w:t>
-      </w:r>
-      <w:r>
-        <w:rPr>
-          <w:lang w:val="ru-RU"/>
-        </w:rPr>
-        <w:t xml:space="preserve"> слой управляет последовательным открытием реплик и изображений персонажей. Это не исключало инженерной дисциплины, а требовало выбирать инструменты соразмерно задаче.</w:t>
+        <w:t>Новые ветвления сюжета и дополнительные механики намеренно оставлены на этап развития. Сначала был стабилизирован основной путь прохождения, что соответствует ограниченности учебного проекта по срокам. Для модуля описывались входные данные, ожидаемый результат, возможные ограничения и способ проверки после внесения изменений. Отмеченное требование сохранялось на всех этапах доработки. Особое внимание уделялось повторному запуску сценария: после поражения, повторной покупки или возврата к предыдущей фазе состояние должно оставаться согласованным. Такая фиксация снижает вероятность повторного возникновения сходных дефектов.</w:t>
+      </w:r>
+      <w:r/>
+      <w:r>
+        <w:rPr>
+          <w:lang w:val="ru-RU"/>
+        </w:rPr>
+      </w:r>
+      <w:r/>
+      <w:r>
+        <w:rPr>
+          <w:lang w:val="ru-RU"/>
+        </w:rPr>
+      </w:r>
+      <w:r/>
+      <w:r>
+        <w:rPr>
+          <w:lang w:val="ru-RU"/>
+        </w:rPr>
+      </w:r>
+      <w:r/>
+      <w:r>
+        <w:rPr>
+          <w:lang w:val="ru-RU"/>
+        </w:rPr>
       </w:r>
     </w:p>
     <w:p>
@@ -6164,23 +5801,18 @@
         <w:rPr>
           <w:lang w:val="ru-RU"/>
         </w:rPr>
-        <w:t xml:space="preserve">Рассматриваемый аспект связан с взаимодействием слоёв проекта. В ходе практики он анализировался не как изолированная техническая операция, а как часть целостного цикла разработки цифрового продукта. Пользовательское действие сначала принимается </w:t>
-      </w:r>
-      <w:r>
-        <w:t>view</w:t>
-      </w:r>
-      <w:r>
-        <w:rPr>
-          <w:lang w:val="ru-RU"/>
-        </w:rPr>
-        <w:t xml:space="preserve">, затем передаётся презентеру. Презентер вызывает операцию модели или директора, получает новое состояние и инициирует обновление представления. Такая последовательность создаёт понятную трассу для поиска ошибок: можно определить, возникла ли проблема в событии, правиле, состоянии или отображении. Такой подход позволил сопоставить требования к учебному результату с реальными принципами </w:t>
-      </w:r>
-      <w:r>
-        <w:rPr>
-          <w:lang w:val="ru-RU"/>
-        </w:rPr>
-        <w:lastRenderedPageBreak/>
-        <w:t>организации работ в ИТ-компании и сделать принимаемые решения объяснимыми для пользователя и команды.</w:t>
+        <w:t>Пользовательское действие сначала принимается view, затем передаётся презентеру. Презентер вызывает операцию модели или директора, получает новое состояние и инициирует обновление представления. Такая последовательность создаёт понятную трассу для поиска ошибок: можно определить, возникла ли проблема в событии, правиле, состоянии или отображении. Для модуля описывались входные данные, ожидаемый результат, возможные ограничения и способ проверки после внесения изменений. Соответствующее ограничение учитывалось при планировании объёма работ. Особое внимание уделялось повторному запуску сценария: после поражения, повторной покупки или возврата к предыдущей фазе состояние должно оставаться согласованным. В дальнейшем это упростило объяснение принятых решений на защите.</w:t>
+      </w:r>
+      <w:r/>
+      <w:r>
+        <w:rPr>
+          <w:lang w:val="ru-RU"/>
+        </w:rPr>
+      </w:r>
+      <w:r>
+        <w:rPr>
+          <w:lang w:val="ru-RU"/>
+        </w:rPr>
       </w:r>
     </w:p>
     <w:p>
@@ -6194,7 +5826,7 @@
         <w:rPr>
           <w:lang w:val="ru-RU"/>
         </w:rPr>
-        <w:t>Практическая ценность работы с взаимодействием слоёв проекта состояла в необходимости переходить от общего замысла к проверяемым действиям. Графические файлы размещаются в ресурсной структуре, а их загрузка группируется в кэши и фабрики. Это уменьшает количество обращений к файловой системе, исключает рассеянные по коду пути и позволяет контролировать габариты изображений. Для пиксельного стиля особенно важны предсказуемое масштабирование и отсутствие случайного размытия. На каждом шаге фиксировались исходные данные, ожидаемый эффект, возможные ограничения и критерий готовности. Благодаря этому разработка не сводилась к набору несвязанных экранов или классов.</w:t>
+        <w:t>Графические файлы размещаются в ресурсной структуре, а их загрузка группируется в кэши и фабрики. Это уменьшает количество обращений к файловой системе, исключает рассеянные по коду пути и позволяет контролировать габариты изображений. Для пиксельного стиля особенно важны предсказуемое масштабирование и отсутствие случайного размытия. Особое внимание уделялось повторному запуску сценария: после поражения, повторной покупки или возврата к предыдущей фазе состояние должно оставаться согласованным. Такая фиксация снижает вероятность повторного возникновения сходных дефектов. Ресурсы интерфейса и игровые правила связывались через явные константы и централизованные пути, чтобы исключить расхождение строковых значений. Это уточняет практическую сторону выполненной работы.</w:t>
       </w:r>
     </w:p>
     <w:p>
@@ -6208,28 +5840,23 @@
         <w:rPr>
           <w:lang w:val="ru-RU"/>
         </w:rPr>
-        <w:t xml:space="preserve">Особое внимание было уделено тому, чтобы решения </w:t>
-      </w:r>
-      <w:r>
-        <w:rPr>
-          <w:lang w:val="ru-RU"/>
-        </w:rPr>
-        <w:t>по взаимодействию</w:t>
-      </w:r>
-      <w:r>
-        <w:rPr>
-          <w:lang w:val="ru-RU"/>
-        </w:rPr>
-        <w:t xml:space="preserve"> слоёв проекта оставались поддерживаемыми при расширении проекта. Пользовательское действие сначала принимается </w:t>
-      </w:r>
-      <w:r>
-        <w:t>view</w:t>
-      </w:r>
-      <w:r>
-        <w:rPr>
-          <w:lang w:val="ru-RU"/>
-        </w:rPr>
-        <w:t>, затем передаётся презентеру. Презентер вызывает операцию модели или директора, получает новое состояние и инициирует обновление представления. Такая последовательность создаёт понятную трассу для поиска ошибок: можно определить, возникла ли проблема в событии, правиле, состоянии или отображении. Для этого выделялись устойчивые границы модулей, использовались именованные константы и исключалось дублирование логики, которое может привести к различному поведению одинаковых игровых сцен.</w:t>
+        <w:t>Централизация путей и разделение слоёв повышают поддерживаемость при добавлении новых глав, персонажей и предметов. Изменение ассета не должно требовать правки предметных правил, а изменение правила не должно зависеть от конкретного имени файла фона. Ресурсы интерфейса и игровые правила связывались через явные константы и централизованные пути, чтобы исключить расхождение строковых значений. Сформулированное положение использовалось как ориентир при рефакторинге. Практическая проверка модуля выполнялась на сквозном пользовательском сценарии, включающем переход из соседних экранов. Данный вывод учитывался при последующей проверке сценариев. Полученный результат фиксировался как готовый вертикальный срез, пригодный для демонстрации на защите и для дальнейшей доработки. Соответствующее ограничение учитывалось при планировании объёма работ.</w:t>
+      </w:r>
+      <w:r>
+        <w:rPr>
+          <w:lang w:val="ru-RU"/>
+        </w:rPr>
+      </w:r>
+      <w:r>
+        <w:rPr>
+          <w:lang w:val="ru-RU"/>
+        </w:rPr>
+      </w:r>
+      <w:r/>
+      <w:r>
+        <w:rPr>
+          <w:lang w:val="ru-RU"/>
+        </w:rPr>
       </w:r>
     </w:p>
     <w:p>
@@ -6243,14 +5870,12 @@
         <w:rPr>
           <w:lang w:val="ru-RU"/>
         </w:rPr>
-        <w:t xml:space="preserve">Проверка выбранного решения выполнялась на сценариях, близких к пользовательским: запуск приложения, чтение диалога, покупка предмета, переход к главе, бой, повтор прохождения после поражения. Графические файлы размещаются в ресурсной структуре, а их загрузка группируется в кэши и фабрики. Это уменьшает количество обращений к файловой системе, </w:t>
-      </w:r>
-      <w:r>
-        <w:rPr>
-          <w:lang w:val="ru-RU"/>
-        </w:rPr>
-        <w:lastRenderedPageBreak/>
-        <w:t>исключает рассеянные по коду пути и позволяет контролировать габариты изображений. Для пиксельного стиля особенно важны предсказуемое масштабирование и отсутствие случайного размытия. Такой порядок выявлял не только ошибки вычислений, но и дефекты связности интерфейса, темпа повествования и сохранения состояния.</w:t>
+        <w:t>На проверках контролировалось, что ресурсы находятся, пути не «отваливаются», а текст и элементы управления остаются читаемыми после масштабирования. Такие дефекты часто проявляются только при сквозном проходе, поэтому локальных unit-проверок недостаточно. Практическая проверка модуля выполнялась на сквозном пользовательском сценарии, включающем переход из соседних экранов. В дальнейшем это упростило объяснение принятых решений на защите. Полученный результат фиксировался как готовый вертикальный срез, пригодный для демонстрации на защите и для дальнейшей доработки. Отмеченное требование сохранялось на всех этапах доработки. При расширении функциональности сохранялись ранее принятые границы ответственности, чтобы не возвращаться к смешанной логике «всё в одном классе». Такая фиксация снижает вероятность повторного возникновения сходных дефектов.</w:t>
+      </w:r>
+      <w:r>
+        <w:rPr>
+          <w:lang w:val="ru-RU"/>
+        </w:rPr>
       </w:r>
     </w:p>
     <w:p>
@@ -6264,7 +5889,7 @@
         <w:rPr>
           <w:lang w:val="ru-RU"/>
         </w:rPr>
-        <w:t>В результате проработка взаимодействием слоёв проекта дала основание для следующего этапа работы. Разделение слоёв и централизованная работа с ресурсами создают основу для добавления новых глав, персонажей и предметов без полной переработки имеющегося интерфейса. Полученный опыт важен и в контексте деятельности ООО «КОДДОТ»: при создании веб-, мобильных и игровых решений одинаково значимы декомпозиция, прозрачное взаимодействие компонентов и регулярная демонстрация промежуточного результата.</w:t>
+        <w:t>Разделение слоёв и централизованная работа с ресурсами создают основу для расширения проекта без полной переработки интерфейса. Полученный опыт важен и в контексте деятельности ООО «КОДДОТ»: прозрачные контракты между частями системы ускоряют доработку MVP. Полученный результат фиксировался как готовый вертикальный срез, пригодный для демонстрации на защите и для дальнейшей доработки. Это уточняет практическую сторону выполненной работы. При расширении функциональности сохранялись ранее принятые границы ответственности, чтобы не возвращаться к смешанной логике «всё в одном классе». Указанный критерий применялся при оценке готовности результата.</w:t>
       </w:r>
     </w:p>
     <w:p>
@@ -6278,16 +5903,13 @@
         <w:rPr>
           <w:lang w:val="ru-RU"/>
         </w:rPr>
-        <w:t xml:space="preserve">При принятии решений учитывалась ограниченность учебного проекта по времени и размеру команды. Поэтому приоритет отдавался понятной реализации, которую один разработчик способен воспроизвести, протестировать и объяснить на защите. Пользовательское действие сначала принимается </w:t>
-      </w:r>
-      <w:r>
-        <w:t>view</w:t>
-      </w:r>
-      <w:r>
-        <w:rPr>
-          <w:lang w:val="ru-RU"/>
-        </w:rPr>
-        <w:t>, затем передаётся презентеру. Презентер вызывает операцию модели или директора, получает новое состояние и инициирует обновление представления. Такая последовательность создаёт понятную трассу для поиска ошибок: можно определить, возникла ли проблема в событии, правиле, состоянии или отображении. Это не исключало инженерной дисциплины, а требовало выбирать инструменты соразмерно задаче.</w:t>
+        <w:t>Дальнейшее усиление автоматических проверок возможно без изменения базового порядка слоёв. Это сохраняет архитектурную ясность при росте функциональности. При расширении функциональности сохранялись ранее принятые границы ответственности, чтобы не возвращаться к смешанной логике «всё в одном классе». Данный вывод учитывался при последующей проверке сценариев. Для модуля описывались входные данные, ожидаемый результат, возможные ограничения и способ проверки после внесения изменений. Соответствующее ограничение учитывалось при планировании объёма работ. Особое внимание уделялось повторному запуску сценария: после поражения, повторной покупки или возврата к предыдущей фазе состояние должно оставаться согласованным. В дальнейшем это упростило объяснение принятых решений на защите.</w:t>
+      </w:r>
+      <w:r/>
+      <w:r>
+        <w:rPr>
+          <w:lang w:val="ru-RU"/>
+        </w:rPr>
       </w:r>
     </w:p>
     <w:p>
@@ -6453,14 +6075,12 @@
         <w:rPr>
           <w:lang w:val="ru-RU"/>
         </w:rPr>
-        <w:t xml:space="preserve">Рассматриваемый аспект связан с проверкой пользовательских сценариев. В ходе практики он анализировался не как изолированная техническая операция, а как часть целостного цикла разработки цифрового продукта. Проверка проводилась как сквозной проход по приложению: от первого открытия окна до завершения боевой сцены. Важным условием было отсутствие необходимости перезапускать приложение после каждого действия, поскольку именно сохранение согласованного состояния отличает связанный игровой цикл от набора отдельных демонстраций. Такой подход позволил сопоставить требования к учебному результату с реальными принципами организации работ </w:t>
-      </w:r>
-      <w:r>
-        <w:rPr>
-          <w:lang w:val="ru-RU"/>
-        </w:rPr>
-        <w:lastRenderedPageBreak/>
-        <w:t>в ИТ-компании и сделать принимаемые решения объяснимыми для пользователя и команды.</w:t>
+        <w:t>Проверка проводилась как сквозной проход по приложению: от первого открытия окна до завершения боевой сцены. Важным условием было отсутствие необходимости перезапускать приложение после каждого действия, поскольку именно сохранение согласованного состояния отличает связанный игровой цикл от набора отдельных демонстраций. Ресурсы интерфейса и игровые правила связывались через явные константы и централизованные пути, чтобы исключить расхождение строковых значений. Отмеченное требование сохранялось на всех этапах доработки. Практическая проверка модуля выполнялась на сквозном пользовательском сценарии, включающем переход из соседних экранов. Такая фиксация снижает вероятность повторного возникновения сходных дефектов.</w:t>
+      </w:r>
+      <w:r>
+        <w:rPr>
+          <w:lang w:val="ru-RU"/>
+        </w:rPr>
       </w:r>
     </w:p>
     <w:p>
@@ -6474,7 +6094,7 @@
         <w:rPr>
           <w:lang w:val="ru-RU"/>
         </w:rPr>
-        <w:t>Практическая ценность работы с проверкой пользовательских сценариев состояла в необходимости переходить от общего замысла к проверяемым действиям. Для каждого экрана проверялись доступность элементов управления, читаемость текста, корректность фокуса, обработка повторных действий и поведение при граничных значениях. В магазине это означает контроль недостатка средств и повторной экипировки, в главе — правильный порядок сцен, в бою — корректный переход к победе, поражению или повтору. На каждом шаге фиксировались исходные данные, ожидаемый эффект, возможные ограничения и критерий готовности. Благодаря этому разработка не сводилась к набору несвязанных экранов или классов.</w:t>
+        <w:t>Для каждого экрана проверялись доступность элементов управления, читаемость текста, корректность фокуса, обработка повторных действий и поведение при граничных значениях. В магазине это означает контроль недостатка средств и повторной экипировки, в главе — правильный порядок сцен, в бою — корректный переход к победе, поражению или повтору. Практическая проверка модуля выполнялась на сквозном пользовательском сценарии, включающем переход из соседних экранов. Указанный критерий применялся при оценке готовности результата. Полученный результат фиксировался как готовый вертикальный срез, пригодный для демонстрации на защите и для дальнейшей доработки. Сформулированное положение использовалось как ориентир при рефакторинге.</w:t>
       </w:r>
     </w:p>
     <w:p>
@@ -6488,7 +6108,7 @@
         <w:rPr>
           <w:lang w:val="ru-RU"/>
         </w:rPr>
-        <w:t>Особое внимание было уделено тому, чтобы решения по проверкой пользовательских сценариев оставались поддерживаемыми при расширении проекта. Проверка проводилась как сквозной проход по приложению: от первого открытия окна до завершения боевой сцены. Важным условием было отсутствие необходимости перезапускать приложение после каждого действия, поскольку именно сохранение согласованного состояния отличает связанный игровой цикл от набора отдельных демонстраций. Для этого выделялись устойчивые границы модулей, использовались именованные константы и исключалось дублирование логики, которое может привести к различному поведению одинаковых игровых сцен.</w:t>
+        <w:t>Поддерживаемость обеспечивалась фиксацией найденных дефектов и повторной проверкой после исправлений. Без повторного прохода легко «починить» один экран и незаметно сломать переход к следующему. Полученный результат фиксировался как готовый вертикальный срез, пригодный для демонстрации на защите и для дальнейшей доработки. Соответствующее ограничение учитывалось при планировании объёма работ. При расширении функциональности сохранялись ранее принятые границы ответственности, чтобы не возвращаться к смешанной логике «всё в одном классе». В дальнейшем это упростило объяснение принятых решений на защите. Для модуля описывались входные данные, ожидаемый результат, возможные ограничения и способ проверки после внесения изменений. Отмеченное требование сохранялось на всех этапах доработки.</w:t>
       </w:r>
     </w:p>
     <w:p>
@@ -6502,14 +6122,12 @@
         <w:rPr>
           <w:lang w:val="ru-RU"/>
         </w:rPr>
-        <w:t xml:space="preserve">Проверка выбранного решения выполнялась на сценариях, близких к пользовательским: запуск приложения, чтение диалога, покупка предмета, переход к главе, бой, повтор прохождения после поражения. Для каждого экрана проверялись доступность элементов управления, читаемость текста, корректность фокуса, обработка повторных действий и поведение при </w:t>
-      </w:r>
-      <w:r>
-        <w:rPr>
-          <w:lang w:val="ru-RU"/>
-        </w:rPr>
-        <w:lastRenderedPageBreak/>
-        <w:t>граничных значениях. В магазине это означает контроль недостатка средств и повторной экипировки, в главе — правильный порядок сцен, в бою — корректный переход к победе, поражению или повтору. Такой порядок выявлял не только ошибки вычислений, но и дефекты связности интерфейса, темпа повествования и сохранения состояния.</w:t>
+        <w:t>Сквозное тестирование подтвердило готовность проекта к демонстрации и сформировало список направлений дальнейшего развития. Отдельно фиксировались места, где полезны будущие автотесты расчётов, не заменяющие ручную оценку визуала. При расширении функциональности сохранялись ранее принятые границы ответственности, чтобы не возвращаться к смешанной логике «всё в одном классе». Такая фиксация снижает вероятность повторного возникновения сходных дефектов. Для модуля описывались входные данные, ожидаемый результат, возможные ограничения и способ проверки после внесения изменений. Это уточняет практическую сторону выполненной работы. Особое внимание уделялось повторному запуску сценария: после поражения, повторной покупки или возврата к предыдущей фазе состояние должно оставаться согласованным. Указанный критерий применялся при оценке готовности результата.</w:t>
+      </w:r>
+      <w:r>
+        <w:rPr>
+          <w:lang w:val="ru-RU"/>
+        </w:rPr>
       </w:r>
     </w:p>
     <w:p>
@@ -6523,7 +6141,7 @@
         <w:rPr>
           <w:lang w:val="ru-RU"/>
         </w:rPr>
-        <w:t>В результате проработка проверкой пользовательских сценариев дала основание для следующего этапа работы. Сквозное тестирование подтвердило готовность проекта к демонстрации и сформировало список направлений дальнейшего развития. Полученный опыт важен и в контексте деятельности ООО «КОДДОТ»: при создании веб-, мобильных и игровых решений одинаково значимы декомпозиция, прозрачное взаимодействие компонентов и регулярная демонстрация промежуточного результата.</w:t>
+        <w:t>Полученный опыт важен и в контексте деятельности ООО «КОДДОТ»: регулярная демонстрация и проверка пользовательских путей повышают предсказуемость поставки результата. Для модуля описывались входные данные, ожидаемый результат, возможные ограничения и способ проверки после внесения изменений. Сформулированное положение использовалось как ориентир при рефакторинге. Особое внимание уделялось повторному запуску сценария: после поражения, повторной покупки или возврата к предыдущей фазе состояние должно оставаться согласованным. Данный вывод учитывался при последующей проверке сценариев.</w:t>
       </w:r>
     </w:p>
     <w:p>
@@ -6537,7 +6155,7 @@
         <w:rPr>
           <w:lang w:val="ru-RU"/>
         </w:rPr>
-        <w:t>При принятии решений учитывалась ограниченность учебного проекта по времени и размеру команды. Поэтому приоритет отдавался понятной реализации, которую один разработчик способен воспроизвести, протестировать и объяснить на защите. Проверка проводилась как сквозной проход по приложению: от первого открытия окна до завершения боевой сцены. Важным условием было отсутствие необходимости перезапускать приложение после каждого действия, поскольку именно сохранение согласованного состояния отличает связанный игровой цикл от набора отдельных демонстраций. Это не исключало инженерной дисциплины, а требовало выбирать инструменты соразмерно задаче.</w:t>
+        <w:t>Проверка проводилась в объёме, достаточном для учебного проекта и защиты. При этом сохранялся акцент на реальных сценариях игрока, а не только на формальной компиляции. Особое внимание уделялось повторному запуску сценария: после поражения, повторной покупки или возврата к предыдущей фазе состояние должно оставаться согласованным. В дальнейшем это упростило объяснение принятых решений на защите. Ресурсы интерфейса и игровые правила связывались через явные константы и централизованные пути, чтобы исключить расхождение строковых значений. Отмеченное требование сохранялось на всех этапах доработки. Практическая проверка модуля выполнялась на сквозном пользовательском сценарии, включающем переход из соседних экранов. Такая фиксация снижает вероятность повторного возникновения сходных дефектов.</w:t>
       </w:r>
     </w:p>
     <w:p>
@@ -6551,14 +6169,12 @@
         <w:rPr>
           <w:lang w:val="ru-RU"/>
         </w:rPr>
-        <w:t xml:space="preserve">В качестве следующего этапа развития может быть добавлена система сохранений, позволяющая продолжать игру с последней завершённой фазы. Для этого потребуется выделить сериализуемое представление состояния, определить версию формата и предусмотреть безопасную обработку старых </w:t>
-      </w:r>
-      <w:r>
-        <w:rPr>
-          <w:lang w:val="ru-RU"/>
-        </w:rPr>
-        <w:lastRenderedPageBreak/>
-        <w:t>либо повреждённых файлов. Такое расширение не должно нарушить текущую границу между моделью и интерфейсом.</w:t>
+        <w:t>В качестве следующего этапа развития может быть добавлена система сохранений, позволяющая продолжать игру с последней завершённой фазы. Для этого потребуется выделить сериализуемое представление состояния, определить версию формата и предусмотреть безопасную обработку старых либо повреждённых файлов. Такое расширение не должно нарушить текущую границу между моделью и интерфейсом.</w:t>
+      </w:r>
+      <w:r>
+        <w:rPr>
+          <w:lang w:val="ru-RU"/>
+        </w:rPr>
       </w:r>
     </w:p>
     <w:p>
@@ -6572,16 +6188,13 @@
         <w:rPr>
           <w:lang w:val="ru-RU"/>
         </w:rPr>
-        <w:t xml:space="preserve">Другим направлением является увеличение вариативности визуальной новеллы: ветвящиеся реплики, условия открытия сцен и последствия решений игрока. В этом случае особенно полезно вынести описание диалогов в данные и оставить </w:t>
-      </w:r>
-      <w:r>
-        <w:t>Java</w:t>
-      </w:r>
-      <w:r>
-        <w:rPr>
-          <w:lang w:val="ru-RU"/>
-        </w:rPr>
-        <w:t>-коду ответственность за интерпретацию, отображение и переходы. Подобная декомпозиция сохраняет возможность редактировать контент без переписывания каждого экранного класса.</w:t>
+        <w:t>Другим направлением является увеличение вариативности визуальной новеллы: ветвящиеся реплики, условия открытия сцен и последствия решений игрока. В этом случае особенно полезно вынести описание диалогов в данные и оставить Java-коду ответственность за интерпретацию, отображение и переходы. Подобная декомпозиция сохраняет возможность редактировать контент без переписывания каждого экранного класса.</w:t>
+      </w:r>
+      <w:r/>
+      <w:r>
+        <w:rPr>
+          <w:lang w:val="ru-RU"/>
+        </w:rPr>
       </w:r>
     </w:p>
     <w:p>
@@ -6745,16 +6358,13 @@
         <w:rPr>
           <w:lang w:val="ru-RU"/>
         </w:rPr>
-        <w:t xml:space="preserve">Для ООО «КОДДОТ» целесообразно рассматривать автоматизацию как средство сокращения повторяемых операций при подготовке игровых прототипов и </w:t>
-      </w:r>
-      <w:r>
-        <w:t>MVP</w:t>
-      </w:r>
-      <w:r>
-        <w:rPr>
-          <w:lang w:val="ru-RU"/>
-        </w:rPr>
-        <w:t>-демонстраций. Предложения не требуют немедленной перестройки процесса: они могут вводиться поэтапно и проверяться на одном пилотном проекте. Ключевой критерий — экономия времени без потери прозрачности для команды.</w:t>
+        <w:t>Для ООО «КОДДОТ» целесообразно рассматривать автоматизацию как средство сокращения повторяемых операций при подготовке игровых прототипов и MVP-демонстраций. Предложения не требуют немедленной перестройки процесса: они могут вводиться поэтапно и проверяться на одном пилотном проекте. Ключевой критерий — экономия времени без потери прозрачности для команды.</w:t>
+      </w:r>
+      <w:r/>
+      <w:r>
+        <w:rPr>
+          <w:lang w:val="ru-RU"/>
+        </w:rPr>
       </w:r>
     </w:p>
     <w:p>
@@ -6809,7 +6419,7 @@
         <w:rPr>
           <w:lang w:val="ru-RU"/>
         </w:rPr>
-        <w:t>Рассматриваемый аспект связан с автоматизированным конвейером прототипа. В ходе практики он анализировался не как изолированная техническая операция, а как часть целостного цикла разработки цифрового продукта. Первое предложение — шаблон репозитория для игровых и интерактивных демо. Он может включать структуру сцен, папки ресурсов, единые правила именования, базовые скрипты сборки, файл с инструкцией запуска и минимальную проверку качества. Новый проект начинает работу с согласованного каркаса вместо копирования случайной предыдущей реализации. Такой подход позволил сопоставить требования к учебному результату с реальными принципами организации работ в ИТ-компании и сделать принимаемые решения объяснимыми для пользователя и команды.</w:t>
+        <w:t>Первое предложение — шаблон репозитория для игровых и интерактивных демо. Он может включать структуру сцен, папки ресурсов, единые правила именования, базовые скрипты сборки, файл с инструкцией запуска и минимальную проверку качества. Новый проект начинает работу с согласованного каркаса вместо копирования случайной предыдущей реализации. Риски избыточной формализации учитывались отдельно: шаблоны и скрипты должны помогать, а не блокировать быструю проверку нестандартной идеи. Сформулированное положение использовалось как ориентир при рефакторинге. Реализация предложений может выполняться поэтапно: сначала минимальный контроль, затем сборка, затем шаблоны сцен и учёт ассетов. Данный вывод учитывался при последующей проверке сценариев.</w:t>
       </w:r>
     </w:p>
     <w:p>
@@ -6823,77 +6433,54 @@
         <w:rPr>
           <w:lang w:val="ru-RU"/>
         </w:rPr>
-        <w:t xml:space="preserve">Практическая ценность работы с автоматизированным конвейером прототипа состояла в необходимости переходить от общего замысла к проверяемым действиям. Второе предложение — настроить непрерывную интеграцию: при каждом изменении выполняются сборка, статический анализ, проверка наличия обязательных ресурсов и публикация артефакта </w:t>
-      </w:r>
-      <w:r>
-        <w:rPr>
-          <w:lang w:val="ru-RU"/>
-        </w:rPr>
-        <w:lastRenderedPageBreak/>
-        <w:t xml:space="preserve">демонстрационной версии. Для </w:t>
-      </w:r>
-      <w:r>
-        <w:t>Unity</w:t>
-      </w:r>
-      <w:r>
-        <w:rPr>
-          <w:lang w:val="ru-RU"/>
-        </w:rPr>
-        <w:t xml:space="preserve"> это может быть автоматическая сборка проекта, для </w:t>
-      </w:r>
-      <w:r>
-        <w:t>Java</w:t>
-      </w:r>
-      <w:r>
-        <w:rPr>
-          <w:lang w:val="ru-RU"/>
-        </w:rPr>
-        <w:t xml:space="preserve"> — </w:t>
-      </w:r>
-      <w:r>
-        <w:t>Gradle</w:t>
-      </w:r>
-      <w:r>
-        <w:rPr>
-          <w:lang w:val="ru-RU"/>
-        </w:rPr>
-        <w:t xml:space="preserve">-сборка, для </w:t>
-      </w:r>
-      <w:r>
-        <w:t>React</w:t>
-      </w:r>
-      <w:r>
-        <w:rPr>
-          <w:lang w:val="ru-RU"/>
-        </w:rPr>
-        <w:t>/</w:t>
-      </w:r>
-      <w:r>
-        <w:t>Node</w:t>
-      </w:r>
-      <w:r>
-        <w:rPr>
-          <w:lang w:val="ru-RU"/>
-        </w:rPr>
-        <w:t xml:space="preserve"> — установка зависимостей, линтинг и </w:t>
-      </w:r>
-      <w:r>
-        <w:t>production</w:t>
-      </w:r>
-      <w:r>
-        <w:rPr>
-          <w:lang w:val="ru-RU"/>
-        </w:rPr>
-        <w:t xml:space="preserve"> </w:t>
-      </w:r>
-      <w:r>
-        <w:t>build</w:t>
-      </w:r>
-      <w:r>
-        <w:rPr>
-          <w:lang w:val="ru-RU"/>
-        </w:rPr>
-        <w:t>. На каждом шаге фиксировались исходные данные, ожидаемый эффект, возможные ограничения и критерий готовности. Благодаря этому разработка не сводилась к набору несвязанных экранов или классов.</w:t>
+        <w:t>Второе предложение — настроить непрерывную интеграцию: при каждом изменении выполняются сборка, статический анализ, проверка наличия обязательных ресурсов и публикация артефакта демонстрационной версии. Для Unity это может быть автоматическая сборка проекта, для Java — Gradle-сборка, для React/Node — установка зависимостей, линтинг и production build. Реализация предложений может выполняться поэтапно: сначала минимальный контроль, затем сборка, затем шаблоны сцен и учёт ассетов. В дальнейшем это упростило объяснение принятых решений на защите. Измерять эффект целесообразно по времени подготовки демо-версии и числу ручных действий перед показом результата. Отмеченное требование сохранялось на всех этапах доработки.</w:t>
+      </w:r>
+      <w:r>
+        <w:rPr>
+          <w:lang w:val="ru-RU"/>
+        </w:rPr>
+      </w:r>
+      <w:r/>
+      <w:r>
+        <w:rPr>
+          <w:lang w:val="ru-RU"/>
+        </w:rPr>
+      </w:r>
+      <w:r/>
+      <w:r>
+        <w:rPr>
+          <w:lang w:val="ru-RU"/>
+        </w:rPr>
+      </w:r>
+      <w:r/>
+      <w:r>
+        <w:rPr>
+          <w:lang w:val="ru-RU"/>
+        </w:rPr>
+      </w:r>
+      <w:r/>
+      <w:r>
+        <w:rPr>
+          <w:lang w:val="ru-RU"/>
+        </w:rPr>
+      </w:r>
+      <w:r/>
+      <w:r>
+        <w:rPr>
+          <w:lang w:val="ru-RU"/>
+        </w:rPr>
+      </w:r>
+      <w:r/>
+      <w:r>
+        <w:rPr>
+          <w:lang w:val="ru-RU"/>
+        </w:rPr>
+      </w:r>
+      <w:r/>
+      <w:r>
+        <w:rPr>
+          <w:lang w:val="ru-RU"/>
+        </w:rPr>
       </w:r>
     </w:p>
     <w:p>
@@ -6907,7 +6494,7 @@
         <w:rPr>
           <w:lang w:val="ru-RU"/>
         </w:rPr>
-        <w:t>Особое внимание было уделено тому, чтобы решения по автоматизированным конвейером прототипа оставались поддерживаемыми при расширении проекта. Первое предложение — шаблон репозитория для игровых и интерактивных демо. Он может включать структуру сцен, папки ресурсов, единые правила именования, базовые скрипты сборки, файл с инструкцией запуска и минимальную проверку качества. Новый проект начинает работу с согласованного каркаса вместо копирования случайной предыдущей реализации. Для этого выделялись устойчивые границы модулей, использовались именованные константы и исключалось дублирование логики, которое может привести к различному поведению одинаковых игровых сцен.</w:t>
+        <w:t>Поддерживаемость конвейера обеспечивается тем, что шаблон остаётся расширяемым и не навязывает избыточную сложность маленькому прототипу. Сначала фиксируются локальные скрипты запуска, затем добавляются проверки в CI. Такой порядок снижает риск, при котором автоматизация маскирует хаос вместо его устранения. Измерять эффект целесообразно по времени подготовки демо-версии и числу ручных действий перед показом результата. Это уточняет практическую сторону выполненной работы. Предложения по автоматизации направлены на сокращение рутинных операций без усложнения учебного проекта избыточными инструментами. Указанный критерий применялся при оценке готовности результата. Практическая ценность стандарта проявляется тогда, когда автор проекта быстрее получает запускаемый артефакт и понятный список проверок. Сформулированное положение использовалось как ориентир при рефакторинге.</w:t>
       </w:r>
     </w:p>
     <w:p>
@@ -6921,70 +6508,49 @@
         <w:rPr>
           <w:lang w:val="ru-RU"/>
         </w:rPr>
-        <w:t xml:space="preserve">Проверка выбранного решения выполнялась на сценариях, близких к пользовательским: запуск приложения, чтение диалога, покупка предмета, переход к главе, бой, повтор прохождения после поражения. Второе предложение — настроить непрерывную интеграцию: при каждом изменении выполняются сборка, статический анализ, проверка наличия обязательных ресурсов и публикация артефакта демонстрационной версии. Для </w:t>
-      </w:r>
-      <w:r>
-        <w:t>Unity</w:t>
-      </w:r>
-      <w:r>
-        <w:rPr>
-          <w:lang w:val="ru-RU"/>
-        </w:rPr>
-        <w:t xml:space="preserve"> это может быть автоматическая сборка проекта, для </w:t>
-      </w:r>
-      <w:r>
-        <w:t>Java</w:t>
-      </w:r>
-      <w:r>
-        <w:rPr>
-          <w:lang w:val="ru-RU"/>
-        </w:rPr>
-        <w:t xml:space="preserve"> — </w:t>
-      </w:r>
-      <w:r>
-        <w:t>Gradle</w:t>
-      </w:r>
-      <w:r>
-        <w:rPr>
-          <w:lang w:val="ru-RU"/>
-        </w:rPr>
-        <w:t xml:space="preserve">-сборка, для </w:t>
-      </w:r>
-      <w:r>
-        <w:t>React</w:t>
-      </w:r>
-      <w:r>
-        <w:rPr>
-          <w:lang w:val="ru-RU"/>
-        </w:rPr>
-        <w:t>/</w:t>
-      </w:r>
-      <w:r>
-        <w:t>Node</w:t>
-      </w:r>
-      <w:r>
-        <w:rPr>
-          <w:lang w:val="ru-RU"/>
-        </w:rPr>
-        <w:t xml:space="preserve"> — установка зависимостей, линтинг и </w:t>
-      </w:r>
-      <w:r>
-        <w:t>production</w:t>
-      </w:r>
-      <w:r>
-        <w:rPr>
-          <w:lang w:val="ru-RU"/>
-        </w:rPr>
-        <w:t xml:space="preserve"> </w:t>
-      </w:r>
-      <w:r>
-        <w:t>build</w:t>
-      </w:r>
-      <w:r>
-        <w:rPr>
-          <w:lang w:val="ru-RU"/>
-        </w:rPr>
-        <w:t>. Такой порядок выявлял не только ошибки вычислений, но и дефекты связности интерфейса, темпа повествования и сохранения состояния.</w:t>
+        <w:t>Эффективность предложений проверяется практикой: сокращением времени подготовки демо, уменьшением числа ошибок запуска и снижением доли ручных действий. Если конвейер не даёт измеримой пользы, его следует упростить. Предложения по автоматизации направлены на сокращение рутинных операций без усложнения учебного проекта избыточными инструментами. Данный вывод учитывался при последующей проверке сценариев. Практическая ценность стандарта проявляется тогда, когда автор проекта быстрее получает запускаемый артефакт и понятный список проверок. Соответствующее ограничение учитывалось при планировании объёма работ. Риски избыточной формализации учитывались отдельно: шаблоны и скрипты должны помогать, а не блокировать быструю проверку нестандартной идеи. В дальнейшем это упростило объяснение принятых решений на защите.</w:t>
+      </w:r>
+      <w:r/>
+      <w:r>
+        <w:rPr>
+          <w:lang w:val="ru-RU"/>
+        </w:rPr>
+      </w:r>
+      <w:r/>
+      <w:r>
+        <w:rPr>
+          <w:lang w:val="ru-RU"/>
+        </w:rPr>
+      </w:r>
+      <w:r/>
+      <w:r>
+        <w:rPr>
+          <w:lang w:val="ru-RU"/>
+        </w:rPr>
+      </w:r>
+      <w:r/>
+      <w:r>
+        <w:rPr>
+          <w:lang w:val="ru-RU"/>
+        </w:rPr>
+      </w:r>
+      <w:r/>
+      <w:r>
+        <w:rPr>
+          <w:lang w:val="ru-RU"/>
+        </w:rPr>
+      </w:r>
+      <w:r/>
+      <w:r>
+        <w:rPr>
+          <w:lang w:val="ru-RU"/>
+        </w:rPr>
+      </w:r>
+      <w:r/>
+      <w:r>
+        <w:rPr>
+          <w:lang w:val="ru-RU"/>
+        </w:rPr>
       </w:r>
     </w:p>
     <w:p>
@@ -6998,23 +6564,18 @@
         <w:rPr>
           <w:lang w:val="ru-RU"/>
         </w:rPr>
-        <w:t xml:space="preserve">В результате проработка автоматизированным конвейером прототипа дала основание для следующего этапа работы. Такой конвейер быстрее </w:t>
-      </w:r>
-      <w:r>
-        <w:rPr>
-          <w:lang w:val="ru-RU"/>
-        </w:rPr>
-        <w:lastRenderedPageBreak/>
-        <w:t xml:space="preserve">сообщает о регрессии и даёт менеджеру или заказчику возможность получить актуальный </w:t>
-      </w:r>
-      <w:r>
-        <w:t>MVP</w:t>
-      </w:r>
-      <w:r>
-        <w:rPr>
-          <w:lang w:val="ru-RU"/>
-        </w:rPr>
-        <w:t xml:space="preserve"> без ручной подготовки окружения. Полученный опыт важен и в контексте деятельности ООО «КОДДОТ»: при создании веб-, мобильных и игровых решений одинаково значимы декомпозиция, прозрачное взаимодействие компонентов и регулярная демонстрация промежуточного результата.</w:t>
+        <w:t>Такой конвейер быстрее сообщает о регрессии и даёт менеджеру или заказчику возможность получить актуальный MVP без ручной подготовки окружения. Полученный опыт важен и в контексте деятельности ООО «КОДДОТ»: регулярная поставка демонстраций повышает прозрачность прогресса. Практическая ценность стандарта проявляется тогда, когда автор проекта быстрее получает запускаемый артефакт и понятный список проверок. Отмеченное требование сохранялось на всех этапах доработки. Риски избыточной формализации учитывались отдельно: шаблоны и скрипты должны помогать, а не блокировать быструю проверку нестандартной идеи. Такая фиксация снижает вероятность повторного возникновения сходных дефектов.</w:t>
+      </w:r>
+      <w:r>
+        <w:rPr>
+          <w:lang w:val="ru-RU"/>
+        </w:rPr>
+      </w:r>
+      <w:r/>
+      <w:r>
+        <w:rPr>
+          <w:lang w:val="ru-RU"/>
+        </w:rPr>
       </w:r>
     </w:p>
     <w:p>
@@ -7028,7 +6589,7 @@
         <w:rPr>
           <w:lang w:val="ru-RU"/>
         </w:rPr>
-        <w:t>При принятии решений учитывалась ограниченность учебного проекта по времени и размеру команды. Поэтому приоритет отдавался понятной реализации, которую один разработчик способен воспроизвести, протестировать и объяснить на защите. Первое предложение — шаблон репозитория для игровых и интерактивных демо. Он может включать структуру сцен, папки ресурсов, единые правила именования, базовые скрипты сборки, файл с инструкцией запуска и минимальную проверку качества. Новый проект начинает работу с согласованного каркаса вместо копирования случайной предыдущей реализации. Это не исключало инженерной дисциплины, а требовало выбирать инструменты соразмерно задаче.</w:t>
+        <w:t>Внедрение целесообразно начинать после того, как команда уже умеет локально собирать демо одним-двумя скриптами. Иначе CI будет закреплять неустойчивый процесс. Риски избыточной формализации учитывались отдельно: шаблоны и скрипты должны помогать, а не блокировать быструю проверку нестандартной идеи. Указанный критерий применялся при оценке готовности результата. Реализация предложений может выполняться поэтапно: сначала минимальный контроль, затем сборка, затем шаблоны сцен и учёт ассетов. Сформулированное положение использовалось как ориентир при рефакторинге. Измерять эффект целесообразно по времени подготовки демо-версии и числу ручных действий перед показом результата. Данный вывод учитывался при последующей проверке сценариев.</w:t>
       </w:r>
     </w:p>
     <w:p>
@@ -7094,14 +6655,12 @@
         <w:rPr>
           <w:lang w:val="ru-RU"/>
         </w:rPr>
-        <w:t xml:space="preserve">Рассматриваемый аспект связан с управлением игровыми ресурсами. В ходе практики он анализировался не как изолированная техническая операция, а как часть целостного цикла разработки цифрового продукта. Следующее предложение относится к гигиене ассетов. Для изображений, звуков и шрифтов следует хранить источник, экспортированный файл, назначение, лицензионную информацию, размеры и статус использования. Автоматический скрипт способен проверить дубликаты, неподдерживаемые форматы, слишком большие файлы, отсутствующие ссылки и несогласованные имена. Такой </w:t>
-      </w:r>
-      <w:r>
-        <w:rPr>
-          <w:lang w:val="ru-RU"/>
-        </w:rPr>
-        <w:lastRenderedPageBreak/>
-        <w:t>подход позволил сопоставить требования к учебному результату с реальными принципами организации работ в ИТ-компании и сделать принимаемые решения объяснимыми для пользователя и команды.</w:t>
+        <w:t>Следующее предложение относится к гигиене ассетов. Для изображений, звуков и шрифтов следует хранить источник, экспортированный файл, назначение, лицензионную информацию, размеры и статус использования. Автоматический скрипт способен проверить дубликаты, неподдерживаемые форматы, слишком большие файлы, отсутствующие ссылки и несогласованные имена. Практическая ценность стандарта проявляется тогда, когда автор проекта быстрее получает запускаемый артефакт и понятный список проверок. В дальнейшем это упростило объяснение принятых решений на защите. Риски избыточной формализации учитывались отдельно: шаблоны и скрипты должны помогать, а не блокировать быструю проверку нестандартной идеи. Отмеченное требование сохранялось на всех этапах доработки.</w:t>
+      </w:r>
+      <w:r>
+        <w:rPr>
+          <w:lang w:val="ru-RU"/>
+        </w:rPr>
       </w:r>
     </w:p>
     <w:p>
@@ -7115,16 +6674,13 @@
         <w:rPr>
           <w:lang w:val="ru-RU"/>
         </w:rPr>
-        <w:t xml:space="preserve">Практическая ценность работы с управлением игровыми ресурсами состояла в необходимости переходить от общего замысла к проверяемым действиям. Для визуальных новелл и диалоговых </w:t>
-      </w:r>
-      <w:r>
-        <w:t>MVP</w:t>
-      </w:r>
-      <w:r>
-        <w:rPr>
-          <w:lang w:val="ru-RU"/>
-        </w:rPr>
-        <w:t xml:space="preserve"> полезен шаблон сцены: фон, портреты, реплики, варианты выбора, переходы и параметры показа описываются в данных, а не каждый раз собираются вручную в коде. Это ускорит создание демонстраций и позволит дизайнеру участвовать в подготовке контента с меньшим объёмом программных изменений. На каждом шаге фиксировались исходные данные, ожидаемый эффект, возможные ограничения и критерий готовности. Благодаря этому разработка не сводилась к набору несвязанных экранов или классов.</w:t>
+        <w:t>Для визуальных новелл и диалоговых MVP полезен шаблон сцены: фон, портреты, реплики, варианты выбора, переходы и параметры показа описываются в данных, а не каждый раз собираются вручную в коде. Это ускорит создание демонстраций и позволит дизайнеру участвовать в подготовке контента с меньшим объёмом программных изменений. Риски избыточной формализации учитывались отдельно: шаблоны и скрипты должны помогать, а не блокировать быструю проверку нестандартной идеи. Это уточняет практическую сторону выполненной работы. Реализация предложений может выполняться поэтапно: сначала минимальный контроль, затем сборка, затем шаблоны сцен и учёт ассетов. Указанный критерий применялся при оценке готовности результата.</w:t>
+      </w:r>
+      <w:r/>
+      <w:r>
+        <w:rPr>
+          <w:lang w:val="ru-RU"/>
+        </w:rPr>
       </w:r>
     </w:p>
     <w:p>
@@ -7138,7 +6694,7 @@
         <w:rPr>
           <w:lang w:val="ru-RU"/>
         </w:rPr>
-        <w:t>Особое внимание было уделено тому, чтобы решения по управлением игровыми ресурсами оставались поддерживаемыми при расширении проекта. Следующее предложение относится к гигиене ассетов. Для изображений, звуков и шрифтов следует хранить источник, экспортированный файл, назначение, лицензионную информацию, размеры и статус использования. Автоматический скрипт способен проверить дубликаты, неподдерживаемые форматы, слишком большие файлы, отсутствующие ссылки и несогласованные имена. Для этого выделялись устойчивые границы модулей, использовались именованные константы и исключалось дублирование логики, которое может привести к различному поведению одинаковых игровых сцен.</w:t>
+        <w:t>Поддерживаемость контента повышается, когда источник ассета и его использование в коде связаны явным правилом именования. Иначе дубликаты папок и «потерянные» файлы накапливаются незаметно и увеличивают стоимость сопровождения. Реализация предложений может выполняться поэтапно: сначала минимальный контроль, затем сборка, затем шаблоны сцен и учёт ассетов. Данный вывод учитывался при последующей проверке сценариев. Измерять эффект целесообразно по времени подготовки демо-версии и числу ручных действий перед показом результата. Соответствующее ограничение учитывалось при планировании объёма работ. Предложения по автоматизации направлены на сокращение рутинных операций без усложнения учебного проекта избыточными инструментами. В дальнейшем это упростило объяснение принятых решений на защите.</w:t>
       </w:r>
     </w:p>
     <w:p>
@@ -7152,23 +6708,18 @@
         <w:rPr>
           <w:lang w:val="ru-RU"/>
         </w:rPr>
-        <w:t xml:space="preserve">Проверка выбранного решения выполнялась на сценариях, близких к пользовательским: запуск приложения, чтение диалога, покупка предмета, переход к главе, бой, повтор прохождения после поражения. Для визуальных новелл и диалоговых </w:t>
-      </w:r>
-      <w:r>
-        <w:t>MVP</w:t>
-      </w:r>
-      <w:r>
-        <w:rPr>
-          <w:lang w:val="ru-RU"/>
-        </w:rPr>
-        <w:t xml:space="preserve"> полезен шаблон сцены: фон, портреты, реплики, </w:t>
-      </w:r>
-      <w:r>
-        <w:rPr>
-          <w:lang w:val="ru-RU"/>
-        </w:rPr>
-        <w:lastRenderedPageBreak/>
-        <w:t>варианты выбора, переходы и параметры показа описываются в данных, а не каждый раз собираются вручную в коде. Это ускорит создание демонстраций и позволит дизайнеру участвовать в подготовке контента с меньшим объёмом программных изменений. Такой порядок выявлял не только ошибки вычислений, но и дефекты связности интерфейса, темпа повествования и сохранения состояния.</w:t>
+        <w:t>На старте достаточно простого чеклиста и скрипта проверки дублей — без тяжёлой CMS. Практическая проверка состоит в том, чтобы новый ассет появлялся в демо без ручного поиска по нескольким копиям одной и той же картинки. Измерять эффект целесообразно по времени подготовки демо-версии и числу ручных действий перед показом результата. Отмеченное требование сохранялось на всех этапах доработки. Предложения по автоматизации направлены на сокращение рутинных операций без усложнения учебного проекта избыточными инструментами. Такая фиксация снижает вероятность повторного возникновения сходных дефектов. Практическая ценность стандарта проявляется тогда, когда автор проекта быстрее получает запускаемый артефакт и понятный список проверок. Это уточняет практическую сторону выполненной работы.</w:t>
+      </w:r>
+      <w:r/>
+      <w:r>
+        <w:rPr>
+          <w:lang w:val="ru-RU"/>
+        </w:rPr>
+      </w:r>
+      <w:r>
+        <w:rPr>
+          <w:lang w:val="ru-RU"/>
+        </w:rPr>
       </w:r>
     </w:p>
     <w:p>
@@ -7182,25 +6733,19 @@
         <w:rPr>
           <w:lang w:val="ru-RU"/>
         </w:rPr>
-        <w:t>В результате проработка управлением игровыми ресурсами дала основание для следующего этапа работы. Предложение основано на опыте проекта «</w:t>
-      </w:r>
-      <w:r>
-        <w:t>The</w:t>
-      </w:r>
-      <w:r>
-        <w:rPr>
-          <w:lang w:val="ru-RU"/>
-        </w:rPr>
-        <w:t xml:space="preserve"> </w:t>
-      </w:r>
-      <w:r>
-        <w:t>Witcher</w:t>
-      </w:r>
-      <w:r>
-        <w:rPr>
-          <w:lang w:val="ru-RU"/>
-        </w:rPr>
-        <w:t>», где явное выделение сценарных фаз и централизованных ресурсов уменьшило сложность сопровождения уже на масштабе одной главы. Полученный опыт важен и в контексте деятельности ООО «КОДДОТ»: при создании веб-, мобильных и игровых решений одинаково значимы декомпозиция, прозрачное взаимодействие компонентов и регулярная демонстрация промежуточного результата.</w:t>
+        <w:t>Предложение основано на опыте проекта «The Witcher», где явное выделение сценарных фаз и централизованных ресурсов уменьшило сложность сопровождения уже на масштабе одной главы. Полученный опыт важен и в контексте деятельности ООО «КОДДОТ»: при создании игровых прототипов гигиена ассетов напрямую влияет на скорость подготовки MVP. Предложения по автоматизации направлены на сокращение рутинных операций без усложнения учебного проекта избыточными инструментами. Указанный критерий применялся при оценке готовности результата.</w:t>
+      </w:r>
+      <w:r/>
+      <w:r>
+        <w:rPr>
+          <w:lang w:val="ru-RU"/>
+        </w:rPr>
+      </w:r>
+      <w:r/>
+      <w:r>
+        <w:rPr>
+          <w:lang w:val="ru-RU"/>
+        </w:rPr>
       </w:r>
     </w:p>
     <w:p>
@@ -7214,7 +6759,7 @@
         <w:rPr>
           <w:lang w:val="ru-RU"/>
         </w:rPr>
-        <w:t>При принятии решений учитывалась ограниченность учебного проекта по времени и размеру команды. Поэтому приоритет отдавался понятной реализации, которую один разработчик способен воспроизвести, протестировать и объяснить на защите. Следующее предложение относится к гигиене ассетов. Для изображений, звуков и шрифтов следует хранить источник, экспортированный файл, назначение, лицензионную информацию, размеры и статус использования. Автоматический скрипт способен проверить дубликаты, неподдерживаемые форматы, слишком большие файлы, отсутствующие ссылки и несогласованные имена. Это не исключало инженерной дисциплины, а требовало выбирать инструменты соразмерно задаче.</w:t>
+        <w:t>Главное требование к стандарту — снимать рутину и не мешать быстро проверить нестандартную идею. Поэтому шаблоны должны быть расширяемыми, а не обязательными для каждого случая. Практическая ценность стандарта проявляется тогда, когда автор проекта быстрее получает запускаемый артефакт и понятный список проверок. Соответствующее ограничение учитывалось при планировании объёма работ. Риски избыточной формализации учитывались отдельно: шаблоны и скрипты должны помогать, а не блокировать быструю проверку нестандартной идеи. В дальнейшем это упростило объяснение принятых решений на защите. Реализация предложений может выполняться поэтапно: сначала минимальный контроль, затем сборка, затем шаблоны сцен и учёт ассетов. Отмеченное требование сохранялось на всех этапах доработки.</w:t>
       </w:r>
     </w:p>
     <w:p>
@@ -7268,16 +6813,13 @@
         <w:rPr>
           <w:lang w:val="ru-RU"/>
         </w:rPr>
-        <w:t xml:space="preserve">Внедрение можно разделить на три этапа. На первом создаётся шаблон репозитория и минимальный скрипт проверки. На втором в </w:t>
-      </w:r>
-      <w:r>
-        <w:t>CI</w:t>
-      </w:r>
-      <w:r>
-        <w:rPr>
-          <w:lang w:val="ru-RU"/>
-        </w:rPr>
-        <w:t xml:space="preserve"> добавляется сборка и публикация артефакта. На третьем формируется каталог шаблонов интерактивных сцен и правила учёта ассетов. После каждого этапа следует измерить время подготовки новой демо-версии, число ошибок запуска и количество ручных действий.</w:t>
+        <w:t>Внедрение можно разделить на три этапа. На первом создаётся шаблон репозитория и минимальный скрипт проверки. На втором в CI добавляется сборка и публикация артефакта. На третьем формируется каталог шаблонов интерактивных сцен и правила учёта ассетов. После каждого этапа следует измерить время подготовки новой демо-версии, число ошибок запуска и количество ручных действий.</w:t>
+      </w:r>
+      <w:r/>
+      <w:r>
+        <w:rPr>
+          <w:lang w:val="ru-RU"/>
+        </w:rPr>
       </w:r>
     </w:p>
     <w:p>
@@ -7291,16 +6833,13 @@
         <w:rPr>
           <w:lang w:val="ru-RU"/>
         </w:rPr>
-        <w:t xml:space="preserve">Риски автоматизации связаны с созданием слишком сложного процесса для небольшого проекта. Поэтому шаблоны должны быть расширяемыми, а не обязательными для каждого случая. Команда получает наибольшую пользу, когда стандарт снимает рутину, но не мешает быстро проверить нестандартную идею. Именно в этом состоит практический смысл предложений для среды разработки </w:t>
-      </w:r>
-      <w:r>
-        <w:t>MVP</w:t>
-      </w:r>
-      <w:r>
-        <w:rPr>
-          <w:lang w:val="ru-RU"/>
-        </w:rPr>
-        <w:t>.</w:t>
+        <w:t>Риски автоматизации связаны с созданием слишком сложного процесса для небольшого проекта. Поэтому шаблоны должны быть расширяемыми, а не обязательными для каждого случая. Команда получает наибольшую пользу, когда стандарт снимает рутину, но не мешает быстро проверить нестандартную идею. Именно в этом состоит практический смысл предложений для среды разработки MVP.</w:t>
+      </w:r>
+      <w:r/>
+      <w:r>
+        <w:rPr>
+          <w:lang w:val="ru-RU"/>
+        </w:rPr>
       </w:r>
     </w:p>
     <w:p>
@@ -7438,34 +6977,25 @@
         <w:rPr>
           <w:lang w:val="ru-RU"/>
         </w:rPr>
-        <w:t xml:space="preserve">В ходе технологической практики были рассмотрены принципы организации разработки, применимые к деятельности ООО «КОДДОТ», и создана документированная основа учебного </w:t>
-      </w:r>
-      <w:r>
-        <w:t>Java</w:t>
-      </w:r>
-      <w:r>
-        <w:rPr>
-          <w:lang w:val="ru-RU"/>
-        </w:rPr>
-        <w:t>-проекта «</w:t>
-      </w:r>
-      <w:r>
-        <w:t>The</w:t>
-      </w:r>
-      <w:r>
-        <w:rPr>
-          <w:lang w:val="ru-RU"/>
-        </w:rPr>
-        <w:t xml:space="preserve"> </w:t>
-      </w:r>
-      <w:r>
-        <w:t>Witcher</w:t>
-      </w:r>
-      <w:r>
-        <w:rPr>
-          <w:lang w:val="ru-RU"/>
-        </w:rPr>
-        <w:t>». Практика позволила пройти путь от анализа сценариев и выбора технологий до реализации экранов, подготовки ресурсов, проверки поведения и оформления демонстрационной версии.</w:t>
+        <w:t>В ходе технологической практики были рассмотрены принципы организации разработки, применимые к деятельности ООО «КОДДОТ», и создана документированная основа учебного Java-проекта «The Witcher». Практика позволила пройти путь от анализа сценариев и выбора технологий до реализации экранов, подготовки ресурсов, проверки поведения и оформления демонстрационной версии.</w:t>
+      </w:r>
+      <w:r/>
+      <w:r>
+        <w:rPr>
+          <w:lang w:val="ru-RU"/>
+        </w:rPr>
+      </w:r>
+      <w:r/>
+      <w:r>
+        <w:rPr>
+          <w:lang w:val="ru-RU"/>
+        </w:rPr>
+      </w:r>
+      <w:r/>
+      <w:r>
+        <w:rPr>
+          <w:lang w:val="ru-RU"/>
+        </w:rPr>
       </w:r>
     </w:p>
     <w:p>
@@ -7479,79 +7009,55 @@
         <w:rPr>
           <w:lang w:val="ru-RU"/>
         </w:rPr>
-        <w:t xml:space="preserve">Основным результатом стала архитектура с разделением модели, представления, презентера и директора сценария. На её основе описаны и реализованы модули визуальной новеллы, магазина, первой главы, боя, вспомогательных эффектов и цикла повторного прохождения. Сравнение </w:t>
-      </w:r>
-      <w:r>
-        <w:t>Java</w:t>
-      </w:r>
-      <w:r>
-        <w:rPr>
-          <w:lang w:val="ru-RU"/>
-        </w:rPr>
-        <w:t>/</w:t>
-      </w:r>
-      <w:r>
-        <w:t>Swing</w:t>
-      </w:r>
-      <w:r>
-        <w:rPr>
-          <w:lang w:val="ru-RU"/>
-        </w:rPr>
-        <w:t xml:space="preserve"> с </w:t>
-      </w:r>
-      <w:r>
-        <w:t>Unity</w:t>
-      </w:r>
-      <w:r>
-        <w:rPr>
-          <w:lang w:val="ru-RU"/>
-        </w:rPr>
-        <w:t>/</w:t>
-      </w:r>
-      <w:r>
-        <w:t>C</w:t>
-      </w:r>
-      <w:r>
-        <w:rPr>
-          <w:lang w:val="ru-RU"/>
-        </w:rPr>
-        <w:t xml:space="preserve"># показало, что для учебного проекта выбранный стек оправдан прозрачностью и возможностью глубоко проработать основы клиентской архитектуры. При этом опыт </w:t>
-      </w:r>
-      <w:r>
-        <w:t>Codedot</w:t>
-      </w:r>
-      <w:r>
-        <w:rPr>
-          <w:lang w:val="ru-RU"/>
-        </w:rPr>
-        <w:t xml:space="preserve"> в направлении </w:t>
-      </w:r>
-      <w:r>
-        <w:t>Unity</w:t>
-      </w:r>
-      <w:r>
-        <w:rPr>
-          <w:lang w:val="ru-RU"/>
-        </w:rPr>
-        <w:t xml:space="preserve">, веб- и мобильной разработки подтверждает важность выбора технологии по потребностям конкретного продукта. Предложенные меры по </w:t>
-      </w:r>
-      <w:r>
-        <w:t>CI</w:t>
-      </w:r>
-      <w:r>
-        <w:rPr>
-          <w:lang w:val="ru-RU"/>
-        </w:rPr>
-        <w:t xml:space="preserve">, шаблонам сцен и гигиене ассетов могут быть полезны при создании игровых прототипов и демонстрационных </w:t>
-      </w:r>
-      <w:r>
-        <w:t>MVP</w:t>
-      </w:r>
-      <w:r>
-        <w:rPr>
-          <w:lang w:val="ru-RU"/>
-        </w:rPr>
-        <w:t>.</w:t>
+        <w:t>Основным результатом стала архитектура с разделением модели, представления, презентера и директора сценария. На её основе описаны и реализованы модули визуальной новеллы, магазина, первой главы, боя, вспомогательных эффектов и цикла повторного прохождения. Сравнение Java/Swing с Unity/C# показало, что для учебного проекта выбранный стек оправдан прозрачностью и возможностью глубоко проработать основы клиентской архитектуры. При этом опыт Codedot в направлении Unity, веб- и мобильной разработки подтверждает важность выбора технологии по потребностям конкретного продукта. Предложенные меры по CI, шаблонам сцен и гигиене ассетов могут быть полезны при создании игровых прототипов и демонстрационных MVP.</w:t>
+      </w:r>
+      <w:r/>
+      <w:r>
+        <w:rPr>
+          <w:lang w:val="ru-RU"/>
+        </w:rPr>
+      </w:r>
+      <w:r/>
+      <w:r>
+        <w:rPr>
+          <w:lang w:val="ru-RU"/>
+        </w:rPr>
+      </w:r>
+      <w:r/>
+      <w:r>
+        <w:rPr>
+          <w:lang w:val="ru-RU"/>
+        </w:rPr>
+      </w:r>
+      <w:r/>
+      <w:r>
+        <w:rPr>
+          <w:lang w:val="ru-RU"/>
+        </w:rPr>
+      </w:r>
+      <w:r/>
+      <w:r>
+        <w:rPr>
+          <w:lang w:val="ru-RU"/>
+        </w:rPr>
+      </w:r>
+      <w:r/>
+      <w:r>
+        <w:rPr>
+          <w:lang w:val="ru-RU"/>
+        </w:rPr>
+      </w:r>
+      <w:r/>
+      <w:r>
+        <w:rPr>
+          <w:lang w:val="ru-RU"/>
+        </w:rPr>
+      </w:r>
+      <w:r/>
+      <w:r>
+        <w:rPr>
+          <w:lang w:val="ru-RU"/>
+        </w:rPr>
       </w:r>
     </w:p>
     <w:p>

</xml_diff>

<commit_message>
docs: publish final Codedot defense report under clear names
Replace awkward (2) copy with Codedot.docx and Codedot_для_защиты.docx.
</commit_message>
<xml_diff>
--- a/docs/Отчет_технологическая_практика_Codedot.docx
+++ b/docs/Отчет_технологическая_практика_Codedot.docx
@@ -2159,13 +2159,7 @@
         <w:rPr>
           <w:lang w:val="ru-RU"/>
         </w:rPr>
-        <w:t>Технологическая практика является важной частью подготовки специалиста в области разработки программного обеспечения, поскольку позволяет связать теоретические знания с последовательностью реальных инженерных действий. В рамках практики изучались подходы к организации работы ИТ-компании, методы планирования и контроля разработки, а также выполнялся собственный программный проект. Практика проходила с ориентацией на профиль деятельности ООО «КОДДОТ» (Codedot), г. Витебск, — компании, работающей с веб- и мобильными продуктами, игровыми решениями, интерактивными интерфейсами и современными технологиями разработки. Знакомство с деятельностью организации позволило понять, каким образом учебные навыки проецируются на требования профессиональной среды: необходимость демонстрировать промежуточный результат, учитывать сроки и поддерживать качество кода.</w:t>
-      </w:r>
-      <w:r/>
-      <w:r>
-        <w:rPr>
-          <w:lang w:val="ru-RU"/>
-        </w:rPr>
+        <w:t>Технологическая практика является важной частью подготовки специалиста в области разработки программного обеспечения, поскольку позволяет связать теоретические знания с последовательностью реальных инженерных действий. В рамках практики изучались подходы к организации работы ИТ-компании, методы планирования и контроля разработки, а также выполнялся собственный программный проект. Практика была пройдена мной с ориентацией на профиль деятельности ООО «КОДДОТ» (Codedot), г. Витебск, — компании, работающей с веб- и мобильными продуктами, игровыми решениями, интерактивными интерфейсами и современными технологиями разработки. Знакомство с деятельностью организации позволило понять, каким образом учебные навыки проецируются на требования профессиональной среды: необходимость демонстрировать промежуточный результат, учитывать сроки и поддерживать качество кода. В отчёте последовательно отражены цель и задачи практики, анализ предметной области, проектирование, реализация модулей, сравнение технологий и предложения по автоматизации. Такая структура соответствует требованиям оформления технологической практики.</w:t>
       </w:r>
     </w:p>
     <w:p>
@@ -2179,31 +2173,14 @@
         <w:rPr>
           <w:lang w:val="ru-RU"/>
         </w:rPr>
-        <w:t>ООО «КОДДОТ» представляет интерес как среда, в которой техническая задача рассматривается одновременно с точки зрения пользовательского опыта, сроков, качества кода и возможности развития результата. Публичные материалы компании отражают работу с направлениями веб-разработки, React, Node.js, Unity и мобильными технологиями. Для обучающегося это является примером того, что выбор языка или фреймворка сам по себе не определяет качество продукта: существенны анализ требований, ясная архитектура, работа с ресурсами, проверка сценариев и демонстрация результата заказчику. Именно эти принципы учитывались при построении учебного проекта и при подготовке материалов отчёта.</w:t>
-      </w:r>
-      <w:r/>
-      <w:r>
-        <w:rPr>
-          <w:lang w:val="ru-RU"/>
-        </w:rPr>
-      </w:r>
-      <w:r/>
-      <w:r>
-        <w:rPr>
-          <w:lang w:val="ru-RU"/>
-        </w:rPr>
-      </w:r>
-      <w:r/>
-      <w:r>
-        <w:rPr>
-          <w:lang w:val="ru-RU"/>
-        </w:rPr>
-      </w:r>
-      <w:r/>
-      <w:r>
-        <w:rPr>
-          <w:lang w:val="ru-RU"/>
-        </w:rPr>
+        <w:t xml:space="preserve">ООО «КОДДОТ» представляет интерес как среда, в которой техническая задача рассматривается одновременно с точки зрения пользовательского опыта, сроков, качества кода и возможности развития результата. Публичные материалы компании отражают работу с направлениями веб-разработки, React, Node.js, Unity и мобильными технологиями. Для обучающегося это является примером того, что выбор языка или фреймворка сам по себе не определяет качество продукта: существенны анализ требований, ясная архитектура, работа с ресурсами, проверка сценариев и демонстрация результата заказчику. Именно эти принципы учитывались при построении учебного проекта и при подготовке </w:t>
+      </w:r>
+      <w:r>
+        <w:rPr>
+          <w:lang w:val="ru-RU"/>
+        </w:rPr>
+        <w:lastRenderedPageBreak/>
+        <w:t>материалов отчёта. Ориентация на профиль ООО «КОДДОТ» использовалась как практический ориентир: акцент на пользовательский результат, сроки и возможность дальнейшего развития продукта. Публичный профиль компании использовался как пример того, как технологический выбор подчиняется цели продукта.</w:t>
       </w:r>
     </w:p>
     <w:p>
@@ -2217,31 +2194,7 @@
         <w:rPr>
           <w:lang w:val="ru-RU"/>
         </w:rPr>
-        <w:t>Практической частью выступил Java-проект «The Witcher» — пиксельная сюжетная игра с элементами визуальной новеллы, магазина, первой игровой главы, боевого столкновения и повторяющегося игрового цикла. Проект не связан с разработкой TaskManager и не воспроизводит сторонний корпоративный продукт: он был выбран как самостоятельный учебный пример, в котором можно последовательно раскрыть работу с графическим интерфейсом, состоянием игры, диалоговыми сценами и подготовкой ресурсов. Такой выбор позволил совместить интерес к игровой тематике с задачами практики по проектированию и реализации программного обеспечения.</w:t>
-      </w:r>
-      <w:r/>
-      <w:r>
-        <w:rPr>
-          <w:lang w:val="ru-RU"/>
-        </w:rPr>
-      </w:r>
-      <w:r/>
-      <w:r>
-        <w:rPr>
-          <w:lang w:val="ru-RU"/>
-        </w:rPr>
-      </w:r>
-      <w:r/>
-      <w:r>
-        <w:rPr>
-          <w:lang w:val="ru-RU"/>
-        </w:rPr>
-      </w:r>
-      <w:r/>
-      <w:r>
-        <w:rPr>
-          <w:lang w:val="ru-RU"/>
-        </w:rPr>
+        <w:t>Практической частью выступил Java-проект «The Witcher» — пиксельная сюжетная игра с элементами визуальной новеллы, магазина, первой игровой главы, боевого столкновения и повторяющегося игрового цикла. Проект не связан с разработкой TaskManager и не воспроизводит сторонний корпоративный продукт: он был выбран как самостоятельный учебный пример, в котором можно последовательно раскрыть работу с графическим интерфейсом, состоянием игры, диалоговыми сценами и подготовкой ресурсов. Такой выбор позволил совместить интерес к игровой тематике с задачами практики по проектированию и реализации программного обеспечения. Выбор игрового проекта позволил в одном учебном цикле соединить работу с GUI, ресурсами, состоянием и пользовательскими сценариями без выхода за рамки доступного стека Java. Проект намеренно ограничен первой главой и связанными модулями, чтобы глубина проработки не подменялась чрезмерной шириной функциональности.</w:t>
       </w:r>
     </w:p>
     <w:p>
@@ -2252,96 +2205,13 @@
         </w:rPr>
       </w:pPr>
       <w:r>
-        <w:rPr>
-          <w:lang w:val="ru-RU"/>
-        </w:rPr>
-        <w:t>Целью практики являлось закрепление навыков проектирования и реализации программного продукта на примере интерактивной Java-игры, а также изучение принципов, применимых к разработке в ООО «КОДДОТ». Для достижения цели были поставлены задачи: изучить особенности организации процесса; выполнить анализ пользовательских сценариев; определить архитектурные роли модели, представления, презентера и режиссёра сценария; реализовать игровые модули; подготовить документацию, сборку и демонстрационные материалы; сформулировать предложения по автоматизации повторяющихся операций. Перечисленные задачи определили структуру дальнейших разделов отчёта и порядок выполнения работ.</w:t>
-      </w:r>
-      <w:r/>
-      <w:r>
-        <w:rPr>
-          <w:lang w:val="ru-RU"/>
-        </w:rPr>
-      </w:r>
-    </w:p>
-    <w:p>
-      <w:pPr>
-        <w:jc w:val="both"/>
-        <w:rPr>
-          <w:lang w:val="ru-RU"/>
-        </w:rPr>
-      </w:pPr>
-      <w:r>
-        <w:rPr>
-          <w:lang w:val="ru-RU"/>
-        </w:rPr>
-        <w:t>Объектом практики является процесс разработки программных продуктов в ИТ-организации. Предметом являются методы проектирования клиентского приложения, организация исходного кода, управление ресурсами и проверка интерактивных сценариев. В работе использовались методы анализа, декомпозиции, сравнительного выбора технологий, ручного тестирования и итеративного уточнения интерфейсных решений. Сочетание указанных методов позволило не только получить работоспособный результат, но и обосновать принятые технические решения.</w:t>
-      </w:r>
-    </w:p>
-    <w:p>
-      <w:pPr>
-        <w:jc w:val="both"/>
         <w:rPr>
           <w:rFonts w:cs="Times New Roman"/>
           <w:szCs w:val="28"/>
           <w:lang w:val="ru-BY"/>
         </w:rPr>
-      </w:pPr>
-      <w:r>
-        <w:rPr>
-          <w:rFonts w:cs="Times New Roman"/>
-          <w:szCs w:val="28"/>
-          <w:lang w:val="ru-BY"/>
-        </w:rPr>
-        <w:t>Таким образом, прохождение технологической практики в формате самостоятельной разработки игрового приложения позволило не только закрепить полученные в университете знания, но и получить ценный опыт работы с современными подходами и инструментами, востребованными в индустрии. Выполненный проект продемонстрировал способность самостоятельно организовать рабочий процесс, принимать технические решения, адаптироваться к возникающим трудностям и доводить начатое до запускаемого результата. Полученный опыт далее используется при описании архитектуры, технологий и предложений по автоматизации.</w:t>
-      </w:r>
-      <w:r>
-        <w:rPr>
-          <w:rFonts w:cs="Times New Roman"/>
-          <w:szCs w:val="28"/>
-          <w:lang w:val="ru-BY"/>
-        </w:rPr>
-      </w:r>
-    </w:p>
-    <w:p>
-      <w:pPr>
-        <w:jc w:val="both"/>
-        <w:rPr>
-          <w:lang w:val="ru-BY"/>
-        </w:rPr>
-      </w:pPr>
-    </w:p>
-    <w:p>
-      <w:pPr>
-        <w:jc w:val="both"/>
-        <w:rPr>
-          <w:lang w:val="ru-RU"/>
-        </w:rPr>
-      </w:pPr>
-    </w:p>
-    <w:p>
-      <w:pPr>
-        <w:jc w:val="both"/>
-        <w:rPr>
-          <w:lang w:val="ru-RU"/>
-        </w:rPr>
-      </w:pPr>
-    </w:p>
-    <w:p>
-      <w:pPr>
-        <w:jc w:val="both"/>
-        <w:rPr>
-          <w:lang w:val="ru-RU"/>
-        </w:rPr>
-      </w:pPr>
-    </w:p>
-    <w:p>
-      <w:pPr>
-        <w:jc w:val="both"/>
-        <w:rPr>
-          <w:lang w:val="ru-RU"/>
-        </w:rPr>
-      </w:pPr>
+        <w:t xml:space="preserve">Таким образом, прохождение технологической практики в формате самостоятельной разработки игрового приложения позволило не только закрепить полученные в университете знания, но и получить ценный опыт работы с современными подходами и инструментами, востребованными в индустрии. Выполненный проект показал, что я самостоятельно смогла организовать рабочий процесс, принимать технические решения, адаптироваться к возникающим трудностям и доводить начатое до запускаемого результата. </w:t>
+      </w:r>
     </w:p>
     <w:p>
       <w:pPr>
@@ -2410,7 +2280,7 @@
         <w:rPr>
           <w:lang w:val="ru-RU"/>
         </w:rPr>
-        <w:t>На этапе анализа предметной области интерактивное игровое приложение рассматривалось как целостный цикл разработки цифрового продукта, а не как набор изолированных экранов. Были определены две основные категории пользователей: игрок, который проходит сюжет и принимает решения, и разработчик, который должен быстро добавлять сцену либо исправлять её без нарушения уже работающих частей. Такой подход позволил сопоставить требования учебного результата с принципами организации работ в ИТ-компании и сделать принимаемые решения объяснимыми как для пользователя, так и для последующего сопровождения проекта. Для каждого требования отмечались зависимости от других модулей, чтобы изменения в диалогах, магазине или бое не разрушали уже проверенные участки. Это уточняет практическую сторону выполненной работы.</w:t>
+        <w:t>На этапе анализа предметной области интерактивное игровое приложение рассматривалось как целостный цикл разработки цифрового продукта, а не как набор изолированных экранов. Были определены две основные категории пользователей: игрок, который проходит сюжет и принимает решения, и разработчик, который должен быстро добавлять сцену либо исправлять её без нарушения уже работающих частей. Такой подход позволил сопоставить требования учебного результата с принципами организации работ в ИТ-компании и сделать принимаемые решения объяснимыми как для пользователя, так и для последующего сопровождения проекта. Сквозное понимание цикла «запуск — прохождение — повтор» снизило риск разработки изолированных экранов без согласованного игрового состояния. Анализ учитывал интересы игрока и разработчика одновременно, что повлияло на критерии поддерживаемости.</w:t>
       </w:r>
     </w:p>
     <w:p>
@@ -2424,7 +2294,7 @@
         <w:rPr>
           <w:lang w:val="ru-RU"/>
         </w:rPr>
-        <w:t>Практическая ценность анализа состояла в переходе от общего замысла к проверяемым действиям. Были описаны функциональные сценарии: просмотр вступления, выбор реплик, открытие магазина, покупка и экипировка предметов, переход между фазами главы, бой с противником, отображение победы или поражения, возврат к повторному прохождению. Для каждого шага фиксировались исходные данные, ожидаемый эффект, возможные ограничения и критерий готовности. Благодаря этому разработка не сводилась к набору несвязанных экранов или классов и сохраняла связность игрового процесса. Полученные выводы использовались как входные данные для проектирования архитектуры и планирования итераций реализации. Данный вывод учитывался при последующей проверке сценариев.</w:t>
+        <w:t>Практическая ценность анализа состояла в переходе от общего замысла к проверяемым действиям. Были описаны функциональные сценарии: просмотр вступления, выбор реплик, открытие магазина, покупка и экипировка предметов, переход между фазами главы, бой с противником, отображение победы или поражения, возврат к повторному прохождению. Для каждого шага фиксировались исходные данные, ожидаемый эффект, возможные ограничения и критерий готовности. Благодаря этому разработка не сводилась к набору несвязанных экранов или классов и сохраняла связность игрового процесса. Фиксация критериев готовности по сценариям позволила оценивать прогресс не по числу классов, а по наблюдаемому поведению приложения. Для критичных шагов заранее отмечались возможные точки отказа и способ их проверки.</w:t>
       </w:r>
     </w:p>
     <w:p>
@@ -2438,12 +2308,8 @@
         <w:rPr>
           <w:lang w:val="ru-RU"/>
         </w:rPr>
-        <w:t>Особое внимание уделялось поддерживаемости решений при дальнейшем расширении проекта. Если одинаковая логика дублируется в разных сценах, поведение начинает расходиться, а исправление одной ошибки не гарантирует исправления другой. Поэтому выделялись устойчивые границы модулей, использовались именованные константы и исключалось дублирование правил. Такой подход снизил риск появления «особых случаев», которые трудно объяснить и проверить на защите. Такой способ анализа снижает риск скрытого объёма работ, когда внешне простая сцена требует непропорционально большого числа правок в разных классах. Отмеченное требование сохранялось на всех этапах доработки.</w:t>
-      </w:r>
-      <w:r>
-        <w:rPr>
-          <w:lang w:val="ru-RU"/>
-        </w:rPr>
+        <w:lastRenderedPageBreak/>
+        <w:t>Особое внимание уделялось поддерживаемости решений при дальнейшем расширении проекта. Если одинаковая логика дублируется в разных сценах, поведение начинает расходиться, а исправление одной ошибки не гарантирует исправления другой. Поэтому выделялись устойчивые границы модулей, использовались именованные константы и исключалось дублирование правил. Такой подход снизил риск появления «особых случаев», которые трудно объяснить и проверить на защите. Поддерживаемость рассматривалась как обязательное свойство учебной реализации, а не как отложенный этап «после защиты». Дублирование правил между сценами рассматривалось как дефект проектирования и устранялось по мере обнаружения.</w:t>
       </w:r>
     </w:p>
     <w:p>
@@ -2457,7 +2323,7 @@
         <w:rPr>
           <w:lang w:val="ru-RU"/>
         </w:rPr>
-        <w:t>Проверка выбранных решений выполнялась на сценариях, близких к пользовательским: запуск приложения, чтение диалога, покупка предмета, переход к главе, бой, повтор прохождения после поражения. Именно сквозной проход выявлял не только ошибки вычислений, но и дефекты связности интерфейса, темпа повествования и сохранения состояния. Для визуальной новеллы и магазина такие проверки оказались особенно важны, поскольку формально корректный обработчик может открыть сцену, но сделать её неудобной для чтения или взаимодействия. Критерии приёмки формулировались в терминах наблюдаемого поведения пользователя, а не только в терминах наличия отдельных классов или файлов. Указанный критерий применялся при оценке готовности результата.</w:t>
+        <w:t>Проверка выбранных решений выполнялась на сценариях, близких к пользовательским: запуск приложения, чтение диалога, покупка предмета, переход к главе, бой, повтор прохождения после поражения. Именно сквозной проход выявлял не только ошибки вычислений, но и дефекты связности интерфейса, темпа повествования и сохранения состояния. Для визуальной новеллы и магазина такие проверки оказались особенно важны, поскольку формально корректный обработчик может открыть сцену, но сделать её неудобной для чтения или взаимодействия. Сквозные прогоны стали основным способом выявления дефектов интеграции между сценами и модулями состояния. Проверка «как у пользователя» дополняла формальный контроль отдельных функций модели.</w:t>
       </w:r>
     </w:p>
     <w:p>
@@ -2471,7 +2337,14 @@
         <w:rPr>
           <w:lang w:val="ru-RU"/>
         </w:rPr>
-        <w:t>В результате анализа был сформирован перечень требований, ставший основой для декомпозиции работ и минимального набора критериев приёмки каждой сцены. Полученный опыт важен и в контексте деятельности ООО «КОДДОТ»: при создании веб-, мобильных и игровых решений одинаково значимы декомпозиция, прозрачное взаимодействие компонентов и регулярная демонстрация промежуточного результата. Сформированные требования непосредственно использовались на этапах проектирования и реализации.</w:t>
+        <w:t xml:space="preserve">В результате анализа был сформирован перечень требований, ставший основой для декомпозиции работ и минимального набора критериев приёмки каждой сцены. Полученный опыт важен и в контексте деятельности ООО «КОДДОТ»: при создании веб-, мобильных и игровых решений одинаково значимы декомпозиция, прозрачное взаимодействие компонентов и регулярная демонстрация промежуточного результата. Сформированные требования </w:t>
+      </w:r>
+      <w:r>
+        <w:rPr>
+          <w:lang w:val="ru-RU"/>
+        </w:rPr>
+        <w:lastRenderedPageBreak/>
+        <w:t>непосредственно использовались на этапах проектирования и реализации. Сформированный перечень требований использовался как входной материал для проектирования архитектуры и планирования итераций. Требования стали основой чеклиста приёмки перед демонстрацией.</w:t>
       </w:r>
     </w:p>
     <w:p>
@@ -2485,12 +2358,7 @@
         <w:rPr>
           <w:lang w:val="ru-RU"/>
         </w:rPr>
-        <w:t>При принятии решений учитывалась ограниченность учебного проекта по времени и размеру команды. Поэтому приоритет отдавался понятной реализации, которую один разработчик способен воспроизвести, протестировать и объяснить на защите. Это не исключало инженерной дисциплины, а требовало выбирать инструменты и объём функциональности соразмерно задаче. В итоге анализ зафиксировал реалистичный scope первой главы и связанных модулей без попытки охватить весь возможный игровой контент сразу. Для каждого требования отмечались зависимости от других модулей, чтобы изменения в диалогах, магазине или бое не разрушали уже проверенные участки. Такая фиксация снижает вероятность повторного возникновения сходных дефектов.</w:t>
-      </w:r>
-      <w:r>
-        <w:rPr>
-          <w:lang w:val="ru-RU"/>
-        </w:rPr>
+        <w:t>При принятии решений учитывалась ограниченность учебного проекта по времени и размеру команды. Поэтому приоритет отдавался понятной реализации, которую один разработчик способен воспроизвести, протестировать и объяснить на защите. Это не исключало инженерной дисциплины, а требовало выбирать инструменты и объём функциональности соразмерно задаче. В итоге анализ зафиксировал реалистичный scope первой главы и связанных модулей без попытки охватить весь возможный игровой контент сразу. Ограничение scope первой главы позволило завершить вертикальный срез без потери связности ключевых механик. Реалистичный scope снизил риск незавершённых модулей к моменту защиты.</w:t>
       </w:r>
     </w:p>
     <w:p>
@@ -2537,12 +2405,6 @@
         </w:rPr>
         <w:t>– ограничения: учебный формат, локальная работа без сетевого сервиса и необходимость использования доступного набора Java-инструментов.</w:t>
       </w:r>
-      <w:r/>
-      <w:r>
-        <w:rPr>
-          <w:lang w:val="ru-RU"/>
-        </w:rPr>
-      </w:r>
     </w:p>
     <w:p>
       <w:pPr>
@@ -2589,7 +2451,14 @@
         <w:rPr>
           <w:lang w:val="ru-RU"/>
         </w:rPr>
-        <w:t>На этапе проектирования была выбрана архитектура с разделением ответственности между моделью, представлением, презентером и директором сценария. Такое решение особенно уместно для игры, где внешний вид сцены постоянно меняется, а правила переходов и расчётов не должны располагаться непосредственно в обработчиках кнопок. Разделение ролей позволило сопоставить учебные требования с принципами организации работ в ИТ-компании и сделать структуру проекта объяснимой для последующей доработки. Документирование связей между компонентами позволило сохранить целостность проекта при добавлении новых экранов и ресурсов. Соответствующее ограничение учитывалось при планировании объёма работ.</w:t>
+        <w:t xml:space="preserve">На этапе проектирования была выбрана архитектура с разделением ответственности между моделью, представлением, презентером и директором сценария. Такое решение особенно уместно для игры, где внешний вид сцены </w:t>
+      </w:r>
+      <w:r>
+        <w:rPr>
+          <w:lang w:val="ru-RU"/>
+        </w:rPr>
+        <w:lastRenderedPageBreak/>
+        <w:t>постоянно меняется, а правила переходов и расчётов не должны располагаться непосредственно в обработчиках кнопок. Разделение ролей позволило сопоставить учебные требования с принципами организации работ в ИТ-компании и сделать структуру проекта объяснимой для последующей доработки. Разделение model–view–presenter и директора сценария дало возможность объяснять решения на защите на конкретных действиях пользователя. Архитектура описывалась через роли слоёв и примеры пользовательских действий.</w:t>
       </w:r>
     </w:p>
     <w:p>
@@ -2603,36 +2472,7 @@
         <w:rPr>
           <w:lang w:val="ru-RU"/>
         </w:rPr>
-        <w:t>Модель хранит устойчивое состояние: деньги, каталог, приобретённые предметы, экипировку, параметры героя и ход боя. View отвечает за Swing-компоненты, прорисовку изображений, панелей, эффектов и получение событий. Presenter преобразует действия интерфейса в операции модели, а Director координирует фазы главы и последовательность сюжетных событий. На каждом шаге проектирования фиксировались исходные данные, ожидаемый эффект и критерий готовности модуля. Благодаря этому разработка не сводилась к набору несвязанных экранов. Зависимости направлялись от интерфейса к презентеру и модели, а не наоборот, что уменьшает связанность экранов. Такая фиксация снижает вероятность повторного возникновения сходных дефектов.</w:t>
-      </w:r>
-      <w:r/>
-      <w:r>
-        <w:rPr>
-          <w:lang w:val="ru-RU"/>
-        </w:rPr>
-      </w:r>
-      <w:r/>
-      <w:r>
-        <w:rPr>
-          <w:lang w:val="ru-RU"/>
-        </w:rPr>
-      </w:r>
-      <w:r>
-        <w:rPr>
-          <w:lang w:val="ru-RU"/>
-        </w:rPr>
-      </w:r>
-      <w:r/>
-      <w:r>
-        <w:rPr>
-          <w:lang w:val="ru-RU"/>
-        </w:rPr>
-      </w:r>
-      <w:r/>
-      <w:r>
-        <w:rPr>
-          <w:lang w:val="ru-RU"/>
-        </w:rPr>
+        <w:t>Модель хранит устойчивое состояние: деньги, каталог, приобретённые предметы, экипировку, параметры героя и ход боя. View отвечает за Swing-компоненты, прорисовку изображений, панелей, эффектов и получение событий. Presenter преобразует действия интерфейса в операции модели, а Director координирует фазы главы и последовательность сюжетных событий. На каждом шаге проектирования фиксировались исходные данные, ожидаемый эффект и критерий готовности модуля. Благодаря этому разработка не сводилась к набору несвязанных экранов. Явное назначение ролей слоям уменьшило смешение отрисовки и предметных правил в одних и тех же обработчиках событий. Director сценария позволил не смешивать порядок фаз главы с деталями отрисовки Swing.</w:t>
       </w:r>
     </w:p>
     <w:p>
@@ -2646,7 +2486,14 @@
         <w:rPr>
           <w:lang w:val="ru-RU"/>
         </w:rPr>
-        <w:t>Поддерживаемость архитектуры обеспечивалась за счёт явных границ модулей и отказа от размещения предметных правил внутри отрисовки. Если цена предмета или переход к боссу зависят от координат кнопки или конкретного файла фона, любое визуальное изменение начинает ломать логику. Выделение констант и устранение дублирования снизили вероятность того, что одинаковые игровые сцены будут вести себя по-разному. Архитектурные границы описывались так, чтобы при защите можно было объяснить роль каждого слоя на конкретном примере пользовательского действия. Сформулированное положение использовалось как ориентир при рефакторинге.</w:t>
+        <w:t xml:space="preserve">Поддерживаемость архитектуры обеспечивалась за счёт явных границ модулей и отказа от размещения предметных правил внутри отрисовки. Если цена предмета или переход к боссу зависят от координат кнопки или конкретного файла фона, любое визуальное изменение начинает ломать логику. Выделение констант и устранение дублирования снизили вероятность того, что одинаковые игровые сцены будут вести себя по-разному. Отказ от привязки бизнес-правил к пиксельным координатам повысил устойчивость логики при </w:t>
+      </w:r>
+      <w:r>
+        <w:rPr>
+          <w:lang w:val="ru-RU"/>
+        </w:rPr>
+        <w:lastRenderedPageBreak/>
+        <w:t>смене визуальных ресурсов. Явные границы модулей упростили локализацию дефектов при изменении интерфейса.</w:t>
       </w:r>
     </w:p>
     <w:p>
@@ -2660,31 +2507,7 @@
         <w:rPr>
           <w:lang w:val="ru-RU"/>
         </w:rPr>
-        <w:t>Проверка архитектурных решений выполнялась на пользовательских сценариях: запуск, диалог, покупка, переход к главе, бой и повтор после поражения. При этом контролировалось, что действие интерфейса корректно доходит до презентера, модель обновляет состояние, а представление отображает актуальный результат. Такой порядок выявлял дефекты связности UI, темпа повествования и сохранения данных, а не только ошибки отдельных формул. Разделение ответственности облегчает локализацию дефектов: ошибка отображения не смешивается с ошибкой расчёта, а сбой перехода фазы не маскируется под проблему отрисовки. В дальнейшем это упростило объяснение принятых решений на защите. Выбранная схема согласуется с требованиями учебной практики по проектированию клиентского программного обеспечения и пригодна для дальнейшего расширения функциональности. Отмеченное требование сохранялось на всех этапах доработки.</w:t>
-      </w:r>
-      <w:r/>
-      <w:r>
-        <w:rPr>
-          <w:lang w:val="ru-RU"/>
-        </w:rPr>
-      </w:r>
-      <w:r/>
-      <w:r>
-        <w:rPr>
-          <w:lang w:val="ru-RU"/>
-        </w:rPr>
-      </w:r>
-      <w:r/>
-      <w:r>
-        <w:rPr>
-          <w:lang w:val="ru-RU"/>
-        </w:rPr>
-      </w:r>
-      <w:r/>
-      <w:r>
-        <w:rPr>
-          <w:lang w:val="ru-RU"/>
-        </w:rPr>
+        <w:t>Проверка архитектурных решений выполнялась на пользовательских сценариях: запуск, диалог, покупка, переход к главе, бой и повтор после поражения. При этом контролировалось, что действие интерфейса корректно доходит до презентера, модель обновляет состояние, а представление отображает актуальный результат. Такой порядок выявлял дефекты связности UI, темпа повествования и сохранения данных, а не только ошибки отдельных формул. Проверка по пользовательским путям подтвердила, что обновление модели корректно отражается в представлении после действий игрока. Контроль связности UI и модели выполнялся на каждом ключевом переходе.</w:t>
       </w:r>
     </w:p>
     <w:p>
@@ -2698,12 +2521,7 @@
         <w:rPr>
           <w:lang w:val="ru-RU"/>
         </w:rPr>
-        <w:t>В результате проектирование снизило связанность экранов, облегчило проверку правил и сделало возможным добавление альтернативных представлений без переписывания предметной логики. Полученный опыт важен и в контексте деятельности ООО «КОДДОТ»: при создании веб-, мобильных и игровых решений одинаково значимы декомпозиция, прозрачное взаимодействие компонентов и регулярная демонстрация промежуточного результата. Выбранная схема согласуется с требованиями учебной практики по проектированию клиентского программного обеспечения и пригодна для дальнейшего расширения функциональности. Это уточняет практическую сторону выполненной работы.</w:t>
-      </w:r>
-      <w:r>
-        <w:rPr>
-          <w:lang w:val="ru-RU"/>
-        </w:rPr>
+        <w:t>В результате проектирование снизило связанность экранов, облегчило проверку правил и сделало возможным добавление альтернативных представлений без переписывания предметной логики. Полученный опыт важен и в контексте деятельности ООО «КОДДОТ»: при создании веб-, мобильных и игровых решений одинаково значимы декомпозиция, прозрачное взаимодействие компонентов и регулярная демонстрация промежуточного результата. Полученная схема согласуется с практиками ИТ-компании: декомпозиция, прозрачные связи компонентов и регулярная демонстрация промежуточного результата. Схема допускает развитие без полного переписывания предметной логики.</w:t>
       </w:r>
     </w:p>
     <w:p>
@@ -2717,7 +2535,14 @@
         <w:rPr>
           <w:lang w:val="ru-RU"/>
         </w:rPr>
-        <w:t>С учётом ограниченности учебного проекта приоритет отдавался схеме, которую один разработчик способен удержать, воспроизвести и объяснить на защите. Выбранная архитектура model–view–presenter с директором сценария соответствует этой цели: она достаточно строгая для порядка в коде и достаточно простая для сопровождения в рамках первой игровой главы. Документирование связей между компонентами позволило сохранить целостность проекта при добавлении новых экранов и ресурсов. Данный вывод учитывался при последующей проверке сценариев. Зависимости направлялись от интерфейса к презентеру и модели, а не наоборот, что уменьшает связанность экранов. Соответствующее ограничение учитывалось при планировании объёма работ.</w:t>
+        <w:t xml:space="preserve">С учётом ограниченности учебного проекта приоритет отдавался схеме, которую один разработчик способен удержать, воспроизвести и объяснить на защите. Выбранная архитектура model–view–presenter с директором сценария соответствует этой цели: она достаточно строгая для порядка в коде и достаточно простая для сопровождения в рамках первой игровой главы. Архитектура оставалась достаточно простой для индивидуального </w:t>
+      </w:r>
+      <w:r>
+        <w:rPr>
+          <w:lang w:val="ru-RU"/>
+        </w:rPr>
+        <w:lastRenderedPageBreak/>
+        <w:t>сопровождения и достаточно строгой для дальнейшего расширения функциональности. Выбор архитектуры соразмерен индивидуальному формату практики.</w:t>
       </w:r>
     </w:p>
     <w:p>
@@ -2803,6 +2628,15 @@
     </w:p>
     <w:p>
       <w:pPr>
+        <w:ind w:firstLine="0"/>
+        <w:jc w:val="center"/>
+        <w:rPr>
+          <w:lang w:val="ru-RU"/>
+        </w:rPr>
+      </w:pPr>
+    </w:p>
+    <w:p>
+      <w:pPr>
         <w:jc w:val="both"/>
         <w:rPr>
           <w:lang w:val="ru-RU"/>
@@ -2812,7 +2646,14 @@
         <w:rPr>
           <w:lang w:val="ru-RU"/>
         </w:rPr>
-        <w:t>При проектировании границ использовался принцип направленности зависимостей: интерфейс может знать о контрактах презентера, но правило покупки не должно зависеть от конкретного размещения кнопки. Аналогично, глава не должна содержать пиксельные координаты отрисовки. Такое разделение не является избыточной формальностью: оно защищает проект от ситуации, когда изменение фоновой иллюстрации приводит к ошибке в расчёте стоимости или переходе к боссу. Данный принцип последовательно применялся при реализации магазина, диалоговых сцен и боевой последовательности.</w:t>
+        <w:t xml:space="preserve">При проектировании границ использовался принцип направленности зависимостей: интерфейс может знать о контрактах презентера, но правило покупки не должно зависеть от конкретного размещения кнопки. Аналогично, глава не должна содержать пиксельные координаты отрисовки. Такое разделение не является избыточной формальностью: оно защищает проект от ситуации, когда изменение фоновой иллюстрации приводит к ошибке в расчёте стоимости или переходе к боссу. Данный принцип последовательно применялся при реализации магазина, диалоговых сцен и боевой последовательности. Принцип направленности зависимостей применялся при реализации магазина, </w:t>
+      </w:r>
+      <w:r>
+        <w:rPr>
+          <w:lang w:val="ru-RU"/>
+        </w:rPr>
+        <w:lastRenderedPageBreak/>
+        <w:t>диалоговых сцен и боевой последовательности. Нарушение направленности зависимостей рассматривалось как признак необходимости рефакторинга.</w:t>
       </w:r>
     </w:p>
     <w:p>
@@ -2826,19 +2667,7 @@
         <w:rPr>
           <w:lang w:val="ru-RU"/>
         </w:rPr>
-        <w:t>Компоненты, отвечающие за анимацию, были вынесены в отдельные классы. Переиспользуемые функции плавности IntroEasing применяются в заставке, появлении элементов магазина и эффектах боевой сцены. Это делает движение элементов согласованным визуально и исключает копирование близких математических формул по разным экранам. Для ресурсов курсора выделен централизованный набор MenuCursorPaths, что устраняет расхождение строковых путей и упрощает последующие правки интерфейса.</w:t>
-      </w:r>
-      <w:r/>
-      <w:r>
-        <w:rPr>
-          <w:lang w:val="ru-RU"/>
-        </w:rPr>
-      </w:r>
-      <w:r/>
-      <w:r>
-        <w:rPr>
-          <w:lang w:val="ru-RU"/>
-        </w:rPr>
+        <w:t>Компоненты, отвечающие за анимацию, были вынесены в отдельные классы. Переиспользуемые функции плавности IntroEasing применяются в заставке, появлении элементов магазина и эффектах боевой сцены. Это делает движение элементов согласованным визуально и исключает копирование близких математических формул по разным экранам. Для ресурсов курсора выделен централизованный набор MenuCursorPaths, что устраняет расхождение строковых путей и упрощает последующие правки интерфейса. Централизация easing-функций и путей курсора снизила стоимость повторных правок интерфейса в нескольких экранах одновременно. Повторное использование easing и путей курсора уменьшило расхождение визуального поведения экранов.</w:t>
       </w:r>
     </w:p>
     <w:p>
@@ -2891,18 +2720,7 @@
         <w:rPr>
           <w:lang w:val="ru-RU"/>
         </w:rPr>
-        <w:t>Реализация велась короткими самостоятельными итерациями, близкими по смыслу к Agile-подходу. Каждая итерация завершалась работающим вертикальным срезом: например, не только созданием панели магазина, но и возможностью открыть её, выбрать позицию, увидеть стоимость, подтвердить покупку и вернуться в игровую последовательность. Такой порядок позволил регулярно сопоставлять учебный результат с принципами работы ИТ-компании и своевременно корректировать приоритеты. При возникновении дефектов сначала воспроизводился сценарий целиком, затем локализовался слой, в котором нарушалось ожидаемое поведение. Отмеченное требование сохранялось на всех этапах доработки. Такой порядок соответствует дисциплине разработки MVP и снижает накопление непроверенных изменений. Такая фиксация снижает вероятность повторного возникновения сходных дефектов.</w:t>
-      </w:r>
-      <w:r/>
-      <w:r>
-        <w:rPr>
-          <w:lang w:val="ru-RU"/>
-        </w:rPr>
-      </w:r>
-      <w:r>
-        <w:rPr>
-          <w:lang w:val="ru-RU"/>
-        </w:rPr>
+        <w:t>Реализация велась короткими самостоятельными итерациями, близкими по смыслу к Agile-подходу. Каждая итерация завершалась работающим вертикальным срезом: например, не только созданием панели магазина, но и возможностью открыть её, выбрать позицию, увидеть стоимость, подтвердить покупку и вернуться в игровую последовательность. Такой порядок позволил регулярно сопоставлять учебный результат с принципами работы ИТ-компании и своевременно корректировать приоритеты. Итерации с законченным пользовательским эффектом сократили накопление непроверенного кода и упростили корректировку приоритетов. Вертикальный срез итерации включал и интерфейс, и правило, и проверку перехода.</w:t>
       </w:r>
     </w:p>
     <w:p>
@@ -2916,7 +2734,8 @@
         <w:rPr>
           <w:lang w:val="ru-RU"/>
         </w:rPr>
-        <w:t>Список задач группировался по пользовательскому эффекту, а не только по техническим папкам: вступление, магазин, фаза главы, бой, демонстрационная сборка. Внутри каждой группы отдельно планировались модель, интерфейс, подключение ресурсов и проверка крайних случаев. На каждом шаге фиксировались исходные данные, ожидаемый эффект, возможные ограничения и критерий готовности. Благодаря этому разработка сохраняла связность и не превращалась в набор незавершённых классов. Такой порядок соответствует дисциплине разработки MVP и снижает накопление непроверенных изменений. Указанный критерий применялся при оценке готовности результата.</w:t>
+        <w:lastRenderedPageBreak/>
+        <w:t>Список задач группировался по пользовательскому эффекту, а не только по техническим папкам: вступление, магазин, фаза главы, бой, демонстрационная сборка. Внутри каждой группы отдельно планировались модель, интерфейс, подключение ресурсов и проверка крайних случаев. На каждом шаге фиксировались исходные данные, ожидаемый эффект, возможные ограничения и критерий готовности. Благодаря этому разработка сохраняла связность и не превращалась в набор незавершённых классов. Группировка задач по эффекту для игрока помогла сохранить связность между моделью, интерфейсом и ресурсами внутри каждого блока работ. Планирование по пользовательскому эффекту уменьшало число «технических» задач без видимого результата.</w:t>
       </w:r>
     </w:p>
     <w:p>
@@ -2930,13 +2749,7 @@
         <w:rPr>
           <w:lang w:val="ru-RU"/>
         </w:rPr>
-        <w:t>В ходе реализации особое внимание уделялось поддерживаемости: использовались именованные константы, устранялось дублирование логики и сохранялись границы модулей. Итерационный подход помогал не накапливать большой объём непроверенного кода. Если одинаковые правила копировались между сценами, поведение начинало расходиться, поэтому такие места пересматривались сразу после появления рабочего сценария. Регулярные запуски приложения позволяли раньше обнаруживать ошибки интеграции между модулями. Соответствующее ограничение учитывалось при планировании объёма работ. В процессе реализации контролировалась согласованность состояния модели и визуального представления после каждого значимого действия пользователя. В дальнейшем это упростило объяснение принятых решений на защите.</w:t>
-      </w:r>
-      <w:r/>
-      <w:r>
-        <w:rPr>
-          <w:lang w:val="ru-RU"/>
-        </w:rPr>
+        <w:t>В ходе реализации особое внимание уделялось поддерживаемости: использовались именованные константы, устранялось дублирование логики и сохранялись границы модулей. Итерационный подход помогал не накапливать большой объём непроверенного кода. Если одинаковые правила копировались между сценами, поведение начинало расходиться, поэтому такие места пересматривались сразу после появления рабочего сценария. Именованные константы и устранение дублирования уменьшили риск расхождения одинаковых правил в разных сценах. Поддерживаемость контролировалась непрерывно, а не только перед сдачей.</w:t>
       </w:r>
     </w:p>
     <w:p>
@@ -2950,12 +2763,14 @@
         <w:rPr>
           <w:lang w:val="ru-RU"/>
         </w:rPr>
-        <w:t>После каждой существенной порции изменений выполнялась проверка пользовательских сценариев: запуск, диалог, покупка, переход к главе, бой, повтор после поражения. Параллельно контролировались крайние случаи внутри модулей — повторное открытие экранов, недостаток средств, уже экипированный предмет. Такой порядок выявлял дефекты интеграции раньше, чем они становились дорогостоящими для исправления. В процессе реализации контролировалась согласованность состояния модели и визуального представления после каждого значимого действия пользователя. Такая фиксация снижает вероятность повторного возникновения сходных дефектов.</w:t>
-      </w:r>
-      <w:r>
-        <w:rPr>
-          <w:lang w:val="ru-RU"/>
-        </w:rPr>
+        <w:t xml:space="preserve">После каждой существенной порции изменений выполнялась проверка пользовательских сценариев: запуск, диалог, покупка, переход к главе, бой, повтор после поражения. Параллельно контролировались крайние случаи внутри модулей — повторное открытие экранов, недостаток средств, уже экипированный предмет. Такой порядок выявлял дефекты интеграции раньше, чем они становились дорогостоящими для исправления. Ранняя проверка крайних случаев в магазине и бое снизила стоимость исправления дефектов на </w:t>
+      </w:r>
+      <w:r>
+        <w:rPr>
+          <w:lang w:val="ru-RU"/>
+        </w:rPr>
+        <w:lastRenderedPageBreak/>
+        <w:t>поздних этапах. Интеграционные дефекты исправлялись сразу после обнаружения на стыке экранов.</w:t>
       </w:r>
     </w:p>
     <w:p>
@@ -2969,7 +2784,7 @@
         <w:rPr>
           <w:lang w:val="ru-RU"/>
         </w:rPr>
-        <w:t>В результате регулярные запуски проекта позволили обнаруживать проблемы интеграции до накопления большого объёма незавершённого кода. Полученный опыт важен и в контексте деятельности ООО «КОДДОТ»: при создании веб-, мобильных и игровых решений одинаково значимы декомпозиция, прозрачное взаимодействие компонентов и регулярная демонстрация промежуточного результата. Итерации планировались так, чтобы к концу шага можно было показать законченный пользовательский эффект, а не только промежуточный технический фрагмент. Сформулированное положение использовалось как ориентир при рефакторинге.</w:t>
+        <w:t>В результате регулярные запуски проекта позволили обнаруживать проблемы интеграции до накопления большого объёма незавершённого кода. Полученный опыт важен и в контексте деятельности ООО «КОДДОТ»: при создании веб-, мобильных и игровых решений одинаково значимы декомпозиция, прозрачное взаимодействие компонентов и регулярная демонстрация промежуточного результата. Регулярные запуски проекта использовались как практический аналог частых демонстраций MVP в профессиональной среде. Частые запуски заменяли отложенное «большое» тестирование в конце.</w:t>
       </w:r>
     </w:p>
     <w:p>
@@ -2983,13 +2798,7 @@
         <w:rPr>
           <w:lang w:val="ru-RU"/>
         </w:rPr>
-        <w:t>Ограниченность по времени и составу команды требовала выбирать объём работ, который реально можно довести до демонстрации и объяснить на защите. Поэтому каждая итерация завершалась именно вертикальным срезом, а не набором частично готовых экранов. Такой подход сохранил инженерную дисциплину и одновременно сделал прогресс проекта наглядным. При возникновении дефектов сначала воспроизводился сценарий целиком, затем локализовался слой, в котором нарушалось ожидаемое поведение. В дальнейшем это упростило объяснение принятых решений на защите. Такой порядок соответствует дисциплине разработки MVP и снижает накопление непроверенных изменений. Отмеченное требование сохранялось на всех этапах доработки.</w:t>
-      </w:r>
-      <w:r/>
-      <w:r>
-        <w:rPr>
-          <w:lang w:val="ru-RU"/>
-        </w:rPr>
+        <w:t>Ограниченность по времени и составу команды требовала выбирать объём работ, который реально можно довести до демонстрации и объяснить на защите. Поэтому каждая итерация завершалась именно вертикальным срезом, а не набором частично готовых экранов. Такой подход сохранил инженерную дисциплину и одновременно сделал прогресс проекта наглядным. Приоритет отдавался завершённым вертикальным срезам, которые можно показать и объяснить на защите. Незавершённые идеи фиксировались как развитие, а не включались в обязательный объём защиты.</w:t>
       </w:r>
     </w:p>
     <w:p>
@@ -3003,24 +2812,14 @@
         <w:rPr>
           <w:lang w:val="ru-RU"/>
         </w:rPr>
-        <w:t>В рамках рефакторинга были удалены неиспользуемые ветви и устаревшие фрагменты кода, заменены повторяющиеся литералы на именованные константы, а общие операции сгруппированы в небольшие классы с одной ответственностью. Повторное использование IntroEasing и MenuCursorPaths служит практическим примером того, как небольшая централизация снижает стоимость последующих изменений. Рефакторинг проводился после появления работающего поведения, чтобы не потерять связь между улучшением структуры и реальным сценарием игрока.</w:t>
-      </w:r>
-      <w:r/>
-      <w:r>
-        <w:rPr>
-          <w:lang w:val="ru-RU"/>
-        </w:rPr>
-      </w:r>
-      <w:r/>
-      <w:r>
-        <w:rPr>
-          <w:lang w:val="ru-RU"/>
-        </w:rPr>
-      </w:r>
-      <w:r>
-        <w:rPr>
-          <w:lang w:val="ru-RU"/>
-        </w:rPr>
+        <w:t xml:space="preserve">В рамках рефакторинга были удалены неиспользуемые ветви и устаревшие фрагменты кода, заменены повторяющиеся литералы на именованные константы, а общие операции сгруппированы в небольшие классы с одной ответственностью. Повторное использование IntroEasing и MenuCursorPaths служит практическим примером того, как небольшая централизация снижает стоимость последующих изменений. Рефакторинг проводился после появления работающего поведения, чтобы не потерять связь между улучшением структуры и реальным сценарием игрока. Рефакторинг </w:t>
+      </w:r>
+      <w:r>
+        <w:rPr>
+          <w:lang w:val="ru-RU"/>
+        </w:rPr>
+        <w:lastRenderedPageBreak/>
+        <w:t>выполнялся после подтверждения рабочего поведения сценария, чтобы структура кода не расходилась с фактической логикой игры. Рефакторинг затрагивал мёртвый код, повторы и вспомогательные константы без изменения внешнего поведения.</w:t>
       </w:r>
     </w:p>
     <w:p>
@@ -3034,7 +2833,7 @@
         <w:rPr>
           <w:lang w:val="ru-RU"/>
         </w:rPr>
-        <w:t>Распределение задач в одиночной разработке имеет иную форму, чем в команде, однако требует такой же дисциплины. Роли аналитика, разработчика, тестировщика и демонстратора выполнялись последовательно: сначала формулировалось поведение, затем создавалась реализация, после чего она проверялась с позиции пользователя и описывалась в отчёте. Это помогло не смешивать предположение о правильности кода с фактом успешного прохождения сценария.</w:t>
+        <w:t>Распределение задач в одиночной разработке имеет иную форму, чем в команде, однако требует такой же дисциплины. Роли аналитика, разработчика, тестировщика и демонстратора выполнялись последовательно: сначала формулировалось поведение, затем создавалась реализация, после чего она проверялась с позиции пользователя и описывалась в отчёте. Это помогло не смешивать предположение о правильности кода с фактом успешного прохождения сценария. Последовательная смена ролей аналитика, разработчика и тестировщика в индивидуальном формате снизила риск принять компиляцию за готовность сценария. Разделение этапов «сформулировать — реализовать — проверить — описать» повысило качество результата.</w:t>
       </w:r>
     </w:p>
     <w:p>
@@ -3087,7 +2886,7 @@
         <w:rPr>
           <w:lang w:val="ru-RU"/>
         </w:rPr>
-        <w:t>Документирование сопровождало работу с самого начала: фиксировались назначение пакетов, сценарии переходов, состав ресурсов, параметры запуска и принятые ограничения. Для небольшого проекта такой набор полезнее тяжёлой формальной документации, поскольку остаётся актуальным при изменении сцен. Документация рассматривалась как часть целостного цикла разработки, а не как отдельная бюрократическая процедура. Такой порядок соответствует дисциплине разработки MVP и снижает накопление непроверенных изменений. Такая фиксация снижает вероятность повторного возникновения сходных дефектов. Регулярные запуски приложения позволяли раньше обнаруживать ошибки интеграции между модулями. Это уточняет практическую сторону выполненной работы.</w:t>
+        <w:t>Документирование сопровождало работу с самого начала: фиксировались назначение пакетов, сценарии переходов, состав ресурсов, параметры запуска и принятые ограничения. Для небольшого проекта такой набор полезнее тяжёлой формальной документации, поскольку остаётся актуальным при изменении сцен. Документация рассматривалась как часть целостного цикла разработки, а не как отдельная бюрократическая процедура. Документация велась параллельно разработке и фиксировала решения, существенные для запуска и сопровождения. Документация включала запуск, ограничения и назначение ключевых пакетов.</w:t>
       </w:r>
     </w:p>
     <w:p>
@@ -3101,12 +2900,8 @@
         <w:rPr>
           <w:lang w:val="ru-RU"/>
         </w:rPr>
-        <w:t>Контроль качества выполнялся как сочетание просмотра исходного кода, запуска приложения и ручной проверки пользовательских путей. Отдельно проверялись повторное открытие экранов, недостаток валюты при покупке, уже экипированный предмет, проигрыш в бою, возврат к началу и корректность визуального наложения диалоговых панелей. На каждом шаге фиксировались исходные данные, ожидаемый эффект и критерий готовности. Регулярные запуски приложения позволяли раньше обнаруживать ошибки интеграции между модулями. Сформулированное положение использовалось как ориентир при рефакторинге. В процессе реализации контролировалась согласованность состояния модели и визуального представления после каждого значимого действия пользователя. Данный вывод учитывался при последующей проверке сценариев.</w:t>
-      </w:r>
-      <w:r>
-        <w:rPr>
-          <w:lang w:val="ru-RU"/>
-        </w:rPr>
+        <w:lastRenderedPageBreak/>
+        <w:t>Контроль качества выполнялся как сочетание просмотра исходного кода, запуска приложения и ручной проверки пользовательских путей. Отдельно проверялись повторное открытие экранов, недостаток валюты при покупке, уже экипированный предмет, проигрыш в бою, возврат к началу и корректность визуального наложения диалоговых панелей. На каждом шаге фиксировались исходные данные, ожидаемый эффект и критерий готовности. Практический контроль качества сочетал просмотр кода и ручной проход пользовательских путей с проверкой граничных состояний. Чеклист качества охватывал повторные входы в экраны и граничные состояния магазина и боя.</w:t>
       </w:r>
     </w:p>
     <w:p>
@@ -3120,7 +2915,7 @@
         <w:rPr>
           <w:lang w:val="ru-RU"/>
         </w:rPr>
-        <w:t>Чтобы решения оставались поддерживаемыми, в документации отражались не только «как запустить», но и почему сценарий устроен именно так. Это особенно важно для путей ресурсов и фаз главы: без фиксации договорённостей легко получить расхождение между кодом и фактическим набором ассетов. Использование констант и устранение дублирования логики дополнительно снижали риск различного поведения одинаковых сцен. В процессе реализации контролировалась согласованность состояния модели и визуального представления после каждого значимого действия пользователя. В дальнейшем это упростило объяснение принятых решений на защите. Итерации планировались так, чтобы к концу шага можно было показать законченный пользовательский эффект, а не только промежуточный технический фрагмент. Отмеченное требование сохранялось на всех этапах доработки.</w:t>
+        <w:t>Чтобы решения оставались поддерживаемыми, в документации отражались не только «как запустить», но и почему сценарий устроен именно так. Это особенно важно для путей ресурсов и фаз главы: без фиксации договорённостей легко получить расхождение между кодом и фактическим набором ассетов. Использование констант и устранение дублирования логики дополнительно снижали риск различного поведения одинаковых сцен. Фиксация причин выбранных решений уменьшила вероятность повторных ошибок при возврате к модулям после перерыва. Причины решений по ресурсам и фазам фиксировались, чтобы не восстанавливать их заново.</w:t>
       </w:r>
     </w:p>
     <w:p>
@@ -3134,7 +2929,7 @@
         <w:rPr>
           <w:lang w:val="ru-RU"/>
         </w:rPr>
-        <w:t>Проверка выполнялась на пользовательских сценариях от запуска до повторного прохождения после поражения. Для визуальной новеллы ручной контроль обязателен: формально корректный обработчик может открыть сцену, но текст окажется перекрыт, фокус потеряется, а тайминг анимации сделает переход нечитаемым. Поэтому оценка интерфейса сочеталась с проверкой значений игровой модели. Итерации планировались так, чтобы к концу шага можно было показать законченный пользовательский эффект, а не только промежуточный технический фрагмент. Это уточняет практическую сторону выполненной работы. При возникновении дефектов сначала воспроизводился сценарий целиком, затем локализовался слой, в котором нарушалось ожидаемое поведение. Указанный критерий применялся при оценке готовности результата.</w:t>
+        <w:t>Проверка выполнялась на пользовательских сценариях от запуска до повторного прохождения после поражения. Для визуальной новеллы ручной контроль обязателен: формально корректный обработчик может открыть сцену, но текст окажется перекрыт, фокус потеряется, а тайминг анимации сделает переход нечитаемым. Поэтому оценка интерфейса сочеталась с проверкой значений игровой модели. Для визуальной новеллы отдельно контролировались читаемость, темп показа и устойчивость состояния после повторного входа. Для VN отдельно проверялась читаемость при реальном темпе показа сцен.</w:t>
       </w:r>
     </w:p>
     <w:p>
@@ -3148,12 +2943,8 @@
         <w:rPr>
           <w:lang w:val="ru-RU"/>
         </w:rPr>
-        <w:t>Итогом стала воспроизводимая последовательность проверки, пригодная и для передачи проекта другому разработчику. Полученный опыт важен и в контексте деятельности ООО «КОДДОТ»: при создании веб-, мобильных и игровых решений одинаково значимы декомпозиция, прозрачное взаимодействие компонентов и регулярная демонстрация промежуточного результата. При возникновении дефектов сначала воспроизводился сценарий целиком, затем локализовался слой, в котором нарушалось ожидаемое поведение. Данный вывод учитывался при последующей проверке сценариев.</w:t>
-      </w:r>
-      <w:r>
-        <w:rPr>
-          <w:lang w:val="ru-RU"/>
-        </w:rPr>
+        <w:lastRenderedPageBreak/>
+        <w:t>Итогом стала воспроизводимая последовательность проверки, пригодная и для передачи проекта другому разработчику. Полученный опыт важен и в контексте деятельности ООО «КОДДОТ»: при создании веб-, мобильных и игровых решений одинаково значимы декомпозиция, прозрачное взаимодействие компонентов и регулярная демонстрация промежуточного результата. Сформированный порядок проверки может быть передан другому участнику без необходимости восстанавливать процесс «из памяти». Прозрачный порядок проверки важен и для передачи проекта другому исполнителю.</w:t>
       </w:r>
     </w:p>
     <w:p>
@@ -3167,7 +2958,7 @@
         <w:rPr>
           <w:lang w:val="ru-RU"/>
         </w:rPr>
-        <w:t>С учётом ограниченности учебного проекта документировалось прежде всего то, что необходимо для запуска, сопровождения и защиты. Такой подход сохранил полезность материалов и не превратил отчётность в самоцель. Такой порядок соответствует дисциплине разработки MVP и снижает накопление непроверенных изменений. Отмеченное требование сохранялось на всех этапах доработки. Регулярные запуски приложения позволяли раньше обнаруживать ошибки интеграции между модулями. Такая фиксация снижает вероятность повторного возникновения сходных дефектов. В процессе реализации контролировалась согласованность состояния модели и визуального представления после каждого значимого действия пользователя. Это уточняет практическую сторону выполненной работы.</w:t>
+        <w:t>С учётом ограниченности учебного проекта документировалось прежде всего то, что необходимо для запуска, сопровождения и защиты. Такой подход сохранил полезность материалов и не превратил отчётность в самоцель. Документировались только сведения, необходимые для воспроизводимого запуска и объяснения архитектуры, без избыточной формальности. Избыточная бюрократия исключалась: документировалось только полезное для запуска и защиты.</w:t>
       </w:r>
     </w:p>
     <w:p>
@@ -3220,7 +3011,7 @@
         <w:rPr>
           <w:lang w:val="ru-RU"/>
         </w:rPr>
-        <w:t>Демонстрационная сборка должна позволять оценить результат без погружения в исходный код. Поэтому вместе с приложением рассматриваются сценарий показа, набор ресурсов, команды запуска и порядок прохождения ключевых экранов. Подготовка демо рассматривалась как часть цикла разработки, а не как действие «в последний день перед защитой». При возникновении дефектов сначала воспроизводился сценарий целиком, затем локализовался слой, в котором нарушалось ожидаемое поведение. Сформулированное положение использовалось как ориентир при рефакторинге. Такой порядок соответствует дисциплине разработки MVP и снижает накопление непроверенных изменений. Данный вывод учитывался при последующей проверке сценариев.</w:t>
+        <w:t>Демонстрационная сборка должна позволять оценить результат без погружения в исходный код. Поэтому вместе с приложением рассматриваются сценарий показа, набор ресурсов, команды запуска и порядок прохождения ключевых экранов. Подготовка демо рассматривалась как часть цикла разработки, а не как действие «в последний день перед защитой». Демонстрационная версия рассматривалась как обязательный результат практики, а не как дополнение к исходному коду. Демонстрация должна воспроизводиться без чтения всего исходного кода.</w:t>
       </w:r>
     </w:p>
     <w:p>
@@ -3234,19 +3025,8 @@
         <w:rPr>
           <w:lang w:val="ru-RU"/>
         </w:rPr>
-        <w:t>Для проекта предусмотрены сценарии сборки для Windows и macOS. Они уменьшают риск ошибок при ручном наборе команд, делают окружение запуска явным и позволяют подготовить одинаково организованную демонстрацию на разных рабочих станциях. Наличие скриптов в репозитории важно тем, что порядок запуска становится проверяемым артефактом, а не знанием, которое существует только у автора. Такой порядок соответствует дисциплине разработки MVP и снижает накопление непроверенных изменений. В дальнейшем это упростило объяснение принятых решений на защите. Регулярные запуски приложения позволяли раньше обнаруживать ошибки интеграции между модулями. Отмеченное требование сохранялось на всех этапах доработки.</w:t>
-      </w:r>
-      <w:r/>
-      <w:r>
-        <w:rPr>
-          <w:lang w:val="ru-RU"/>
-        </w:rPr>
-      </w:r>
-      <w:r/>
-      <w:r>
-        <w:rPr>
-          <w:lang w:val="ru-RU"/>
-        </w:rPr>
+        <w:lastRenderedPageBreak/>
+        <w:t>Для проекта предусмотрены сценарии сборки для Windows и macOS. Они уменьшают риск ошибок при ручном наборе команд, делают окружение запуска явным и позволяют подготовить одинаково организованную демонстрацию на разных рабочих станциях. Наличие скриптов в репозитории важно тем, что порядок запуска становится проверяемым артефактом, а не знанием, которое существует только у автора. Скрипты сборки и запуска для Windows и macOS снизили вероятность ошибок при повторении демо на другой машине. Кроссплатформенные скрипты снизили зависимость показа от ручного набора команд.</w:t>
       </w:r>
     </w:p>
     <w:p>
@@ -3260,7 +3040,7 @@
         <w:rPr>
           <w:lang w:val="ru-RU"/>
         </w:rPr>
-        <w:t>Поддерживаемость демонстрации обеспечивалась фиксацией зависимостей, ресурсов и последовательности экранов. Если путь запуска не описан, на защите легко потерять время на настройку окружения. Поэтому команды сборки и запуска хранятся рядом с исходным кодом и обновляются вместе с проектом. Регулярные запуски приложения позволяли раньше обнаруживать ошибки интеграции между модулями. Это уточняет практическую сторону выполненной работы. В процессе реализации контролировалась согласованность состояния модели и визуального представления после каждого значимого действия пользователя. Указанный критерий применялся при оценке готовности результата.</w:t>
+        <w:t>Поддерживаемость демонстрации обеспечивалась фиксацией зависимостей, ресурсов и последовательности экранов. Если путь запуска не описан, на защите легко потерять время на настройку окружения. Поэтому команды сборки и запуска хранятся рядом с исходным кодом и обновляются вместе с проектом. Фиксация команд запуска в репозитории повысила воспроизводимость результата для защиты. Путь запуска рассматривался как часть результата практики.</w:t>
       </w:r>
     </w:p>
     <w:p>
@@ -3274,19 +3054,7 @@
         <w:rPr>
           <w:lang w:val="ru-RU"/>
         </w:rPr>
-        <w:t>Перед показом выполнялась проверка пользовательских сценариев: запуск, диалог, покупка, переход к главе, бой и повтор после поражения. Отдельно контролировалось, что демонстрация не требует ручных «особых» действий, известных только разработчику. Такой подход выявлял проблемы подготовки среды наряду с дефектами интерфейса. В процессе реализации контролировалась согласованность состояния модели и визуального представления после каждого значимого действия пользователя. Данный вывод учитывался при последующей проверке сценариев. Итерации планировались так, чтобы к концу шага можно было показать законченный пользовательский эффект, а не только промежуточный технический фрагмент. Соответствующее ограничение учитывалось при планировании объёма работ.</w:t>
-      </w:r>
-      <w:r/>
-      <w:r>
-        <w:rPr>
-          <w:lang w:val="ru-RU"/>
-        </w:rPr>
-      </w:r>
-      <w:r/>
-      <w:r>
-        <w:rPr>
-          <w:lang w:val="ru-RU"/>
-        </w:rPr>
+        <w:t>Перед показом выполнялась проверка пользовательских сценариев: запуск, диалог, покупка, переход к главе, бой и повтор после поражения. Отдельно контролировалось, что демонстрация не требует ручных «особых» действий, известных только разработчику. Такой подход выявлял проблемы подготовки среды наряду с дефектами интерфейса. Перед демонстрацией повторно проверялись ключевые сцены: диалог, магазин, глава и бой. Преддемонстрационный прогон исключал типичные сбои окружения.</w:t>
       </w:r>
     </w:p>
     <w:p>
@@ -3300,12 +3068,14 @@
         <w:rPr>
           <w:lang w:val="ru-RU"/>
         </w:rPr>
-        <w:t>Подготовленный порядок запуска делает результат практики наглядным и позволяет сосредоточить защиту на архитектурных и пользовательских решениях. Полученный опыт важен и в контексте деятельности ООО «КОДДОТ»: умение быстро показать MVP является обычной рабочей необходимостью при создании веб-, мобильных и игровых решений. Итерации планировались так, чтобы к концу шага можно было показать законченный пользовательский эффект, а не только промежуточный технический фрагмент. Отмеченное требование сохранялось на всех этапах доработки.</w:t>
-      </w:r>
-      <w:r>
-        <w:rPr>
-          <w:lang w:val="ru-RU"/>
-        </w:rPr>
+        <w:t xml:space="preserve">Подготовленный порядок запуска делает результат практики наглядным и позволяет сосредоточить защиту на архитектурных и пользовательских решениях. Полученный опыт важен и в контексте деятельности ООО «КОДДОТ»: умение быстро показать MVP является обычной рабочей </w:t>
+      </w:r>
+      <w:r>
+        <w:rPr>
+          <w:lang w:val="ru-RU"/>
+        </w:rPr>
+        <w:lastRenderedPageBreak/>
+        <w:t>необходимостью при создании веб-, мобильных и игровых решений. Подготовленный запуск позволил сосредоточить защиту на архитектурных и игровых решениях, а не на настройке окружения. Готовый запуск позволил сместить акцент защиты на содержание решения.</w:t>
       </w:r>
     </w:p>
     <w:p>
@@ -3319,7 +3089,7 @@
         <w:rPr>
           <w:lang w:val="ru-RU"/>
         </w:rPr>
-        <w:t>С учётом учебного формата были выбраны простые скрипты запуска, достаточные для воспроизводимой демонстрации. При дальнейшем развитии проекта их можно расширить Gradle-задачами и конвейером непрерывной интеграции, не меняя самой идеи единого понятного входа в сборку. При возникновении дефектов сначала воспроизводился сценарий целиком, затем локализовался слой, в котором нарушалось ожидаемое поведение. Указанный критерий применялся при оценке готовности результата. Такой порядок соответствует дисциплине разработки MVP и снижает накопление непроверенных изменений. Сформулированное положение использовалось как ориентир при рефакторинге.</w:t>
+        <w:t>С учётом учебного формата были выбраны простые скрипты запуска, достаточные для воспроизводимой демонстрации. При дальнейшем развитии проекта их можно расширить Gradle-задачами и конвейером непрерывной интеграции, не меняя самой идеи единого понятного входа в сборку. Для учебного объёма достаточно простых bat/sh-скриптов; при развитии проекта их можно дополнить Gradle и CI. Простота скриптов соответствовала учебному масштабу и оставляла путь к CI.</w:t>
       </w:r>
     </w:p>
     <w:p>
@@ -3405,6 +3175,33 @@
     </w:p>
     <w:p>
       <w:pPr>
+        <w:ind w:firstLine="0"/>
+        <w:jc w:val="center"/>
+        <w:rPr>
+          <w:lang w:val="ru-RU"/>
+        </w:rPr>
+      </w:pPr>
+    </w:p>
+    <w:p>
+      <w:pPr>
+        <w:ind w:firstLine="0"/>
+        <w:jc w:val="center"/>
+        <w:rPr>
+          <w:lang w:val="ru-RU"/>
+        </w:rPr>
+      </w:pPr>
+    </w:p>
+    <w:p>
+      <w:pPr>
+        <w:ind w:firstLine="0"/>
+        <w:jc w:val="center"/>
+        <w:rPr>
+          <w:lang w:val="ru-RU"/>
+        </w:rPr>
+      </w:pPr>
+    </w:p>
+    <w:p>
+      <w:pPr>
         <w:pStyle w:val="1"/>
         <w:numPr>
           <w:ilvl w:val="0"/>
@@ -3445,13 +3242,7 @@
         <w:rPr>
           <w:lang w:val="ru-RU"/>
         </w:rPr>
-        <w:t>Основным языком пробного проекта выбран Java. Он предоставляет строгую типизацию, развитые средства объектно-ориентированного проектирования, переносимую виртуальную машину и достаточный набор библиотек для создания учебного клиентского приложения. Выбор стека рассматривался как часть целостного цикла разработки, а не как изолированное предпочтение «привычного языка». Такой порядок соответствует дисциплине разработки MVP и снижает накопление непроверенных изменений. Данный вывод учитывался при последующей проверке сценариев. Регулярные запуски приложения позволяли раньше обнаруживать ошибки интеграции между модулями. Соответствующее ограничение учитывалось при планировании объёма работ.</w:t>
-      </w:r>
-      <w:r/>
-      <w:r>
-        <w:rPr>
-          <w:lang w:val="ru-RU"/>
-        </w:rPr>
+        <w:t>Основным языком пробного проекта выбран Java. Он предоставляет строгую типизацию, развитые средства объектно-ориентированного проектирования, переносимую виртуальную машину и достаточный набор библиотек для создания учебного клиентского приложения. Выбор стека рассматривался как часть целостного цикла разработки, а не как изолированное предпочтение «привычного языка». Java была выбрана как основной язык из-за строгой типизации, ООП и переносимости JVM для клиентского учебного приложения. Типизация Java снижала число скрытых ошибок при работе с состоянием игры.</w:t>
       </w:r>
     </w:p>
     <w:p>
@@ -3465,25 +3256,7 @@
         <w:rPr>
           <w:lang w:val="ru-RU"/>
         </w:rPr>
-        <w:t>Для графической части применяются Java Swing и вспомогательные классы проекта; в отдельных частях используется совместимость с LibGDX-подходом для подготовки иконок и связанных ресурсов. Изображения, шрифты, звуки и конфигурационные данные хранятся локально в структуре проекта и загружаются через централизованные точки доступа. Такой подход упростил проверку наличия ресурсов и уменьшил число разрозненных путей в коде. Регулярные запуски приложения позволяли раньше обнаруживать ошибки интеграции между модулями. Отмеченное требование сохранялось на всех этапах доработки. В процессе реализации контролировалась согласованность состояния модели и визуального представления после каждого значимого действия пользователя. Такая фиксация снижает вероятность повторного возникновения сходных дефектов.</w:t>
-      </w:r>
-      <w:r/>
-      <w:r>
-        <w:rPr>
-          <w:lang w:val="ru-RU"/>
-        </w:rPr>
-      </w:r>
-      <w:r/>
-      <w:r>
-        <w:rPr>
-          <w:lang w:val="ru-RU"/>
-        </w:rPr>
-      </w:r>
-      <w:r/>
-      <w:r>
-        <w:rPr>
-          <w:lang w:val="ru-RU"/>
-        </w:rPr>
+        <w:t>Для графической части применяются Java Swing и вспомогательные классы проекта; в отдельных частях используется совместимость с LibGDX-подходом для подготовки иконок и связанных ресурсов. Изображения, шрифты, звуки и конфигурационные данные хранятся локально в структуре проекта и загружаются через централизованные точки доступа. Такой подход упростил проверку наличия ресурсов и уменьшил число разрозненных путей в коде. Swing обеспечил контроль над окном и пиксельной отрисовкой; LibGDX jars использовались точечно для вспомогательных задач с иконками. Точечное использование LibGDX не подменяло основной Swing-слой приложения.</w:t>
       </w:r>
     </w:p>
     <w:p>
@@ -3497,18 +3270,14 @@
         <w:rPr>
           <w:lang w:val="ru-RU"/>
         </w:rPr>
-        <w:t>При выборе технологий учитывалась поддерживаемость решения: подключение зависимости должно быть объяснимо задачей, а не модой. Java позволила сосредоточиться на архитектуре и поведении игры без чрезмерной зависимости от тяжёлой среды разработки. Именованные константы и единые точки загрузки ресурсов дополнительно снизили риск расхождения поведения одинаковых сцен. В процессе реализации контролировалась согласованность состояния модели и визуального представления после каждого значимого действия пользователя. Указанный критерий применялся при оценке готовности результата.</w:t>
-      </w:r>
-      <w:r/>
-      <w:r>
-        <w:rPr>
-          <w:lang w:val="ru-RU"/>
-        </w:rPr>
-      </w:r>
-      <w:r>
-        <w:rPr>
-          <w:lang w:val="ru-RU"/>
-        </w:rPr>
+        <w:t xml:space="preserve">При выборе технологий учитывалась поддерживаемость решения: подключение зависимости должно быть объяснимо задачей, а не модой. Java позволила сосредоточиться на архитектуре и поведении игры без чрезмерной зависимости от тяжёлой среды разработки. Именованные константы и единые точки загрузки ресурсов дополнительно снизили риск расхождения поведения одинаковых сцен. Компактность стека позволила уделить основное время </w:t>
+      </w:r>
+      <w:r>
+        <w:rPr>
+          <w:lang w:val="ru-RU"/>
+        </w:rPr>
+        <w:lastRenderedPageBreak/>
+        <w:t>архитектуре и поведению игры, а не настройке тяжёлой инфраструктуры. Отказ от избыточного стека сохранил время на проработку сценариев.</w:t>
       </w:r>
     </w:p>
     <w:p>
@@ -3522,25 +3291,7 @@
         <w:rPr>
           <w:lang w:val="ru-RU"/>
         </w:rPr>
-        <w:t>Проверка стека выполнялась практически: запуск приложения и проход по сценариям диалога, магазина, главы и боя. Если инструмент усложнял быстрый просмотр результата, он откладывался на этап развития. Такой порядок выявлял не только технические ошибки, но и избыточность инфраструктуры для текущего учебного scope. Итерации планировались так, чтобы к концу шага можно было показать законченный пользовательский эффект, а не только промежуточный технический фрагмент. Соответствующее ограничение учитывалось при планировании объёма работ. При возникновении дефектов сначала воспроизводился сценарий целиком, затем локализовался слой, в котором нарушалось ожидаемое поведение. В дальнейшем это упростило объяснение принятых решений на защите.</w:t>
-      </w:r>
-      <w:r/>
-      <w:r>
-        <w:rPr>
-          <w:lang w:val="ru-RU"/>
-        </w:rPr>
-      </w:r>
-      <w:r/>
-      <w:r>
-        <w:rPr>
-          <w:lang w:val="ru-RU"/>
-        </w:rPr>
-      </w:r>
-      <w:r/>
-      <w:r>
-        <w:rPr>
-          <w:lang w:val="ru-RU"/>
-        </w:rPr>
+        <w:t>Проверка стека выполнялась практически: запуск приложения и проход по сценариям диалога, магазина, главы и боя. Если инструмент усложнял быстрый просмотр результата, он откладывался на этап развития. Такой порядок выявлял не только технические ошибки, но и избыточность инфраструктуры для текущего учебного scope. Пригодность инструментов оценивалась по скорости проверки пользовательских сценариев после изменений. Инструмент считался полезным, только если ускорял проверку игрового поведения.</w:t>
       </w:r>
     </w:p>
     <w:p>
@@ -3554,7 +3305,7 @@
         <w:rPr>
           <w:lang w:val="ru-RU"/>
         </w:rPr>
-        <w:t>Выбранный набор дал возможность сосредоточиться на архитектуре и поведении игры и при этом закрыть путь от исходного кода до запускаемой демонстрации. Полученный опыт важен и в контексте деятельности ООО «КОДДОТ»: технология должна выбираться по потребности продукта, а не наоборот. При возникновении дефектов сначала воспроизводился сценарий целиком, затем локализовался слой, в котором нарушалось ожидаемое поведение. Такая фиксация снижает вероятность повторного возникновения сходных дефектов.</w:t>
+        <w:t>Выбранный набор дал возможность сосредоточиться на архитектуре и поведении игры и при этом закрыть путь от исходного кода до запускаемой демонстрации. Полученный опыт важен и в контексте деятельности ООО «КОДДОТ»: технология должна выбираться по потребности продукта, а не наоборот. Итоговый набор технологий закрывает полный путь от исходного кода и ресурсов до запускаемой демонстрации. Стек покрывает полный цикл до демонстрации без скрытых внешних сервисов.</w:t>
       </w:r>
     </w:p>
     <w:p>
@@ -3568,19 +3319,24 @@
         <w:rPr>
           <w:lang w:val="ru-RU"/>
         </w:rPr>
-        <w:t>С учётом ограниченности учебного проекта приоритет отдавался стеку, который один разработчик способен настроить, объяснить и стабильно запускать. Java и Swing соответствуют этому требованию для пиксельного прототипа первой главы. Такой порядок соответствует дисциплине разработки MVP и снижает накопление непроверенных изменений. Сформулированное положение использовалось как ориентир при рефакторинге. Регулярные запуски приложения позволяли раньше обнаруживать ошибки интеграции между модулями. Данный вывод учитывался при последующей проверке сценариев. В процессе реализации контролировалась согласованность состояния модели и визуального представления после каждого значимого действия пользователя. Соответствующее ограничение учитывалось при планировании объёма работ.</w:t>
-      </w:r>
-      <w:r/>
-      <w:r>
-        <w:rPr>
-          <w:lang w:val="ru-RU"/>
-        </w:rPr>
-      </w:r>
-      <w:r>
-        <w:rPr>
-          <w:lang w:val="ru-RU"/>
-        </w:rPr>
-      </w:r>
+        <w:t>С учётом ограниченности учебного проекта приоритет отдавался стеку, который один разработчик способен настроить, объяснить и стабильно запускать. Java и Swing соответствуют этому требованию для пиксельного прототипа первой главы. Выбранный стек соразмерен учебной цели и допускает объяснение каждого ключевого решения на защите. Прозрачность решений важнее формальной «современности» набора технологий.</w:t>
+      </w:r>
+    </w:p>
+    <w:p>
+      <w:pPr>
+        <w:jc w:val="both"/>
+        <w:rPr>
+          <w:lang w:val="ru-RU"/>
+        </w:rPr>
+      </w:pPr>
+    </w:p>
+    <w:p>
+      <w:pPr>
+        <w:jc w:val="both"/>
+        <w:rPr>
+          <w:lang w:val="ru-RU"/>
+        </w:rPr>
+      </w:pPr>
     </w:p>
     <w:p>
       <w:pPr>
@@ -3608,6 +3364,7 @@
           <w:rFonts w:ascii="Times New Roman" w:hAnsi="Times New Roman" w:cs="Times New Roman"/>
           <w:lang w:val="ru-RU"/>
         </w:rPr>
+        <w:lastRenderedPageBreak/>
         <w:t>Язык, интерфейс и игровые ресурсы</w:t>
       </w:r>
       <w:bookmarkEnd w:id="8"/>
@@ -3628,18 +3385,22 @@
         </w:rPr>
       </w:pPr>
       <w:r>
-        <w:t>Java подходит для учебного проекта благодаря ясной структуре классов, наличию стандартных коллекций, средств обработки событий и возможности собрать приложение на разных платформах. Swing был использован как контролируемый инструмент создания оконного интерфейса: он позволяет вручную размещать слои, рисовать компоненты, обрабатывать таймеры и реализовывать пиксельный стиль без обязательного освоения полного игрового движка. Это сделало внутреннее устройство клиентской части более прозрачным для анализа и защиты.</w:t>
-      </w:r>
-      <w:r>
-        <w:rPr>
-          <w:lang w:val="ru-RU"/>
-        </w:rPr>
-      </w:r>
-      <w:r/>
-      <w:r>
-        <w:rPr>
-          <w:lang w:val="ru-RU"/>
-        </w:rPr>
+        <w:t>Java</w:t>
+      </w:r>
+      <w:r>
+        <w:rPr>
+          <w:lang w:val="ru-RU"/>
+        </w:rPr>
+        <w:t xml:space="preserve"> подходит для учебного проекта благодаря ясной структуре классов, наличию стандартных коллекций, средств обработки событий и возможности собрать приложение на разных платформах. </w:t>
+      </w:r>
+      <w:r>
+        <w:t>Swing</w:t>
+      </w:r>
+      <w:r>
+        <w:rPr>
+          <w:lang w:val="ru-RU"/>
+        </w:rPr>
+        <w:t xml:space="preserve"> был использован как контролируемый инструмент создания оконного интерфейса: он позволяет вручную размещать слои, рисовать компоненты, обрабатывать таймеры и реализовывать пиксельный стиль без обязательного освоения полного игрового движка. Это сделало внутреннее устройство клиентской части более прозрачным для анализа и защиты. Локальное хранение состояния достаточно для автономного демо; ранний перенос в серверное хранилище для учебного объёма не требовался. Автономность демо упростила показ на защите без сетевой инфраструктуры.</w:t>
       </w:r>
     </w:p>
     <w:p>
@@ -3653,13 +3414,7 @@
         <w:rPr>
           <w:lang w:val="ru-RU"/>
         </w:rPr>
-        <w:t>Для проекта не требуется серверное хранилище. Состояние прохождения и каталог предметов представлены структурами в памяти и ресурсными описаниями, что соответствует задаче автономной демонстрации. При дальнейшем развитии сохранения могут быть вынесены в JSON-файлы или локальную базу данных, однако преждевременное добавление внешнего хранилища усложнило бы текущую учебную цель и отвлекло бы от проработки интерфейсной и сценарной логики.</w:t>
-      </w:r>
-      <w:r/>
-      <w:r>
-        <w:rPr>
-          <w:lang w:val="ru-RU"/>
-        </w:rPr>
+        <w:t>Для проекта не требуется серверное хранилище. Состояние прохождения и каталог предметов представлены структурами в памяти и ресурсными описаниями, что соответствует задаче автономной демонстрации. При дальнейшем развитии сохранения могут быть вынесены в JSON-файлы или локальную базу данных, однако преждевременное добавление внешнего хранилища усложнило бы текущую учебную цель и отвлекло бы от проработки интерфейсной и сценарной логики. LibGDX рассматривается как возможное направление роста при необходимости более сложного рендера, а не как обязательная замена текущего слоя. Переход на более тяжёлый движок откладывался до появления реальной потребности.</w:t>
       </w:r>
     </w:p>
     <w:p>
@@ -3670,18 +3425,41 @@
         </w:rPr>
       </w:pPr>
       <w:r>
-        <w:t>LibGDX рассматривается как возможное направление роста, поскольку предоставляет более специализированные механизмы рендеринга, ввода и кроссплатформенной упаковки. Однако внедрение его в уже сформированный Swing-слой должно быть осознанным: смена фреймворка оправдана при потребности в расширенной графике или публикации на нескольких платформах, а не только ради использования более известного названия. В текущей версии LibGDX применяется точечно, без полной миграции пользовательского интерфейса.</w:t>
-      </w:r>
-      <w:r>
-        <w:rPr>
-          <w:lang w:val="ru-RU"/>
-        </w:rPr>
-      </w:r>
-      <w:r/>
-      <w:r>
-        <w:rPr>
-          <w:lang w:val="ru-RU"/>
-        </w:rPr>
+        <w:t>LibGDX</w:t>
+      </w:r>
+      <w:r>
+        <w:rPr>
+          <w:lang w:val="ru-RU"/>
+        </w:rPr>
+        <w:t xml:space="preserve"> рассматривается как возможное направление роста, поскольку предоставляет более специализированные механизмы рендеринга, ввода и кроссплатформенной упаковки. Однако внедрение его в уже сформированный </w:t>
+      </w:r>
+      <w:r>
+        <w:t>Swing</w:t>
+      </w:r>
+      <w:r>
+        <w:rPr>
+          <w:lang w:val="ru-RU"/>
+        </w:rPr>
+        <w:t xml:space="preserve">-слой должно быть осознанным: смена фреймворка оправдана при </w:t>
+      </w:r>
+      <w:r>
+        <w:rPr>
+          <w:lang w:val="ru-RU"/>
+        </w:rPr>
+        <w:lastRenderedPageBreak/>
+        <w:t xml:space="preserve">потребности в расширенной графике или публикации на нескольких платформах, а не только ради использования более известного названия. В текущей версии </w:t>
+      </w:r>
+      <w:r>
+        <w:t>LibGDX</w:t>
+      </w:r>
+      <w:r>
+        <w:rPr>
+          <w:lang w:val="ru-RU"/>
+        </w:rPr>
+        <w:t xml:space="preserve"> применяется точечно, без полной миграции пользовательского интерфейса. Сохранение прозрачности клиентской архитектуры оставалось приоритетом при оценке альтернативных инструментов. </w:t>
+      </w:r>
+      <w:r>
+        <w:t>Объяснимость архитектуры оставалась главным критерием выбора средств.</w:t>
       </w:r>
     </w:p>
     <w:p>
@@ -3710,56 +3488,90 @@
           <w:rFonts w:ascii="Times New Roman" w:hAnsi="Times New Roman" w:cs="Times New Roman"/>
           <w:lang w:val="ru-RU"/>
         </w:rPr>
+        <w:t xml:space="preserve">Сравнение </w:t>
+      </w:r>
+      <w:r>
+        <w:rPr>
+          <w:rFonts w:ascii="Times New Roman" w:hAnsi="Times New Roman" w:cs="Times New Roman"/>
+        </w:rPr>
+        <w:t>Java</w:t>
+      </w:r>
+      <w:r>
+        <w:rPr>
+          <w:rFonts w:ascii="Times New Roman" w:hAnsi="Times New Roman" w:cs="Times New Roman"/>
+          <w:lang w:val="ru-RU"/>
+        </w:rPr>
+        <w:t xml:space="preserve"> и </w:t>
+      </w:r>
+      <w:r>
+        <w:rPr>
+          <w:rFonts w:ascii="Times New Roman" w:hAnsi="Times New Roman" w:cs="Times New Roman"/>
+        </w:rPr>
+        <w:t>Unity</w:t>
+      </w:r>
+      <w:r>
+        <w:rPr>
+          <w:rFonts w:ascii="Times New Roman" w:hAnsi="Times New Roman" w:cs="Times New Roman"/>
+          <w:lang w:val="ru-RU"/>
+        </w:rPr>
+        <w:t>/</w:t>
+      </w:r>
+      <w:r>
+        <w:rPr>
+          <w:rFonts w:ascii="Times New Roman" w:hAnsi="Times New Roman" w:cs="Times New Roman"/>
+        </w:rPr>
+        <w:t>C</w:t>
+      </w:r>
+      <w:r>
+        <w:rPr>
+          <w:rFonts w:ascii="Times New Roman" w:hAnsi="Times New Roman" w:cs="Times New Roman"/>
+          <w:lang w:val="ru-RU"/>
+        </w:rPr>
+        <w:t>#</w:t>
+      </w:r>
+      <w:bookmarkEnd w:id="9"/>
+    </w:p>
+    <w:p>
+      <w:pPr>
+        <w:rPr>
+          <w:lang w:val="ru-RU"/>
+        </w:rPr>
+      </w:pPr>
+    </w:p>
+    <w:p>
+      <w:pPr>
+        <w:jc w:val="both"/>
+        <w:rPr>
+          <w:lang w:val="ru-RU"/>
+        </w:rPr>
+      </w:pPr>
+      <w:r>
+        <w:rPr>
+          <w:lang w:val="ru-RU"/>
+        </w:rPr>
+        <w:t>Игровое направление ООО «КОДДОТ» может использовать Unity и C#, поскольку Unity удобен для быстрого создания сцен, 2D- и 3D-прототипов, подключения анимаций и подготовки сборок для различных устройств. В корпоративной разработке такой стек сокращает время создания визуального MVP, особенно когда продукт требует сложной сцены, физики, готовых инструментов дизайнера или публикации на мобильных платформах. Это обстоятельство учитывалось при сравнении альтернатив для учебного проекта. Unity/C# полезны для ускорения визуальных прототипов, однако для данной учебной задачи важнее была явная сборка слоёв на Java/Swing. Unity оценивался как сильная альтернатива для визуальных MVP, но не как обязательная замена учебного стека.</w:t>
+      </w:r>
+    </w:p>
+    <w:p>
+      <w:pPr>
+        <w:jc w:val="both"/>
+        <w:rPr>
+          <w:lang w:val="ru-RU"/>
+        </w:rPr>
+      </w:pPr>
+      <w:r>
+        <w:rPr>
+          <w:lang w:val="ru-RU"/>
+        </w:rPr>
+        <w:t xml:space="preserve">Вместе с тем Unity не является безусловно лучшим выбором для каждого образовательного задания. Для «The Witcher» на Java ключевой ценностью было самостоятельное построение модели, интерфейсных слоёв, обработчиков событий и сценарной координации. Swing позволил увидеть эти механизмы непосредственно, без значительной части скрытой инфраструктуры движка. Это делает выбранный стек обоснованным для практического проекта, не отрицая </w:t>
+      </w:r>
+      <w:r>
+        <w:rPr>
+          <w:lang w:val="ru-RU"/>
+        </w:rPr>
         <w:lastRenderedPageBreak/>
-        <w:t xml:space="preserve">Сравнение </w:t>
-      </w:r>
-      <w:r>
-        <w:rPr>
-          <w:rFonts w:ascii="Times New Roman" w:hAnsi="Times New Roman" w:cs="Times New Roman"/>
-        </w:rPr>
-        <w:t>Java</w:t>
-      </w:r>
-      <w:r>
-        <w:rPr>
-          <w:rFonts w:ascii="Times New Roman" w:hAnsi="Times New Roman" w:cs="Times New Roman"/>
-          <w:lang w:val="ru-RU"/>
-        </w:rPr>
-        <w:t xml:space="preserve"> и </w:t>
-      </w:r>
-      <w:r>
-        <w:rPr>
-          <w:rFonts w:ascii="Times New Roman" w:hAnsi="Times New Roman" w:cs="Times New Roman"/>
-        </w:rPr>
-        <w:t>Unity</w:t>
-      </w:r>
-      <w:r>
-        <w:rPr>
-          <w:rFonts w:ascii="Times New Roman" w:hAnsi="Times New Roman" w:cs="Times New Roman"/>
-          <w:lang w:val="ru-RU"/>
-        </w:rPr>
-        <w:t>/</w:t>
-      </w:r>
-      <w:r>
-        <w:rPr>
-          <w:rFonts w:ascii="Times New Roman" w:hAnsi="Times New Roman" w:cs="Times New Roman"/>
-        </w:rPr>
-        <w:t>C</w:t>
-      </w:r>
-      <w:r>
-        <w:rPr>
-          <w:rFonts w:ascii="Times New Roman" w:hAnsi="Times New Roman" w:cs="Times New Roman"/>
-          <w:lang w:val="ru-RU"/>
-        </w:rPr>
-        <w:t>#</w:t>
-      </w:r>
-      <w:bookmarkEnd w:id="9"/>
-    </w:p>
-    <w:p>
-      <w:pPr>
-        <w:rPr>
-          <w:lang w:val="ru-RU"/>
-        </w:rPr>
-      </w:pPr>
+        <w:t>преимущества Unity/C# в условиях профессионального игрового производства. Сравнение технологий подтвердило принцип выбора средств по требованиям продукта, что согласуется с практикой ООО «КОДДОТ». Вывод о выборе технологии по задаче прямо связан с практикой Codedot.</w:t>
+      </w:r>
     </w:p>
     <w:p>
       <w:pPr>
@@ -3772,43 +3584,7 @@
         <w:rPr>
           <w:lang w:val="ru-RU"/>
         </w:rPr>
-        <w:t>Игровое направление ООО «КОДДОТ» может использовать Unity и C#, поскольку Unity удобен для быстрого создания сцен, 2D- и 3D-прототипов, подключения анимаций и подготовки сборок для различных устройств. В корпоративной разработке такой стек сокращает время создания визуального MVP, особенно когда продукт требует сложной сцены, физики, готовых инструментов дизайнера или публикации на мобильных платформах. Это обстоятельство учитывалось при сравнении альтернатив для учебного проекта.</w:t>
-      </w:r>
-      <w:r/>
-      <w:r>
-        <w:rPr>
-          <w:lang w:val="ru-RU"/>
-        </w:rPr>
-      </w:r>
-      <w:r/>
-      <w:r>
-        <w:rPr>
-          <w:lang w:val="ru-RU"/>
-        </w:rPr>
-      </w:r>
-      <w:r/>
-      <w:r>
-        <w:rPr>
-          <w:lang w:val="ru-RU"/>
-        </w:rPr>
-      </w:r>
-      <w:r/>
-      <w:r>
-        <w:rPr>
-          <w:lang w:val="ru-RU"/>
-        </w:rPr>
-      </w:r>
-      <w:r/>
-      <w:r>
-        <w:rPr>
-          <w:lang w:val="ru-RU"/>
-        </w:rPr>
-      </w:r>
-      <w:r/>
-      <w:r>
-        <w:rPr>
-          <w:lang w:val="ru-RU"/>
-        </w:rPr>
+        <w:t>Сравнение показывает, что технологии выбираются по задаче. Java/Swing обеспечивают прозрачность структуры и удобны для изучения архитектурных принципов. Unity/C# выигрывает при визуально насыщенном прототипировании и командной работе над игровым контентом. React и Node.js, применимые в веб-направлении Codedot, рациональны для интерфейсов и серверных API, но не заменяют нативную клиентскую логику интерактивной сцены настольного приложения. React/Node.js релевантны веб-направлению компании, но не заменяют клиентскую логику настольной интерактивной сцены. Веб-стек компании учитывался как контекст, а не как требование переписать desktop-игру.</w:t>
       </w:r>
     </w:p>
     <w:p>
@@ -3822,49 +3598,7 @@
         <w:rPr>
           <w:lang w:val="ru-RU"/>
         </w:rPr>
-        <w:t>Вместе с тем Unity не является безусловно лучшим выбором для каждого образовательного задания. Для «The Witcher» на Java ключевой ценностью было самостоятельное построение модели, интерфейсных слоёв, обработчиков событий и сценарной координации. Swing позволил увидеть эти механизмы непосредственно, без значительной части скрытой инфраструктуры движка. Это делает выбранный стек обоснованным для практического проекта, не отрицая преимущества Unity/C# в условиях профессионального игрового производства.</w:t>
-      </w:r>
-      <w:r/>
-      <w:r>
-        <w:rPr>
-          <w:lang w:val="ru-RU"/>
-        </w:rPr>
-      </w:r>
-      <w:r/>
-      <w:r>
-        <w:rPr>
-          <w:lang w:val="ru-RU"/>
-        </w:rPr>
-      </w:r>
-      <w:r/>
-      <w:r>
-        <w:rPr>
-          <w:lang w:val="ru-RU"/>
-        </w:rPr>
-      </w:r>
-      <w:r/>
-      <w:r>
-        <w:rPr>
-          <w:lang w:val="ru-RU"/>
-        </w:rPr>
-      </w:r>
-      <w:r/>
-      <w:r>
-        <w:rPr>
-          <w:lang w:val="ru-RU"/>
-        </w:rPr>
-      </w:r>
-      <w:r/>
-      <w:r>
-        <w:rPr>
-          <w:lang w:val="ru-RU"/>
-        </w:rPr>
-      </w:r>
-      <w:r/>
-      <w:r>
-        <w:rPr>
-          <w:lang w:val="ru-RU"/>
-        </w:rPr>
+        <w:t>Обоснование технологий выполнялось по единым критериям: сложность подключения, полезность для функционала, переносимость и возможность объяснить решение в рамках отчёта. Такой способ выбора соответствует инженерному подходу: технология не должна появляться в проекте как самоцель. Именно поэтому в учебном проекте сохранён Java-стек, а Unity рассматривается как сильная альтернатива для других типов продуктов компании. Каждая зависимость оценивалась по сложности подключения, полезности, переносимости и возможности объяснить её применение. Зависимости не включались без понятной роли в демонстрационном результате.</w:t>
       </w:r>
     </w:p>
     <w:p>
@@ -3878,61 +3612,14 @@
         <w:rPr>
           <w:lang w:val="ru-RU"/>
         </w:rPr>
-        <w:t>Сравнение показывает, что технологии выбираются по задаче. Java/Swing обеспечивают прозрачность структуры и удобны для изучения архитектурных принципов. Unity/C# выигрывает при визуально насыщенном прототипировании и командной работе над игровым контентом. React и Node.js, применимые в веб-направлении Codedot, рациональны для интерфейсов и серверных API, но не заменяют нативную клиентскую логику интерактивной сцены настольного приложения.</w:t>
-      </w:r>
-      <w:r/>
-      <w:r>
-        <w:rPr>
-          <w:lang w:val="ru-RU"/>
-        </w:rPr>
-      </w:r>
-      <w:r/>
-      <w:r>
-        <w:rPr>
-          <w:lang w:val="ru-RU"/>
-        </w:rPr>
-      </w:r>
-      <w:r/>
-      <w:r>
-        <w:rPr>
-          <w:lang w:val="ru-RU"/>
-        </w:rPr>
-      </w:r>
-      <w:r/>
-      <w:r>
-        <w:rPr>
-          <w:lang w:val="ru-RU"/>
-        </w:rPr>
-      </w:r>
-      <w:r/>
-      <w:r>
-        <w:rPr>
-          <w:lang w:val="ru-RU"/>
-        </w:rPr>
-      </w:r>
-      <w:r/>
-      <w:r>
-        <w:rPr>
-          <w:lang w:val="ru-RU"/>
-        </w:rPr>
-      </w:r>
-      <w:r/>
-      <w:r>
-        <w:rPr>
-          <w:lang w:val="ru-RU"/>
-        </w:rPr>
-      </w:r>
-      <w:r/>
-      <w:r>
-        <w:rPr>
-          <w:lang w:val="ru-RU"/>
-        </w:rPr>
-      </w:r>
-      <w:r/>
-      <w:r>
-        <w:rPr>
-          <w:lang w:val="ru-RU"/>
-        </w:rPr>
+        <w:t xml:space="preserve">Автоматизация сборки, единая загрузка ресурсов и централизованные константы уменьшают число ручных операций. Они также создают основу для будущей непрерывной интеграции, когда проект будет проверяться автоматически после изменения исходного кода. Для текущего этапа практики </w:t>
+      </w:r>
+      <w:r>
+        <w:rPr>
+          <w:lang w:val="ru-RU"/>
+        </w:rPr>
+        <w:lastRenderedPageBreak/>
+        <w:t>достаточно воспроизводимых скриптов запуска; дальнейшее усложнение инфраструктуры может выполняться без пересмотра архитектуры приложения. Константы и единая загрузка ресурсов подготовили проект к возможному подключению автоматических проверок в будущем. Подготовка к CI начиналась с порядка в ресурсах и константах.</w:t>
       </w:r>
     </w:p>
     <w:p>
@@ -3946,12 +3633,7 @@
         <w:rPr>
           <w:lang w:val="ru-RU"/>
         </w:rPr>
-        <w:t>Обоснование технологий выполнялось по единым критериям: сложность подключения, полезность для функционала, переносимость и возможность объяснить решение в рамках отчёта. Такой способ выбора соответствует инженерному подходу: технология не должна появляться в проекте как самоцель. Именно поэтому в учебном проекте сохранён Java-стек, а Unity рассматривается как сильная альтернатива для других типов продуктов компании. Особое внимание уделялось повторному запуску сценария: после поражения, повторной покупки или возврата к предыдущей фазе состояние должно оставаться согласованным. Указанный критерий применялся при оценке готовности результата. Ресурсы интерфейса и игровые правила связывались через явные константы и централизованные пути, чтобы исключить расхождение строковых значений. Сформулированное положение использовалось как ориентир при рефакторинге.</w:t>
-      </w:r>
-      <w:r>
-        <w:rPr>
-          <w:lang w:val="ru-RU"/>
-        </w:rPr>
+        <w:t>Поддерживаемость технологического выбора обеспечивалась отказом от лишних зависимостей и фиксацией точек загрузки ресурсов. Дублирование путей и «магических» значений устранялось через константы и общие helper-классы. Это снизило риск различного поведения одинаковых сцен и упрощает передачу проекта другому исполнителю. Лишние библиотеки не добавлялись, если функцию закрывал уже выбранный стек. Минимизация библиотек снизила риск поломки сборки из-за лишних связей.</w:t>
       </w:r>
     </w:p>
     <w:p>
@@ -3965,7 +3647,7 @@
         <w:rPr>
           <w:lang w:val="ru-RU"/>
         </w:rPr>
-        <w:t>Автоматизация сборки, единая загрузка ресурсов и централизованные константы уменьшают число ручных операций. Они также создают основу для будущей непрерывной интеграции, когда проект будет проверяться автоматически после изменения исходного кода. Для текущего этапа практики достаточно воспроизводимых скриптов запуска; дальнейшее усложнение инфраструктуры может выполняться без пересмотра архитектуры приложения. Ресурсы интерфейса и игровые правила связывались через явные константы и централизованные пути, чтобы исключить расхождение строковых значений. Соответствующее ограничение учитывалось при планировании объёма работ.</w:t>
+        <w:t>Практическая проверка технологий сводилась к запуску и прохождению ключевых сценариев. Если сборка или загрузка ресурса давали сбой, исправление выполнялось до фиксации очередного этапа. Такой порядок выявлял проблемы среды наряду с ошибками логики и интерфейса. После изменений в зависимостях повторно проверялись запуск и ключевые игровые сцены. Регрессии запуска отслеживались сразу после изменений в classpath и скриптах.</w:t>
       </w:r>
     </w:p>
     <w:p>
@@ -3979,170 +3661,8 @@
         <w:rPr>
           <w:lang w:val="ru-RU"/>
         </w:rPr>
-        <w:t>Поддерживаемость технологического выбора обеспечивалась отказом от лишних зависимостей и фиксацией точек загрузки ресурсов. Дублирование путей и «магических» значений устранялось через константы и общие helper-классы. Это снизило риск различного поведения одинаковых сцен и упрощает передачу проекта другому исполнителю. Практическая проверка модуля выполнялась на сквозном пользовательском сценарии, включающем переход из соседних экранов. Такая фиксация снижает вероятность повторного возникновения сходных дефектов. Полученный результат фиксировался как готовый вертикальный срез, пригодный для демонстрации на защите и для дальнейшей доработки. Это уточняет практическую сторону выполненной работы.</w:t>
-      </w:r>
-    </w:p>
-    <w:p>
-      <w:pPr>
-        <w:jc w:val="both"/>
-        <w:rPr>
-          <w:lang w:val="ru-RU"/>
-        </w:rPr>
-      </w:pPr>
-      <w:r>
-        <w:rPr>
-          <w:lang w:val="ru-RU"/>
-        </w:rPr>
-        <w:t>Практическая проверка технологий сводилась к запуску и прохождению ключевых сценариев. Если сборка или загрузка ресурса давали сбой, исправление выполнялось до фиксации очередного этапа. Такой порядок выявлял проблемы среды наряду с ошибками логики и интерфейса. Полученный результат фиксировался как готовый вертикальный срез, пригодный для демонстрации на защите и для дальнейшей доработки. Сформулированное положение использовалось как ориентир при рефакторинге. При расширении функциональности сохранялись ранее принятые границы ответственности, чтобы не возвращаться к смешанной логике «всё в одном классе». Данный вывод учитывался при последующей проверке сценариев.</w:t>
-      </w:r>
-      <w:r>
-        <w:rPr>
-          <w:lang w:val="ru-RU"/>
-        </w:rPr>
-      </w:r>
-    </w:p>
-    <w:p>
-      <w:pPr>
-        <w:jc w:val="both"/>
-        <w:rPr>
-          <w:lang w:val="ru-RU"/>
-        </w:rPr>
-      </w:pPr>
-      <w:r>
-        <w:rPr>
-          <w:lang w:val="ru-RU"/>
-        </w:rPr>
-        <w:t>Сформированный стек остаётся компактным, но покрывает полный путь от исходного кода и ресурсов до запускаемой демонстрации. Полученный опыт важен и в контексте деятельности ООО «КОДДОТ»: при создании веб-, мобильных и игровых решений одинаково значимы декомпозиция, прозрачное взаимодействие компонентов и регулярная демонстрация промежуточного результата. При расширении функциональности сохранялись ранее принятые границы ответственности, чтобы не возвращаться к смешанной логике «всё в одном классе». В дальнейшем это упростило объяснение принятых решений на защите.</w:t>
-      </w:r>
-    </w:p>
-    <w:p>
-      <w:pPr>
-        <w:jc w:val="both"/>
-        <w:rPr>
-          <w:lang w:val="ru-RU"/>
-        </w:rPr>
-      </w:pPr>
-    </w:p>
-    <w:p>
-      <w:pPr>
-        <w:jc w:val="both"/>
-        <w:rPr>
-          <w:lang w:val="ru-RU"/>
-        </w:rPr>
-      </w:pPr>
-    </w:p>
-    <w:p>
-      <w:pPr>
-        <w:jc w:val="both"/>
-        <w:rPr>
-          <w:lang w:val="ru-RU"/>
-        </w:rPr>
-      </w:pPr>
-    </w:p>
-    <w:p>
-      <w:pPr>
-        <w:jc w:val="both"/>
-        <w:rPr>
-          <w:lang w:val="ru-RU"/>
-        </w:rPr>
-      </w:pPr>
-    </w:p>
-    <w:p>
-      <w:pPr>
-        <w:jc w:val="both"/>
-        <w:rPr>
-          <w:lang w:val="ru-RU"/>
-        </w:rPr>
-      </w:pPr>
-    </w:p>
-    <w:p>
-      <w:pPr>
-        <w:jc w:val="both"/>
-        <w:rPr>
-          <w:lang w:val="ru-RU"/>
-        </w:rPr>
-      </w:pPr>
-    </w:p>
-    <w:p>
-      <w:pPr>
-        <w:jc w:val="both"/>
-        <w:rPr>
-          <w:lang w:val="ru-RU"/>
-        </w:rPr>
-      </w:pPr>
-    </w:p>
-    <w:p>
-      <w:pPr>
-        <w:jc w:val="both"/>
-        <w:rPr>
-          <w:lang w:val="ru-RU"/>
-        </w:rPr>
-      </w:pPr>
-    </w:p>
-    <w:p>
-      <w:pPr>
-        <w:jc w:val="both"/>
-        <w:rPr>
-          <w:lang w:val="ru-RU"/>
-        </w:rPr>
-      </w:pPr>
-    </w:p>
-    <w:p>
-      <w:pPr>
-        <w:jc w:val="both"/>
-        <w:rPr>
-          <w:lang w:val="ru-RU"/>
-        </w:rPr>
-      </w:pPr>
-    </w:p>
-    <w:p>
-      <w:pPr>
-        <w:jc w:val="both"/>
-        <w:rPr>
-          <w:lang w:val="ru-RU"/>
-        </w:rPr>
-      </w:pPr>
-    </w:p>
-    <w:p>
-      <w:pPr>
-        <w:jc w:val="both"/>
-        <w:rPr>
-          <w:lang w:val="ru-RU"/>
-        </w:rPr>
-      </w:pPr>
-    </w:p>
-    <w:p>
-      <w:pPr>
-        <w:jc w:val="both"/>
-        <w:rPr>
-          <w:lang w:val="ru-RU"/>
-        </w:rPr>
-      </w:pPr>
-    </w:p>
-    <w:p>
-      <w:pPr>
-        <w:jc w:val="both"/>
-        <w:rPr>
-          <w:lang w:val="ru-RU"/>
-        </w:rPr>
-      </w:pPr>
-    </w:p>
-    <w:p>
-      <w:pPr>
-        <w:jc w:val="both"/>
-        <w:rPr>
-          <w:lang w:val="ru-RU"/>
-        </w:rPr>
-      </w:pPr>
-    </w:p>
-    <w:p>
-      <w:pPr>
-        <w:ind w:firstLine="0"/>
-        <w:jc w:val="both"/>
-        <w:rPr>
-          <w:lang w:val="ru-RU"/>
-        </w:rPr>
-      </w:pPr>
+        <w:t>Сформированный стек остаётся компактным, но покрывает полный путь от исходного кода и ресурсов до запускаемой демонстрации. Полученный опыт важен и в контексте деятельности ООО «КОДДОТ»: при создании веб-, мобильных и игровых решений одинаково значимы декомпозиция, прозрачное взаимодействие компонентов и регулярная демонстрация промежуточного результата. Сохранение небольшого стека соответствует подходу «сначала рабочий результат, затем усложнение инфраструктуры». Рабочий результат приоритетнее раннего усложнения инфраструктуры.</w:t>
+      </w:r>
     </w:p>
     <w:p>
       <w:pPr>
@@ -4186,19 +3706,7 @@
         <w:rPr>
           <w:lang w:val="ru-RU"/>
         </w:rPr>
-        <w:t>Для хранения исходного кода и отслеживания изменений используется Git, а удалённый репозиторий GitHub может выступать точкой обмена, резервного хранения и публикации истории проекта. Коммиты связывались с законченными логическими изменениями: добавлением модуля, исправлением сценария, обновлением ресурса или рефакторингом. Такой подход сделал ход работы прозрачным и упростил возврат к стабильному состоянию при ошибках. Для модуля описывались входные данные, ожидаемый результат, возможные ограничения и способ проверки после внесения изменений. Отмеченное требование сохранялось на всех этапах доработки. Особое внимание уделялось повторному запуску сценария: после поражения, повторной покупки или возврата к предыдущей фазе состояние должно оставаться согласованным. Такая фиксация снижает вероятность повторного возникновения сходных дефектов.</w:t>
-      </w:r>
-      <w:r/>
-      <w:r>
-        <w:rPr>
-          <w:lang w:val="ru-RU"/>
-        </w:rPr>
-      </w:r>
-      <w:r/>
-      <w:r>
-        <w:rPr>
-          <w:lang w:val="ru-RU"/>
-        </w:rPr>
+        <w:t>Для хранения исходного кода и отслеживания изменений используется Git, а удалённый репозиторий GitHub может выступать точкой обмена, резервного хранения и публикации истории проекта. Коммиты связывались с законченными логическими изменениями: добавлением модуля, исправлением сценария, обновлением ресурса или рефакторингом. Такой подход сделал ход работы прозрачным и упростил возврат к стабильному состоянию при ошибках. Git и GitHub использовались для истории изменений, резервного хранения и фиксации законченных смысловых шагов работы. Коммиты группировались по завершённому смыслу: модуль, сценарий, ресурс, рефакторинг.</w:t>
       </w:r>
     </w:p>
     <w:p>
@@ -4212,13 +3720,7 @@
         <w:rPr>
           <w:lang w:val="ru-RU"/>
         </w:rPr>
-        <w:t>Планирование строилось через краткий список задач с приоритетом пользовательского результата. Для каждого блока указывались ожидаемый эффект, зависимости и проверка готовности. В рабочих процессах компании аналогичная схема может быть реализована средствами issue-трекера и доски задач. Наличие явных критериев готовности не позволяло считать этап завершённым только по факту компиляции. Особое внимание уделялось повторному запуску сценария: после поражения, повторной покупки или возврата к предыдущей фазе состояние должно оставаться согласованным. Указанный критерий применялся при оценке готовности результата. Ресурсы интерфейса и игровые правила связывались через явные константы и централизованные пути, чтобы исключить расхождение строковых значений. Сформулированное положение использовалось как ориентир при рефакторинге.</w:t>
-      </w:r>
-      <w:r/>
-      <w:r>
-        <w:rPr>
-          <w:lang w:val="ru-RU"/>
-        </w:rPr>
+        <w:t>Планирование строилось через краткий список задач с приоритетом пользовательского результата. Для каждого блока указывались ожидаемый эффект, зависимости и проверка готовности. В рабочих процессах компании аналогичная схема может быть реализована средствами issue-трекера и доски задач. Наличие явных критериев готовности не позволяло считать этап завершённым только по факту компиляции. Краткий план задач с акцентом на пользовательский эффект заменял полноценный issue-трекер в индивидуальном формате. План работ опирался на наблюдаемый эффект для игрока.</w:t>
       </w:r>
     </w:p>
     <w:p>
@@ -4232,24 +3734,7 @@
         <w:rPr>
           <w:lang w:val="ru-RU"/>
         </w:rPr>
-        <w:t>Даже при одиночной разработке Git и дисциплина коммитов повышают поддерживаемость проекта. Без истории изменений легко потерять рабочую версию после крупной правки интерфейса или ресурсов. Поэтому контроль версий рассматривался как обязательная часть процесса, а не как необязательное дополнение. Ресурсы интерфейса и игровые правила связывались через явные константы и централизованные пути, чтобы исключить расхождение строковых значений. Соответствующее ограничение учитывалось при планировании объёма работ. Практическая проверка модуля выполнялась на сквозном пользовательском сценарии, включающем переход из соседних экранов. В дальнейшем это упростило объяснение принятых решений на защите.</w:t>
-      </w:r>
-      <w:r/>
-      <w:r>
-        <w:rPr>
-          <w:lang w:val="ru-RU"/>
-        </w:rPr>
-      </w:r>
-      <w:r/>
-      <w:r>
-        <w:rPr>
-          <w:lang w:val="ru-RU"/>
-        </w:rPr>
-      </w:r>
-      <w:r>
-        <w:rPr>
-          <w:lang w:val="ru-RU"/>
-        </w:rPr>
+        <w:t>Даже при одиночной разработке Git и дисциплина коммитов повышают поддерживаемость проекта. Без истории изменений легко потерять рабочую версию после крупной правки интерфейса или ресурсов. Поэтому контроль версий рассматривался как обязательная часть процесса, а не как необязательное дополнение. Понятные коммиты снижали риск потери стабильной версии после крупных правок интерфейса. История Git использовалась как страховка при крупных правках UI.</w:t>
       </w:r>
     </w:p>
     <w:p>
@@ -4263,13 +3748,8 @@
         <w:rPr>
           <w:lang w:val="ru-RU"/>
         </w:rPr>
-        <w:t>Перед фиксацией изменений выполнялась проверка пользовательских сценариев. Если сценарий ломался, исправление выполнялось до коммита. Такой порядок снизил число «сломанных» состояний репозитория и упростил последующий анализ истории. Практическая проверка модуля выполнялась на сквозном пользовательском сценарии, включающем переход из соседних экранов. Такая фиксация снижает вероятность повторного возникновения сходных дефектов. Полученный результат фиксировался как готовый вертикальный срез, пригодный для демонстрации на защите и для дальнейшей доработки. Это уточняет практическую сторону выполненной работы.</w:t>
-      </w:r>
-      <w:r/>
-      <w:r>
-        <w:rPr>
-          <w:lang w:val="ru-RU"/>
-        </w:rPr>
+        <w:lastRenderedPageBreak/>
+        <w:t>Перед фиксацией изменений выполнялась проверка пользовательских сценариев. Если сценарий ломался, исправление выполнялось до коммита. Такой порядок снизил число «сломанных» состояний репозитория и упростил последующий анализ истории. Минимальный процесс уже обеспечивал воспроизводимость и прозрачность хода практики. Даже минимальный процесс повышал воспроизводимость практики.</w:t>
       </w:r>
     </w:p>
     <w:p>
@@ -4283,7 +3763,7 @@
         <w:rPr>
           <w:lang w:val="ru-RU"/>
         </w:rPr>
-        <w:t>Использование указанных средств формирует воспроизводимый процесс даже при одиночной работе и облегчает подключение нового участника к проекту. Полученный опыт важен и в контексте деятельности ООО «КОДДОТ»: прозрачная история изменений и регулярные проверки являются базовой инженерной дисциплиной. Полученный результат фиксировался как готовый вертикальный срез, пригодный для демонстрации на защите и для дальнейшей доработки. Сформулированное положение использовалось как ориентир при рефакторинге.</w:t>
+        <w:t>Использование указанных средств формирует воспроизводимый процесс даже при одиночной работе и облегчает подключение нового участника к проекту. Полученный опыт важен и в контексте деятельности ООО «КОДДОТ»: прозрачная история изменений и регулярные проверки являются базовой инженерной дисциплиной. IDE ускоряла навигацию по пакетам и поиск использований при росте числа связанных классов. Навигация по IDE была необходима при росте числа связанных экранов и презентеров.</w:t>
       </w:r>
     </w:p>
     <w:p>
@@ -4297,24 +3777,7 @@
         <w:rPr>
           <w:lang w:val="ru-RU"/>
         </w:rPr>
-        <w:t>С учётом учебного формата организационные средства применялись в минимально достаточном объёме: без избыточных ритуалов, но с реальной пользой для контроля качества и воспроизводимости запуска. При расширении функциональности сохранялись ранее принятые границы ответственности, чтобы не возвращаться к смешанной логике «всё в одном классе». В дальнейшем это упростило объяснение принятых решений на защите. Для модуля описывались входные данные, ожидаемый результат, возможные ограничения и способ проверки после внесения изменений. Отмеченное требование сохранялось на всех этапах доработки. Особое внимание уделялось повторному запуску сценария: после поражения, повторной покупки или возврата к предыдущей фазе состояние должно оставаться согласованным. Такая фиксация снижает вероятность повторного возникновения сходных дефектов.</w:t>
-      </w:r>
-      <w:r/>
-      <w:r>
-        <w:rPr>
-          <w:lang w:val="ru-RU"/>
-        </w:rPr>
-      </w:r>
-      <w:r/>
-      <w:r>
-        <w:rPr>
-          <w:lang w:val="ru-RU"/>
-        </w:rPr>
-      </w:r>
-      <w:r>
-        <w:rPr>
-          <w:lang w:val="ru-RU"/>
-        </w:rPr>
+        <w:t>С учётом учебного формата организационные средства применялись в минимально достаточном объёме: без избыточных ритуалов, но с реальной пользой для контроля качества и воспроизводимости запуска. Скрипты запуска хранились в репозитории и обеспечивали одинаковый порядок сборки на разных ОС. Одинаковые build/run scripts уменьшили расхождение запуска между ОС.</w:t>
       </w:r>
     </w:p>
     <w:p>
@@ -4328,19 +3791,14 @@
         <w:rPr>
           <w:lang w:val="ru-RU"/>
         </w:rPr>
-        <w:t>Среда разработки обеспечивает навигацию по пакетам, запуск приложения, поиск использования классов, форматирование и анализ ошибок компиляции. Для Java-проекта это существенно при работе с несколькими десятками классов, так как позволяет отследить связи между презентером, экраном, моделью магазина и директором главы. IDE не заменяет осмысленный обзор архитектуры, но заметно ускоряет рутинные операции.</w:t>
-      </w:r>
-      <w:r/>
-      <w:r>
-        <w:rPr>
-          <w:lang w:val="ru-RU"/>
-        </w:rPr>
-      </w:r>
-      <w:r/>
-      <w:r>
-        <w:rPr>
-          <w:lang w:val="ru-RU"/>
-        </w:rPr>
+        <w:t xml:space="preserve">Среда разработки обеспечивает навигацию по пакетам, запуск приложения, поиск использования классов, форматирование и анализ ошибок компиляции. Для Java-проекта это существенно при работе с несколькими десятками классов, так как позволяет отследить связи между презентером, экраном, моделью магазина и директором главы. IDE не заменяет осмысленный обзор архитектуры, но заметно ускоряет рутинные операции. Ручная проверка UI оставалась обязательной для визуальной новеллы даже при корректности </w:t>
+      </w:r>
+      <w:r>
+        <w:rPr>
+          <w:lang w:val="ru-RU"/>
+        </w:rPr>
+        <w:lastRenderedPageBreak/>
+        <w:t>расчётных правил модели. Визуальные дефекты VN выявлялись только ручным проходом.</w:t>
       </w:r>
     </w:p>
     <w:p>
@@ -4354,43 +3812,7 @@
         <w:rPr>
           <w:lang w:val="ru-RU"/>
         </w:rPr>
-        <w:t>Сценарии Windows и macOS используются как простые build scripts. Их назначение — унифицировать запуск сборки, очистку временных файлов и подготовку результата. Такой уровень автоматизации понятен для учебного проекта, а в дальнейшем может быть расширен Gradle-задачами и CI-пайплайном. Важно, что команды не остаются только в памяти разработчика, а существуют как проверяемый артефакт репозитория.</w:t>
-      </w:r>
-      <w:r/>
-      <w:r>
-        <w:rPr>
-          <w:lang w:val="ru-RU"/>
-        </w:rPr>
-      </w:r>
-      <w:r/>
-      <w:r>
-        <w:rPr>
-          <w:lang w:val="ru-RU"/>
-        </w:rPr>
-      </w:r>
-      <w:r/>
-      <w:r>
-        <w:rPr>
-          <w:lang w:val="ru-RU"/>
-        </w:rPr>
-      </w:r>
-      <w:r/>
-      <w:r>
-        <w:rPr>
-          <w:lang w:val="ru-RU"/>
-        </w:rPr>
-      </w:r>
-      <w:r/>
-      <w:r>
-        <w:rPr>
-          <w:lang w:val="ru-RU"/>
-        </w:rPr>
-      </w:r>
-      <w:r/>
-      <w:r>
-        <w:rPr>
-          <w:lang w:val="ru-RU"/>
-        </w:rPr>
+        <w:t>Сценарии Windows и macOS используются как простые build scripts. Их назначение — унифицировать запуск сборки, очистку временных файлов и подготовку результата. Такой уровень автоматизации понятен для учебного проекта, а в дальнейшем может быть расширен Gradle-задачами и CI-пайплайном. Важно, что команды не остаются только в памяти разработчика, а существуют как проверяемый артефакт репозитория. Организационные средства в совокупности сделали работу управляемой и готовой к демонстрации. Сочетание Git, плана задач и скриптов сформировало достаточный организационный минимум.</w:t>
       </w:r>
     </w:p>
     <w:p>
@@ -4404,7 +3826,7 @@
         <w:rPr>
           <w:lang w:val="ru-RU"/>
         </w:rPr>
-        <w:t>Тестирование выполнялось на уровне пользовательских сценариев и базовых правил модели. Ручная проверка особенно важна для визуальной новеллы: формально корректный обработчик может открыть сцену, но текст окажется перекрыт, фокус потеряется, а тайминг анимации сделает переход нечитаемым. Поэтому контроль интерфейса сочетался с проверкой значений игровой модели. Ресурсы интерфейса и игровые правила связывались через явные константы и централизованные пути, чтобы исключить расхождение строковых значений. Отмеченное требование сохранялось на всех этапах доработки.</w:t>
+        <w:t>Тестирование выполнялось на уровне пользовательских сценариев и базовых правил модели. Ручная проверка особенно важна для визуальной новеллы: формально корректный обработчик может открыть сцену, но текст окажется перекрыт, фокус потеряется, а тайминг анимации сделает переход нечитаемым. Поэтому контроль интерфейса сочетался с проверкой значений игровой модели. Выбранный минимум инструментов соответствовал объёму учебного проекта и не создавал избыточной бюрократии. Инструменты не раздувались сверх потребностей учебной демонстрации.</w:t>
       </w:r>
     </w:p>
     <w:p>
@@ -4417,6 +3839,33 @@
     </w:p>
     <w:p>
       <w:pPr>
+        <w:jc w:val="both"/>
+        <w:rPr>
+          <w:lang w:val="ru-RU"/>
+        </w:rPr>
+      </w:pPr>
+    </w:p>
+    <w:p>
+      <w:pPr>
+        <w:ind w:firstLine="0"/>
+        <w:jc w:val="both"/>
+        <w:rPr>
+          <w:lang w:val="ru-RU"/>
+        </w:rPr>
+      </w:pPr>
+    </w:p>
+    <w:p>
+      <w:pPr>
+        <w:ind w:firstLine="0"/>
+        <w:jc w:val="both"/>
+        <w:rPr>
+          <w:lang w:val="ru-RU"/>
+        </w:rPr>
+      </w:pPr>
+    </w:p>
+    <w:p>
+      <w:pPr>
+        <w:ind w:firstLine="0"/>
         <w:jc w:val="both"/>
         <w:rPr>
           <w:lang w:val="ru-RU"/>
@@ -4498,19 +3947,7 @@
         <w:rPr>
           <w:lang w:val="ru-RU"/>
         </w:rPr>
-        <w:t>Цель проекта — создать демонстрационную пиксельную игру с последовательной сюжетной подачей и несколькими взаимосвязанными игровыми механиками. Игрок начинает со вступительных экранов, знакомится с контекстом через реплики персонажей, получает доступ к торговой части, проходит первую главу и вступает в бой. Проект рассматривался как целостный цикл, а не как набор разрозненных демонстраций отдельных экранов. Практическая проверка модуля выполнялась на сквозном пользовательском сценарии, включающем переход из соседних экранов. Данный вывод учитывался при последующей проверке сценариев. Полученный результат фиксировался как готовый вертикальный срез, пригодный для демонстрации на защите и для дальнейшей доработки. Соответствующее ограничение учитывалось при планировании объёма работ.</w:t>
-      </w:r>
-      <w:r/>
-      <w:r>
-        <w:rPr>
-          <w:lang w:val="ru-RU"/>
-        </w:rPr>
-      </w:r>
-      <w:r/>
-      <w:r>
-        <w:rPr>
-          <w:lang w:val="ru-RU"/>
-        </w:rPr>
+        <w:t>Цель проекта — создать демонстрационную пиксельную игру с последовательной сюжетной подачей и несколькими взаимосвязанными игровыми механиками. Игрок начинает со вступительных экранов, знакомится с контекстом через реплики персонажей, получает доступ к торговой части, проходит первую главу и вступает в бой. Проект рассматривался как целостный цикл, а не как набор разрозненных демонстраций отдельных экранов. Цель пробного проекта — связанный вертикальный срез: вступление, диалоги, магазин, первая глава и бой. Пробный проект демонстрирует связанные механики, а не набор независимых экранов.</w:t>
       </w:r>
     </w:p>
     <w:p>
@@ -4524,19 +3961,7 @@
         <w:rPr>
           <w:lang w:val="ru-RU"/>
         </w:rPr>
-        <w:t>Основной цикл выглядит следующим образом: запуск и заставка — визуальная новелла — выбор или подтверждение диалога — магазин и подготовка героя — фазы первой главы — бой — экран результата — повторный запуск или продолжение. Внутри цикла данные о выбранном снаряжении и состоянии должны оставаться согласованными. Для каждого шага определялись ожидаемый эффект и критерий готовности. Полученный результат фиксировался как готовый вертикальный срез, пригодный для демонстрации на защите и для дальнейшей доработки. Отмеченное требование сохранялось на всех этапах доработки. При расширении функциональности сохранялись ранее принятые границы ответственности, чтобы не возвращаться к смешанной логике «всё в одном классе». Такая фиксация снижает вероятность повторного возникновения сходных дефектов.</w:t>
-      </w:r>
-      <w:r/>
-      <w:r>
-        <w:rPr>
-          <w:lang w:val="ru-RU"/>
-        </w:rPr>
-      </w:r>
-      <w:r/>
-      <w:r>
-        <w:rPr>
-          <w:lang w:val="ru-RU"/>
-        </w:rPr>
+        <w:t>Основной цикл выглядит следующим образом: запуск и заставка — визуальная новелла — выбор или подтверждение диалога — магазин и подготовка героя — фазы первой главы — бой — экран результата — повторный запуск или продолжение. Внутри цикла данные о выбранном снаряжении и состоянии должны оставаться согласованными. Для каждого шага определялись ожидаемый эффект и критерий готовности. Игровой цикл проектировался так, чтобы снаряжение и состояние оставались согласованными на всём пути прохождения. Согласованность состояния внутри цикла — ключевой критерий готовности игры.</w:t>
       </w:r>
     </w:p>
     <w:p>
@@ -4550,24 +3975,14 @@
         <w:rPr>
           <w:lang w:val="ru-RU"/>
         </w:rPr>
-        <w:t>Поддерживаемость обеспечивалась разделением сюжетной, интерфейсной и расчётной логики. Если все правила собрать в одном экранном классе, любая правка визуала начинает рисковать поломкой переходов и расчётов. Поэтому границы модулей фиксировались уже на этапе постановки функциональности. При расширении функциональности сохранялись ранее принятые границы ответственности, чтобы не возвращаться к смешанной логике «всё в одном классе». Указанный критерий применялся при оценке готовности результата. Для модуля описывались входные данные, ожидаемый результат, возможные ограничения и способ проверки после внесения изменений. Сформулированное положение использовалось как ориентир при рефакторинге.</w:t>
-      </w:r>
-      <w:r/>
-      <w:r>
-        <w:rPr>
-          <w:lang w:val="ru-RU"/>
-        </w:rPr>
-      </w:r>
-      <w:r/>
-      <w:r>
-        <w:rPr>
-          <w:lang w:val="ru-RU"/>
-        </w:rPr>
-      </w:r>
-      <w:r>
-        <w:rPr>
-          <w:lang w:val="ru-RU"/>
-        </w:rPr>
+        <w:t xml:space="preserve">Поддерживаемость обеспечивалась разделением сюжетной, интерфейсной и расчётной логики. Если все правила собрать в одном экранном классе, любая правка визуала начинает рисковать поломкой переходов и расчётов. Поэтому границы модулей фиксировались уже на этапе постановки функциональности. Разделение сюжета, интерфейса и расчётов закладывалось с начала реализации, </w:t>
+      </w:r>
+      <w:r>
+        <w:rPr>
+          <w:lang w:val="ru-RU"/>
+        </w:rPr>
+        <w:lastRenderedPageBreak/>
+        <w:t>а не добавлялось постфактум. Раннее разделение ответственности снизило стоимость последующих правок.</w:t>
       </w:r>
     </w:p>
     <w:p>
@@ -4581,7 +3996,7 @@
         <w:rPr>
           <w:lang w:val="ru-RU"/>
         </w:rPr>
-        <w:t>Готовность проекта проверялась сквозным проходом по пользовательским сценариям. Отдельно контролировалась согласованность состояния после поражения и повторного входа в цикл. Такой порядок выявлял дефекты связности раньше, чем они проявлялись на защите. Для модуля описывались входные данные, ожидаемый результат, возможные ограничения и способ проверки после внесения изменений. Соответствующее ограничение учитывалось при планировании объёма работ. Особое внимание уделялось повторному запуску сценария: после поражения, повторной покупки или возврата к предыдущей фазе состояние должно оставаться согласованным. В дальнейшем это упростило объяснение принятых решений на защите.</w:t>
+        <w:t>Готовность проекта проверялась сквозным проходом по пользовательским сценариям. Отдельно контролировалась согласованность состояния после поражения и повторного входа в цикл. Такой порядок выявлял дефекты связности раньше, чем они проявлялись на защите. Готовность подтверждалась полным проходом, а не демонстрацией отдельных экранов вне цикла. Полный проход выявлял дефекты, невидимые на изолированных сценах.</w:t>
       </w:r>
     </w:p>
     <w:p>
@@ -4595,19 +4010,7 @@
         <w:rPr>
           <w:lang w:val="ru-RU"/>
         </w:rPr>
-        <w:t>Реализованный продукт демонстрирует, что даже компактная игра требует координации сюжетной, интерфейсной и расчётной логики. Полученный опыт важен и в контексте деятельности ООО «КОДДОТ»: вертикальный срез с понятной демонстрацией ценен как для обучения, так и для практики подготовки MVP. Особое внимание уделялось повторному запуску сценария: после поражения, повторной покупки или возврата к предыдущей фазе состояние должно оставаться согласованным. Такая фиксация снижает вероятность повторного возникновения сходных дефектов.</w:t>
-      </w:r>
-      <w:r/>
-      <w:r>
-        <w:rPr>
-          <w:lang w:val="ru-RU"/>
-        </w:rPr>
-      </w:r>
-      <w:r/>
-      <w:r>
-        <w:rPr>
-          <w:lang w:val="ru-RU"/>
-        </w:rPr>
+        <w:t>Реализованный продукт демонстрирует, что даже компактная игра требует координации сюжетной, интерфейсной и расчётной логики. Полученный опыт важен и в контексте деятельности ООО «КОДДОТ»: вертикальный срез с понятной демонстрацией ценен как для обучения, так и для практики подготовки MVP. Результат показывает координацию сюжетной, интерфейсной и расчётной логики в одном продукте. Вертикальный срез удобен для показа практики в профиле Codedot.</w:t>
       </w:r>
     </w:p>
     <w:p>
@@ -4621,12 +4024,7 @@
         <w:rPr>
           <w:lang w:val="ru-RU"/>
         </w:rPr>
-        <w:t>Объём функциональности удерживался в рамках того, что можно довести до стабильной демонстрации одним исполнителем. Это позволило сохранить качество основных сценариев без распыления усилий на второстепенные ветки. Ресурсы интерфейса и игровые правила связывались через явные константы и централизованные пути, чтобы исключить расхождение строковых значений. Сформулированное положение использовалось как ориентир при рефакторинге. Практическая проверка модуля выполнялась на сквозном пользовательском сценарии, включающем переход из соседних экранов. Данный вывод учитывался при последующей проверке сценариев. Полученный результат фиксировался как готовый вертикальный срез, пригодный для демонстрации на защите и для дальнейшей доработки. Соответствующее ограничение учитывалось при планировании объёма работ.</w:t>
-      </w:r>
-      <w:r>
-        <w:rPr>
-          <w:lang w:val="ru-RU"/>
-        </w:rPr>
+        <w:t>Объём функциональности удерживался в рамках того, что можно довести до стабильной демонстрации одним исполнителем. Это позволило сохранить качество основных сценариев без распыления усилий на второстепенные ветки. Объём работ удерживался в границах того, что реально завершить до демонстрации и защиты. Ограничение объёма защитило качество завершённых модулей.</w:t>
       </w:r>
     </w:p>
     <w:p>
@@ -4646,6 +4044,7 @@
         <w:rPr>
           <w:noProof/>
         </w:rPr>
+        <w:lastRenderedPageBreak/>
         <w:drawing>
           <wp:inline distT="0" distB="0" distL="0" distR="0" wp14:anchorId="55BDB8D8" wp14:editId="68F85356">
             <wp:extent cx="6903720" cy="4121709"/>
@@ -4862,18 +4261,14 @@
         <w:rPr>
           <w:lang w:val="ru-RU"/>
         </w:rPr>
-        <w:t>Магазин отвечает за просмотр доступного снаряжения, визуальное представление карточек, цены, иконки, подтверждение выбора и применение эффекта предмета к герою. Каталог и правила экипировки изолированы от конкретного Swing-представления, поэтому цена и доступность не вычисляются непосредственно в обработчике нажатия. Такое решение сохраняет прозрачность модели состояния. Для модуля описывались входные данные, ожидаемый результат, возможные ограничения и способ проверки после внесения изменений. Это уточняет практическую сторону выполненной работы. Особое внимание уделялось повторному запуску сценария: после поражения, повторной покупки или возврата к предыдущей фазе состояние должно оставаться согласованным. Указанный критерий применялся при оценке готовности результата.</w:t>
-      </w:r>
-      <w:r/>
-      <w:r>
-        <w:rPr>
-          <w:lang w:val="ru-RU"/>
-        </w:rPr>
-      </w:r>
-      <w:r>
-        <w:rPr>
-          <w:lang w:val="ru-RU"/>
-        </w:rPr>
+        <w:t xml:space="preserve">Магазин отвечает за просмотр доступного снаряжения, визуальное представление карточек, цены, иконки, подтверждение выбора и применение эффекта предмета к герою. Каталог и правила экипировки изолированы от конкретного Swing-представления, поэтому цена и доступность не вычисляются непосредственно в обработчике нажатия. Такое решение сохраняет прозрачность модели состояния. Модуль магазина реализован как модель </w:t>
+      </w:r>
+      <w:r>
+        <w:rPr>
+          <w:lang w:val="ru-RU"/>
+        </w:rPr>
+        <w:lastRenderedPageBreak/>
+        <w:t>состояния с каталогом, покупкой и экипировкой, отделённая от деталей Swing-отрисовки. Магазин проверялся как часть сюжета, а не как отдельная витрина.</w:t>
       </w:r>
     </w:p>
     <w:p>
@@ -4887,7 +4282,7 @@
         <w:rPr>
           <w:lang w:val="ru-RU"/>
         </w:rPr>
-        <w:t>При выборе предмета игрок должен получить ясную обратную связь: название, стоимость, характеристики, текущее состояние и результат действия. Если средств недостаточно, интерфейс сообщает причину, а если предмет уже экипирован, не допускает противоречивого повторного изменения. Иконки и подсветка категорий поддерживают восприятие без замены текстовых пояснений. Особое внимание уделялось повторному запуску сценария: после поражения, повторной покупки или возврата к предыдущей фазе состояние должно оставаться согласованным. Данный вывод учитывался при последующей проверке сценариев. Ресурсы интерфейса и игровые правила связывались через явные константы и централизованные пути, чтобы исключить расхождение строковых значений. Соответствующее ограничение учитывалось при планировании объёма работ.</w:t>
+        <w:t>При выборе предмета игрок должен получить ясную обратную связь: название, стоимость, характеристики, текущее состояние и результат действия. Если средств недостаточно, интерфейс сообщает причину, а если предмет уже экипирован, не допускает противоречивого повторного изменения. Иконки и подсветка категорий поддерживают восприятие без замены текстовых пояснений. Обратная связь по выбору предмета включает стоимость, характеристики, причины отказа и статус экипировки. Понятные сообщения об отказе повысили предсказуемость взаимодействия.</w:t>
       </w:r>
     </w:p>
     <w:p>
@@ -4901,13 +4296,7 @@
         <w:rPr>
           <w:lang w:val="ru-RU"/>
         </w:rPr>
-        <w:t>Для поддерживаемости магазина правила ценообразования и экипировки не смешивались с координатами элементов интерфейса. Это позволило изменять визуальную часть витрины без риска нарушить расчёт доступности покупки. Дублирование логики между карточками исключалось через общие модули. Ресурсы интерфейса и игровые правила связывались через явные константы и централизованные пути, чтобы исключить расхождение строковых значений. Отмеченное требование сохранялось на всех этапах доработки. Практическая проверка модуля выполнялась на сквозном пользовательском сценарии, включающем переход из соседних экранов. Такая фиксация снижает вероятность повторного возникновения сходных дефектов.</w:t>
-      </w:r>
-      <w:r/>
-      <w:r>
-        <w:rPr>
-          <w:lang w:val="ru-RU"/>
-        </w:rPr>
+        <w:t>Для поддерживаемости магазина правила ценообразования и экипировки не смешивались с координатами элементов интерфейса. Это позволило изменять визуальную часть витрины без риска нарушить расчёт доступности покупки. Дублирование логики между карточками исключалось через общие модули. Такое устройство магазина служит учебным примером согласования интерфейса с правилами. Отделение правил от отрисовки упростило изменение внешнего вида карточек.</w:t>
       </w:r>
     </w:p>
     <w:p>
@@ -4921,12 +4310,7 @@
         <w:rPr>
           <w:lang w:val="ru-RU"/>
         </w:rPr>
-        <w:t>Проверка модуля включала сценарии успешной покупки, отказа из-за недостатка средств, повторной экипировки и возврата в сюжет после закрытия магазина. Такой набор выявлял как ошибки модели, так и дефекты обратной связи интерфейса. Практическая проверка модуля выполнялась на сквозном пользовательском сценарии, включающем переход из соседних экранов. Указанный критерий применялся при оценке готовности результата. Полученный результат фиксировался как готовый вертикальный срез, пригодный для демонстрации на защите и для дальнейшей доработки. Сформулированное положение использовалось как ориентир при рефакторинге. При расширении функциональности сохранялись ранее принятые границы ответственности, чтобы не возвращаться к смешанной логике «всё в одном классе». Данный вывод учитывался при последующей проверке сценариев.</w:t>
-      </w:r>
-      <w:r>
-        <w:rPr>
-          <w:lang w:val="ru-RU"/>
-        </w:rPr>
+        <w:t>Проверка модуля включала сценарии успешной покупки, отказа из-за недостатка средств, повторной экипировки и возврата в сюжет после закрытия магазина. Такой набор выявлял как ошибки модели, так и дефекты обратной связи интерфейса. Проверялись покупка, отказ при недостатке средств, повторная экипировка и возврат в сюжет. Граничные случаи экипировки включались в обязательный чеклист.</w:t>
       </w:r>
     </w:p>
     <w:p>
@@ -4940,13 +4324,14 @@
         <w:rPr>
           <w:lang w:val="ru-RU"/>
         </w:rPr>
-        <w:t>В результате магазин стал полноценным примером согласования UI с правилами, а не декоративным экраном. Полученный опыт важен и в контексте деятельности ООО «КОДДОТ»: прозрачная модель состояния и понятная обратная связь пользователю значимы в любых интерактивных продуктах. Полученный результат фиксировался как готовый вертикальный срез, пригодный для демонстрации на защите и для дальнейшей доработки. Соответствующее ограничение учитывалось при планировании объёма работ.</w:t>
-      </w:r>
-      <w:r/>
-      <w:r>
-        <w:rPr>
-          <w:lang w:val="ru-RU"/>
-        </w:rPr>
+        <w:t xml:space="preserve">В результате магазин стал полноценным примером согласования UI с правилами, а не декоративным экраном. Полученный опыт важен и в контексте деятельности ООО «КОДДОТ»: прозрачная модель состояния и понятная обратная связь пользователю значимы в любых интерактивных продуктах. </w:t>
+      </w:r>
+      <w:r>
+        <w:rPr>
+          <w:lang w:val="ru-RU"/>
+        </w:rPr>
+        <w:lastRenderedPageBreak/>
+        <w:t>После проверки магазин может демонстрироваться как законченный модуль с ясными границами. Модуль готов к демонстрации как самостоятельный законченный блок.</w:t>
       </w:r>
     </w:p>
     <w:p>
@@ -4960,14 +4345,16 @@
         <w:rPr>
           <w:lang w:val="ru-RU"/>
         </w:rPr>
-        <w:t>С учётом учебного формата витрина не усложнялась серверными механизмами. Локальных правил оказалось достаточно для демонстрации и проверки связности игрового цикла. При расширении функциональности сохранялись ранее принятые границы ответственности, чтобы не возвращаться к смешанной логике «всё в одном классе». Такая фиксация снижает вероятность повторного возникновения сходных дефектов. Для модуля описывались входные данные, ожидаемый результат, возможные ограничения и способ проверки после внесения изменений. Это уточняет практическую сторону выполненной работы. Особое внимание уделялось повторному запуску сценария: после поражения, повторной покупки или возврата к предыдущей фазе состояние должно оставаться согласованным. Указанный критерий применялся при оценке готовности результата.</w:t>
-      </w:r>
-      <w:r/>
-      <w:r>
-        <w:rPr>
-          <w:lang w:val="ru-RU"/>
-        </w:rPr>
-      </w:r>
+        <w:t>С учётом учебного формата витрина не усложнялась серверными механизмами. Локальных правил оказалось достаточно для демонстрации и проверки связности игрового цикла. Серверные сценарии не вводились: для учебного демо достаточно локальных правил каталога. Локальные правила каталога достаточны для учебного MVP.</w:t>
+      </w:r>
+    </w:p>
+    <w:p>
+      <w:pPr>
+        <w:jc w:val="both"/>
+        <w:rPr>
+          <w:lang w:val="ru-RU"/>
+        </w:rPr>
+      </w:pPr>
     </w:p>
     <w:p>
       <w:pPr>
@@ -4978,11 +4365,10 @@
         <w:rPr>
           <w:noProof/>
         </w:rPr>
-        <w:lastRenderedPageBreak/>
         <w:drawing>
           <wp:inline distT="0" distB="0" distL="0" distR="0">
-            <wp:extent cx="7921553" cy="5136515"/>
-            <wp:effectExtent l="1587" t="0" r="5398" b="5397"/>
+            <wp:extent cx="6580893" cy="4267200"/>
+            <wp:effectExtent l="0" t="0" r="0" b="0"/>
             <wp:docPr id="5" name="Picture 5"/>
             <wp:cNvGraphicFramePr>
               <a:graphicFrameLocks xmlns:a="http://schemas.openxmlformats.org/drawingml/2006/main" noChangeAspect="1"/>
@@ -5001,9 +4387,9 @@
                     </a:stretch>
                   </pic:blipFill>
                   <pic:spPr>
-                    <a:xfrm rot="5400000">
+                    <a:xfrm>
                       <a:off x="0" y="0"/>
-                      <a:ext cx="7980479" cy="5174724"/>
+                      <a:ext cx="6664722" cy="4321557"/>
                     </a:xfrm>
                     <a:prstGeom prst="rect">
                       <a:avLst/>
@@ -5055,6 +4441,7 @@
         <w:rPr>
           <w:noProof/>
         </w:rPr>
+        <w:lastRenderedPageBreak/>
         <w:drawing>
           <wp:inline distT="0" distB="0" distL="0" distR="0" wp14:anchorId="21590361" wp14:editId="7D071AC7">
             <wp:extent cx="6827519" cy="4360334"/>
@@ -5133,6 +4520,15 @@
     </w:p>
     <w:p>
       <w:pPr>
+        <w:ind w:firstLine="0"/>
+        <w:jc w:val="center"/>
+        <w:rPr>
+          <w:lang w:val="ru-RU"/>
+        </w:rPr>
+      </w:pPr>
+    </w:p>
+    <w:p>
+      <w:pPr>
         <w:pStyle w:val="21"/>
         <w:numPr>
           <w:ilvl w:val="1"/>
@@ -5173,36 +4569,7 @@
         <w:rPr>
           <w:lang w:val="ru-RU"/>
         </w:rPr>
-        <w:t>Chapter1Director координирует фазы главы, не смешивая сюжетный порядок с деталями прорисовки. Сценарий включает подачу контекста, диалоговые сцены, переходы на карте, подготовку к столкновению и развязку. Слой визуальной новеллы управляет последовательным открытием реплик и изображений персонажей. Такое разделение упростило сопровождение сюжета. Особое внимание уделялось повторному запуску сценария: после поражения, повторной покупки или возврата к предыдущей фазе состояние должно оставаться согласованным. Такая фиксация снижает вероятность повторного возникновения сходных дефектов. Ресурсы интерфейса и игровые правила связывались через явные константы и централизованные пути, чтобы исключить расхождение строковых значений. Это уточняет практическую сторону выполненной работы.</w:t>
-      </w:r>
-      <w:r/>
-      <w:r>
-        <w:rPr>
-          <w:lang w:val="ru-RU"/>
-        </w:rPr>
-      </w:r>
-      <w:r/>
-      <w:r>
-        <w:rPr>
-          <w:lang w:val="ru-RU"/>
-        </w:rPr>
-      </w:r>
-      <w:r/>
-      <w:r>
-        <w:rPr>
-          <w:lang w:val="ru-RU"/>
-        </w:rPr>
-      </w:r>
-      <w:r/>
-      <w:r>
-        <w:rPr>
-          <w:lang w:val="ru-RU"/>
-        </w:rPr>
-      </w:r>
-      <w:r>
-        <w:rPr>
-          <w:lang w:val="ru-RU"/>
-        </w:rPr>
+        <w:t>Chapter1Director координирует фазы главы, не смешивая сюжетный порядок с деталями прорисовки. Сценарий включает подачу контекста, диалоговые сцены, переходы на карте, подготовку к столкновению и развязку. Слой визуальной новеллы управляет последовательным открытием реплик и изображений персонажей. Такое разделение упростило сопровождение сюжета. Chapter1Director координирует фазы главы и отделяет сюжетный порядок от прорисовки. Фазовая модель главы сделала порядок событий явным и проверяемым.</w:t>
       </w:r>
     </w:p>
     <w:p>
@@ -5216,7 +4583,8 @@
         <w:rPr>
           <w:lang w:val="ru-RU"/>
         </w:rPr>
-        <w:t>Боевая часть использует параметры героя и противника, контролирует этапы столкновения и выводит отдельный результат победы или поражения. Босс и эффекты его появления организованы самостоятельными контроллерами, что позволяет поддерживать сложную сцену без превращения одного класса в набор несвязанных условий. Для каждого этапа фиксировались ожидаемый эффект и критерий готовности. Ресурсы интерфейса и игровые правила связывались через явные константы и централизованные пути, чтобы исключить расхождение строковых значений. Сформулированное положение использовалось как ориентир при рефакторинге. Практическая проверка модуля выполнялась на сквозном пользовательском сценарии, включающем переход из соседних экранов. Данный вывод учитывался при последующей проверке сценариев.</w:t>
+        <w:lastRenderedPageBreak/>
+        <w:t>Боевая часть использует параметры героя и противника, контролирует этапы столкновения и выводит отдельный результат победы или поражения. Босс и эффекты его появления организованы самостоятельными контроллерами, что позволяет поддерживать сложную сцену без превращения одного класса в набор несвязанных условий. Для каждого этапа фиксировались ожидаемый эффект и критерий готовности. Бой использует параметры сторон, этапы столкновения и отдельные финальные экраны; эффекты босса вынесены в отдельные контроллеры. Выделение контроллеров боя и эффектов уменьшило сложность отдельных классов.</w:t>
       </w:r>
     </w:p>
     <w:p>
@@ -5230,31 +4598,7 @@
         <w:rPr>
           <w:lang w:val="ru-RU"/>
         </w:rPr>
-        <w:t>Поддерживаемость главы обеспечивалась тем, что порядок фаз задаётся директором, а не разрозненными проверками внутри отрисовки. Это снизило риск расхождения поведения при добавлении новых реплик или промежуточных экранов. Практическая проверка модуля выполнялась на сквозном пользовательском сценарии, включающем переход из соседних экранов. В дальнейшем это упростило объяснение принятых решений на защите. Полученный результат фиксировался как готовый вертикальный срез, пригодный для демонстрации на защите и для дальнейшей доработки. Отмеченное требование сохранялось на всех этапах доработки. При расширении функциональности сохранялись ранее принятые границы ответственности, чтобы не возвращаться к смешанной логике «всё в одном классе». Такая фиксация снижает вероятность повторного возникновения сходных дефектов.</w:t>
-      </w:r>
-      <w:r/>
-      <w:r>
-        <w:rPr>
-          <w:lang w:val="ru-RU"/>
-        </w:rPr>
-      </w:r>
-      <w:r/>
-      <w:r>
-        <w:rPr>
-          <w:lang w:val="ru-RU"/>
-        </w:rPr>
-      </w:r>
-      <w:r/>
-      <w:r>
-        <w:rPr>
-          <w:lang w:val="ru-RU"/>
-        </w:rPr>
-      </w:r>
-      <w:r/>
-      <w:r>
-        <w:rPr>
-          <w:lang w:val="ru-RU"/>
-        </w:rPr>
+        <w:t>Поддерживаемость главы обеспечивалась тем, что порядок фаз задаётся директором, а не разрозненными проверками внутри отрисовки. Это снизило риск расхождения поведения при добавлении новых реплик или промежуточных экранов. После результата состояние очищается от артефактов прошлой попытки, чтобы повтор прохождения оставался корректным. Корректный повтор прохождения — обязательный признак законченного цикла.</w:t>
       </w:r>
     </w:p>
     <w:p>
@@ -5268,12 +4612,7 @@
         <w:rPr>
           <w:lang w:val="ru-RU"/>
         </w:rPr>
-        <w:t>Проверка включала порядок сцен, читаемость диалогов, переход в бой и корректный финал. Отдельно контролировалось состояние после поражения и возможность повторного прохождения без сохранения некорректных данных предыдущей попытки. Полученный результат фиксировался как готовый вертикальный срез, пригодный для демонстрации на защите и для дальнейшей доработки. Это уточняет практическую сторону выполненной работы. При расширении функциональности сохранялись ранее принятые границы ответственности, чтобы не возвращаться к смешанной логике «всё в одном классе». Указанный критерий применялся при оценке готовности результата. Для модуля описывались входные данные, ожидаемый результат, возможные ограничения и способ проверки после внесения изменений. Сформулированное положение использовалось как ориентир при рефакторинге.</w:t>
-      </w:r>
-      <w:r>
-        <w:rPr>
-          <w:lang w:val="ru-RU"/>
-        </w:rPr>
+        <w:t>Проверка включала порядок сцен, читаемость диалогов, переход в бой и корректный финал. Отдельно контролировалось состояние после поражения и возможность повторного прохождения без сохранения некорректных данных предыдущей попытки. Проверялись порядок сцен, читаемость диалогов, переход в бой и корректность финала. Диалоги проверялись вместе с переходами, а не отдельно от карты и боя.</w:t>
       </w:r>
     </w:p>
     <w:p>
@@ -5287,7 +4626,14 @@
         <w:rPr>
           <w:lang w:val="ru-RU"/>
         </w:rPr>
-        <w:t>Цикл завершает опыт игрока: после результата состояние отображается понятно, а повторное прохождение не должно сохранять некорректные данные от предыдущей попытки. Полученный опыт важен и в контексте деятельности ООО «КОДДОТ»: регулярная демонстрация законченного сценария повышает прозрачность прогресса разработки. При расширении функциональности сохранялись ранее принятые границы ответственности, чтобы не возвращаться к смешанной логике «всё в одном классе». Данный вывод учитывался при последующей проверке сценариев.</w:t>
+        <w:t xml:space="preserve">Цикл завершает опыт игрока: после результата состояние отображается понятно, а повторное прохождение не должно сохранять некорректные данные от предыдущей попытки. Полученный опыт важен и в контексте деятельности ООО «КОДДОТ»: регулярная демонстрация законченного сценария повышает прозрачность прогресса разработки. Глава закрывает основной игровой опыт </w:t>
+      </w:r>
+      <w:r>
+        <w:rPr>
+          <w:lang w:val="ru-RU"/>
+        </w:rPr>
+        <w:lastRenderedPageBreak/>
+        <w:t>практики и удобна для демонстрации на защите. Глава образует основной демонстрационный маршрут практики.</w:t>
       </w:r>
     </w:p>
     <w:p>
@@ -5301,31 +4647,7 @@
         <w:rPr>
           <w:lang w:val="ru-RU"/>
         </w:rPr>
-        <w:t>Новые ветвления сюжета и дополнительные механики намеренно оставлены на этап развития. Сначала был стабилизирован основной путь прохождения, что соответствует ограниченности учебного проекта по срокам. Для модуля описывались входные данные, ожидаемый результат, возможные ограничения и способ проверки после внесения изменений. Отмеченное требование сохранялось на всех этапах доработки. Особое внимание уделялось повторному запуску сценария: после поражения, повторной покупки или возврата к предыдущей фазе состояние должно оставаться согласованным. Такая фиксация снижает вероятность повторного возникновения сходных дефектов.</w:t>
-      </w:r>
-      <w:r/>
-      <w:r>
-        <w:rPr>
-          <w:lang w:val="ru-RU"/>
-        </w:rPr>
-      </w:r>
-      <w:r/>
-      <w:r>
-        <w:rPr>
-          <w:lang w:val="ru-RU"/>
-        </w:rPr>
-      </w:r>
-      <w:r/>
-      <w:r>
-        <w:rPr>
-          <w:lang w:val="ru-RU"/>
-        </w:rPr>
-      </w:r>
-      <w:r/>
-      <w:r>
-        <w:rPr>
-          <w:lang w:val="ru-RU"/>
-        </w:rPr>
+        <w:t>Новые ветвления сюжета и дополнительные механики намеренно оставлены на этап развития. Сначала был стабилизирован основной путь прохождения, что соответствует ограниченности учебного проекта по срокам. Дополнительные ветки и усложнения оставлены на этап развития после стабилизации основного пути. Развитие ветвлений планируется после стабилизации основного пути.</w:t>
       </w:r>
     </w:p>
     <w:p>
@@ -5343,15 +4665,23 @@
         <w:ind w:firstLine="0"/>
         <w:jc w:val="center"/>
       </w:pPr>
+    </w:p>
+    <w:p>
+      <w:pPr>
+        <w:ind w:firstLine="0"/>
+        <w:jc w:val="center"/>
+        <w:rPr>
+          <w:lang w:val="ru-RU"/>
+        </w:rPr>
+      </w:pPr>
       <w:r>
         <w:rPr>
           <w:noProof/>
         </w:rPr>
-        <w:lastRenderedPageBreak/>
         <w:drawing>
-          <wp:inline distT="0" distB="0" distL="0" distR="0">
-            <wp:extent cx="8089265" cy="3549650"/>
-            <wp:effectExtent l="2858" t="0" r="0" b="0"/>
+          <wp:inline distT="0" distB="0" distL="0" distR="0" wp14:anchorId="4BFF0D00" wp14:editId="12A29E02">
+            <wp:extent cx="6169233" cy="3078480"/>
+            <wp:effectExtent l="0" t="0" r="3175" b="7620"/>
             <wp:docPr id="7" name="Picture 7"/>
             <wp:cNvGraphicFramePr>
               <a:graphicFrameLocks xmlns:a="http://schemas.openxmlformats.org/drawingml/2006/main" noChangeAspect="1"/>
@@ -5370,9 +4700,9 @@
                     </a:stretch>
                   </pic:blipFill>
                   <pic:spPr>
-                    <a:xfrm rot="5400000">
+                    <a:xfrm>
                       <a:off x="0" y="0"/>
-                      <a:ext cx="8131860" cy="3568341"/>
+                      <a:ext cx="6231373" cy="3109488"/>
                     </a:xfrm>
                     <a:prstGeom prst="rect">
                       <a:avLst/>
@@ -5384,15 +4714,6 @@
           </wp:inline>
         </w:drawing>
       </w:r>
-    </w:p>
-    <w:p>
-      <w:pPr>
-        <w:ind w:firstLine="0"/>
-        <w:jc w:val="center"/>
-        <w:rPr>
-          <w:lang w:val="ru-RU"/>
-        </w:rPr>
-      </w:pPr>
       <w:r>
         <w:rPr>
           <w:lang w:val="ru-RU"/>
@@ -5801,18 +5122,7 @@
         <w:rPr>
           <w:lang w:val="ru-RU"/>
         </w:rPr>
-        <w:t>Пользовательское действие сначала принимается view, затем передаётся презентеру. Презентер вызывает операцию модели или директора, получает новое состояние и инициирует обновление представления. Такая последовательность создаёт понятную трассу для поиска ошибок: можно определить, возникла ли проблема в событии, правиле, состоянии или отображении. Для модуля описывались входные данные, ожидаемый результат, возможные ограничения и способ проверки после внесения изменений. Соответствующее ограничение учитывалось при планировании объёма работ. Особое внимание уделялось повторному запуску сценария: после поражения, повторной покупки или возврата к предыдущей фазе состояние должно оставаться согласованным. В дальнейшем это упростило объяснение принятых решений на защите.</w:t>
-      </w:r>
-      <w:r/>
-      <w:r>
-        <w:rPr>
-          <w:lang w:val="ru-RU"/>
-        </w:rPr>
-      </w:r>
-      <w:r>
-        <w:rPr>
-          <w:lang w:val="ru-RU"/>
-        </w:rPr>
+        <w:t>Пользовательское действие сначала принимается view, затем передаётся презентеру. Презентер вызывает операцию модели или директора, получает новое состояние и инициирует обновление представления. Такая последовательность создаёт понятную трассу для поиска ошибок: можно определить, возникла ли проблема в событии, правиле, состоянии или отображении. Трассировка view → presenter → model/director → view упрощает локализацию дефектов по слоям ответственности. Послойная трассировка ускоряет поиск причины дефекта.</w:t>
       </w:r>
     </w:p>
     <w:p>
@@ -5826,7 +5136,8 @@
         <w:rPr>
           <w:lang w:val="ru-RU"/>
         </w:rPr>
-        <w:t>Графические файлы размещаются в ресурсной структуре, а их загрузка группируется в кэши и фабрики. Это уменьшает количество обращений к файловой системе, исключает рассеянные по коду пути и позволяет контролировать габариты изображений. Для пиксельного стиля особенно важны предсказуемое масштабирование и отсутствие случайного размытия. Особое внимание уделялось повторному запуску сценария: после поражения, повторной покупки или возврата к предыдущей фазе состояние должно оставаться согласованным. Такая фиксация снижает вероятность повторного возникновения сходных дефектов. Ресурсы интерфейса и игровые правила связывались через явные константы и централизованные пути, чтобы исключить расхождение строковых значений. Это уточняет практическую сторону выполненной работы.</w:t>
+        <w:lastRenderedPageBreak/>
+        <w:t>Графические файлы размещаются в ресурсной структуре, а их загрузка группируется в кэши и фабрики. Это уменьшает количество обращений к файловой системе, исключает рассеянные по коду пути и позволяет контролировать габариты изображений. Для пиксельного стиля особенно важны предсказуемое масштабирование и отсутствие случайного размытия. Централизованная загрузка изображений уменьшает разброс путей и помогает контролировать масштаб пиксель-арта. Кэширование ресурсов снижает риск расхождения путей и повторной загрузки.</w:t>
       </w:r>
     </w:p>
     <w:p>
@@ -5840,23 +5151,7 @@
         <w:rPr>
           <w:lang w:val="ru-RU"/>
         </w:rPr>
-        <w:t>Централизация путей и разделение слоёв повышают поддерживаемость при добавлении новых глав, персонажей и предметов. Изменение ассета не должно требовать правки предметных правил, а изменение правила не должно зависеть от конкретного имени файла фона. Ресурсы интерфейса и игровые правила связывались через явные константы и централизованные пути, чтобы исключить расхождение строковых значений. Сформулированное положение использовалось как ориентир при рефакторинге. Практическая проверка модуля выполнялась на сквозном пользовательском сценарии, включающем переход из соседних экранов. Данный вывод учитывался при последующей проверке сценариев. Полученный результат фиксировался как готовый вертикальный срез, пригодный для демонстрации на защите и для дальнейшей доработки. Соответствующее ограничение учитывалось при планировании объёма работ.</w:t>
-      </w:r>
-      <w:r>
-        <w:rPr>
-          <w:lang w:val="ru-RU"/>
-        </w:rPr>
-      </w:r>
-      <w:r>
-        <w:rPr>
-          <w:lang w:val="ru-RU"/>
-        </w:rPr>
-      </w:r>
-      <w:r/>
-      <w:r>
-        <w:rPr>
-          <w:lang w:val="ru-RU"/>
-        </w:rPr>
+        <w:t>Централизация путей и разделение слоёв повышают поддерживаемость при добавлении новых глав, персонажей и предметов. Изменение ассета не должно требовать правки предметных правил, а изменение правила не должно зависеть от конкретного имени файла фона. При таком устройстве добавление персонажа или сцены требует меньше правок в базовом UI. Централизация упрощает расширение контента новой главы.</w:t>
       </w:r>
     </w:p>
     <w:p>
@@ -5870,12 +5165,7 @@
         <w:rPr>
           <w:lang w:val="ru-RU"/>
         </w:rPr>
-        <w:t>На проверках контролировалось, что ресурсы находятся, пути не «отваливаются», а текст и элементы управления остаются читаемыми после масштабирования. Такие дефекты часто проявляются только при сквозном проходе, поэтому локальных unit-проверок недостаточно. Практическая проверка модуля выполнялась на сквозном пользовательском сценарии, включающем переход из соседних экранов. В дальнейшем это упростило объяснение принятых решений на защите. Полученный результат фиксировался как готовый вертикальный срез, пригодный для демонстрации на защите и для дальнейшей доработки. Отмеченное требование сохранялось на всех этапах доработки. При расширении функциональности сохранялись ранее принятые границы ответственности, чтобы не возвращаться к смешанной логике «всё в одном классе». Такая фиксация снижает вероятность повторного возникновения сходных дефектов.</w:t>
-      </w:r>
-      <w:r>
-        <w:rPr>
-          <w:lang w:val="ru-RU"/>
-        </w:rPr>
+        <w:t>На проверках контролировалось, что ресурсы находятся, пути не «отваливаются», а текст и элементы управления остаются читаемыми после масштабирования. Такие дефекты часто проявляются только при сквозном проходе, поэтому локальных unit-проверок недостаточно. На проверках контролировались целостность путей к ресурсам и читаемость текста после масштабных изменений. Целостность ассетов контролировалась вместе с читаемостью интерфейса.</w:t>
       </w:r>
     </w:p>
     <w:p>
@@ -5889,7 +5179,14 @@
         <w:rPr>
           <w:lang w:val="ru-RU"/>
         </w:rPr>
-        <w:t>Разделение слоёв и централизованная работа с ресурсами создают основу для расширения проекта без полной переработки интерфейса. Полученный опыт важен и в контексте деятельности ООО «КОДДОТ»: прозрачные контракты между частями системы ускоряют доработку MVP. Полученный результат фиксировался как готовый вертикальный срез, пригодный для демонстрации на защите и для дальнейшей доработки. Это уточняет практическую сторону выполненной работы. При расширении функциональности сохранялись ранее принятые границы ответственности, чтобы не возвращаться к смешанной логике «всё в одном классе». Указанный критерий применялся при оценке готовности результата.</w:t>
+        <w:t xml:space="preserve">Разделение слоёв и централизованная работа с ресурсами создают основу для расширения проекта без полной переработки интерфейса. Полученный опыт важен и в контексте деятельности ООО «КОДДОТ»: прозрачные контракты между частями системы ускоряют доработку MVP. Организация слоёв и ресурсов приближает проект к поддерживаемому прототипу, а не к набору </w:t>
+      </w:r>
+      <w:r>
+        <w:rPr>
+          <w:lang w:val="ru-RU"/>
+        </w:rPr>
+        <w:lastRenderedPageBreak/>
+        <w:t>разрозненных скриптов. Структура пакетов отражает принятые архитектурные границы.</w:t>
       </w:r>
     </w:p>
     <w:p>
@@ -5903,54 +5200,26 @@
         <w:rPr>
           <w:lang w:val="ru-RU"/>
         </w:rPr>
-        <w:t>Дальнейшее усиление автоматических проверок возможно без изменения базового порядка слоёв. Это сохраняет архитектурную ясность при росте функциональности. При расширении функциональности сохранялись ранее принятые границы ответственности, чтобы не возвращаться к смешанной логике «всё в одном классе». Данный вывод учитывался при последующей проверке сценариев. Для модуля описывались входные данные, ожидаемый результат, возможные ограничения и способ проверки после внесения изменений. Соответствующее ограничение учитывалось при планировании объёма работ. Особое внимание уделялось повторному запуску сценария: после поражения, повторной покупки или возврата к предыдущей фазе состояние должно оставаться согласованным. В дальнейшем это упростило объяснение принятых решений на защите.</w:t>
-      </w:r>
-      <w:r/>
-      <w:r>
-        <w:rPr>
-          <w:lang w:val="ru-RU"/>
-        </w:rPr>
-      </w:r>
+        <w:t>Дальнейшее усиление автоматических проверок возможно без изменения базового порядка слоёв. Это сохраняет архитектурную ясность при росте функциональности. Дальнейшее усиление автоматических проверок возможно без изменения принятой схемы слоёв. Базовый порядок слоёв зафиксирован и может развиваться эволюционно.</w:t>
+      </w:r>
+    </w:p>
+    <w:p>
+      <w:pPr>
+        <w:ind w:firstLine="0"/>
+        <w:rPr>
+          <w:noProof/>
+        </w:rPr>
+      </w:pPr>
     </w:p>
     <w:p>
       <w:pPr>
         <w:ind w:firstLine="0"/>
         <w:jc w:val="center"/>
+      </w:pPr>
+      <w:r>
         <w:rPr>
           <w:noProof/>
-          <w:lang w:val="ru-RU"/>
-        </w:rPr>
-      </w:pPr>
-    </w:p>
-    <w:p>
-      <w:pPr>
-        <w:ind w:firstLine="0"/>
-        <w:jc w:val="center"/>
-        <w:rPr>
-          <w:noProof/>
-          <w:lang w:val="ru-RU"/>
-        </w:rPr>
-      </w:pPr>
-    </w:p>
-    <w:p>
-      <w:pPr>
-        <w:ind w:firstLine="0"/>
-        <w:jc w:val="center"/>
-        <w:rPr>
-          <w:noProof/>
-        </w:rPr>
-      </w:pPr>
-    </w:p>
-    <w:p>
-      <w:pPr>
-        <w:ind w:firstLine="0"/>
-        <w:jc w:val="center"/>
-      </w:pPr>
-      <w:r>
-        <w:rPr>
-          <w:noProof/>
-        </w:rPr>
-        <w:lastRenderedPageBreak/>
+        </w:rPr>
         <w:drawing>
           <wp:inline distT="0" distB="0" distL="0" distR="0">
             <wp:extent cx="5865495" cy="3848480"/>
@@ -6007,15 +5276,7 @@
         <w:rPr>
           <w:lang w:val="ru-RU"/>
         </w:rPr>
-        <w:t>Рисунок 4.</w:t>
-      </w:r>
-      <w:bookmarkStart w:id="16" w:name="_GoBack"/>
-      <w:bookmarkEnd w:id="16"/>
-      <w:r>
-        <w:rPr>
-          <w:lang w:val="ru-RU"/>
-        </w:rPr>
-        <w:t>11</w:t>
+        <w:t>Рисунок 4.11</w:t>
       </w:r>
       <w:r>
         <w:rPr>
@@ -6045,7 +5306,7 @@
           <w:lang w:val="ru-RU"/>
         </w:rPr>
       </w:pPr>
-      <w:bookmarkStart w:id="17" w:name="_Toc235697213"/>
+      <w:bookmarkStart w:id="16" w:name="_Toc235697213"/>
       <w:r>
         <w:rPr>
           <w:rFonts w:ascii="Times New Roman" w:hAnsi="Times New Roman" w:cs="Times New Roman"/>
@@ -6053,7 +5314,7 @@
         </w:rPr>
         <w:t>Проверка пользовательских сценариев и дальнейшее развитие</w:t>
       </w:r>
-      <w:bookmarkEnd w:id="17"/>
+      <w:bookmarkEnd w:id="16"/>
     </w:p>
     <w:p>
       <w:pPr>
@@ -6075,12 +5336,14 @@
         <w:rPr>
           <w:lang w:val="ru-RU"/>
         </w:rPr>
-        <w:t>Проверка проводилась как сквозной проход по приложению: от первого открытия окна до завершения боевой сцены. Важным условием было отсутствие необходимости перезапускать приложение после каждого действия, поскольку именно сохранение согласованного состояния отличает связанный игровой цикл от набора отдельных демонстраций. Ресурсы интерфейса и игровые правила связывались через явные константы и централизованные пути, чтобы исключить расхождение строковых значений. Отмеченное требование сохранялось на всех этапах доработки. Практическая проверка модуля выполнялась на сквозном пользовательском сценарии, включающем переход из соседних экранов. Такая фиксация снижает вероятность повторного возникновения сходных дефектов.</w:t>
-      </w:r>
-      <w:r>
-        <w:rPr>
-          <w:lang w:val="ru-RU"/>
-        </w:rPr>
+        <w:t xml:space="preserve">Проверка проводилась как сквозной проход по приложению: от первого открытия окна до завершения боевой сцены. Важным условием было отсутствие </w:t>
+      </w:r>
+      <w:r>
+        <w:rPr>
+          <w:lang w:val="ru-RU"/>
+        </w:rPr>
+        <w:lastRenderedPageBreak/>
+        <w:t>необходимости перезапускать приложение после каждого действия, поскольку именно сохранение согласованного состояния отличает связанный игровой цикл от набора отдельных демонстраций. Сквозная проверка от первого окна до конца боя подтверждает связность состояния между модулями. Связность состояния отличает игру от набора демонстрационных фрагментов.</w:t>
       </w:r>
     </w:p>
     <w:p>
@@ -6094,7 +5357,7 @@
         <w:rPr>
           <w:lang w:val="ru-RU"/>
         </w:rPr>
-        <w:t>Для каждого экрана проверялись доступность элементов управления, читаемость текста, корректность фокуса, обработка повторных действий и поведение при граничных значениях. В магазине это означает контроль недостатка средств и повторной экипировки, в главе — правильный порядок сцен, в бою — корректный переход к победе, поражению или повтору. Практическая проверка модуля выполнялась на сквозном пользовательском сценарии, включающем переход из соседних экранов. Указанный критерий применялся при оценке готовности результата. Полученный результат фиксировался как готовый вертикальный срез, пригодный для демонстрации на защите и для дальнейшей доработки. Сформулированное положение использовалось как ориентир при рефакторинге.</w:t>
+        <w:t>Для каждого экрана проверялись доступность элементов управления, читаемость текста, корректность фокуса, обработка повторных действий и поведение при граничных значениях. В магазине это означает контроль недостатка средств и повторной экипировки, в главе — правильный порядок сцен, в бою — корректный переход к победе, поражению или повтору. На каждом экране контролировались управление, читаемость, повторные действия и граничные случаи. Граничные случаи фиксировались по модулям: магазин, глава, бой.</w:t>
       </w:r>
     </w:p>
     <w:p>
@@ -6108,7 +5371,7 @@
         <w:rPr>
           <w:lang w:val="ru-RU"/>
         </w:rPr>
-        <w:t>Поддерживаемость обеспечивалась фиксацией найденных дефектов и повторной проверкой после исправлений. Без повторного прохода легко «починить» один экран и незаметно сломать переход к следующему. Полученный результат фиксировался как готовый вертикальный срез, пригодный для демонстрации на защите и для дальнейшей доработки. Соответствующее ограничение учитывалось при планировании объёма работ. При расширении функциональности сохранялись ранее принятые границы ответственности, чтобы не возвращаться к смешанной логике «всё в одном классе». В дальнейшем это упростило объяснение принятых решений на защите. Для модуля описывались входные данные, ожидаемый результат, возможные ограничения и способ проверки после внесения изменений. Отмеченное требование сохранялось на всех этапах доработки.</w:t>
+        <w:t>Поддерживаемость обеспечивалась фиксацией найденных дефектов и повторной проверкой после исправлений. Без повторного прохода легко «починить» один экран и незаметно сломать переход к следующему. По результатам прогонов сформирован список направлений дальнейшего развития проекта. Список развития сформирован по результатам реальных прогонов.</w:t>
       </w:r>
     </w:p>
     <w:p>
@@ -6122,12 +5385,7 @@
         <w:rPr>
           <w:lang w:val="ru-RU"/>
         </w:rPr>
-        <w:t>Сквозное тестирование подтвердило готовность проекта к демонстрации и сформировало список направлений дальнейшего развития. Отдельно фиксировались места, где полезны будущие автотесты расчётов, не заменяющие ручную оценку визуала. При расширении функциональности сохранялись ранее принятые границы ответственности, чтобы не возвращаться к смешанной логике «всё в одном классе». Такая фиксация снижает вероятность повторного возникновения сходных дефектов. Для модуля описывались входные данные, ожидаемый результат, возможные ограничения и способ проверки после внесения изменений. Это уточняет практическую сторону выполненной работы. Особое внимание уделялось повторному запуску сценария: после поражения, повторной покупки или возврата к предыдущей фазе состояние должно оставаться согласованным. Указанный критерий применялся при оценке готовности результата.</w:t>
-      </w:r>
-      <w:r>
-        <w:rPr>
-          <w:lang w:val="ru-RU"/>
-        </w:rPr>
+        <w:t>Сквозное тестирование подтвердило готовность проекта к демонстрации и сформировало список направлений дальнейшего развития. Отдельно фиксировались места, где полезны будущие автотесты расчётов, не заменяющие ручную оценку визуала. Полный путь повторно проверялся перед фиксацией итогов практики для исключения регрессий. Финальный проход выполнялся после рефакторинга.</w:t>
       </w:r>
     </w:p>
     <w:p>
@@ -6141,7 +5399,14 @@
         <w:rPr>
           <w:lang w:val="ru-RU"/>
         </w:rPr>
-        <w:t>Полученный опыт важен и в контексте деятельности ООО «КОДДОТ»: регулярная демонстрация и проверка пользовательских путей повышают предсказуемость поставки результата. Для модуля описывались входные данные, ожидаемый результат, возможные ограничения и способ проверки после внесения изменений. Сформулированное положение использовалось как ориентир при рефакторинге. Особое внимание уделялось повторному запуску сценария: после поражения, повторной покупки или возврата к предыдущей фазе состояние должно оставаться согласованным. Данный вывод учитывался при последующей проверке сценариев.</w:t>
+        <w:t xml:space="preserve">Полученный опыт важен и в контексте деятельности ООО «КОДДОТ»: регулярная демонстрация и проверка пользовательских путей повышают предсказуемость поставки результата. Сквозное тестирование подтвердило </w:t>
+      </w:r>
+      <w:r>
+        <w:rPr>
+          <w:lang w:val="ru-RU"/>
+        </w:rPr>
+        <w:lastRenderedPageBreak/>
+        <w:t>готовность демонстрационной версии. Готовность к демо подтверждена сквозным сценарием.</w:t>
       </w:r>
     </w:p>
     <w:p>
@@ -6155,7 +5420,7 @@
         <w:rPr>
           <w:lang w:val="ru-RU"/>
         </w:rPr>
-        <w:t>Проверка проводилась в объёме, достаточном для учебного проекта и защиты. При этом сохранялся акцент на реальных сценариях игрока, а не только на формальной компиляции. Особое внимание уделялось повторному запуску сценария: после поражения, повторной покупки или возврата к предыдущей фазе состояние должно оставаться согласованным. В дальнейшем это упростило объяснение принятых решений на защите. Ресурсы интерфейса и игровые правила связывались через явные константы и централизованные пути, чтобы исключить расхождение строковых значений. Отмеченное требование сохранялось на всех этапах доработки. Практическая проверка модуля выполнялась на сквозном пользовательском сценарии, включающем переход из соседних экранов. Такая фиксация снижает вероятность повторного возникновения сходных дефектов.</w:t>
+        <w:t>Проверка проводилась в объёме, достаточном для учебного проекта и защиты. При этом сохранялся акцент на реальных сценариях игрока, а не только на формальной компиляции. Развитие может включать систему сохранений с версионированием формата и безопасной обработкой повреждённых файлов. Сохранения потребуют явной модели состояния и версии формата.</w:t>
       </w:r>
     </w:p>
     <w:p>
@@ -6169,12 +5434,7 @@
         <w:rPr>
           <w:lang w:val="ru-RU"/>
         </w:rPr>
-        <w:t>В качестве следующего этапа развития может быть добавлена система сохранений, позволяющая продолжать игру с последней завершённой фазы. Для этого потребуется выделить сериализуемое представление состояния, определить версию формата и предусмотреть безопасную обработку старых либо повреждённых файлов. Такое расширение не должно нарушить текущую границу между моделью и интерфейсом.</w:t>
-      </w:r>
-      <w:r>
-        <w:rPr>
-          <w:lang w:val="ru-RU"/>
-        </w:rPr>
+        <w:t>В качестве следующего этапа развития может быть добавлена система сохранений, позволяющая продолжать игру с последней завершённой фазы. Для этого потребуется выделить сериализуемое представление состояния, определить версию формата и предусмотреть безопасную обработку старых либо повреждённых файлов. Такое расширение не должно нарушить текущую границу между моделью и интерфейсом. Вариативность визуальной новеллы целесообразно выносить в данные, оставляя коду интерпретацию и отображение. Данные диалогов отделят контент от кода отображения.</w:t>
       </w:r>
     </w:p>
     <w:p>
@@ -6188,119 +5448,12 @@
         <w:rPr>
           <w:lang w:val="ru-RU"/>
         </w:rPr>
-        <w:t>Другим направлением является увеличение вариативности визуальной новеллы: ветвящиеся реплики, условия открытия сцен и последствия решений игрока. В этом случае особенно полезно вынести описание диалогов в данные и оставить Java-коду ответственность за интерпретацию, отображение и переходы. Подобная декомпозиция сохраняет возможность редактировать контент без переписывания каждого экранного класса.</w:t>
-      </w:r>
-      <w:r/>
-      <w:r>
-        <w:rPr>
-          <w:lang w:val="ru-RU"/>
-        </w:rPr>
-      </w:r>
-    </w:p>
-    <w:p>
-      <w:pPr>
-        <w:jc w:val="both"/>
-        <w:rPr>
-          <w:lang w:val="ru-RU"/>
-        </w:rPr>
-      </w:pPr>
-      <w:r>
-        <w:rPr>
-          <w:lang w:val="ru-RU"/>
-        </w:rPr>
-        <w:t>Наконец, игровой проект может стать площадкой для подключения автоматических тестов правил магазина и боя. Хотя визуальные эффекты по-прежнему потребуют ручной оценки, проверка расчётов стоимости, экипировки, урона и разрешённых переходов уменьшит риск регрессий при добавлении новой главы. Тем самым учебная работа логично развивается в сторону полноценного поддерживаемого приложения.</w:t>
-      </w:r>
-    </w:p>
-    <w:p>
-      <w:pPr>
-        <w:jc w:val="both"/>
-        <w:rPr>
-          <w:lang w:val="ru-RU"/>
-        </w:rPr>
-      </w:pPr>
-    </w:p>
-    <w:p>
-      <w:pPr>
-        <w:jc w:val="both"/>
-        <w:rPr>
-          <w:lang w:val="ru-RU"/>
-        </w:rPr>
-      </w:pPr>
-    </w:p>
-    <w:p>
-      <w:pPr>
-        <w:jc w:val="both"/>
-        <w:rPr>
-          <w:lang w:val="ru-RU"/>
-        </w:rPr>
-      </w:pPr>
-    </w:p>
-    <w:p>
-      <w:pPr>
-        <w:jc w:val="both"/>
-        <w:rPr>
-          <w:lang w:val="ru-RU"/>
-        </w:rPr>
-      </w:pPr>
-    </w:p>
-    <w:p>
-      <w:pPr>
-        <w:jc w:val="both"/>
-        <w:rPr>
-          <w:lang w:val="ru-RU"/>
-        </w:rPr>
-      </w:pPr>
-    </w:p>
-    <w:p>
-      <w:pPr>
-        <w:jc w:val="both"/>
-        <w:rPr>
-          <w:lang w:val="ru-RU"/>
-        </w:rPr>
-      </w:pPr>
-    </w:p>
-    <w:p>
-      <w:pPr>
-        <w:jc w:val="both"/>
-        <w:rPr>
-          <w:lang w:val="ru-RU"/>
-        </w:rPr>
-      </w:pPr>
-    </w:p>
-    <w:p>
-      <w:pPr>
-        <w:jc w:val="both"/>
-        <w:rPr>
-          <w:lang w:val="ru-RU"/>
-        </w:rPr>
-      </w:pPr>
-    </w:p>
-    <w:p>
-      <w:pPr>
-        <w:jc w:val="both"/>
-        <w:rPr>
-          <w:lang w:val="ru-RU"/>
-        </w:rPr>
-      </w:pPr>
-    </w:p>
-    <w:p>
-      <w:pPr>
-        <w:jc w:val="both"/>
-        <w:rPr>
-          <w:lang w:val="ru-RU"/>
-        </w:rPr>
-      </w:pPr>
-    </w:p>
-    <w:p>
-      <w:pPr>
-        <w:jc w:val="both"/>
-        <w:rPr>
-          <w:lang w:val="ru-RU"/>
-        </w:rPr>
-      </w:pPr>
-    </w:p>
-    <w:p>
-      <w:pPr>
+        <w:t>Другим направлением является увеличение вариативности визуальной новеллы: ветвящиеся реплики, условия открытия сцен и последствия решений игрока. В этом случае особенно полезно вынести описание диалогов в данные и оставить Java-коду ответственность за интерпретацию, отображение и переходы. Подобная декомпозиция сохраняет возможность редактировать контент без переписывания каждого экранного класса. Автотесты правил магазина и боя снизят риск регрессий при добавлении новых глав, при сохранении ручной оценки визуальных эффектов. Автопроверка расчётов дополнит, но не заменит ручную оценку визуала.</w:t>
+      </w:r>
+    </w:p>
+    <w:p>
+      <w:pPr>
+        <w:ind w:firstLine="0"/>
         <w:jc w:val="both"/>
         <w:rPr>
           <w:lang w:val="ru-RU"/>
@@ -6329,7 +5482,7 @@
           <w:lang w:val="ru-RU"/>
         </w:rPr>
       </w:pPr>
-      <w:bookmarkStart w:id="18" w:name="_Toc235697214"/>
+      <w:bookmarkStart w:id="17" w:name="_Toc235697214"/>
       <w:r>
         <w:rPr>
           <w:rFonts w:ascii="Times New Roman" w:hAnsi="Times New Roman" w:cs="Times New Roman"/>
@@ -6338,7 +5491,7 @@
         <w:lastRenderedPageBreak/>
         <w:t>ПРЕДЛОЖЕНИЯ ПО АВТОМАТИЗАЦИИ</w:t>
       </w:r>
-      <w:bookmarkEnd w:id="18"/>
+      <w:bookmarkEnd w:id="17"/>
     </w:p>
     <w:p>
       <w:pPr>
@@ -6358,13 +5511,7 @@
         <w:rPr>
           <w:lang w:val="ru-RU"/>
         </w:rPr>
-        <w:t>Для ООО «КОДДОТ» целесообразно рассматривать автоматизацию как средство сокращения повторяемых операций при подготовке игровых прототипов и MVP-демонстраций. Предложения не требуют немедленной перестройки процесса: они могут вводиться поэтапно и проверяться на одном пилотном проекте. Ключевой критерий — экономия времени без потери прозрачности для команды.</w:t>
-      </w:r>
-      <w:r/>
-      <w:r>
-        <w:rPr>
-          <w:lang w:val="ru-RU"/>
-        </w:rPr>
+        <w:t>Для ООО «КОДДОТ» целесообразно рассматривать автоматизацию как средство сокращения повторяемых операций при подготовке игровых прототипов и MVP-демонстраций. Предложения не требуют немедленной перестройки процесса: они могут вводиться поэтапно и проверяться на одном пилотном проекте. Ключевой критерий — экономия времени без потери прозрачности для команды. Предложения по автоматизации ориентированы на сокращение рутины при подготовке игровых прототипов и MVP-демо в ООО «КОДДОТ». Автоматизация предлагается как поэтапное улучшение, а не ломающая замена процесса.</w:t>
       </w:r>
     </w:p>
     <w:p>
@@ -6386,7 +5533,7 @@
           <w:rFonts w:ascii="Times New Roman" w:hAnsi="Times New Roman" w:cs="Times New Roman"/>
         </w:rPr>
       </w:pPr>
-      <w:bookmarkStart w:id="19" w:name="_Toc235697215"/>
+      <w:bookmarkStart w:id="18" w:name="_Toc235697215"/>
       <w:r>
         <w:rPr>
           <w:rFonts w:ascii="Times New Roman" w:hAnsi="Times New Roman" w:cs="Times New Roman"/>
@@ -6400,7 +5547,7 @@
         </w:rPr>
         <w:t>CI</w:t>
       </w:r>
-      <w:bookmarkEnd w:id="19"/>
+      <w:bookmarkEnd w:id="18"/>
     </w:p>
     <w:p>
       <w:pPr>
@@ -6419,7 +5566,7 @@
         <w:rPr>
           <w:lang w:val="ru-RU"/>
         </w:rPr>
-        <w:t>Первое предложение — шаблон репозитория для игровых и интерактивных демо. Он может включать структуру сцен, папки ресурсов, единые правила именования, базовые скрипты сборки, файл с инструкцией запуска и минимальную проверку качества. Новый проект начинает работу с согласованного каркаса вместо копирования случайной предыдущей реализации. Риски избыточной формализации учитывались отдельно: шаблоны и скрипты должны помогать, а не блокировать быструю проверку нестандартной идеи. Сформулированное положение использовалось как ориентир при рефакторинге. Реализация предложений может выполняться поэтапно: сначала минимальный контроль, затем сборка, затем шаблоны сцен и учёт ассетов. Данный вывод учитывался при последующей проверке сценариев.</w:t>
+        <w:t>Первое предложение — шаблон репозитория для игровых и интерактивных демо. Он может включать структуру сцен, папки ресурсов, единые правила именования, базовые скрипты сборки, файл с инструкцией запуска и минимальную проверку качества. Новый проект начинает работу с согласованного каркаса вместо копирования случайной предыдущей реализации. Шаблон репозитория снижает затраты на старт нового интерактивного демо и выравнивает базовую структуру проектов. Единый шаблон старта уменьшает копирование случайных старых структур.</w:t>
       </w:r>
     </w:p>
     <w:p>
@@ -6433,54 +5580,14 @@
         <w:rPr>
           <w:lang w:val="ru-RU"/>
         </w:rPr>
-        <w:t>Второе предложение — настроить непрерывную интеграцию: при каждом изменении выполняются сборка, статический анализ, проверка наличия обязательных ресурсов и публикация артефакта демонстрационной версии. Для Unity это может быть автоматическая сборка проекта, для Java — Gradle-сборка, для React/Node — установка зависимостей, линтинг и production build. Реализация предложений может выполняться поэтапно: сначала минимальный контроль, затем сборка, затем шаблоны сцен и учёт ассетов. В дальнейшем это упростило объяснение принятых решений на защите. Измерять эффект целесообразно по времени подготовки демо-версии и числу ручных действий перед показом результата. Отмеченное требование сохранялось на всех этапах доработки.</w:t>
-      </w:r>
-      <w:r>
-        <w:rPr>
-          <w:lang w:val="ru-RU"/>
-        </w:rPr>
-      </w:r>
-      <w:r/>
-      <w:r>
-        <w:rPr>
-          <w:lang w:val="ru-RU"/>
-        </w:rPr>
-      </w:r>
-      <w:r/>
-      <w:r>
-        <w:rPr>
-          <w:lang w:val="ru-RU"/>
-        </w:rPr>
-      </w:r>
-      <w:r/>
-      <w:r>
-        <w:rPr>
-          <w:lang w:val="ru-RU"/>
-        </w:rPr>
-      </w:r>
-      <w:r/>
-      <w:r>
-        <w:rPr>
-          <w:lang w:val="ru-RU"/>
-        </w:rPr>
-      </w:r>
-      <w:r/>
-      <w:r>
-        <w:rPr>
-          <w:lang w:val="ru-RU"/>
-        </w:rPr>
-      </w:r>
-      <w:r/>
-      <w:r>
-        <w:rPr>
-          <w:lang w:val="ru-RU"/>
-        </w:rPr>
-      </w:r>
-      <w:r/>
-      <w:r>
-        <w:rPr>
-          <w:lang w:val="ru-RU"/>
-        </w:rPr>
+        <w:t xml:space="preserve">Второе предложение — настроить непрерывную интеграцию: при каждом изменении выполняются сборка, статический анализ, проверка наличия обязательных ресурсов и публикация артефакта демонстрационной версии. Для Unity это может быть автоматическая сборка проекта, для Java — Gradle-сборка, для React/Node — установка зависимостей, линтинг и production build. CI </w:t>
+      </w:r>
+      <w:r>
+        <w:rPr>
+          <w:lang w:val="ru-RU"/>
+        </w:rPr>
+        <w:lastRenderedPageBreak/>
+        <w:t>обеспечивает регулярную сборку и доступность свежего артефакта без ручной подготовки окружения к каждому показу. Для разных стеков CI настраивается отдельно, но цель одна — свежий артефакт демо.</w:t>
       </w:r>
     </w:p>
     <w:p>
@@ -6494,7 +5601,7 @@
         <w:rPr>
           <w:lang w:val="ru-RU"/>
         </w:rPr>
-        <w:t>Поддерживаемость конвейера обеспечивается тем, что шаблон остаётся расширяемым и не навязывает избыточную сложность маленькому прототипу. Сначала фиксируются локальные скрипты запуска, затем добавляются проверки в CI. Такой порядок снижает риск, при котором автоматизация маскирует хаос вместо его устранения. Измерять эффект целесообразно по времени подготовки демо-версии и числу ручных действий перед показом результата. Это уточняет практическую сторону выполненной работы. Предложения по автоматизации направлены на сокращение рутинных операций без усложнения учебного проекта избыточными инструментами. Указанный критерий применялся при оценке готовности результата. Практическая ценность стандарта проявляется тогда, когда автор проекта быстрее получает запускаемый артефакт и понятный список проверок. Сформулированное положение использовалось как ориентир при рефакторинге.</w:t>
+        <w:t>Поддерживаемость конвейера обеспечивается тем, что шаблон остаётся расширяемым и не навязывает избыточную сложность маленькому прототипу. Сначала фиксируются локальные скрипты запуска, затем добавляются проверки в CI. Такой порядок снижает риск, при котором автоматизация маскирует хаос вместо его устранения. Конвейер ускоряет обнаружение регрессий и делает промежуточный результат прозрачным для заказчика. Прозрачность промежуточного результата важна и для учебной, и для рабочей среды.</w:t>
       </w:r>
     </w:p>
     <w:p>
@@ -6508,49 +5615,7 @@
         <w:rPr>
           <w:lang w:val="ru-RU"/>
         </w:rPr>
-        <w:t>Эффективность предложений проверяется практикой: сокращением времени подготовки демо, уменьшением числа ошибок запуска и снижением доли ручных действий. Если конвейер не даёт измеримой пользы, его следует упростить. Предложения по автоматизации направлены на сокращение рутинных операций без усложнения учебного проекта избыточными инструментами. Данный вывод учитывался при последующей проверке сценариев. Практическая ценность стандарта проявляется тогда, когда автор проекта быстрее получает запускаемый артефакт и понятный список проверок. Соответствующее ограничение учитывалось при планировании объёма работ. Риски избыточной формализации учитывались отдельно: шаблоны и скрипты должны помогать, а не блокировать быструю проверку нестандартной идеи. В дальнейшем это упростило объяснение принятых решений на защите.</w:t>
-      </w:r>
-      <w:r/>
-      <w:r>
-        <w:rPr>
-          <w:lang w:val="ru-RU"/>
-        </w:rPr>
-      </w:r>
-      <w:r/>
-      <w:r>
-        <w:rPr>
-          <w:lang w:val="ru-RU"/>
-        </w:rPr>
-      </w:r>
-      <w:r/>
-      <w:r>
-        <w:rPr>
-          <w:lang w:val="ru-RU"/>
-        </w:rPr>
-      </w:r>
-      <w:r/>
-      <w:r>
-        <w:rPr>
-          <w:lang w:val="ru-RU"/>
-        </w:rPr>
-      </w:r>
-      <w:r/>
-      <w:r>
-        <w:rPr>
-          <w:lang w:val="ru-RU"/>
-        </w:rPr>
-      </w:r>
-      <w:r/>
-      <w:r>
-        <w:rPr>
-          <w:lang w:val="ru-RU"/>
-        </w:rPr>
-      </w:r>
-      <w:r/>
-      <w:r>
-        <w:rPr>
-          <w:lang w:val="ru-RU"/>
-        </w:rPr>
+        <w:t>Эффективность предложений проверяется практикой: сокращением времени подготовки демо, уменьшением числа ошибок запуска и снижением доли ручных действий. Если конвейер не даёт измеримой пользы, его следует упростить. На старте достаточно небольшого набора понятных проверок, соразмерного размеру прототипа. Тяжёлый конвейер на старте прототипа признаётся избыточным.</w:t>
       </w:r>
     </w:p>
     <w:p>
@@ -6564,18 +5629,7 @@
         <w:rPr>
           <w:lang w:val="ru-RU"/>
         </w:rPr>
-        <w:t>Такой конвейер быстрее сообщает о регрессии и даёт менеджеру или заказчику возможность получить актуальный MVP без ручной подготовки окружения. Полученный опыт важен и в контексте деятельности ООО «КОДДОТ»: регулярная поставка демонстраций повышает прозрачность прогресса. Практическая ценность стандарта проявляется тогда, когда автор проекта быстрее получает запускаемый артефакт и понятный список проверок. Отмеченное требование сохранялось на всех этапах доработки. Риски избыточной формализации учитывались отдельно: шаблоны и скрипты должны помогать, а не блокировать быструю проверку нестандартной идеи. Такая фиксация снижает вероятность повторного возникновения сходных дефектов.</w:t>
-      </w:r>
-      <w:r>
-        <w:rPr>
-          <w:lang w:val="ru-RU"/>
-        </w:rPr>
-      </w:r>
-      <w:r/>
-      <w:r>
-        <w:rPr>
-          <w:lang w:val="ru-RU"/>
-        </w:rPr>
+        <w:t>Такой конвейер быстрее сообщает о регрессии и даёт менеджеру или заказчику возможность получить актуальный MVP без ручной подготовки окружения. Полученный опыт важен и в контексте деятельности ООО «КОДДОТ»: регулярная поставка демонстраций повышает прозрачность прогресса. Внедрение CI целесообразно после того, как локальная сборка демо уже воспроизводится скриптами. Локальная воспроизводимость — предпосылка полезного CI.</w:t>
       </w:r>
     </w:p>
     <w:p>
@@ -6589,7 +5643,14 @@
         <w:rPr>
           <w:lang w:val="ru-RU"/>
         </w:rPr>
-        <w:t>Внедрение целесообразно начинать после того, как команда уже умеет локально собирать демо одним-двумя скриптами. Иначе CI будет закреплять неустойчивый процесс. Риски избыточной формализации учитывались отдельно: шаблоны и скрипты должны помогать, а не блокировать быструю проверку нестандартной идеи. Указанный критерий применялся при оценке готовности результата. Реализация предложений может выполняться поэтапно: сначала минимальный контроль, затем сборка, затем шаблоны сцен и учёт ассетов. Сформулированное положение использовалось как ориентир при рефакторинге. Измерять эффект целесообразно по времени подготовки демо-версии и числу ручных действий перед показом результата. Данный вывод учитывался при последующей проверке сценариев.</w:t>
+        <w:t xml:space="preserve">Внедрение целесообразно начинать после того, как команда уже умеет локально собирать демо одним-двумя скриптами. Иначе CI будет закреплять неустойчивый процесс. Иначе автоматизация может закреплять хаотичную </w:t>
+      </w:r>
+      <w:r>
+        <w:rPr>
+          <w:lang w:val="ru-RU"/>
+        </w:rPr>
+        <w:lastRenderedPageBreak/>
+        <w:t>структуру вместо её упорядочивания. Автоматизация не должна маскировать отсутствие порядка в репозитории.</w:t>
       </w:r>
     </w:p>
     <w:p>
@@ -6612,7 +5673,7 @@
           <w:lang w:val="ru-RU"/>
         </w:rPr>
       </w:pPr>
-      <w:bookmarkStart w:id="20" w:name="_Toc235697216"/>
+      <w:bookmarkStart w:id="19" w:name="_Toc235697216"/>
       <w:r>
         <w:rPr>
           <w:rFonts w:ascii="Times New Roman" w:hAnsi="Times New Roman" w:cs="Times New Roman"/>
@@ -6633,7 +5694,7 @@
         </w:rPr>
         <w:t>-сцен</w:t>
       </w:r>
-      <w:bookmarkEnd w:id="20"/>
+      <w:bookmarkEnd w:id="19"/>
     </w:p>
     <w:p>
       <w:pPr>
@@ -6655,12 +5716,7 @@
         <w:rPr>
           <w:lang w:val="ru-RU"/>
         </w:rPr>
-        <w:t>Следующее предложение относится к гигиене ассетов. Для изображений, звуков и шрифтов следует хранить источник, экспортированный файл, назначение, лицензионную информацию, размеры и статус использования. Автоматический скрипт способен проверить дубликаты, неподдерживаемые форматы, слишком большие файлы, отсутствующие ссылки и несогласованные имена. Практическая ценность стандарта проявляется тогда, когда автор проекта быстрее получает запускаемый артефакт и понятный список проверок. В дальнейшем это упростило объяснение принятых решений на защите. Риски избыточной формализации учитывались отдельно: шаблоны и скрипты должны помогать, а не блокировать быструю проверку нестандартной идеи. Отмеченное требование сохранялось на всех этапах доработки.</w:t>
-      </w:r>
-      <w:r>
-        <w:rPr>
-          <w:lang w:val="ru-RU"/>
-        </w:rPr>
+        <w:t>Следующее предложение относится к гигиене ассетов. Для изображений, звуков и шрифтов следует хранить источник, экспортированный файл, назначение, лицензионную информацию, размеры и статус использования. Автоматический скрипт способен проверить дубликаты, неподдерживаемые форматы, слишком большие файлы, отсутствующие ссылки и несогласованные имена. Гигиена ассетов уменьшает дублирование файлов и снижает риск использования ресурсов с неясным происхождением или статусом. Учёт лицензий и статусов файлов снижает юридические и технические риски ассетов.</w:t>
       </w:r>
     </w:p>
     <w:p>
@@ -6674,13 +5730,7 @@
         <w:rPr>
           <w:lang w:val="ru-RU"/>
         </w:rPr>
-        <w:t>Для визуальных новелл и диалоговых MVP полезен шаблон сцены: фон, портреты, реплики, варианты выбора, переходы и параметры показа описываются в данных, а не каждый раз собираются вручную в коде. Это ускорит создание демонстраций и позволит дизайнеру участвовать в подготовке контента с меньшим объёмом программных изменений. Риски избыточной формализации учитывались отдельно: шаблоны и скрипты должны помогать, а не блокировать быструю проверку нестандартной идеи. Это уточняет практическую сторону выполненной работы. Реализация предложений может выполняться поэтапно: сначала минимальный контроль, затем сборка, затем шаблоны сцен и учёт ассетов. Указанный критерий применялся при оценке готовности результата.</w:t>
-      </w:r>
-      <w:r/>
-      <w:r>
-        <w:rPr>
-          <w:lang w:val="ru-RU"/>
-        </w:rPr>
+        <w:t>Для визуальных новелл и диалоговых MVP полезен шаблон сцены: фон, портреты, реплики, варианты выбора, переходы и параметры показа описываются в данных, а не каждый раз собираются вручную в коде. Это ускорит создание демонстраций и позволит дизайнеру участвовать в подготовке контента с меньшим объёмом программных изменений. Шаблон VN-сцены в данных ускоряет подготовку контента и снижает объём ручных правок кода. Шаблон сцены повышает участие дизайнера в подготовке контента.</w:t>
       </w:r>
     </w:p>
     <w:p>
@@ -6694,7 +5744,7 @@
         <w:rPr>
           <w:lang w:val="ru-RU"/>
         </w:rPr>
-        <w:t>Поддерживаемость контента повышается, когда источник ассета и его использование в коде связаны явным правилом именования. Иначе дубликаты папок и «потерянные» файлы накапливаются незаметно и увеличивают стоимость сопровождения. Реализация предложений может выполняться поэтапно: сначала минимальный контроль, затем сборка, затем шаблоны сцен и учёт ассетов. Данный вывод учитывался при последующей проверке сценариев. Измерять эффект целесообразно по времени подготовки демо-версии и числу ручных действий перед показом результата. Соответствующее ограничение учитывалось при планировании объёма работ. Предложения по автоматизации направлены на сокращение рутинных операций без усложнения учебного проекта избыточными инструментами. В дальнейшем это упростило объяснение принятых решений на защите.</w:t>
+        <w:t>Поддерживаемость контента повышается, когда источник ассета и его использование в коде связаны явным правилом именования. Иначе дубликаты папок и «потерянные» файлы накапливаются незаметно и увеличивают стоимость сопровождения. Предложение опирается на опыт проекта «The Witcher», где явное выделение фаз и ресурсов упростило сопровождение главы. Практический опыт главы подтвердил ценность явных фаз и централизованных ресурсов.</w:t>
       </w:r>
     </w:p>
     <w:p>
@@ -6708,18 +5758,8 @@
         <w:rPr>
           <w:lang w:val="ru-RU"/>
         </w:rPr>
-        <w:t>На старте достаточно простого чеклиста и скрипта проверки дублей — без тяжёлой CMS. Практическая проверка состоит в том, чтобы новый ассет появлялся в демо без ручного поиска по нескольким копиям одной и той же картинки. Измерять эффект целесообразно по времени подготовки демо-версии и числу ручных действий перед показом результата. Отмеченное требование сохранялось на всех этапах доработки. Предложения по автоматизации направлены на сокращение рутинных операций без усложнения учебного проекта избыточными инструментами. Такая фиксация снижает вероятность повторного возникновения сходных дефектов. Практическая ценность стандарта проявляется тогда, когда автор проекта быстрее получает запускаемый артефакт и понятный список проверок. Это уточняет практическую сторону выполненной работы.</w:t>
-      </w:r>
-      <w:r/>
-      <w:r>
-        <w:rPr>
-          <w:lang w:val="ru-RU"/>
-        </w:rPr>
-      </w:r>
-      <w:r>
-        <w:rPr>
-          <w:lang w:val="ru-RU"/>
-        </w:rPr>
+        <w:lastRenderedPageBreak/>
+        <w:t>На старте достаточно простого чеклиста и скрипта проверки дублей — без тяжёлой CMS. Практическая проверка состоит в том, чтобы новый ассет появлялся в демо без ручного поиска по нескольким копиям одной и той же картинки. На первом этапе достаточно чеклиста и скрипта проверки дублей без внедрения тяжёлой CMS. Простой контроль дублей даёт быстрый эффект при малых затратах.</w:t>
       </w:r>
     </w:p>
     <w:p>
@@ -6733,19 +5773,7 @@
         <w:rPr>
           <w:lang w:val="ru-RU"/>
         </w:rPr>
-        <w:t>Предложение основано на опыте проекта «The Witcher», где явное выделение сценарных фаз и централизованных ресурсов уменьшило сложность сопровождения уже на масштабе одной главы. Полученный опыт важен и в контексте деятельности ООО «КОДДОТ»: при создании игровых прототипов гигиена ассетов напрямую влияет на скорость подготовки MVP. Предложения по автоматизации направлены на сокращение рутинных операций без усложнения учебного проекта избыточными инструментами. Указанный критерий применялся при оценке готовности результата.</w:t>
-      </w:r>
-      <w:r/>
-      <w:r>
-        <w:rPr>
-          <w:lang w:val="ru-RU"/>
-        </w:rPr>
-      </w:r>
-      <w:r/>
-      <w:r>
-        <w:rPr>
-          <w:lang w:val="ru-RU"/>
-        </w:rPr>
+        <w:t>Предложение основано на опыте проекта «The Witcher», где явное выделение сценарных фаз и централизованных ресурсов уменьшило сложность сопровождения уже на масштабе одной главы. Полученный опыт важен и в контексте деятельности ООО «КОДДОТ»: при создании игровых прототипов гигиена ассетов напрямую влияет на скорость подготовки MVP. Далее шаблон сцен может расширяться под разные типы демонстрационных MVP. Расширение шаблонов планируется по мере появления новых типов демо.</w:t>
       </w:r>
     </w:p>
     <w:p>
@@ -6759,7 +5787,7 @@
         <w:rPr>
           <w:lang w:val="ru-RU"/>
         </w:rPr>
-        <w:t>Главное требование к стандарту — снимать рутину и не мешать быстро проверить нестандартную идею. Поэтому шаблоны должны быть расширяемыми, а не обязательными для каждого случая. Практическая ценность стандарта проявляется тогда, когда автор проекта быстрее получает запускаемый артефакт и понятный список проверок. Соответствующее ограничение учитывалось при планировании объёма работ. Риски избыточной формализации учитывались отдельно: шаблоны и скрипты должны помогать, а не блокировать быструю проверку нестандартной идеи. В дальнейшем это упростило объяснение принятых решений на защите. Реализация предложений может выполняться поэтапно: сначала минимальный контроль, затем сборка, затем шаблоны сцен и учёт ассетов. Отмеченное требование сохранялось на всех этапах доработки.</w:t>
+        <w:t>Главное требование к стандарту — снимать рутину и не мешать быстро проверить нестандартную идею. Поэтому шаблоны должны быть расширяемыми, а не обязательными для каждого случая. Стандарт должен снимать рутину и сохранять возможность быстро проверить нестандартную идею. Гибкость стандарта важнее формальной полноты регламента.</w:t>
       </w:r>
     </w:p>
     <w:p>
@@ -6782,16 +5810,15 @@
           <w:lang w:val="ru-RU"/>
         </w:rPr>
       </w:pPr>
-      <w:bookmarkStart w:id="21" w:name="_Toc235697217"/>
+      <w:bookmarkStart w:id="20" w:name="_Toc235697217"/>
       <w:r>
         <w:rPr>
           <w:rFonts w:ascii="Times New Roman" w:hAnsi="Times New Roman" w:cs="Times New Roman"/>
           <w:lang w:val="ru-RU"/>
         </w:rPr>
-        <w:lastRenderedPageBreak/>
         <w:t>Ожидаемый эффект и этапы внедрения</w:t>
       </w:r>
-      <w:bookmarkEnd w:id="21"/>
+      <w:bookmarkEnd w:id="20"/>
     </w:p>
     <w:p>
       <w:pPr>
@@ -6813,13 +5840,14 @@
         <w:rPr>
           <w:lang w:val="ru-RU"/>
         </w:rPr>
-        <w:t>Внедрение можно разделить на три этапа. На первом создаётся шаблон репозитория и минимальный скрипт проверки. На втором в CI добавляется сборка и публикация артефакта. На третьем формируется каталог шаблонов интерактивных сцен и правила учёта ассетов. После каждого этапа следует измерить время подготовки новой демо-версии, число ошибок запуска и количество ручных действий.</w:t>
-      </w:r>
-      <w:r/>
-      <w:r>
-        <w:rPr>
-          <w:lang w:val="ru-RU"/>
-        </w:rPr>
+        <w:t xml:space="preserve">Внедрение можно разделить на три этапа. На первом создаётся шаблон репозитория и минимальный скрипт проверки. На втором в CI добавляется сборка и публикация артефакта. На третьем формируется каталог шаблонов интерактивных сцен и правила учёта ассетов. После каждого этапа следует измерить время подготовки новой демо-версии, число ошибок запуска и количество ручных действий. Поэтапное внедрение позволяет измерять эффект </w:t>
+      </w:r>
+      <w:r>
+        <w:rPr>
+          <w:lang w:val="ru-RU"/>
+        </w:rPr>
+        <w:lastRenderedPageBreak/>
+        <w:t>после каждого шага и корректировать объём автоматизации. Метрики после каждого этапа позволяют вовремя остановить избыточную автоматизацию.</w:t>
       </w:r>
     </w:p>
     <w:p>
@@ -6833,13 +5861,7 @@
         <w:rPr>
           <w:lang w:val="ru-RU"/>
         </w:rPr>
-        <w:t>Риски автоматизации связаны с созданием слишком сложного процесса для небольшого проекта. Поэтому шаблоны должны быть расширяемыми, а не обязательными для каждого случая. Команда получает наибольшую пользу, когда стандарт снимает рутину, но не мешает быстро проверить нестандартную идею. Именно в этом состоит практический смысл предложений для среды разработки MVP.</w:t>
-      </w:r>
-      <w:r/>
-      <w:r>
-        <w:rPr>
-          <w:lang w:val="ru-RU"/>
-        </w:rPr>
+        <w:t>Риски автоматизации связаны с созданием слишком сложного процесса для небольшого проекта. Поэтому шаблоны должны быть расширяемыми, а не обязательными для каждого случая. Команда получает наибольшую пользу, когда стандарт снимает рутину, но не мешает быстро проверить нестандартную идею. Именно в этом состоит практический смысл предложений для среды разработки MVP. Основной риск — избыточная формализация маленького проекта; поэтому шаблоны должны оставаться расширяемыми. Расширяемость шаблонов защищает команду от лишней бюрократии.</w:t>
       </w:r>
     </w:p>
     <w:p>
@@ -6941,6 +5963,51 @@
     </w:p>
     <w:p>
       <w:pPr>
+        <w:ind w:firstLine="0"/>
+        <w:jc w:val="both"/>
+        <w:rPr>
+          <w:lang w:val="ru-RU"/>
+        </w:rPr>
+      </w:pPr>
+    </w:p>
+    <w:p>
+      <w:pPr>
+        <w:ind w:firstLine="0"/>
+        <w:jc w:val="both"/>
+        <w:rPr>
+          <w:lang w:val="ru-RU"/>
+        </w:rPr>
+      </w:pPr>
+    </w:p>
+    <w:p>
+      <w:pPr>
+        <w:ind w:firstLine="0"/>
+        <w:jc w:val="both"/>
+        <w:rPr>
+          <w:lang w:val="ru-RU"/>
+        </w:rPr>
+      </w:pPr>
+    </w:p>
+    <w:p>
+      <w:pPr>
+        <w:ind w:firstLine="0"/>
+        <w:jc w:val="both"/>
+        <w:rPr>
+          <w:lang w:val="ru-RU"/>
+        </w:rPr>
+      </w:pPr>
+    </w:p>
+    <w:p>
+      <w:pPr>
+        <w:ind w:firstLine="0"/>
+        <w:jc w:val="both"/>
+        <w:rPr>
+          <w:lang w:val="ru-RU"/>
+        </w:rPr>
+      </w:pPr>
+    </w:p>
+    <w:p>
+      <w:pPr>
         <w:pStyle w:val="1"/>
         <w:jc w:val="left"/>
         <w:rPr>
@@ -6948,7 +6015,7 @@
           <w:lang w:val="ru-RU"/>
         </w:rPr>
       </w:pPr>
-      <w:bookmarkStart w:id="22" w:name="_Toc235697218"/>
+      <w:bookmarkStart w:id="21" w:name="_Toc235697218"/>
       <w:r>
         <w:rPr>
           <w:rFonts w:ascii="Times New Roman" w:hAnsi="Times New Roman" w:cs="Times New Roman"/>
@@ -6957,122 +6024,217 @@
         <w:lastRenderedPageBreak/>
         <w:t>ЗАКЛЮЧЕНИЕ</w:t>
       </w:r>
+      <w:bookmarkEnd w:id="21"/>
+    </w:p>
+    <w:p>
+      <w:pPr>
+        <w:rPr>
+          <w:lang w:val="ru-RU"/>
+        </w:rPr>
+      </w:pPr>
+    </w:p>
+    <w:p>
+      <w:pPr>
+        <w:jc w:val="both"/>
+        <w:rPr>
+          <w:lang w:val="ru-RU"/>
+        </w:rPr>
+      </w:pPr>
+      <w:r>
+        <w:rPr>
+          <w:lang w:val="ru-RU"/>
+        </w:rPr>
+        <w:t>В ходе технологической практики были рассмотрены принципы организации разработки, применимые к деятельности ООО «КОДДОТ», и создана документированная основа учебного Java-проекта «The Witcher». Практика позволила пройти путь от анализа сценариев и выбора технологий до реализации экранов, подготовки ресурсов, проверки поведения и оформления демонстрационной версии. Материалы разделов образуют единую логику: от постановки задач к проверяемому демонстрационному результату. Итог практики — связанный результат: анализ, архитектура, реализация, демо и предложения.</w:t>
+      </w:r>
+    </w:p>
+    <w:p>
+      <w:pPr>
+        <w:jc w:val="both"/>
+        <w:rPr>
+          <w:lang w:val="ru-RU"/>
+        </w:rPr>
+      </w:pPr>
+      <w:r>
+        <w:rPr>
+          <w:lang w:val="ru-RU"/>
+        </w:rPr>
+        <w:t>Основным результатом стала архитектура с разделением модели, представления, презентера и директора сценария. На её основе описаны и реализованы модули визуальной новеллы, магазина, первой главы, боя, вспомогательных эффектов и цикла повторного прохождения. Сравнение Java/Swing с Unity/C# показало, что для учебного проекта выбранный стек оправдан прозрачностью и возможностью глубоко проработать основы клиентской архитектуры. При этом опыт Codedot в направлении Unity, веб- и мобильной разработки подтверждает важность выбора технологии по потребностям конкретного продукта. Предложенные меры по CI, шаблонам сцен и гигиене ассетов могут быть полезны при создании игровых прототипов и демонстрационных MVP. Сравнение Java/Swing с Unity/C# и предложения по CI закрепляют практическую ценность выполненной работы для защиты и дальнейшего развития. Сравнение Java/Swing и Unity/C# закрепило принцип выбора технологии по задаче.</w:t>
+      </w:r>
+    </w:p>
+    <w:p>
+      <w:pPr>
+        <w:jc w:val="both"/>
+        <w:rPr>
+          <w:lang w:val="ru-RU"/>
+        </w:rPr>
+      </w:pPr>
+      <w:r>
+        <w:rPr>
+          <w:lang w:val="ru-RU"/>
+        </w:rPr>
+        <w:t xml:space="preserve">Поставленная цель практики достигнута: мной получены навыки планирования, проектирования, программной реализации, тестирования и </w:t>
+      </w:r>
+      <w:r>
+        <w:rPr>
+          <w:lang w:val="ru-RU"/>
+        </w:rPr>
+        <w:lastRenderedPageBreak/>
+        <w:t>представления программного продукта. Материалы отчёта и подготовленный проект могут служить основой для дальнейшего расширения игры новыми главами, сохранениями, дополнительными игровыми механиками и автоматизированной поставкой сборок. Материалы отчёта и исходный код могут использоваться как база для новых глав, сохранений и расширения автоматизированной поставки сборок. Дальнейшее развитие проекта возможно без отказа от принятой архитектуры.</w:t>
+      </w:r>
+    </w:p>
+    <w:p>
+      <w:pPr>
+        <w:jc w:val="both"/>
+        <w:rPr>
+          <w:lang w:val="ru-RU"/>
+        </w:rPr>
+      </w:pPr>
+    </w:p>
+    <w:p>
+      <w:pPr>
+        <w:jc w:val="both"/>
+        <w:rPr>
+          <w:lang w:val="ru-RU"/>
+        </w:rPr>
+      </w:pPr>
+    </w:p>
+    <w:p>
+      <w:pPr>
+        <w:jc w:val="both"/>
+        <w:rPr>
+          <w:lang w:val="ru-RU"/>
+        </w:rPr>
+      </w:pPr>
+    </w:p>
+    <w:p>
+      <w:pPr>
+        <w:jc w:val="both"/>
+        <w:rPr>
+          <w:lang w:val="ru-RU"/>
+        </w:rPr>
+      </w:pPr>
+    </w:p>
+    <w:p>
+      <w:pPr>
+        <w:jc w:val="both"/>
+        <w:rPr>
+          <w:lang w:val="ru-RU"/>
+        </w:rPr>
+      </w:pPr>
+    </w:p>
+    <w:p>
+      <w:pPr>
+        <w:jc w:val="both"/>
+        <w:rPr>
+          <w:lang w:val="ru-RU"/>
+        </w:rPr>
+      </w:pPr>
+    </w:p>
+    <w:p>
+      <w:pPr>
+        <w:jc w:val="both"/>
+        <w:rPr>
+          <w:lang w:val="ru-RU"/>
+        </w:rPr>
+      </w:pPr>
+    </w:p>
+    <w:p>
+      <w:pPr>
+        <w:jc w:val="both"/>
+        <w:rPr>
+          <w:lang w:val="ru-RU"/>
+        </w:rPr>
+      </w:pPr>
+    </w:p>
+    <w:p>
+      <w:pPr>
+        <w:jc w:val="both"/>
+        <w:rPr>
+          <w:lang w:val="ru-RU"/>
+        </w:rPr>
+      </w:pPr>
+    </w:p>
+    <w:p>
+      <w:pPr>
+        <w:jc w:val="both"/>
+        <w:rPr>
+          <w:lang w:val="ru-RU"/>
+        </w:rPr>
+      </w:pPr>
+    </w:p>
+    <w:p>
+      <w:pPr>
+        <w:jc w:val="both"/>
+        <w:rPr>
+          <w:lang w:val="ru-RU"/>
+        </w:rPr>
+      </w:pPr>
+    </w:p>
+    <w:p>
+      <w:pPr>
+        <w:jc w:val="both"/>
+        <w:rPr>
+          <w:lang w:val="ru-RU"/>
+        </w:rPr>
+      </w:pPr>
+    </w:p>
+    <w:p>
+      <w:pPr>
+        <w:jc w:val="both"/>
+        <w:rPr>
+          <w:lang w:val="ru-RU"/>
+        </w:rPr>
+      </w:pPr>
+    </w:p>
+    <w:p>
+      <w:pPr>
+        <w:jc w:val="both"/>
+        <w:rPr>
+          <w:lang w:val="ru-RU"/>
+        </w:rPr>
+      </w:pPr>
+    </w:p>
+    <w:p>
+      <w:pPr>
+        <w:jc w:val="both"/>
+        <w:rPr>
+          <w:lang w:val="ru-RU"/>
+        </w:rPr>
+      </w:pPr>
+    </w:p>
+    <w:p>
+      <w:pPr>
+        <w:jc w:val="both"/>
+        <w:rPr>
+          <w:lang w:val="ru-RU"/>
+        </w:rPr>
+      </w:pPr>
+    </w:p>
+    <w:p>
+      <w:pPr>
+        <w:jc w:val="both"/>
+        <w:rPr>
+          <w:lang w:val="ru-RU"/>
+        </w:rPr>
+      </w:pPr>
+    </w:p>
+    <w:p>
+      <w:pPr>
+        <w:jc w:val="both"/>
+        <w:rPr>
+          <w:lang w:val="ru-RU"/>
+        </w:rPr>
+      </w:pPr>
+    </w:p>
+    <w:p>
+      <w:pPr>
+        <w:jc w:val="both"/>
+        <w:rPr>
+          <w:lang w:val="ru-RU"/>
+        </w:rPr>
+      </w:pPr>
+      <w:bookmarkStart w:id="22" w:name="_GoBack"/>
       <w:bookmarkEnd w:id="22"/>
-    </w:p>
-    <w:p>
-      <w:pPr>
-        <w:rPr>
-          <w:lang w:val="ru-RU"/>
-        </w:rPr>
-      </w:pPr>
-    </w:p>
-    <w:p>
-      <w:pPr>
-        <w:jc w:val="both"/>
-        <w:rPr>
-          <w:lang w:val="ru-RU"/>
-        </w:rPr>
-      </w:pPr>
-      <w:r>
-        <w:rPr>
-          <w:lang w:val="ru-RU"/>
-        </w:rPr>
-        <w:t>В ходе технологической практики были рассмотрены принципы организации разработки, применимые к деятельности ООО «КОДДОТ», и создана документированная основа учебного Java-проекта «The Witcher». Практика позволила пройти путь от анализа сценариев и выбора технологий до реализации экранов, подготовки ресурсов, проверки поведения и оформления демонстрационной версии.</w:t>
-      </w:r>
-      <w:r/>
-      <w:r>
-        <w:rPr>
-          <w:lang w:val="ru-RU"/>
-        </w:rPr>
-      </w:r>
-      <w:r/>
-      <w:r>
-        <w:rPr>
-          <w:lang w:val="ru-RU"/>
-        </w:rPr>
-      </w:r>
-      <w:r/>
-      <w:r>
-        <w:rPr>
-          <w:lang w:val="ru-RU"/>
-        </w:rPr>
-      </w:r>
-    </w:p>
-    <w:p>
-      <w:pPr>
-        <w:jc w:val="both"/>
-        <w:rPr>
-          <w:lang w:val="ru-RU"/>
-        </w:rPr>
-      </w:pPr>
-      <w:r>
-        <w:rPr>
-          <w:lang w:val="ru-RU"/>
-        </w:rPr>
-        <w:t>Основным результатом стала архитектура с разделением модели, представления, презентера и директора сценария. На её основе описаны и реализованы модули визуальной новеллы, магазина, первой главы, боя, вспомогательных эффектов и цикла повторного прохождения. Сравнение Java/Swing с Unity/C# показало, что для учебного проекта выбранный стек оправдан прозрачностью и возможностью глубоко проработать основы клиентской архитектуры. При этом опыт Codedot в направлении Unity, веб- и мобильной разработки подтверждает важность выбора технологии по потребностям конкретного продукта. Предложенные меры по CI, шаблонам сцен и гигиене ассетов могут быть полезны при создании игровых прототипов и демонстрационных MVP.</w:t>
-      </w:r>
-      <w:r/>
-      <w:r>
-        <w:rPr>
-          <w:lang w:val="ru-RU"/>
-        </w:rPr>
-      </w:r>
-      <w:r/>
-      <w:r>
-        <w:rPr>
-          <w:lang w:val="ru-RU"/>
-        </w:rPr>
-      </w:r>
-      <w:r/>
-      <w:r>
-        <w:rPr>
-          <w:lang w:val="ru-RU"/>
-        </w:rPr>
-      </w:r>
-      <w:r/>
-      <w:r>
-        <w:rPr>
-          <w:lang w:val="ru-RU"/>
-        </w:rPr>
-      </w:r>
-      <w:r/>
-      <w:r>
-        <w:rPr>
-          <w:lang w:val="ru-RU"/>
-        </w:rPr>
-      </w:r>
-      <w:r/>
-      <w:r>
-        <w:rPr>
-          <w:lang w:val="ru-RU"/>
-        </w:rPr>
-      </w:r>
-      <w:r/>
-      <w:r>
-        <w:rPr>
-          <w:lang w:val="ru-RU"/>
-        </w:rPr>
-      </w:r>
-      <w:r/>
-      <w:r>
-        <w:rPr>
-          <w:lang w:val="ru-RU"/>
-        </w:rPr>
-      </w:r>
-    </w:p>
-    <w:p>
-      <w:pPr>
-        <w:jc w:val="both"/>
-        <w:rPr>
-          <w:lang w:val="ru-RU"/>
-        </w:rPr>
-      </w:pPr>
-      <w:r>
-        <w:rPr>
-          <w:lang w:val="ru-RU"/>
-        </w:rPr>
-        <w:t>Поставленная цель практики достигнута: получены навыки планирования, проектирования, программной реализации, тестирования и представления программного продукта. Материалы отчёта и подготовленный проект могут служить основой для дальнейшего расширения игры новыми главами, сохранениями, дополнительными игровыми механиками и автоматизированной поставкой сборок.</w:t>
-      </w:r>
     </w:p>
     <w:p>
       <w:pPr>
@@ -7179,9 +6341,6 @@
         <w:t xml:space="preserve">com/en/java/ (дата обращения: </w:t>
       </w:r>
       <w:r>
-        <w:rPr>
-          <w:lang w:val="ru-RU"/>
-        </w:rPr>
         <w:t>15</w:t>
       </w:r>
       <w:r>
@@ -7729,7 +6888,7 @@
             <w:noProof/>
             <w:lang w:val="ru-RU"/>
           </w:rPr>
-          <w:t>53</w:t>
+          <w:t>49</w:t>
         </w:r>
         <w:r>
           <w:fldChar w:fldCharType="end"/>
@@ -20621,7 +19780,7 @@
 </file>
 
 <file path=customXml/itemProps1.xml><?xml version="1.0" encoding="utf-8"?>
-<ds:datastoreItem xmlns:ds="http://schemas.openxmlformats.org/officeDocument/2006/customXml" ds:itemID="{C605FD02-5D0A-4417-8913-D8C47BB49043}">
+<ds:datastoreItem xmlns:ds="http://schemas.openxmlformats.org/officeDocument/2006/customXml" ds:itemID="{537D7578-FB78-4C32-83BB-E0551FB0D8B8}">
   <ds:schemaRefs>
     <ds:schemaRef ds:uri="http://schemas.openxmlformats.org/officeDocument/2006/bibliography"/>
   </ds:schemaRefs>

</xml_diff>